<commit_message>
Corrected barrier test: fit-matched blind pairs and straight-path profiles; update report, poster, demo, docs; fix pair selection
</commit_message>
<xml_diff>
--- a/report/Report_Sarkar_Choudhuri_Project1.docx
+++ b/report/Report_Sarkar_Choudhuri_Project1.docx
@@ -2059,7 +2059,7 @@
             </w:rPr>
             <w:fldChar w:fldCharType="separate"/>
           </w:r>
-          <w:hyperlink w:anchor="__RefHeading___Toc2192_2894726032">
+          <w:hyperlink w:anchor="__RefHeading___Toc2288_186613870">
             <w:r>
               <w:rPr>
                 <w:webHidden/>
@@ -2080,7 +2080,7 @@
             </w:tabs>
             <w:rPr/>
           </w:pPr>
-          <w:hyperlink w:anchor="__RefHeading___Toc2194_2894726032">
+          <w:hyperlink w:anchor="__RefHeading___Toc2290_186613870">
             <w:r>
               <w:rPr>
                 <w:webHidden/>
@@ -2101,7 +2101,7 @@
             </w:tabs>
             <w:rPr/>
           </w:pPr>
-          <w:hyperlink w:anchor="__RefHeading___Toc2196_2894726032">
+          <w:hyperlink w:anchor="__RefHeading___Toc2292_186613870">
             <w:r>
               <w:rPr>
                 <w:webHidden/>
@@ -2122,7 +2122,7 @@
             </w:tabs>
             <w:rPr/>
           </w:pPr>
-          <w:hyperlink w:anchor="__RefHeading___Toc2198_2894726032">
+          <w:hyperlink w:anchor="__RefHeading___Toc2294_186613870">
             <w:r>
               <w:rPr>
                 <w:webHidden/>
@@ -2143,7 +2143,7 @@
             </w:tabs>
             <w:rPr/>
           </w:pPr>
-          <w:hyperlink w:anchor="__RefHeading___Toc2200_2894726032">
+          <w:hyperlink w:anchor="__RefHeading___Toc2296_186613870">
             <w:r>
               <w:rPr>
                 <w:webHidden/>
@@ -2164,7 +2164,7 @@
             </w:tabs>
             <w:rPr/>
           </w:pPr>
-          <w:hyperlink w:anchor="__RefHeading___Toc2202_2894726032">
+          <w:hyperlink w:anchor="__RefHeading___Toc2298_186613870">
             <w:r>
               <w:rPr>
                 <w:webHidden/>
@@ -2185,7 +2185,7 @@
             </w:tabs>
             <w:rPr/>
           </w:pPr>
-          <w:hyperlink w:anchor="__RefHeading___Toc2204_2894726032">
+          <w:hyperlink w:anchor="__RefHeading___Toc2300_186613870">
             <w:r>
               <w:rPr>
                 <w:webHidden/>
@@ -2206,7 +2206,7 @@
             </w:tabs>
             <w:rPr/>
           </w:pPr>
-          <w:hyperlink w:anchor="__RefHeading___Toc2206_2894726032">
+          <w:hyperlink w:anchor="__RefHeading___Toc2302_186613870">
             <w:r>
               <w:rPr>
                 <w:webHidden/>
@@ -2227,7 +2227,7 @@
             </w:tabs>
             <w:rPr/>
           </w:pPr>
-          <w:hyperlink w:anchor="__RefHeading___Toc2208_2894726032">
+          <w:hyperlink w:anchor="__RefHeading___Toc2304_186613870">
             <w:r>
               <w:rPr>
                 <w:webHidden/>
@@ -2248,7 +2248,7 @@
             </w:tabs>
             <w:rPr/>
           </w:pPr>
-          <w:hyperlink w:anchor="__RefHeading___Toc2210_2894726032">
+          <w:hyperlink w:anchor="__RefHeading___Toc2306_186613870">
             <w:r>
               <w:rPr>
                 <w:webHidden/>
@@ -2269,7 +2269,7 @@
             </w:tabs>
             <w:rPr/>
           </w:pPr>
-          <w:hyperlink w:anchor="__RefHeading___Toc2212_2894726032">
+          <w:hyperlink w:anchor="__RefHeading___Toc2308_186613870">
             <w:r>
               <w:rPr>
                 <w:webHidden/>
@@ -2290,7 +2290,7 @@
             </w:tabs>
             <w:rPr/>
           </w:pPr>
-          <w:hyperlink w:anchor="__RefHeading___Toc2214_2894726032">
+          <w:hyperlink w:anchor="__RefHeading___Toc2310_186613870">
             <w:r>
               <w:rPr>
                 <w:webHidden/>
@@ -2311,7 +2311,7 @@
             </w:tabs>
             <w:rPr/>
           </w:pPr>
-          <w:hyperlink w:anchor="__RefHeading___Toc2216_2894726032">
+          <w:hyperlink w:anchor="__RefHeading___Toc2312_186613870">
             <w:r>
               <w:rPr>
                 <w:webHidden/>
@@ -2332,7 +2332,7 @@
             </w:tabs>
             <w:rPr/>
           </w:pPr>
-          <w:hyperlink w:anchor="__RefHeading___Toc2218_2894726032">
+          <w:hyperlink w:anchor="__RefHeading___Toc2314_186613870">
             <w:r>
               <w:rPr>
                 <w:webHidden/>
@@ -2353,7 +2353,7 @@
             </w:tabs>
             <w:rPr/>
           </w:pPr>
-          <w:hyperlink w:anchor="__RefHeading___Toc2220_2894726032">
+          <w:hyperlink w:anchor="__RefHeading___Toc2316_186613870">
             <w:r>
               <w:rPr>
                 <w:webHidden/>
@@ -2374,7 +2374,7 @@
             </w:tabs>
             <w:rPr/>
           </w:pPr>
-          <w:hyperlink w:anchor="__RefHeading___Toc2222_2894726032">
+          <w:hyperlink w:anchor="__RefHeading___Toc2318_186613870">
             <w:r>
               <w:rPr>
                 <w:webHidden/>
@@ -2395,7 +2395,7 @@
             </w:tabs>
             <w:rPr/>
           </w:pPr>
-          <w:hyperlink w:anchor="__RefHeading___Toc2224_2894726032">
+          <w:hyperlink w:anchor="__RefHeading___Toc2320_186613870">
             <w:r>
               <w:rPr>
                 <w:webHidden/>
@@ -2416,7 +2416,7 @@
             </w:tabs>
             <w:rPr/>
           </w:pPr>
-          <w:hyperlink w:anchor="__RefHeading___Toc2226_2894726032">
+          <w:hyperlink w:anchor="__RefHeading___Toc2322_186613870">
             <w:r>
               <w:rPr>
                 <w:webHidden/>
@@ -2437,7 +2437,7 @@
             </w:tabs>
             <w:rPr/>
           </w:pPr>
-          <w:hyperlink w:anchor="__RefHeading___Toc2228_2894726032">
+          <w:hyperlink w:anchor="__RefHeading___Toc2324_186613870">
             <w:r>
               <w:rPr>
                 <w:webHidden/>
@@ -2458,7 +2458,7 @@
             </w:tabs>
             <w:rPr/>
           </w:pPr>
-          <w:hyperlink w:anchor="__RefHeading___Toc2230_2894726032">
+          <w:hyperlink w:anchor="__RefHeading___Toc2326_186613870">
             <w:r>
               <w:rPr>
                 <w:webHidden/>
@@ -2479,7 +2479,7 @@
             </w:tabs>
             <w:rPr/>
           </w:pPr>
-          <w:hyperlink w:anchor="__RefHeading___Toc2232_2894726032">
+          <w:hyperlink w:anchor="__RefHeading___Toc2328_186613870">
             <w:r>
               <w:rPr>
                 <w:webHidden/>
@@ -2500,7 +2500,7 @@
             </w:tabs>
             <w:rPr/>
           </w:pPr>
-          <w:hyperlink w:anchor="__RefHeading___Toc2234_2894726032">
+          <w:hyperlink w:anchor="__RefHeading___Toc2330_186613870">
             <w:r>
               <w:rPr>
                 <w:webHidden/>
@@ -2521,7 +2521,7 @@
             </w:tabs>
             <w:rPr/>
           </w:pPr>
-          <w:hyperlink w:anchor="__RefHeading___Toc2236_2894726032">
+          <w:hyperlink w:anchor="__RefHeading___Toc2332_186613870">
             <w:r>
               <w:rPr>
                 <w:webHidden/>
@@ -2542,7 +2542,7 @@
             </w:tabs>
             <w:rPr/>
           </w:pPr>
-          <w:hyperlink w:anchor="__RefHeading___Toc2238_2894726032">
+          <w:hyperlink w:anchor="__RefHeading___Toc2334_186613870">
             <w:r>
               <w:rPr>
                 <w:webHidden/>
@@ -2563,7 +2563,7 @@
             </w:tabs>
             <w:rPr/>
           </w:pPr>
-          <w:hyperlink w:anchor="__RefHeading___Toc2240_2894726032">
+          <w:hyperlink w:anchor="__RefHeading___Toc2336_186613870">
             <w:r>
               <w:rPr>
                 <w:webHidden/>
@@ -2584,7 +2584,7 @@
             </w:tabs>
             <w:rPr/>
           </w:pPr>
-          <w:hyperlink w:anchor="__RefHeading___Toc2242_2894726032">
+          <w:hyperlink w:anchor="__RefHeading___Toc2338_186613870">
             <w:r>
               <w:rPr>
                 <w:webHidden/>
@@ -2605,7 +2605,7 @@
             </w:tabs>
             <w:rPr/>
           </w:pPr>
-          <w:hyperlink w:anchor="__RefHeading___Toc2244_2894726032">
+          <w:hyperlink w:anchor="__RefHeading___Toc2340_186613870">
             <w:r>
               <w:rPr>
                 <w:webHidden/>
@@ -2626,7 +2626,7 @@
             </w:tabs>
             <w:rPr/>
           </w:pPr>
-          <w:hyperlink w:anchor="__RefHeading___Toc2246_2894726032">
+          <w:hyperlink w:anchor="__RefHeading___Toc2342_186613870">
             <w:r>
               <w:rPr>
                 <w:webHidden/>
@@ -2647,7 +2647,7 @@
             </w:tabs>
             <w:rPr/>
           </w:pPr>
-          <w:hyperlink w:anchor="__RefHeading___Toc2248_2894726032">
+          <w:hyperlink w:anchor="__RefHeading___Toc2344_186613870">
             <w:r>
               <w:rPr>
                 <w:webHidden/>
@@ -2668,7 +2668,7 @@
             </w:tabs>
             <w:rPr/>
           </w:pPr>
-          <w:hyperlink w:anchor="__RefHeading___Toc2250_2894726032">
+          <w:hyperlink w:anchor="__RefHeading___Toc2346_186613870">
             <w:r>
               <w:rPr>
                 <w:webHidden/>
@@ -2689,7 +2689,7 @@
             </w:tabs>
             <w:rPr/>
           </w:pPr>
-          <w:hyperlink w:anchor="__RefHeading___Toc2252_2894726032">
+          <w:hyperlink w:anchor="__RefHeading___Toc2348_186613870">
             <w:r>
               <w:rPr>
                 <w:webHidden/>
@@ -2710,7 +2710,7 @@
             </w:tabs>
             <w:rPr/>
           </w:pPr>
-          <w:hyperlink w:anchor="__RefHeading___Toc2254_2894726032">
+          <w:hyperlink w:anchor="__RefHeading___Toc2350_186613870">
             <w:r>
               <w:rPr>
                 <w:webHidden/>
@@ -2731,7 +2731,7 @@
             </w:tabs>
             <w:rPr/>
           </w:pPr>
-          <w:hyperlink w:anchor="__RefHeading___Toc2256_2894726032">
+          <w:hyperlink w:anchor="__RefHeading___Toc2352_186613870">
             <w:r>
               <w:rPr>
                 <w:webHidden/>
@@ -2752,7 +2752,7 @@
             </w:tabs>
             <w:rPr/>
           </w:pPr>
-          <w:hyperlink w:anchor="__RefHeading___Toc2258_2894726032">
+          <w:hyperlink w:anchor="__RefHeading___Toc2354_186613870">
             <w:r>
               <w:rPr>
                 <w:webHidden/>
@@ -2773,7 +2773,7 @@
             </w:tabs>
             <w:rPr/>
           </w:pPr>
-          <w:hyperlink w:anchor="__RefHeading___Toc2260_2894726032">
+          <w:hyperlink w:anchor="__RefHeading___Toc2356_186613870">
             <w:r>
               <w:rPr>
                 <w:webHidden/>
@@ -2794,7 +2794,7 @@
             </w:tabs>
             <w:rPr/>
           </w:pPr>
-          <w:hyperlink w:anchor="__RefHeading___Toc2262_2894726032">
+          <w:hyperlink w:anchor="__RefHeading___Toc2358_186613870">
             <w:r>
               <w:rPr>
                 <w:webHidden/>
@@ -2815,7 +2815,7 @@
             </w:tabs>
             <w:rPr/>
           </w:pPr>
-          <w:hyperlink w:anchor="__RefHeading___Toc2264_2894726032">
+          <w:hyperlink w:anchor="__RefHeading___Toc2360_186613870">
             <w:r>
               <w:rPr>
                 <w:webHidden/>
@@ -2836,7 +2836,7 @@
             </w:tabs>
             <w:rPr/>
           </w:pPr>
-          <w:hyperlink w:anchor="__RefHeading___Toc2266_2894726032">
+          <w:hyperlink w:anchor="__RefHeading___Toc2362_186613870">
             <w:r>
               <w:rPr>
                 <w:webHidden/>
@@ -2857,7 +2857,7 @@
             </w:tabs>
             <w:rPr/>
           </w:pPr>
-          <w:hyperlink w:anchor="__RefHeading___Toc2268_2894726032">
+          <w:hyperlink w:anchor="__RefHeading___Toc2364_186613870">
             <w:r>
               <w:rPr>
                 <w:webHidden/>
@@ -2878,7 +2878,7 @@
             </w:tabs>
             <w:rPr/>
           </w:pPr>
-          <w:hyperlink w:anchor="__RefHeading___Toc2270_2894726032">
+          <w:hyperlink w:anchor="__RefHeading___Toc2366_186613870">
             <w:r>
               <w:rPr>
                 <w:webHidden/>
@@ -2950,7 +2950,7 @@
             </w:rPr>
             <w:fldChar w:fldCharType="separate"/>
           </w:r>
-          <w:hyperlink w:anchor="__RefHeading___Toc2272_2894726032">
+          <w:hyperlink w:anchor="__RefHeading___Toc2368_186613870">
             <w:r>
               <w:rPr>
                 <w:webHidden/>
@@ -2971,7 +2971,7 @@
             </w:tabs>
             <w:rPr/>
           </w:pPr>
-          <w:hyperlink w:anchor="__RefHeading___Toc2302_2894726032">
+          <w:hyperlink w:anchor="__RefHeading___Toc2398_186613870">
             <w:r>
               <w:rPr>
                 <w:webHidden/>
@@ -2992,7 +2992,7 @@
             </w:tabs>
             <w:rPr/>
           </w:pPr>
-          <w:hyperlink w:anchor="__RefHeading___Toc2300_2894726032">
+          <w:hyperlink w:anchor="__RefHeading___Toc2396_186613870">
             <w:r>
               <w:rPr>
                 <w:webHidden/>
@@ -3013,13 +3013,13 @@
             </w:tabs>
             <w:rPr/>
           </w:pPr>
-          <w:hyperlink w:anchor="__RefHeading___Toc2298_2894726032">
+          <w:hyperlink w:anchor="__RefHeading___Toc2394_186613870">
             <w:r>
               <w:rPr>
                 <w:webHidden/>
                 <w:rStyle w:val="IndexLink"/>
               </w:rPr>
-              <w:t>Figure 8.3: Prediction change along the solution difference d relative to random directions of equal length</w:t>
+              <w:t>Figure 8.3: Left: prediction error along the straight line between fit-matched blind solutions (blue, ten pairs) and from the best blind solution to the near-truth solution (orange). Right: final error and recovery for each of the eight starts</w:t>
               <w:tab/>
               <w:t>16</w:t>
             </w:r>
@@ -3034,15 +3034,15 @@
             </w:tabs>
             <w:rPr/>
           </w:pPr>
-          <w:hyperlink w:anchor="__RefHeading___Toc2296_2894726032">
+          <w:hyperlink w:anchor="__RefHeading___Toc2392_186613870">
             <w:r>
               <w:rPr>
                 <w:webHidden/>
                 <w:rStyle w:val="IndexLink"/>
               </w:rPr>
-              <w:t>Figure 8.4: Directional sensitivity of the operator: solution-difference directions against 200 random directions</w:t>
+              <w:t>Figure 8.4: Directional sensitivity of the operator in the original run: solution-difference directions against 200 random directions (the corrected pair gives 2.1×)</w:t>
               <w:tab/>
-              <w:t>16</w:t>
+              <w:t>17</w:t>
             </w:r>
           </w:hyperlink>
         </w:p>
@@ -3055,7 +3055,7 @@
             </w:tabs>
             <w:rPr/>
           </w:pPr>
-          <w:hyperlink w:anchor="__RefHeading___Toc2294_2894726032">
+          <w:hyperlink w:anchor="__RefHeading___Toc2390_186613870">
             <w:r>
               <w:rPr>
                 <w:webHidden/>
@@ -3076,7 +3076,7 @@
             </w:tabs>
             <w:rPr/>
           </w:pPr>
-          <w:hyperlink w:anchor="__RefHeading___Toc2292_2894726032">
+          <w:hyperlink w:anchor="__RefHeading___Toc2388_186613870">
             <w:r>
               <w:rPr>
                 <w:webHidden/>
@@ -3084,7 +3084,7 @@
               </w:rPr>
               <w:t>Figure 8.6: Recovery, relative error and retrieval against measurement noise</w:t>
               <w:tab/>
-              <w:t>17</w:t>
+              <w:t>18</w:t>
             </w:r>
           </w:hyperlink>
         </w:p>
@@ -3097,7 +3097,7 @@
             </w:tabs>
             <w:rPr/>
           </w:pPr>
-          <w:hyperlink w:anchor="__RefHeading___Toc2290_2894726032">
+          <w:hyperlink w:anchor="__RefHeading___Toc2386_186613870">
             <w:r>
               <w:rPr>
                 <w:webHidden/>
@@ -3118,7 +3118,7 @@
             </w:tabs>
             <w:rPr/>
           </w:pPr>
-          <w:hyperlink w:anchor="__RefHeading___Toc2288_2894726032">
+          <w:hyperlink w:anchor="__RefHeading___Toc2384_186613870">
             <w:r>
               <w:rPr>
                 <w:webHidden/>
@@ -3139,7 +3139,7 @@
             </w:tabs>
             <w:rPr/>
           </w:pPr>
-          <w:hyperlink w:anchor="__RefHeading___Toc2286_2894726032">
+          <w:hyperlink w:anchor="__RefHeading___Toc2382_186613870">
             <w:r>
               <w:rPr>
                 <w:webHidden/>
@@ -3147,7 +3147,7 @@
               </w:rPr>
               <w:t>Figure 8.9: Gradient inversion against the best ridge decoder</w:t>
               <w:tab/>
-              <w:t>18</w:t>
+              <w:t>19</w:t>
             </w:r>
           </w:hyperlink>
         </w:p>
@@ -3160,7 +3160,7 @@
             </w:tabs>
             <w:rPr/>
           </w:pPr>
-          <w:hyperlink w:anchor="__RefHeading___Toc2284_2894726032">
+          <w:hyperlink w:anchor="__RefHeading___Toc2380_186613870">
             <w:r>
               <w:rPr>
                 <w:webHidden/>
@@ -3168,7 +3168,7 @@
               </w:rPr>
               <w:t>Figure 8.10: The six anatomical networks on the inflated fsaverage5 surface</w:t>
               <w:tab/>
-              <w:t>19</w:t>
+              <w:t>20</w:t>
             </w:r>
           </w:hyperlink>
         </w:p>
@@ -3181,7 +3181,7 @@
             </w:tabs>
             <w:rPr/>
           </w:pPr>
-          <w:hyperlink w:anchor="__RefHeading___Toc2282_2894726032">
+          <w:hyperlink w:anchor="__RefHeading___Toc2378_186613870">
             <w:r>
               <w:rPr>
                 <w:webHidden/>
@@ -3202,7 +3202,7 @@
             </w:tabs>
             <w:rPr/>
           </w:pPr>
-          <w:hyperlink w:anchor="__RefHeading___Toc2280_2894726032">
+          <w:hyperlink w:anchor="__RefHeading___Toc2376_186613870">
             <w:r>
               <w:rPr>
                 <w:webHidden/>
@@ -3223,7 +3223,7 @@
             </w:tabs>
             <w:rPr/>
           </w:pPr>
-          <w:hyperlink w:anchor="__RefHeading___Toc2278_2894726032">
+          <w:hyperlink w:anchor="__RefHeading___Toc2374_186613870">
             <w:r>
               <w:rPr>
                 <w:webHidden/>
@@ -3244,7 +3244,7 @@
             </w:tabs>
             <w:rPr/>
           </w:pPr>
-          <w:hyperlink w:anchor="__RefHeading___Toc2276_2894726032">
+          <w:hyperlink w:anchor="__RefHeading___Toc2372_186613870">
             <w:r>
               <w:rPr>
                 <w:webHidden/>
@@ -3265,7 +3265,7 @@
             </w:tabs>
             <w:rPr/>
           </w:pPr>
-          <w:hyperlink w:anchor="__RefHeading___Toc2274_2894726032">
+          <w:hyperlink w:anchor="__RefHeading___Toc2370_186613870">
             <w:r>
               <w:rPr>
                 <w:webHidden/>
@@ -3337,7 +3337,7 @@
             </w:rPr>
             <w:fldChar w:fldCharType="separate"/>
           </w:r>
-          <w:hyperlink w:anchor="__RefHeading___Toc2304_2894726032">
+          <w:hyperlink w:anchor="__RefHeading___Toc2400_186613870">
             <w:r>
               <w:rPr>
                 <w:webHidden/>
@@ -3358,7 +3358,7 @@
             </w:tabs>
             <w:rPr/>
           </w:pPr>
-          <w:hyperlink w:anchor="__RefHeading___Toc2340_2894726032">
+          <w:hyperlink w:anchor="__RefHeading___Toc2436_186613870">
             <w:r>
               <w:rPr>
                 <w:webHidden/>
@@ -3379,7 +3379,7 @@
             </w:tabs>
             <w:rPr/>
           </w:pPr>
-          <w:hyperlink w:anchor="__RefHeading___Toc2338_2894726032">
+          <w:hyperlink w:anchor="__RefHeading___Toc2434_186613870">
             <w:r>
               <w:rPr>
                 <w:webHidden/>
@@ -3400,7 +3400,7 @@
             </w:tabs>
             <w:rPr/>
           </w:pPr>
-          <w:hyperlink w:anchor="__RefHeading___Toc2336_2894726032">
+          <w:hyperlink w:anchor="__RefHeading___Toc2432_186613870">
             <w:r>
               <w:rPr>
                 <w:webHidden/>
@@ -3421,7 +3421,7 @@
             </w:tabs>
             <w:rPr/>
           </w:pPr>
-          <w:hyperlink w:anchor="__RefHeading___Toc2334_2894726032">
+          <w:hyperlink w:anchor="__RefHeading___Toc2430_186613870">
             <w:r>
               <w:rPr>
                 <w:webHidden/>
@@ -3442,7 +3442,7 @@
             </w:tabs>
             <w:rPr/>
           </w:pPr>
-          <w:hyperlink w:anchor="__RefHeading___Toc2332_2894726032">
+          <w:hyperlink w:anchor="__RefHeading___Toc2428_186613870">
             <w:r>
               <w:rPr>
                 <w:webHidden/>
@@ -3463,7 +3463,7 @@
             </w:tabs>
             <w:rPr/>
           </w:pPr>
-          <w:hyperlink w:anchor="__RefHeading___Toc2330_2894726032">
+          <w:hyperlink w:anchor="__RefHeading___Toc2426_186613870">
             <w:r>
               <w:rPr>
                 <w:webHidden/>
@@ -3484,7 +3484,7 @@
             </w:tabs>
             <w:rPr/>
           </w:pPr>
-          <w:hyperlink w:anchor="__RefHeading___Toc2328_2894726032">
+          <w:hyperlink w:anchor="__RefHeading___Toc2424_186613870">
             <w:r>
               <w:rPr>
                 <w:webHidden/>
@@ -3505,7 +3505,7 @@
             </w:tabs>
             <w:rPr/>
           </w:pPr>
-          <w:hyperlink w:anchor="__RefHeading___Toc2326_2894726032">
+          <w:hyperlink w:anchor="__RefHeading___Toc2422_186613870">
             <w:r>
               <w:rPr>
                 <w:webHidden/>
@@ -3526,7 +3526,7 @@
             </w:tabs>
             <w:rPr/>
           </w:pPr>
-          <w:hyperlink w:anchor="__RefHeading___Toc2324_2894726032">
+          <w:hyperlink w:anchor="__RefHeading___Toc2420_186613870">
             <w:r>
               <w:rPr>
                 <w:webHidden/>
@@ -3547,7 +3547,7 @@
             </w:tabs>
             <w:rPr/>
           </w:pPr>
-          <w:hyperlink w:anchor="__RefHeading___Toc2322_2894726032">
+          <w:hyperlink w:anchor="__RefHeading___Toc2418_186613870">
             <w:r>
               <w:rPr>
                 <w:webHidden/>
@@ -3568,7 +3568,7 @@
             </w:tabs>
             <w:rPr/>
           </w:pPr>
-          <w:hyperlink w:anchor="__RefHeading___Toc2320_2894726032">
+          <w:hyperlink w:anchor="__RefHeading___Toc2416_186613870">
             <w:r>
               <w:rPr>
                 <w:webHidden/>
@@ -3589,13 +3589,13 @@
             </w:tabs>
             <w:rPr/>
           </w:pPr>
-          <w:hyperlink w:anchor="__RefHeading___Toc2318_2894726032">
+          <w:hyperlink w:anchor="__RefHeading___Toc2414_186613870">
             <w:r>
               <w:rPr>
                 <w:webHidden/>
                 <w:rStyle w:val="IndexLink"/>
               </w:rPr>
-              <w:t>Table 8.3: Prediction change along d against random directions</w:t>
+              <w:t>Table 8.3: Straight-path barrier between fit-matched blind solutions (ground truth 0, 14 000 steps)</w:t>
               <w:tab/>
               <w:t>16</w:t>
             </w:r>
@@ -3610,7 +3610,7 @@
             </w:tabs>
             <w:rPr/>
           </w:pPr>
-          <w:hyperlink w:anchor="__RefHeading___Toc2316_2894726032">
+          <w:hyperlink w:anchor="__RefHeading___Toc2412_186613870">
             <w:r>
               <w:rPr>
                 <w:webHidden/>
@@ -3631,7 +3631,7 @@
             </w:tabs>
             <w:rPr/>
           </w:pPr>
-          <w:hyperlink w:anchor="__RefHeading___Toc2314_2894726032">
+          <w:hyperlink w:anchor="__RefHeading___Toc2410_186613870">
             <w:r>
               <w:rPr>
                 <w:webHidden/>
@@ -3652,7 +3652,7 @@
             </w:tabs>
             <w:rPr/>
           </w:pPr>
-          <w:hyperlink w:anchor="__RefHeading___Toc2312_2894726032">
+          <w:hyperlink w:anchor="__RefHeading___Toc2408_186613870">
             <w:r>
               <w:rPr>
                 <w:webHidden/>
@@ -3673,7 +3673,7 @@
             </w:tabs>
             <w:rPr/>
           </w:pPr>
-          <w:hyperlink w:anchor="__RefHeading___Toc2310_2894726032">
+          <w:hyperlink w:anchor="__RefHeading___Toc2406_186613870">
             <w:r>
               <w:rPr>
                 <w:webHidden/>
@@ -3694,7 +3694,7 @@
             </w:tabs>
             <w:rPr/>
           </w:pPr>
-          <w:hyperlink w:anchor="__RefHeading___Toc2308_2894726032">
+          <w:hyperlink w:anchor="__RefHeading___Toc2404_186613870">
             <w:r>
               <w:rPr>
                 <w:webHidden/>
@@ -3715,7 +3715,7 @@
             </w:tabs>
             <w:rPr/>
           </w:pPr>
-          <w:hyperlink w:anchor="__RefHeading___Toc2306_2894726032">
+          <w:hyperlink w:anchor="__RefHeading___Toc2402_186613870">
             <w:r>
               <w:rPr>
                 <w:webHidden/>
@@ -4625,7 +4625,7 @@
         <w:pStyle w:val="Heading1"/>
         <w:rPr/>
       </w:pPr>
-      <w:bookmarkStart w:id="2" w:name="__RefHeading___Toc2192_2894726032"/>
+      <w:bookmarkStart w:id="2" w:name="__RefHeading___Toc2288_186613870"/>
       <w:bookmarkEnd w:id="2"/>
       <w:r>
         <w:rPr/>
@@ -4682,7 +4682,7 @@
         <w:pStyle w:val="Heading2"/>
         <w:rPr/>
       </w:pPr>
-      <w:bookmarkStart w:id="3" w:name="__RefHeading___Toc2194_2894726032"/>
+      <w:bookmarkStart w:id="3" w:name="__RefHeading___Toc2290_186613870"/>
       <w:bookmarkEnd w:id="3"/>
       <w:r>
         <w:rPr/>
@@ -4760,7 +4760,7 @@
         <w:pStyle w:val="TableCaption"/>
         <w:rPr/>
       </w:pPr>
-      <w:bookmarkStart w:id="4" w:name="__RefHeading___Toc2304_2894726032"/>
+      <w:bookmarkStart w:id="4" w:name="__RefHeading___Toc2400_186613870"/>
       <w:bookmarkEnd w:id="4"/>
       <w:r>
         <w:rPr>
@@ -5692,7 +5692,7 @@
         <w:pStyle w:val="Heading2"/>
         <w:rPr/>
       </w:pPr>
-      <w:bookmarkStart w:id="5" w:name="__RefHeading___Toc2196_2894726032"/>
+      <w:bookmarkStart w:id="5" w:name="__RefHeading___Toc2292_186613870"/>
       <w:bookmarkEnd w:id="5"/>
       <w:r>
         <w:rPr/>
@@ -5719,7 +5719,7 @@
         <w:pStyle w:val="TableCaption"/>
         <w:rPr/>
       </w:pPr>
-      <w:bookmarkStart w:id="6" w:name="__RefHeading___Toc2340_2894726032"/>
+      <w:bookmarkStart w:id="6" w:name="__RefHeading___Toc2436_186613870"/>
       <w:bookmarkEnd w:id="6"/>
       <w:r>
         <w:rPr>
@@ -6845,7 +6845,7 @@
         <w:pStyle w:val="Heading2"/>
         <w:rPr/>
       </w:pPr>
-      <w:bookmarkStart w:id="7" w:name="__RefHeading___Toc2198_2894726032"/>
+      <w:bookmarkStart w:id="7" w:name="__RefHeading___Toc2294_186613870"/>
       <w:bookmarkEnd w:id="7"/>
       <w:r>
         <w:rPr/>
@@ -6875,7 +6875,7 @@
         <w:pStyle w:val="Heading1"/>
         <w:rPr/>
       </w:pPr>
-      <w:bookmarkStart w:id="8" w:name="__RefHeading___Toc2200_2894726032"/>
+      <w:bookmarkStart w:id="8" w:name="__RefHeading___Toc2296_186613870"/>
       <w:bookmarkEnd w:id="8"/>
       <w:r>
         <w:rPr/>
@@ -7013,7 +7013,7 @@
         <w:pStyle w:val="Heading1"/>
         <w:rPr/>
       </w:pPr>
-      <w:bookmarkStart w:id="9" w:name="__RefHeading___Toc2202_2894726032"/>
+      <w:bookmarkStart w:id="9" w:name="__RefHeading___Toc2298_186613870"/>
       <w:bookmarkEnd w:id="9"/>
       <w:r>
         <w:rPr/>
@@ -7025,7 +7025,7 @@
         <w:pStyle w:val="TableCaption"/>
         <w:rPr/>
       </w:pPr>
-      <w:bookmarkStart w:id="10" w:name="__RefHeading___Toc2338_2894726032"/>
+      <w:bookmarkStart w:id="10" w:name="__RefHeading___Toc2434_186613870"/>
       <w:bookmarkEnd w:id="10"/>
       <w:r>
         <w:rPr>
@@ -7415,7 +7415,7 @@
         <w:pStyle w:val="Heading1"/>
         <w:rPr/>
       </w:pPr>
-      <w:bookmarkStart w:id="11" w:name="__RefHeading___Toc2204_2894726032"/>
+      <w:bookmarkStart w:id="11" w:name="__RefHeading___Toc2300_186613870"/>
       <w:bookmarkEnd w:id="11"/>
       <w:r>
         <w:rPr/>
@@ -7491,7 +7491,7 @@
         <w:pStyle w:val="FigureCaption"/>
         <w:rPr/>
       </w:pPr>
-      <w:bookmarkStart w:id="12" w:name="__RefHeading___Toc2272_2894726032"/>
+      <w:bookmarkStart w:id="12" w:name="__RefHeading___Toc2368_186613870"/>
       <w:bookmarkEnd w:id="12"/>
       <w:r>
         <w:rPr>
@@ -7506,7 +7506,7 @@
         <w:pStyle w:val="Heading2"/>
         <w:rPr/>
       </w:pPr>
-      <w:bookmarkStart w:id="13" w:name="__RefHeading___Toc2206_2894726032"/>
+      <w:bookmarkStart w:id="13" w:name="__RefHeading___Toc2302_186613870"/>
       <w:bookmarkEnd w:id="13"/>
       <w:r>
         <w:rPr/>
@@ -7518,7 +7518,7 @@
         <w:pStyle w:val="Heading3"/>
         <w:rPr/>
       </w:pPr>
-      <w:bookmarkStart w:id="14" w:name="__RefHeading___Toc2208_2894726032"/>
+      <w:bookmarkStart w:id="14" w:name="__RefHeading___Toc2304_186613870"/>
       <w:bookmarkEnd w:id="14"/>
       <w:r>
         <w:rPr/>
@@ -7545,7 +7545,7 @@
         <w:pStyle w:val="Heading3"/>
         <w:rPr/>
       </w:pPr>
-      <w:bookmarkStart w:id="15" w:name="__RefHeading___Toc2210_2894726032"/>
+      <w:bookmarkStart w:id="15" w:name="__RefHeading___Toc2306_186613870"/>
       <w:bookmarkEnd w:id="15"/>
       <w:r>
         <w:rPr/>
@@ -7572,7 +7572,7 @@
         <w:pStyle w:val="TableCaption"/>
         <w:rPr/>
       </w:pPr>
-      <w:bookmarkStart w:id="16" w:name="__RefHeading___Toc2336_2894726032"/>
+      <w:bookmarkStart w:id="16" w:name="__RefHeading___Toc2432_186613870"/>
       <w:bookmarkEnd w:id="16"/>
       <w:r>
         <w:rPr>
@@ -8603,7 +8603,7 @@
         <w:pStyle w:val="TableCaption"/>
         <w:rPr/>
       </w:pPr>
-      <w:bookmarkStart w:id="17" w:name="__RefHeading___Toc2334_2894726032"/>
+      <w:bookmarkStart w:id="17" w:name="__RefHeading___Toc2430_186613870"/>
       <w:bookmarkEnd w:id="17"/>
       <w:r>
         <w:rPr>
@@ -9468,7 +9468,7 @@
         <w:pStyle w:val="Heading3"/>
         <w:rPr/>
       </w:pPr>
-      <w:bookmarkStart w:id="18" w:name="__RefHeading___Toc2212_2894726032"/>
+      <w:bookmarkStart w:id="18" w:name="__RefHeading___Toc2308_186613870"/>
       <w:bookmarkEnd w:id="18"/>
       <w:r>
         <w:rPr/>
@@ -9495,7 +9495,7 @@
         <w:pStyle w:val="TableCaption"/>
         <w:rPr/>
       </w:pPr>
-      <w:bookmarkStart w:id="19" w:name="__RefHeading___Toc2332_2894726032"/>
+      <w:bookmarkStart w:id="19" w:name="__RefHeading___Toc2428_186613870"/>
       <w:bookmarkEnd w:id="19"/>
       <w:r>
         <w:rPr>
@@ -10209,7 +10209,7 @@
         <w:pStyle w:val="Heading3"/>
         <w:rPr/>
       </w:pPr>
-      <w:bookmarkStart w:id="20" w:name="__RefHeading___Toc2214_2894726032"/>
+      <w:bookmarkStart w:id="20" w:name="__RefHeading___Toc2310_186613870"/>
       <w:bookmarkEnd w:id="20"/>
       <w:r>
         <w:rPr/>
@@ -10267,7 +10267,7 @@
         <w:pStyle w:val="Heading2"/>
         <w:rPr/>
       </w:pPr>
-      <w:bookmarkStart w:id="21" w:name="__RefHeading___Toc2216_2894726032"/>
+      <w:bookmarkStart w:id="21" w:name="__RefHeading___Toc2312_186613870"/>
       <w:bookmarkEnd w:id="21"/>
       <w:r>
         <w:rPr/>
@@ -10279,7 +10279,7 @@
         <w:pStyle w:val="TableCaption"/>
         <w:rPr/>
       </w:pPr>
-      <w:bookmarkStart w:id="22" w:name="__RefHeading___Toc2330_2894726032"/>
+      <w:bookmarkStart w:id="22" w:name="__RefHeading___Toc2426_186613870"/>
       <w:bookmarkEnd w:id="22"/>
       <w:r>
         <w:rPr>
@@ -10891,7 +10891,7 @@
         <w:pStyle w:val="Heading2"/>
         <w:rPr/>
       </w:pPr>
-      <w:bookmarkStart w:id="23" w:name="__RefHeading___Toc2218_2894726032"/>
+      <w:bookmarkStart w:id="23" w:name="__RefHeading___Toc2314_186613870"/>
       <w:bookmarkEnd w:id="23"/>
       <w:r>
         <w:rPr/>
@@ -10918,7 +10918,7 @@
         <w:pStyle w:val="TableCaption"/>
         <w:rPr/>
       </w:pPr>
-      <w:bookmarkStart w:id="24" w:name="__RefHeading___Toc2328_2894726032"/>
+      <w:bookmarkStart w:id="24" w:name="__RefHeading___Toc2424_186613870"/>
       <w:bookmarkEnd w:id="24"/>
       <w:r>
         <w:rPr>
@@ -11533,7 +11533,7 @@
         <w:pStyle w:val="Heading1"/>
         <w:rPr/>
       </w:pPr>
-      <w:bookmarkStart w:id="25" w:name="__RefHeading___Toc2220_2894726032"/>
+      <w:bookmarkStart w:id="25" w:name="__RefHeading___Toc2316_186613870"/>
       <w:bookmarkEnd w:id="25"/>
       <w:r>
         <w:rPr/>
@@ -11560,7 +11560,7 @@
         <w:pStyle w:val="Heading2"/>
         <w:rPr/>
       </w:pPr>
-      <w:bookmarkStart w:id="26" w:name="__RefHeading___Toc2222_2894726032"/>
+      <w:bookmarkStart w:id="26" w:name="__RefHeading___Toc2318_186613870"/>
       <w:bookmarkEnd w:id="26"/>
       <w:r>
         <w:rPr/>
@@ -11587,7 +11587,7 @@
         <w:pStyle w:val="Heading2"/>
         <w:rPr/>
       </w:pPr>
-      <w:bookmarkStart w:id="27" w:name="__RefHeading___Toc2224_2894726032"/>
+      <w:bookmarkStart w:id="27" w:name="__RefHeading___Toc2320_186613870"/>
       <w:bookmarkEnd w:id="27"/>
       <w:r>
         <w:rPr/>
@@ -11630,7 +11630,7 @@
         <w:pStyle w:val="Heading2"/>
         <w:rPr/>
       </w:pPr>
-      <w:bookmarkStart w:id="28" w:name="__RefHeading___Toc2226_2894726032"/>
+      <w:bookmarkStart w:id="28" w:name="__RefHeading___Toc2322_186613870"/>
       <w:bookmarkEnd w:id="28"/>
       <w:r>
         <w:rPr/>
@@ -11649,7 +11649,7 @@
           <w:b w:val="false"/>
           <w:sz w:val="24"/>
         </w:rPr>
-        <w:t>Four explanations were tested, each with a signature that would appear if it were true. (H1) Information loss: fit-matched solutions differ along a null-space direction the operator ignores. (H2) Non-convexity: distinct minima at equal fit, separated by a barrier. (H3) Optimiser artefact: recovery keeps rising with budget. (H4) Unidentifiable gain: a rescaled x gives the same output. Inversions were started from eight initialisation distributions and compared only when within 2× of the best fit, so under-converged runs could not pose as alternative solutions; the analysis was replicated over four ground truths. For two fit-matched solutions with difference d, a null space predicts that moving along d changes f far less than a random direction of the same length at every scale; a barrier predicts the advantage shrinks and reverses. These tests use forward passes only and do not depend on the optimiser.</w:t>
+        <w:t>Four explanations were tested, each with a signature that would appear if it were true. (H1) Information loss: fit-matched solutions differ along a null-space direction the operator ignores. (H2) Non-convexity: distinct minima at equal fit, separated by a barrier. (H3) Optimiser artefact: recovery keeps rising with budget. (H4) Unidentifiable gain: a rescaled x gives the same output. Inversions were started from eight initialisation distributions and compared only when within 2× of the best fit, so under-converged runs could not pose as alternative solutions; the analysis was replicated over four ground truths. For two fit-matched solutions, a null space predicts that the prediction error stays flat along the straight line between them, while separate minima predict a rise in between; this test and the sensitivity probe use forward passes only and do not depend on the optimiser. Two further starts placed near the truth serve as a control for whether a deeper minimum exists.</w:t>
       </w:r>
     </w:p>
     <w:p>
@@ -11657,7 +11657,7 @@
         <w:pStyle w:val="Heading2"/>
         <w:rPr/>
       </w:pPr>
-      <w:bookmarkStart w:id="29" w:name="__RefHeading___Toc2228_2894726032"/>
+      <w:bookmarkStart w:id="29" w:name="__RefHeading___Toc2324_186613870"/>
       <w:bookmarkEnd w:id="29"/>
       <w:r>
         <w:rPr/>
@@ -11684,7 +11684,7 @@
         <w:pStyle w:val="Heading2"/>
         <w:rPr/>
       </w:pPr>
-      <w:bookmarkStart w:id="30" w:name="__RefHeading___Toc2230_2894726032"/>
+      <w:bookmarkStart w:id="30" w:name="__RefHeading___Toc2326_186613870"/>
       <w:bookmarkEnd w:id="30"/>
       <w:r>
         <w:rPr/>
@@ -11787,7 +11787,7 @@
         <w:pStyle w:val="Heading1"/>
         <w:rPr/>
       </w:pPr>
-      <w:bookmarkStart w:id="31" w:name="__RefHeading___Toc2232_2894726032"/>
+      <w:bookmarkStart w:id="31" w:name="__RefHeading___Toc2328_186613870"/>
       <w:bookmarkEnd w:id="31"/>
       <w:r>
         <w:rPr/>
@@ -11799,7 +11799,7 @@
         <w:pStyle w:val="TableCaption"/>
         <w:rPr/>
       </w:pPr>
-      <w:bookmarkStart w:id="32" w:name="__RefHeading___Toc2326_2894726032"/>
+      <w:bookmarkStart w:id="32" w:name="__RefHeading___Toc2422_186613870"/>
       <w:bookmarkEnd w:id="32"/>
       <w:r>
         <w:rPr>
@@ -12589,7 +12589,7 @@
         <w:pStyle w:val="Heading1"/>
         <w:rPr/>
       </w:pPr>
-      <w:bookmarkStart w:id="33" w:name="__RefHeading___Toc2234_2894726032"/>
+      <w:bookmarkStart w:id="33" w:name="__RefHeading___Toc2330_186613870"/>
       <w:bookmarkEnd w:id="33"/>
       <w:r>
         <w:rPr/>
@@ -12601,7 +12601,7 @@
         <w:pStyle w:val="TableCaption"/>
         <w:rPr/>
       </w:pPr>
-      <w:bookmarkStart w:id="34" w:name="__RefHeading___Toc2324_2894726032"/>
+      <w:bookmarkStart w:id="34" w:name="__RefHeading___Toc2420_186613870"/>
       <w:bookmarkEnd w:id="34"/>
       <w:r>
         <w:rPr>
@@ -13535,7 +13535,7 @@
         <w:pStyle w:val="Heading1"/>
         <w:rPr/>
       </w:pPr>
-      <w:bookmarkStart w:id="35" w:name="__RefHeading___Toc2236_2894726032"/>
+      <w:bookmarkStart w:id="35" w:name="__RefHeading___Toc2332_186613870"/>
       <w:bookmarkEnd w:id="35"/>
       <w:r>
         <w:rPr/>
@@ -13547,7 +13547,7 @@
         <w:pStyle w:val="Heading2"/>
         <w:rPr/>
       </w:pPr>
-      <w:bookmarkStart w:id="36" w:name="__RefHeading___Toc2238_2894726032"/>
+      <w:bookmarkStart w:id="36" w:name="__RefHeading___Toc2334_186613870"/>
       <w:bookmarkEnd w:id="36"/>
       <w:r>
         <w:rPr/>
@@ -13623,7 +13623,7 @@
         <w:pStyle w:val="FigureCaption"/>
         <w:rPr/>
       </w:pPr>
-      <w:bookmarkStart w:id="37" w:name="__RefHeading___Toc2302_2894726032"/>
+      <w:bookmarkStart w:id="37" w:name="__RefHeading___Toc2398_186613870"/>
       <w:bookmarkEnd w:id="37"/>
       <w:r>
         <w:rPr>
@@ -13638,7 +13638,7 @@
         <w:pStyle w:val="TableCaption"/>
         <w:rPr/>
       </w:pPr>
-      <w:bookmarkStart w:id="38" w:name="__RefHeading___Toc2322_2894726032"/>
+      <w:bookmarkStart w:id="38" w:name="__RefHeading___Toc2418_186613870"/>
       <w:bookmarkEnd w:id="38"/>
       <w:r>
         <w:rPr>
@@ -14410,7 +14410,7 @@
         <w:pStyle w:val="Heading2"/>
         <w:rPr/>
       </w:pPr>
-      <w:bookmarkStart w:id="39" w:name="__RefHeading___Toc2240_2894726032"/>
+      <w:bookmarkStart w:id="39" w:name="__RefHeading___Toc2336_186613870"/>
       <w:bookmarkEnd w:id="39"/>
       <w:r>
         <w:rPr/>
@@ -14486,7 +14486,7 @@
         <w:pStyle w:val="FigureCaption"/>
         <w:rPr/>
       </w:pPr>
-      <w:bookmarkStart w:id="40" w:name="__RefHeading___Toc2300_2894726032"/>
+      <w:bookmarkStart w:id="40" w:name="__RefHeading___Toc2396_186613870"/>
       <w:bookmarkEnd w:id="40"/>
       <w:r>
         <w:rPr>
@@ -14501,7 +14501,7 @@
         <w:pStyle w:val="TableCaption"/>
         <w:rPr/>
       </w:pPr>
-      <w:bookmarkStart w:id="41" w:name="__RefHeading___Toc2320_2894726032"/>
+      <w:bookmarkStart w:id="41" w:name="__RefHeading___Toc2416_186613870"/>
       <w:bookmarkEnd w:id="41"/>
       <w:r>
         <w:rPr>
@@ -15197,7 +15197,7 @@
         <w:pStyle w:val="Heading2"/>
         <w:rPr/>
       </w:pPr>
-      <w:bookmarkStart w:id="42" w:name="__RefHeading___Toc2242_2894726032"/>
+      <w:bookmarkStart w:id="42" w:name="__RefHeading___Toc2338_186613870"/>
       <w:bookmarkEnd w:id="42"/>
       <w:r>
         <w:rPr/>
@@ -15216,7 +15216,44 @@
           <w:b w:val="false"/>
           <w:sz w:val="24"/>
         </w:rPr>
-        <w:t>Moving a solution along the difference d to another fit-matched solution changed the prediction less than a random direction at small scales (2.6× less at 0.1 of the separation) but more at the full separation (0.6×; Figure 8.3, Table 8.3). A null space would keep d cheap at every scale, so the information-loss hypothesis is rejected: the solutions are distinct minima separated by a barrier. The advantage of d was also local, falling from 2.0× at its own trajectory to 1.0–1.1× at unrelated ground truths.</w:t>
+        <w:t>The straight line between two fit-matched solutions distinguishes the hypotheses. If the solutions lay in one flat valley (a null space), the prediction error would stay at the endpoints' level all along the line; if they are separate minima, the error rises in between. The test uses forward passes only. It was run on 19 October 2026 with notebooks/Verification_Tests.ipynb (14 000 steps, ground truth 0), comparing only the five starts that were blind to the truth and fit-matched (3.57–3.90 × 10⁻⁷, within 1.1× of each other; agreement mean 0.954, minimum 0.890).</w:t>
+      </w:r>
+    </w:p>
+    <w:p>
+      <w:pPr>
+        <w:pStyle w:val="Normal"/>
+        <w:spacing w:lineRule="auto" w:line="360" w:before="0" w:after="160"/>
+        <w:jc w:val="both"/>
+        <w:rPr/>
+      </w:pPr>
+      <w:r>
+        <w:rPr>
+          <w:b w:val="false"/>
+          <w:sz w:val="24"/>
+        </w:rPr>
+        <w:t>The error rose between every one of the ten pairs, to 1.5–6.0× the worse endpoint (median 3.8×), and the rise grew as the two solutions became less similar (Figure 8.3, Table 8.3). Two control starts placed near the truth reached a 4.6× lower error and higher recovery (0.951–0.976, against 0.894–0.918 for the blind starts), and the straight path from the best blind solution to the near-truth one rose 7.2× above the blind end. The blind solutions are therefore distinct local minima, separated by barriers from one another and from a deeper minimum near the truth: the inverse is non-convex, and the information-loss hypothesis is rejected.</w:t>
+      </w:r>
+    </w:p>
+    <w:p>
+      <w:pPr>
+        <w:pStyle w:val="Normal"/>
+        <w:spacing w:lineRule="auto" w:line="360" w:before="0" w:after="160"/>
+        <w:jc w:val="both"/>
+        <w:rPr/>
+      </w:pPr>
+      <w:r>
+        <w:rPr>
+          <w:b/>
+          <w:sz w:val="24"/>
+        </w:rPr>
+        <w:t>Correction.</w:t>
+      </w:r>
+      <w:r>
+        <w:rPr>
+          <w:b w:val="false"/>
+          <w:sz w:val="24"/>
+        </w:rPr>
+        <w:t xml:space="preserve"> An earlier version of this test chose the least similar pair among all eight starts and compared the change along d with random directions. That rule paired an under-converged solution (Gaussian s.d. 5, error 1.15 × 10⁻⁶, recovery 0.62), so its numbers (2.6× falling to 0.6×) are withdrawn. With a fit-matched pair, the change along d stays far below random directions at every scale (2.6×, 6.0×, 13×, 258× at 0.1, 0.25, 0.5 and 1.0 of the gap), as it must when both ends fit the target; that comparison cannot detect a barrier, which is why the straight-path error is reported instead. The selection rule in scripts/synthetic_characterisation.py has been corrected.</w:t>
       </w:r>
     </w:p>
     <w:p>
@@ -15231,7 +15268,7 @@
         <w:rPr/>
         <w:drawing>
           <wp:inline distT="0" distB="0" distL="0" distR="0">
-            <wp:extent cx="4389120" cy="2656205"/>
+            <wp:extent cx="5760720" cy="2038350"/>
             <wp:effectExtent l="0" t="0" r="0" b="0"/>
             <wp:docPr id="5" name="Picture 6" descr=""/>
             <wp:cNvGraphicFramePr>
@@ -15255,7 +15292,7 @@
                   <pic:spPr bwMode="auto">
                     <a:xfrm>
                       <a:off x="0" y="0"/>
-                      <a:ext cx="4389120" cy="2656205"/>
+                      <a:ext cx="5760720" cy="2038350"/>
                     </a:xfrm>
                     <a:prstGeom prst="rect">
                       <a:avLst/>
@@ -15273,14 +15310,14 @@
         <w:pStyle w:val="FigureCaption"/>
         <w:rPr/>
       </w:pPr>
-      <w:bookmarkStart w:id="43" w:name="__RefHeading___Toc2298_2894726032"/>
+      <w:bookmarkStart w:id="43" w:name="__RefHeading___Toc2394_186613870"/>
       <w:bookmarkEnd w:id="43"/>
       <w:r>
         <w:rPr>
           <w:b w:val="false"/>
           <w:sz w:val="20"/>
         </w:rPr>
-        <w:t>Figure 8.3: Prediction change along the solution difference d relative to random directions of equal length</w:t>
+        <w:t>Figure 8.3: Left: prediction error along the straight line between fit-matched blind solutions (blue, ten pairs) and from the best blind solution to the near-truth solution (orange). Right: final error and recovery for each of the eight starts</w:t>
       </w:r>
     </w:p>
     <w:p>
@@ -15288,19 +15325,19 @@
         <w:pStyle w:val="TableCaption"/>
         <w:rPr/>
       </w:pPr>
-      <w:bookmarkStart w:id="44" w:name="__RefHeading___Toc2318_2894726032"/>
+      <w:bookmarkStart w:id="44" w:name="__RefHeading___Toc2414_186613870"/>
       <w:bookmarkEnd w:id="44"/>
       <w:r>
         <w:rPr>
           <w:b w:val="false"/>
           <w:sz w:val="20"/>
         </w:rPr>
-        <w:t>Table 8.3: Prediction change along d against random directions</w:t>
+        <w:t>Table 8.3: Straight-path barrier between fit-matched blind solutions (ground truth 0, 14 000 steps)</w:t>
       </w:r>
     </w:p>
     <w:tbl>
       <w:tblPr>
-        <w:tblW w:w="8639" w:type="dxa"/>
+        <w:tblW w:w="9071" w:type="dxa"/>
         <w:jc w:val="center"/>
         <w:tblInd w:w="0" w:type="dxa"/>
         <w:tblLayout w:type="fixed"/>
@@ -15313,10 +15350,10 @@
         <w:tblLook w:val="04a0" w:noHBand="0" w:noVBand="1" w:firstColumn="1" w:lastRow="0" w:lastColumn="0" w:firstRow="1"/>
       </w:tblPr>
       <w:tblGrid>
-        <w:gridCol w:w="2735"/>
-        <w:gridCol w:w="2015"/>
-        <w:gridCol w:w="2304"/>
-        <w:gridCol w:w="1584"/>
+        <w:gridCol w:w="3310"/>
+        <w:gridCol w:w="1873"/>
+        <w:gridCol w:w="2159"/>
+        <w:gridCol w:w="1728"/>
       </w:tblGrid>
       <w:tr>
         <w:trPr>
@@ -15325,7 +15362,7 @@
         </w:trPr>
         <w:tc>
           <w:tcPr>
-            <w:tcW w:w="2735" w:type="dxa"/>
+            <w:tcW w:w="3310" w:type="dxa"/>
             <w:tcBorders>
               <w:top w:val="single" w:sz="4" w:space="0" w:color="000000"/>
               <w:left w:val="single" w:sz="4" w:space="0" w:color="000000"/>
@@ -15346,13 +15383,13 @@
                 <w:b/>
                 <w:sz w:val="20"/>
               </w:rPr>
-              <w:t>Scale (fraction of separation)</w:t>
-            </w:r>
-          </w:p>
-        </w:tc>
-        <w:tc>
-          <w:tcPr>
-            <w:tcW w:w="2015" w:type="dxa"/>
+              <w:t>Solution pair</w:t>
+            </w:r>
+          </w:p>
+        </w:tc>
+        <w:tc>
+          <w:tcPr>
+            <w:tcW w:w="1873" w:type="dxa"/>
             <w:tcBorders>
               <w:top w:val="single" w:sz="4" w:space="0" w:color="000000"/>
               <w:left w:val="single" w:sz="4" w:space="0" w:color="000000"/>
@@ -15373,13 +15410,13 @@
                 <w:b/>
                 <w:sz w:val="20"/>
               </w:rPr>
-              <w:t>MSE along d</w:t>
-            </w:r>
-          </w:p>
-        </w:tc>
-        <w:tc>
-          <w:tcPr>
-            <w:tcW w:w="2304" w:type="dxa"/>
+              <w:t>Agreement (cosine)</w:t>
+            </w:r>
+          </w:p>
+        </w:tc>
+        <w:tc>
+          <w:tcPr>
+            <w:tcW w:w="2159" w:type="dxa"/>
             <w:tcBorders>
               <w:top w:val="single" w:sz="4" w:space="0" w:color="000000"/>
               <w:left w:val="single" w:sz="4" w:space="0" w:color="000000"/>
@@ -15400,13 +15437,13 @@
                 <w:b/>
                 <w:sz w:val="20"/>
               </w:rPr>
-              <w:t>MSE random (median)</w:t>
-            </w:r>
-          </w:p>
-        </w:tc>
-        <w:tc>
-          <w:tcPr>
-            <w:tcW w:w="1584" w:type="dxa"/>
+              <w:t>Peak error on the path</w:t>
+            </w:r>
+          </w:p>
+        </w:tc>
+        <w:tc>
+          <w:tcPr>
+            <w:tcW w:w="1728" w:type="dxa"/>
             <w:tcBorders>
               <w:top w:val="single" w:sz="4" w:space="0" w:color="000000"/>
               <w:left w:val="single" w:sz="4" w:space="0" w:color="000000"/>
@@ -15427,7 +15464,7 @@
                 <w:b/>
                 <w:sz w:val="20"/>
               </w:rPr>
-              <w:t>Random / d</w:t>
+              <w:t>Peak / worse end</w:t>
             </w:r>
           </w:p>
         </w:tc>
@@ -15438,104 +15475,104 @@
         </w:trPr>
         <w:tc>
           <w:tcPr>
-            <w:tcW w:w="2735" w:type="dxa"/>
-            <w:tcBorders>
-              <w:top w:val="single" w:sz="4" w:space="0" w:color="000000"/>
-              <w:left w:val="single" w:sz="4" w:space="0" w:color="000000"/>
-              <w:bottom w:val="single" w:sz="4" w:space="0" w:color="000000"/>
-              <w:right w:val="single" w:sz="4" w:space="0" w:color="000000"/>
-            </w:tcBorders>
-          </w:tcPr>
-          <w:p>
-            <w:pPr>
-              <w:pStyle w:val="Normal"/>
-              <w:spacing w:lineRule="auto" w:line="240" w:before="20" w:after="20"/>
-              <w:rPr/>
-            </w:pPr>
-            <w:r>
-              <w:rPr>
-                <w:b w:val="false"/>
-                <w:sz w:val="20"/>
-              </w:rPr>
-              <w:t>0.10</w:t>
-            </w:r>
-          </w:p>
-        </w:tc>
-        <w:tc>
-          <w:tcPr>
-            <w:tcW w:w="2015" w:type="dxa"/>
-            <w:tcBorders>
-              <w:top w:val="single" w:sz="4" w:space="0" w:color="000000"/>
-              <w:left w:val="single" w:sz="4" w:space="0" w:color="000000"/>
-              <w:bottom w:val="single" w:sz="4" w:space="0" w:color="000000"/>
-              <w:right w:val="single" w:sz="4" w:space="0" w:color="000000"/>
-            </w:tcBorders>
-          </w:tcPr>
-          <w:p>
-            <w:pPr>
-              <w:pStyle w:val="Normal"/>
-              <w:spacing w:lineRule="auto" w:line="240" w:before="20" w:after="20"/>
-              <w:jc w:val="center"/>
-              <w:rPr/>
-            </w:pPr>
-            <w:r>
-              <w:rPr>
-                <w:b w:val="false"/>
-                <w:sz w:val="20"/>
-              </w:rPr>
-              <w:t>9.31 × 10⁻⁷</w:t>
-            </w:r>
-          </w:p>
-        </w:tc>
-        <w:tc>
-          <w:tcPr>
-            <w:tcW w:w="2304" w:type="dxa"/>
-            <w:tcBorders>
-              <w:top w:val="single" w:sz="4" w:space="0" w:color="000000"/>
-              <w:left w:val="single" w:sz="4" w:space="0" w:color="000000"/>
-              <w:bottom w:val="single" w:sz="4" w:space="0" w:color="000000"/>
-              <w:right w:val="single" w:sz="4" w:space="0" w:color="000000"/>
-            </w:tcBorders>
-          </w:tcPr>
-          <w:p>
-            <w:pPr>
-              <w:pStyle w:val="Normal"/>
-              <w:spacing w:lineRule="auto" w:line="240" w:before="20" w:after="20"/>
-              <w:jc w:val="center"/>
-              <w:rPr/>
-            </w:pPr>
-            <w:r>
-              <w:rPr>
-                <w:b w:val="false"/>
-                <w:sz w:val="20"/>
-              </w:rPr>
-              <w:t>2.39 × 10⁻⁶</w:t>
-            </w:r>
-          </w:p>
-        </w:tc>
-        <w:tc>
-          <w:tcPr>
-            <w:tcW w:w="1584" w:type="dxa"/>
-            <w:tcBorders>
-              <w:top w:val="single" w:sz="4" w:space="0" w:color="000000"/>
-              <w:left w:val="single" w:sz="4" w:space="0" w:color="000000"/>
-              <w:bottom w:val="single" w:sz="4" w:space="0" w:color="000000"/>
-              <w:right w:val="single" w:sz="4" w:space="0" w:color="000000"/>
-            </w:tcBorders>
-          </w:tcPr>
-          <w:p>
-            <w:pPr>
-              <w:pStyle w:val="Normal"/>
-              <w:spacing w:lineRule="auto" w:line="240" w:before="20" w:after="20"/>
-              <w:jc w:val="center"/>
-              <w:rPr/>
-            </w:pPr>
-            <w:r>
-              <w:rPr>
-                <w:b w:val="false"/>
-                <w:sz w:val="20"/>
-              </w:rPr>
-              <w:t>2.6×</w:t>
+            <w:tcW w:w="3310" w:type="dxa"/>
+            <w:tcBorders>
+              <w:top w:val="single" w:sz="4" w:space="0" w:color="000000"/>
+              <w:left w:val="single" w:sz="4" w:space="0" w:color="000000"/>
+              <w:bottom w:val="single" w:sz="4" w:space="0" w:color="000000"/>
+              <w:right w:val="single" w:sz="4" w:space="0" w:color="000000"/>
+            </w:tcBorders>
+          </w:tcPr>
+          <w:p>
+            <w:pPr>
+              <w:pStyle w:val="Normal"/>
+              <w:spacing w:lineRule="auto" w:line="240" w:before="20" w:after="20"/>
+              <w:rPr/>
+            </w:pPr>
+            <w:r>
+              <w:rPr>
+                <w:b w:val="false"/>
+                <w:sz w:val="20"/>
+              </w:rPr>
+              <w:t>Gaussian 1.0 – zeros</w:t>
+            </w:r>
+          </w:p>
+        </w:tc>
+        <w:tc>
+          <w:tcPr>
+            <w:tcW w:w="1873" w:type="dxa"/>
+            <w:tcBorders>
+              <w:top w:val="single" w:sz="4" w:space="0" w:color="000000"/>
+              <w:left w:val="single" w:sz="4" w:space="0" w:color="000000"/>
+              <w:bottom w:val="single" w:sz="4" w:space="0" w:color="000000"/>
+              <w:right w:val="single" w:sz="4" w:space="0" w:color="000000"/>
+            </w:tcBorders>
+          </w:tcPr>
+          <w:p>
+            <w:pPr>
+              <w:pStyle w:val="Normal"/>
+              <w:spacing w:lineRule="auto" w:line="240" w:before="20" w:after="20"/>
+              <w:jc w:val="center"/>
+              <w:rPr/>
+            </w:pPr>
+            <w:r>
+              <w:rPr>
+                <w:b w:val="false"/>
+                <w:sz w:val="20"/>
+              </w:rPr>
+              <w:t>0.927</w:t>
+            </w:r>
+          </w:p>
+        </w:tc>
+        <w:tc>
+          <w:tcPr>
+            <w:tcW w:w="2159" w:type="dxa"/>
+            <w:tcBorders>
+              <w:top w:val="single" w:sz="4" w:space="0" w:color="000000"/>
+              <w:left w:val="single" w:sz="4" w:space="0" w:color="000000"/>
+              <w:bottom w:val="single" w:sz="4" w:space="0" w:color="000000"/>
+              <w:right w:val="single" w:sz="4" w:space="0" w:color="000000"/>
+            </w:tcBorders>
+          </w:tcPr>
+          <w:p>
+            <w:pPr>
+              <w:pStyle w:val="Normal"/>
+              <w:spacing w:lineRule="auto" w:line="240" w:before="20" w:after="20"/>
+              <w:jc w:val="center"/>
+              <w:rPr/>
+            </w:pPr>
+            <w:r>
+              <w:rPr>
+                <w:b w:val="false"/>
+                <w:sz w:val="20"/>
+              </w:rPr>
+              <w:t>2.36 × 10⁻⁶</w:t>
+            </w:r>
+          </w:p>
+        </w:tc>
+        <w:tc>
+          <w:tcPr>
+            <w:tcW w:w="1728" w:type="dxa"/>
+            <w:tcBorders>
+              <w:top w:val="single" w:sz="4" w:space="0" w:color="000000"/>
+              <w:left w:val="single" w:sz="4" w:space="0" w:color="000000"/>
+              <w:bottom w:val="single" w:sz="4" w:space="0" w:color="000000"/>
+              <w:right w:val="single" w:sz="4" w:space="0" w:color="000000"/>
+            </w:tcBorders>
+          </w:tcPr>
+          <w:p>
+            <w:pPr>
+              <w:pStyle w:val="Normal"/>
+              <w:spacing w:lineRule="auto" w:line="240" w:before="20" w:after="20"/>
+              <w:jc w:val="center"/>
+              <w:rPr/>
+            </w:pPr>
+            <w:r>
+              <w:rPr>
+                <w:b w:val="false"/>
+                <w:sz w:val="20"/>
+              </w:rPr>
+              <w:t>6.0×</w:t>
             </w:r>
           </w:p>
         </w:tc>
@@ -15546,104 +15583,104 @@
         </w:trPr>
         <w:tc>
           <w:tcPr>
-            <w:tcW w:w="2735" w:type="dxa"/>
-            <w:tcBorders>
-              <w:top w:val="single" w:sz="4" w:space="0" w:color="000000"/>
-              <w:left w:val="single" w:sz="4" w:space="0" w:color="000000"/>
-              <w:bottom w:val="single" w:sz="4" w:space="0" w:color="000000"/>
-              <w:right w:val="single" w:sz="4" w:space="0" w:color="000000"/>
-            </w:tcBorders>
-          </w:tcPr>
-          <w:p>
-            <w:pPr>
-              <w:pStyle w:val="Normal"/>
-              <w:spacing w:lineRule="auto" w:line="240" w:before="20" w:after="20"/>
-              <w:rPr/>
-            </w:pPr>
-            <w:r>
-              <w:rPr>
-                <w:b w:val="false"/>
-                <w:sz w:val="20"/>
-              </w:rPr>
-              <w:t>0.25</w:t>
-            </w:r>
-          </w:p>
-        </w:tc>
-        <w:tc>
-          <w:tcPr>
-            <w:tcW w:w="2015" w:type="dxa"/>
-            <w:tcBorders>
-              <w:top w:val="single" w:sz="4" w:space="0" w:color="000000"/>
-              <w:left w:val="single" w:sz="4" w:space="0" w:color="000000"/>
-              <w:bottom w:val="single" w:sz="4" w:space="0" w:color="000000"/>
-              <w:right w:val="single" w:sz="4" w:space="0" w:color="000000"/>
-            </w:tcBorders>
-          </w:tcPr>
-          <w:p>
-            <w:pPr>
-              <w:pStyle w:val="Normal"/>
-              <w:spacing w:lineRule="auto" w:line="240" w:before="20" w:after="20"/>
-              <w:jc w:val="center"/>
-              <w:rPr/>
-            </w:pPr>
-            <w:r>
-              <w:rPr>
-                <w:b w:val="false"/>
-                <w:sz w:val="20"/>
-              </w:rPr>
-              <w:t>7.75 × 10⁻⁶</w:t>
-            </w:r>
-          </w:p>
-        </w:tc>
-        <w:tc>
-          <w:tcPr>
-            <w:tcW w:w="2304" w:type="dxa"/>
-            <w:tcBorders>
-              <w:top w:val="single" w:sz="4" w:space="0" w:color="000000"/>
-              <w:left w:val="single" w:sz="4" w:space="0" w:color="000000"/>
-              <w:bottom w:val="single" w:sz="4" w:space="0" w:color="000000"/>
-              <w:right w:val="single" w:sz="4" w:space="0" w:color="000000"/>
-            </w:tcBorders>
-          </w:tcPr>
-          <w:p>
-            <w:pPr>
-              <w:pStyle w:val="Normal"/>
-              <w:spacing w:lineRule="auto" w:line="240" w:before="20" w:after="20"/>
-              <w:jc w:val="center"/>
-              <w:rPr/>
-            </w:pPr>
-            <w:r>
-              <w:rPr>
-                <w:b w:val="false"/>
-                <w:sz w:val="20"/>
-              </w:rPr>
-              <w:t>1.52 × 10⁻⁵</w:t>
-            </w:r>
-          </w:p>
-        </w:tc>
-        <w:tc>
-          <w:tcPr>
-            <w:tcW w:w="1584" w:type="dxa"/>
-            <w:tcBorders>
-              <w:top w:val="single" w:sz="4" w:space="0" w:color="000000"/>
-              <w:left w:val="single" w:sz="4" w:space="0" w:color="000000"/>
-              <w:bottom w:val="single" w:sz="4" w:space="0" w:color="000000"/>
-              <w:right w:val="single" w:sz="4" w:space="0" w:color="000000"/>
-            </w:tcBorders>
-          </w:tcPr>
-          <w:p>
-            <w:pPr>
-              <w:pStyle w:val="Normal"/>
-              <w:spacing w:lineRule="auto" w:line="240" w:before="20" w:after="20"/>
-              <w:jc w:val="center"/>
-              <w:rPr/>
-            </w:pPr>
-            <w:r>
-              <w:rPr>
-                <w:b w:val="false"/>
-                <w:sz w:val="20"/>
-              </w:rPr>
-              <w:t>2.0×</w:t>
+            <w:tcW w:w="3310" w:type="dxa"/>
+            <w:tcBorders>
+              <w:top w:val="single" w:sz="4" w:space="0" w:color="000000"/>
+              <w:left w:val="single" w:sz="4" w:space="0" w:color="000000"/>
+              <w:bottom w:val="single" w:sz="4" w:space="0" w:color="000000"/>
+              <w:right w:val="single" w:sz="4" w:space="0" w:color="000000"/>
+            </w:tcBorders>
+          </w:tcPr>
+          <w:p>
+            <w:pPr>
+              <w:pStyle w:val="Normal"/>
+              <w:spacing w:lineRule="auto" w:line="240" w:before="20" w:after="20"/>
+              <w:rPr/>
+            </w:pPr>
+            <w:r>
+              <w:rPr>
+                <w:b w:val="false"/>
+                <w:sz w:val="20"/>
+              </w:rPr>
+              <w:t>Gaussian 1.0 – uniform</w:t>
+            </w:r>
+          </w:p>
+        </w:tc>
+        <w:tc>
+          <w:tcPr>
+            <w:tcW w:w="1873" w:type="dxa"/>
+            <w:tcBorders>
+              <w:top w:val="single" w:sz="4" w:space="0" w:color="000000"/>
+              <w:left w:val="single" w:sz="4" w:space="0" w:color="000000"/>
+              <w:bottom w:val="single" w:sz="4" w:space="0" w:color="000000"/>
+              <w:right w:val="single" w:sz="4" w:space="0" w:color="000000"/>
+            </w:tcBorders>
+          </w:tcPr>
+          <w:p>
+            <w:pPr>
+              <w:pStyle w:val="Normal"/>
+              <w:spacing w:lineRule="auto" w:line="240" w:before="20" w:after="20"/>
+              <w:jc w:val="center"/>
+              <w:rPr/>
+            </w:pPr>
+            <w:r>
+              <w:rPr>
+                <w:b w:val="false"/>
+                <w:sz w:val="20"/>
+              </w:rPr>
+              <w:t>0.890</w:t>
+            </w:r>
+          </w:p>
+        </w:tc>
+        <w:tc>
+          <w:tcPr>
+            <w:tcW w:w="2159" w:type="dxa"/>
+            <w:tcBorders>
+              <w:top w:val="single" w:sz="4" w:space="0" w:color="000000"/>
+              <w:left w:val="single" w:sz="4" w:space="0" w:color="000000"/>
+              <w:bottom w:val="single" w:sz="4" w:space="0" w:color="000000"/>
+              <w:right w:val="single" w:sz="4" w:space="0" w:color="000000"/>
+            </w:tcBorders>
+          </w:tcPr>
+          <w:p>
+            <w:pPr>
+              <w:pStyle w:val="Normal"/>
+              <w:spacing w:lineRule="auto" w:line="240" w:before="20" w:after="20"/>
+              <w:jc w:val="center"/>
+              <w:rPr/>
+            </w:pPr>
+            <w:r>
+              <w:rPr>
+                <w:b w:val="false"/>
+                <w:sz w:val="20"/>
+              </w:rPr>
+              <w:t>1.79 × 10⁻⁶</w:t>
+            </w:r>
+          </w:p>
+        </w:tc>
+        <w:tc>
+          <w:tcPr>
+            <w:tcW w:w="1728" w:type="dxa"/>
+            <w:tcBorders>
+              <w:top w:val="single" w:sz="4" w:space="0" w:color="000000"/>
+              <w:left w:val="single" w:sz="4" w:space="0" w:color="000000"/>
+              <w:bottom w:val="single" w:sz="4" w:space="0" w:color="000000"/>
+              <w:right w:val="single" w:sz="4" w:space="0" w:color="000000"/>
+            </w:tcBorders>
+          </w:tcPr>
+          <w:p>
+            <w:pPr>
+              <w:pStyle w:val="Normal"/>
+              <w:spacing w:lineRule="auto" w:line="240" w:before="20" w:after="20"/>
+              <w:jc w:val="center"/>
+              <w:rPr/>
+            </w:pPr>
+            <w:r>
+              <w:rPr>
+                <w:b w:val="false"/>
+                <w:sz w:val="20"/>
+              </w:rPr>
+              <w:t>4.6×</w:t>
             </w:r>
           </w:p>
         </w:tc>
@@ -15654,104 +15691,104 @@
         </w:trPr>
         <w:tc>
           <w:tcPr>
-            <w:tcW w:w="2735" w:type="dxa"/>
-            <w:tcBorders>
-              <w:top w:val="single" w:sz="4" w:space="0" w:color="000000"/>
-              <w:left w:val="single" w:sz="4" w:space="0" w:color="000000"/>
-              <w:bottom w:val="single" w:sz="4" w:space="0" w:color="000000"/>
-              <w:right w:val="single" w:sz="4" w:space="0" w:color="000000"/>
-            </w:tcBorders>
-          </w:tcPr>
-          <w:p>
-            <w:pPr>
-              <w:pStyle w:val="Normal"/>
-              <w:spacing w:lineRule="auto" w:line="240" w:before="20" w:after="20"/>
-              <w:rPr/>
-            </w:pPr>
-            <w:r>
-              <w:rPr>
-                <w:b w:val="false"/>
-                <w:sz w:val="20"/>
-              </w:rPr>
-              <w:t>0.50</w:t>
-            </w:r>
-          </w:p>
-        </w:tc>
-        <w:tc>
-          <w:tcPr>
-            <w:tcW w:w="2015" w:type="dxa"/>
-            <w:tcBorders>
-              <w:top w:val="single" w:sz="4" w:space="0" w:color="000000"/>
-              <w:left w:val="single" w:sz="4" w:space="0" w:color="000000"/>
-              <w:bottom w:val="single" w:sz="4" w:space="0" w:color="000000"/>
-              <w:right w:val="single" w:sz="4" w:space="0" w:color="000000"/>
-            </w:tcBorders>
-          </w:tcPr>
-          <w:p>
-            <w:pPr>
-              <w:pStyle w:val="Normal"/>
-              <w:spacing w:lineRule="auto" w:line="240" w:before="20" w:after="20"/>
-              <w:jc w:val="center"/>
-              <w:rPr/>
-            </w:pPr>
-            <w:r>
-              <w:rPr>
-                <w:b w:val="false"/>
-                <w:sz w:val="20"/>
-              </w:rPr>
-              <w:t>4.52 × 10⁻⁵</w:t>
-            </w:r>
-          </w:p>
-        </w:tc>
-        <w:tc>
-          <w:tcPr>
-            <w:tcW w:w="2304" w:type="dxa"/>
-            <w:tcBorders>
-              <w:top w:val="single" w:sz="4" w:space="0" w:color="000000"/>
-              <w:left w:val="single" w:sz="4" w:space="0" w:color="000000"/>
-              <w:bottom w:val="single" w:sz="4" w:space="0" w:color="000000"/>
-              <w:right w:val="single" w:sz="4" w:space="0" w:color="000000"/>
-            </w:tcBorders>
-          </w:tcPr>
-          <w:p>
-            <w:pPr>
-              <w:pStyle w:val="Normal"/>
-              <w:spacing w:lineRule="auto" w:line="240" w:before="20" w:after="20"/>
-              <w:jc w:val="center"/>
-              <w:rPr/>
-            </w:pPr>
-            <w:r>
-              <w:rPr>
-                <w:b w:val="false"/>
-                <w:sz w:val="20"/>
-              </w:rPr>
-              <w:t>6.19 × 10⁻⁵</w:t>
-            </w:r>
-          </w:p>
-        </w:tc>
-        <w:tc>
-          <w:tcPr>
-            <w:tcW w:w="1584" w:type="dxa"/>
-            <w:tcBorders>
-              <w:top w:val="single" w:sz="4" w:space="0" w:color="000000"/>
-              <w:left w:val="single" w:sz="4" w:space="0" w:color="000000"/>
-              <w:bottom w:val="single" w:sz="4" w:space="0" w:color="000000"/>
-              <w:right w:val="single" w:sz="4" w:space="0" w:color="000000"/>
-            </w:tcBorders>
-          </w:tcPr>
-          <w:p>
-            <w:pPr>
-              <w:pStyle w:val="Normal"/>
-              <w:spacing w:lineRule="auto" w:line="240" w:before="20" w:after="20"/>
-              <w:jc w:val="center"/>
-              <w:rPr/>
-            </w:pPr>
-            <w:r>
-              <w:rPr>
-                <w:b w:val="false"/>
-                <w:sz w:val="20"/>
-              </w:rPr>
-              <w:t>1.4×</w:t>
+            <w:tcW w:w="3310" w:type="dxa"/>
+            <w:tcBorders>
+              <w:top w:val="single" w:sz="4" w:space="0" w:color="000000"/>
+              <w:left w:val="single" w:sz="4" w:space="0" w:color="000000"/>
+              <w:bottom w:val="single" w:sz="4" w:space="0" w:color="000000"/>
+              <w:right w:val="single" w:sz="4" w:space="0" w:color="000000"/>
+            </w:tcBorders>
+          </w:tcPr>
+          <w:p>
+            <w:pPr>
+              <w:pStyle w:val="Normal"/>
+              <w:spacing w:lineRule="auto" w:line="240" w:before="20" w:after="20"/>
+              <w:rPr/>
+            </w:pPr>
+            <w:r>
+              <w:rPr>
+                <w:b w:val="false"/>
+                <w:sz w:val="20"/>
+              </w:rPr>
+              <w:t>Gaussian 0.01 – Gaussian 1.0</w:t>
+            </w:r>
+          </w:p>
+        </w:tc>
+        <w:tc>
+          <w:tcPr>
+            <w:tcW w:w="1873" w:type="dxa"/>
+            <w:tcBorders>
+              <w:top w:val="single" w:sz="4" w:space="0" w:color="000000"/>
+              <w:left w:val="single" w:sz="4" w:space="0" w:color="000000"/>
+              <w:bottom w:val="single" w:sz="4" w:space="0" w:color="000000"/>
+              <w:right w:val="single" w:sz="4" w:space="0" w:color="000000"/>
+            </w:tcBorders>
+          </w:tcPr>
+          <w:p>
+            <w:pPr>
+              <w:pStyle w:val="Normal"/>
+              <w:spacing w:lineRule="auto" w:line="240" w:before="20" w:after="20"/>
+              <w:jc w:val="center"/>
+              <w:rPr/>
+            </w:pPr>
+            <w:r>
+              <w:rPr>
+                <w:b w:val="false"/>
+                <w:sz w:val="20"/>
+              </w:rPr>
+              <w:t>0.927</w:t>
+            </w:r>
+          </w:p>
+        </w:tc>
+        <w:tc>
+          <w:tcPr>
+            <w:tcW w:w="2159" w:type="dxa"/>
+            <w:tcBorders>
+              <w:top w:val="single" w:sz="4" w:space="0" w:color="000000"/>
+              <w:left w:val="single" w:sz="4" w:space="0" w:color="000000"/>
+              <w:bottom w:val="single" w:sz="4" w:space="0" w:color="000000"/>
+              <w:right w:val="single" w:sz="4" w:space="0" w:color="000000"/>
+            </w:tcBorders>
+          </w:tcPr>
+          <w:p>
+            <w:pPr>
+              <w:pStyle w:val="Normal"/>
+              <w:spacing w:lineRule="auto" w:line="240" w:before="20" w:after="20"/>
+              <w:jc w:val="center"/>
+              <w:rPr/>
+            </w:pPr>
+            <w:r>
+              <w:rPr>
+                <w:b w:val="false"/>
+                <w:sz w:val="20"/>
+              </w:rPr>
+              <w:t>1.71 × 10⁻⁶</w:t>
+            </w:r>
+          </w:p>
+        </w:tc>
+        <w:tc>
+          <w:tcPr>
+            <w:tcW w:w="1728" w:type="dxa"/>
+            <w:tcBorders>
+              <w:top w:val="single" w:sz="4" w:space="0" w:color="000000"/>
+              <w:left w:val="single" w:sz="4" w:space="0" w:color="000000"/>
+              <w:bottom w:val="single" w:sz="4" w:space="0" w:color="000000"/>
+              <w:right w:val="single" w:sz="4" w:space="0" w:color="000000"/>
+            </w:tcBorders>
+          </w:tcPr>
+          <w:p>
+            <w:pPr>
+              <w:pStyle w:val="Normal"/>
+              <w:spacing w:lineRule="auto" w:line="240" w:before="20" w:after="20"/>
+              <w:jc w:val="center"/>
+              <w:rPr/>
+            </w:pPr>
+            <w:r>
+              <w:rPr>
+                <w:b w:val="false"/>
+                <w:sz w:val="20"/>
+              </w:rPr>
+              <w:t>4.4×</w:t>
             </w:r>
           </w:p>
         </w:tc>
@@ -15762,104 +15799,860 @@
         </w:trPr>
         <w:tc>
           <w:tcPr>
-            <w:tcW w:w="2735" w:type="dxa"/>
-            <w:tcBorders>
-              <w:top w:val="single" w:sz="4" w:space="0" w:color="000000"/>
-              <w:left w:val="single" w:sz="4" w:space="0" w:color="000000"/>
-              <w:bottom w:val="single" w:sz="4" w:space="0" w:color="000000"/>
-              <w:right w:val="single" w:sz="4" w:space="0" w:color="000000"/>
-            </w:tcBorders>
-          </w:tcPr>
-          <w:p>
-            <w:pPr>
-              <w:pStyle w:val="Normal"/>
-              <w:spacing w:lineRule="auto" w:line="240" w:before="20" w:after="20"/>
-              <w:rPr/>
-            </w:pPr>
-            <w:r>
-              <w:rPr>
-                <w:b w:val="false"/>
-                <w:sz w:val="20"/>
-              </w:rPr>
-              <w:t>1.00</w:t>
-            </w:r>
-          </w:p>
-        </w:tc>
-        <w:tc>
-          <w:tcPr>
-            <w:tcW w:w="2015" w:type="dxa"/>
-            <w:tcBorders>
-              <w:top w:val="single" w:sz="4" w:space="0" w:color="000000"/>
-              <w:left w:val="single" w:sz="4" w:space="0" w:color="000000"/>
-              <w:bottom w:val="single" w:sz="4" w:space="0" w:color="000000"/>
-              <w:right w:val="single" w:sz="4" w:space="0" w:color="000000"/>
-            </w:tcBorders>
-          </w:tcPr>
-          <w:p>
-            <w:pPr>
-              <w:pStyle w:val="Normal"/>
-              <w:spacing w:lineRule="auto" w:line="240" w:before="20" w:after="20"/>
-              <w:jc w:val="center"/>
-              <w:rPr/>
-            </w:pPr>
-            <w:r>
-              <w:rPr>
-                <w:b w:val="false"/>
-                <w:sz w:val="20"/>
-              </w:rPr>
-              <w:t>3.91 × 10⁻⁴</w:t>
-            </w:r>
-          </w:p>
-        </w:tc>
-        <w:tc>
-          <w:tcPr>
-            <w:tcW w:w="2304" w:type="dxa"/>
-            <w:tcBorders>
-              <w:top w:val="single" w:sz="4" w:space="0" w:color="000000"/>
-              <w:left w:val="single" w:sz="4" w:space="0" w:color="000000"/>
-              <w:bottom w:val="single" w:sz="4" w:space="0" w:color="000000"/>
-              <w:right w:val="single" w:sz="4" w:space="0" w:color="000000"/>
-            </w:tcBorders>
-          </w:tcPr>
-          <w:p>
-            <w:pPr>
-              <w:pStyle w:val="Normal"/>
-              <w:spacing w:lineRule="auto" w:line="240" w:before="20" w:after="20"/>
-              <w:jc w:val="center"/>
-              <w:rPr/>
-            </w:pPr>
-            <w:r>
-              <w:rPr>
-                <w:b w:val="false"/>
-                <w:sz w:val="20"/>
-              </w:rPr>
-              <w:t>2.20 × 10⁻⁴</w:t>
-            </w:r>
-          </w:p>
-        </w:tc>
-        <w:tc>
-          <w:tcPr>
-            <w:tcW w:w="1584" w:type="dxa"/>
-            <w:tcBorders>
-              <w:top w:val="single" w:sz="4" w:space="0" w:color="000000"/>
-              <w:left w:val="single" w:sz="4" w:space="0" w:color="000000"/>
-              <w:bottom w:val="single" w:sz="4" w:space="0" w:color="000000"/>
-              <w:right w:val="single" w:sz="4" w:space="0" w:color="000000"/>
-            </w:tcBorders>
-          </w:tcPr>
-          <w:p>
-            <w:pPr>
-              <w:pStyle w:val="Normal"/>
-              <w:spacing w:lineRule="auto" w:line="240" w:before="20" w:after="20"/>
-              <w:jc w:val="center"/>
-              <w:rPr/>
-            </w:pPr>
-            <w:r>
-              <w:rPr>
-                <w:b w:val="false"/>
-                <w:sz w:val="20"/>
-              </w:rPr>
-              <w:t>0.6×</w:t>
+            <w:tcW w:w="3310" w:type="dxa"/>
+            <w:tcBorders>
+              <w:top w:val="single" w:sz="4" w:space="0" w:color="000000"/>
+              <w:left w:val="single" w:sz="4" w:space="0" w:color="000000"/>
+              <w:bottom w:val="single" w:sz="4" w:space="0" w:color="000000"/>
+              <w:right w:val="single" w:sz="4" w:space="0" w:color="000000"/>
+            </w:tcBorders>
+          </w:tcPr>
+          <w:p>
+            <w:pPr>
+              <w:pStyle w:val="Normal"/>
+              <w:spacing w:lineRule="auto" w:line="240" w:before="20" w:after="20"/>
+              <w:rPr/>
+            </w:pPr>
+            <w:r>
+              <w:rPr>
+                <w:b w:val="false"/>
+                <w:sz w:val="20"/>
+              </w:rPr>
+              <w:t>uniform – zeros</w:t>
+            </w:r>
+          </w:p>
+        </w:tc>
+        <w:tc>
+          <w:tcPr>
+            <w:tcW w:w="1873" w:type="dxa"/>
+            <w:tcBorders>
+              <w:top w:val="single" w:sz="4" w:space="0" w:color="000000"/>
+              <w:left w:val="single" w:sz="4" w:space="0" w:color="000000"/>
+              <w:bottom w:val="single" w:sz="4" w:space="0" w:color="000000"/>
+              <w:right w:val="single" w:sz="4" w:space="0" w:color="000000"/>
+            </w:tcBorders>
+          </w:tcPr>
+          <w:p>
+            <w:pPr>
+              <w:pStyle w:val="Normal"/>
+              <w:spacing w:lineRule="auto" w:line="240" w:before="20" w:after="20"/>
+              <w:jc w:val="center"/>
+              <w:rPr/>
+            </w:pPr>
+            <w:r>
+              <w:rPr>
+                <w:b w:val="false"/>
+                <w:sz w:val="20"/>
+              </w:rPr>
+              <w:t>0.958</w:t>
+            </w:r>
+          </w:p>
+        </w:tc>
+        <w:tc>
+          <w:tcPr>
+            <w:tcW w:w="2159" w:type="dxa"/>
+            <w:tcBorders>
+              <w:top w:val="single" w:sz="4" w:space="0" w:color="000000"/>
+              <w:left w:val="single" w:sz="4" w:space="0" w:color="000000"/>
+              <w:bottom w:val="single" w:sz="4" w:space="0" w:color="000000"/>
+              <w:right w:val="single" w:sz="4" w:space="0" w:color="000000"/>
+            </w:tcBorders>
+          </w:tcPr>
+          <w:p>
+            <w:pPr>
+              <w:pStyle w:val="Normal"/>
+              <w:spacing w:lineRule="auto" w:line="240" w:before="20" w:after="20"/>
+              <w:jc w:val="center"/>
+              <w:rPr/>
+            </w:pPr>
+            <w:r>
+              <w:rPr>
+                <w:b w:val="false"/>
+                <w:sz w:val="20"/>
+              </w:rPr>
+              <w:t>1.50 × 10⁻⁶</w:t>
+            </w:r>
+          </w:p>
+        </w:tc>
+        <w:tc>
+          <w:tcPr>
+            <w:tcW w:w="1728" w:type="dxa"/>
+            <w:tcBorders>
+              <w:top w:val="single" w:sz="4" w:space="0" w:color="000000"/>
+              <w:left w:val="single" w:sz="4" w:space="0" w:color="000000"/>
+              <w:bottom w:val="single" w:sz="4" w:space="0" w:color="000000"/>
+              <w:right w:val="single" w:sz="4" w:space="0" w:color="000000"/>
+            </w:tcBorders>
+          </w:tcPr>
+          <w:p>
+            <w:pPr>
+              <w:pStyle w:val="Normal"/>
+              <w:spacing w:lineRule="auto" w:line="240" w:before="20" w:after="20"/>
+              <w:jc w:val="center"/>
+              <w:rPr/>
+            </w:pPr>
+            <w:r>
+              <w:rPr>
+                <w:b w:val="false"/>
+                <w:sz w:val="20"/>
+              </w:rPr>
+              <w:t>4.1×</w:t>
+            </w:r>
+          </w:p>
+        </w:tc>
+      </w:tr>
+      <w:tr>
+        <w:trPr>
+          <w:cantSplit w:val="true"/>
+        </w:trPr>
+        <w:tc>
+          <w:tcPr>
+            <w:tcW w:w="3310" w:type="dxa"/>
+            <w:tcBorders>
+              <w:top w:val="single" w:sz="4" w:space="0" w:color="000000"/>
+              <w:left w:val="single" w:sz="4" w:space="0" w:color="000000"/>
+              <w:bottom w:val="single" w:sz="4" w:space="0" w:color="000000"/>
+              <w:right w:val="single" w:sz="4" w:space="0" w:color="000000"/>
+            </w:tcBorders>
+          </w:tcPr>
+          <w:p>
+            <w:pPr>
+              <w:pStyle w:val="Normal"/>
+              <w:spacing w:lineRule="auto" w:line="240" w:before="20" w:after="20"/>
+              <w:rPr/>
+            </w:pPr>
+            <w:r>
+              <w:rPr>
+                <w:b w:val="false"/>
+                <w:sz w:val="20"/>
+              </w:rPr>
+              <w:t>Gaussian 0.1 – Gaussian 1.0</w:t>
+            </w:r>
+          </w:p>
+        </w:tc>
+        <w:tc>
+          <w:tcPr>
+            <w:tcW w:w="1873" w:type="dxa"/>
+            <w:tcBorders>
+              <w:top w:val="single" w:sz="4" w:space="0" w:color="000000"/>
+              <w:left w:val="single" w:sz="4" w:space="0" w:color="000000"/>
+              <w:bottom w:val="single" w:sz="4" w:space="0" w:color="000000"/>
+              <w:right w:val="single" w:sz="4" w:space="0" w:color="000000"/>
+            </w:tcBorders>
+          </w:tcPr>
+          <w:p>
+            <w:pPr>
+              <w:pStyle w:val="Normal"/>
+              <w:spacing w:lineRule="auto" w:line="240" w:before="20" w:after="20"/>
+              <w:jc w:val="center"/>
+              <w:rPr/>
+            </w:pPr>
+            <w:r>
+              <w:rPr>
+                <w:b w:val="false"/>
+                <w:sz w:val="20"/>
+              </w:rPr>
+              <w:t>0.940</w:t>
+            </w:r>
+          </w:p>
+        </w:tc>
+        <w:tc>
+          <w:tcPr>
+            <w:tcW w:w="2159" w:type="dxa"/>
+            <w:tcBorders>
+              <w:top w:val="single" w:sz="4" w:space="0" w:color="000000"/>
+              <w:left w:val="single" w:sz="4" w:space="0" w:color="000000"/>
+              <w:bottom w:val="single" w:sz="4" w:space="0" w:color="000000"/>
+              <w:right w:val="single" w:sz="4" w:space="0" w:color="000000"/>
+            </w:tcBorders>
+          </w:tcPr>
+          <w:p>
+            <w:pPr>
+              <w:pStyle w:val="Normal"/>
+              <w:spacing w:lineRule="auto" w:line="240" w:before="20" w:after="20"/>
+              <w:jc w:val="center"/>
+              <w:rPr/>
+            </w:pPr>
+            <w:r>
+              <w:rPr>
+                <w:b w:val="false"/>
+                <w:sz w:val="20"/>
+              </w:rPr>
+              <w:t>1.57 × 10⁻⁶</w:t>
+            </w:r>
+          </w:p>
+        </w:tc>
+        <w:tc>
+          <w:tcPr>
+            <w:tcW w:w="1728" w:type="dxa"/>
+            <w:tcBorders>
+              <w:top w:val="single" w:sz="4" w:space="0" w:color="000000"/>
+              <w:left w:val="single" w:sz="4" w:space="0" w:color="000000"/>
+              <w:bottom w:val="single" w:sz="4" w:space="0" w:color="000000"/>
+              <w:right w:val="single" w:sz="4" w:space="0" w:color="000000"/>
+            </w:tcBorders>
+          </w:tcPr>
+          <w:p>
+            <w:pPr>
+              <w:pStyle w:val="Normal"/>
+              <w:spacing w:lineRule="auto" w:line="240" w:before="20" w:after="20"/>
+              <w:jc w:val="center"/>
+              <w:rPr/>
+            </w:pPr>
+            <w:r>
+              <w:rPr>
+                <w:b w:val="false"/>
+                <w:sz w:val="20"/>
+              </w:rPr>
+              <w:t>4.0×</w:t>
+            </w:r>
+          </w:p>
+        </w:tc>
+      </w:tr>
+      <w:tr>
+        <w:trPr>
+          <w:cantSplit w:val="true"/>
+        </w:trPr>
+        <w:tc>
+          <w:tcPr>
+            <w:tcW w:w="3310" w:type="dxa"/>
+            <w:tcBorders>
+              <w:top w:val="single" w:sz="4" w:space="0" w:color="000000"/>
+              <w:left w:val="single" w:sz="4" w:space="0" w:color="000000"/>
+              <w:bottom w:val="single" w:sz="4" w:space="0" w:color="000000"/>
+              <w:right w:val="single" w:sz="4" w:space="0" w:color="000000"/>
+            </w:tcBorders>
+          </w:tcPr>
+          <w:p>
+            <w:pPr>
+              <w:pStyle w:val="Normal"/>
+              <w:spacing w:lineRule="auto" w:line="240" w:before="20" w:after="20"/>
+              <w:rPr/>
+            </w:pPr>
+            <w:r>
+              <w:rPr>
+                <w:b w:val="false"/>
+                <w:sz w:val="20"/>
+              </w:rPr>
+              <w:t>Gaussian 0.01 – uniform</w:t>
+            </w:r>
+          </w:p>
+        </w:tc>
+        <w:tc>
+          <w:tcPr>
+            <w:tcW w:w="1873" w:type="dxa"/>
+            <w:tcBorders>
+              <w:top w:val="single" w:sz="4" w:space="0" w:color="000000"/>
+              <w:left w:val="single" w:sz="4" w:space="0" w:color="000000"/>
+              <w:bottom w:val="single" w:sz="4" w:space="0" w:color="000000"/>
+              <w:right w:val="single" w:sz="4" w:space="0" w:color="000000"/>
+            </w:tcBorders>
+          </w:tcPr>
+          <w:p>
+            <w:pPr>
+              <w:pStyle w:val="Normal"/>
+              <w:spacing w:lineRule="auto" w:line="240" w:before="20" w:after="20"/>
+              <w:jc w:val="center"/>
+              <w:rPr/>
+            </w:pPr>
+            <w:r>
+              <w:rPr>
+                <w:b w:val="false"/>
+                <w:sz w:val="20"/>
+              </w:rPr>
+              <w:t>0.957</w:t>
+            </w:r>
+          </w:p>
+        </w:tc>
+        <w:tc>
+          <w:tcPr>
+            <w:tcW w:w="2159" w:type="dxa"/>
+            <w:tcBorders>
+              <w:top w:val="single" w:sz="4" w:space="0" w:color="000000"/>
+              <w:left w:val="single" w:sz="4" w:space="0" w:color="000000"/>
+              <w:bottom w:val="single" w:sz="4" w:space="0" w:color="000000"/>
+              <w:right w:val="single" w:sz="4" w:space="0" w:color="000000"/>
+            </w:tcBorders>
+          </w:tcPr>
+          <w:p>
+            <w:pPr>
+              <w:pStyle w:val="Normal"/>
+              <w:spacing w:lineRule="auto" w:line="240" w:before="20" w:after="20"/>
+              <w:jc w:val="center"/>
+              <w:rPr/>
+            </w:pPr>
+            <w:r>
+              <w:rPr>
+                <w:b w:val="false"/>
+                <w:sz w:val="20"/>
+              </w:rPr>
+              <w:t>1.32 × 10⁻⁶</w:t>
+            </w:r>
+          </w:p>
+        </w:tc>
+        <w:tc>
+          <w:tcPr>
+            <w:tcW w:w="1728" w:type="dxa"/>
+            <w:tcBorders>
+              <w:top w:val="single" w:sz="4" w:space="0" w:color="000000"/>
+              <w:left w:val="single" w:sz="4" w:space="0" w:color="000000"/>
+              <w:bottom w:val="single" w:sz="4" w:space="0" w:color="000000"/>
+              <w:right w:val="single" w:sz="4" w:space="0" w:color="000000"/>
+            </w:tcBorders>
+          </w:tcPr>
+          <w:p>
+            <w:pPr>
+              <w:pStyle w:val="Normal"/>
+              <w:spacing w:lineRule="auto" w:line="240" w:before="20" w:after="20"/>
+              <w:jc w:val="center"/>
+              <w:rPr/>
+            </w:pPr>
+            <w:r>
+              <w:rPr>
+                <w:b w:val="false"/>
+                <w:sz w:val="20"/>
+              </w:rPr>
+              <w:t>3.6×</w:t>
+            </w:r>
+          </w:p>
+        </w:tc>
+      </w:tr>
+      <w:tr>
+        <w:trPr>
+          <w:cantSplit w:val="true"/>
+        </w:trPr>
+        <w:tc>
+          <w:tcPr>
+            <w:tcW w:w="3310" w:type="dxa"/>
+            <w:tcBorders>
+              <w:top w:val="single" w:sz="4" w:space="0" w:color="000000"/>
+              <w:left w:val="single" w:sz="4" w:space="0" w:color="000000"/>
+              <w:bottom w:val="single" w:sz="4" w:space="0" w:color="000000"/>
+              <w:right w:val="single" w:sz="4" w:space="0" w:color="000000"/>
+            </w:tcBorders>
+          </w:tcPr>
+          <w:p>
+            <w:pPr>
+              <w:pStyle w:val="Normal"/>
+              <w:spacing w:lineRule="auto" w:line="240" w:before="20" w:after="20"/>
+              <w:rPr/>
+            </w:pPr>
+            <w:r>
+              <w:rPr>
+                <w:b w:val="false"/>
+                <w:sz w:val="20"/>
+              </w:rPr>
+              <w:t>Gaussian 0.1 – uniform</w:t>
+            </w:r>
+          </w:p>
+        </w:tc>
+        <w:tc>
+          <w:tcPr>
+            <w:tcW w:w="1873" w:type="dxa"/>
+            <w:tcBorders>
+              <w:top w:val="single" w:sz="4" w:space="0" w:color="000000"/>
+              <w:left w:val="single" w:sz="4" w:space="0" w:color="000000"/>
+              <w:bottom w:val="single" w:sz="4" w:space="0" w:color="000000"/>
+              <w:right w:val="single" w:sz="4" w:space="0" w:color="000000"/>
+            </w:tcBorders>
+          </w:tcPr>
+          <w:p>
+            <w:pPr>
+              <w:pStyle w:val="Normal"/>
+              <w:spacing w:lineRule="auto" w:line="240" w:before="20" w:after="20"/>
+              <w:jc w:val="center"/>
+              <w:rPr/>
+            </w:pPr>
+            <w:r>
+              <w:rPr>
+                <w:b w:val="false"/>
+                <w:sz w:val="20"/>
+              </w:rPr>
+              <w:t>0.956</w:t>
+            </w:r>
+          </w:p>
+        </w:tc>
+        <w:tc>
+          <w:tcPr>
+            <w:tcW w:w="2159" w:type="dxa"/>
+            <w:tcBorders>
+              <w:top w:val="single" w:sz="4" w:space="0" w:color="000000"/>
+              <w:left w:val="single" w:sz="4" w:space="0" w:color="000000"/>
+              <w:bottom w:val="single" w:sz="4" w:space="0" w:color="000000"/>
+              <w:right w:val="single" w:sz="4" w:space="0" w:color="000000"/>
+            </w:tcBorders>
+          </w:tcPr>
+          <w:p>
+            <w:pPr>
+              <w:pStyle w:val="Normal"/>
+              <w:spacing w:lineRule="auto" w:line="240" w:before="20" w:after="20"/>
+              <w:jc w:val="center"/>
+              <w:rPr/>
+            </w:pPr>
+            <w:r>
+              <w:rPr>
+                <w:b w:val="false"/>
+                <w:sz w:val="20"/>
+              </w:rPr>
+              <w:t>1.25 × 10⁻⁶</w:t>
+            </w:r>
+          </w:p>
+        </w:tc>
+        <w:tc>
+          <w:tcPr>
+            <w:tcW w:w="1728" w:type="dxa"/>
+            <w:tcBorders>
+              <w:top w:val="single" w:sz="4" w:space="0" w:color="000000"/>
+              <w:left w:val="single" w:sz="4" w:space="0" w:color="000000"/>
+              <w:bottom w:val="single" w:sz="4" w:space="0" w:color="000000"/>
+              <w:right w:val="single" w:sz="4" w:space="0" w:color="000000"/>
+            </w:tcBorders>
+          </w:tcPr>
+          <w:p>
+            <w:pPr>
+              <w:pStyle w:val="Normal"/>
+              <w:spacing w:lineRule="auto" w:line="240" w:before="20" w:after="20"/>
+              <w:jc w:val="center"/>
+              <w:rPr/>
+            </w:pPr>
+            <w:r>
+              <w:rPr>
+                <w:b w:val="false"/>
+                <w:sz w:val="20"/>
+              </w:rPr>
+              <w:t>3.4×</w:t>
+            </w:r>
+          </w:p>
+        </w:tc>
+      </w:tr>
+      <w:tr>
+        <w:trPr>
+          <w:cantSplit w:val="true"/>
+        </w:trPr>
+        <w:tc>
+          <w:tcPr>
+            <w:tcW w:w="3310" w:type="dxa"/>
+            <w:tcBorders>
+              <w:top w:val="single" w:sz="4" w:space="0" w:color="000000"/>
+              <w:left w:val="single" w:sz="4" w:space="0" w:color="000000"/>
+              <w:bottom w:val="single" w:sz="4" w:space="0" w:color="000000"/>
+              <w:right w:val="single" w:sz="4" w:space="0" w:color="000000"/>
+            </w:tcBorders>
+          </w:tcPr>
+          <w:p>
+            <w:pPr>
+              <w:pStyle w:val="Normal"/>
+              <w:spacing w:lineRule="auto" w:line="240" w:before="20" w:after="20"/>
+              <w:rPr/>
+            </w:pPr>
+            <w:r>
+              <w:rPr>
+                <w:b w:val="false"/>
+                <w:sz w:val="20"/>
+              </w:rPr>
+              <w:t>Gaussian 0.01 – Gaussian 0.1</w:t>
+            </w:r>
+          </w:p>
+        </w:tc>
+        <w:tc>
+          <w:tcPr>
+            <w:tcW w:w="1873" w:type="dxa"/>
+            <w:tcBorders>
+              <w:top w:val="single" w:sz="4" w:space="0" w:color="000000"/>
+              <w:left w:val="single" w:sz="4" w:space="0" w:color="000000"/>
+              <w:bottom w:val="single" w:sz="4" w:space="0" w:color="000000"/>
+              <w:right w:val="single" w:sz="4" w:space="0" w:color="000000"/>
+            </w:tcBorders>
+          </w:tcPr>
+          <w:p>
+            <w:pPr>
+              <w:pStyle w:val="Normal"/>
+              <w:spacing w:lineRule="auto" w:line="240" w:before="20" w:after="20"/>
+              <w:jc w:val="center"/>
+              <w:rPr/>
+            </w:pPr>
+            <w:r>
+              <w:rPr>
+                <w:b w:val="false"/>
+                <w:sz w:val="20"/>
+              </w:rPr>
+              <w:t>0.992</w:t>
+            </w:r>
+          </w:p>
+        </w:tc>
+        <w:tc>
+          <w:tcPr>
+            <w:tcW w:w="2159" w:type="dxa"/>
+            <w:tcBorders>
+              <w:top w:val="single" w:sz="4" w:space="0" w:color="000000"/>
+              <w:left w:val="single" w:sz="4" w:space="0" w:color="000000"/>
+              <w:bottom w:val="single" w:sz="4" w:space="0" w:color="000000"/>
+              <w:right w:val="single" w:sz="4" w:space="0" w:color="000000"/>
+            </w:tcBorders>
+          </w:tcPr>
+          <w:p>
+            <w:pPr>
+              <w:pStyle w:val="Normal"/>
+              <w:spacing w:lineRule="auto" w:line="240" w:before="20" w:after="20"/>
+              <w:jc w:val="center"/>
+              <w:rPr/>
+            </w:pPr>
+            <w:r>
+              <w:rPr>
+                <w:b w:val="false"/>
+                <w:sz w:val="20"/>
+              </w:rPr>
+              <w:t>8.12 × 10⁻⁷</w:t>
+            </w:r>
+          </w:p>
+        </w:tc>
+        <w:tc>
+          <w:tcPr>
+            <w:tcW w:w="1728" w:type="dxa"/>
+            <w:tcBorders>
+              <w:top w:val="single" w:sz="4" w:space="0" w:color="000000"/>
+              <w:left w:val="single" w:sz="4" w:space="0" w:color="000000"/>
+              <w:bottom w:val="single" w:sz="4" w:space="0" w:color="000000"/>
+              <w:right w:val="single" w:sz="4" w:space="0" w:color="000000"/>
+            </w:tcBorders>
+          </w:tcPr>
+          <w:p>
+            <w:pPr>
+              <w:pStyle w:val="Normal"/>
+              <w:spacing w:lineRule="auto" w:line="240" w:before="20" w:after="20"/>
+              <w:jc w:val="center"/>
+              <w:rPr/>
+            </w:pPr>
+            <w:r>
+              <w:rPr>
+                <w:b w:val="false"/>
+                <w:sz w:val="20"/>
+              </w:rPr>
+              <w:t>2.2×</w:t>
+            </w:r>
+          </w:p>
+        </w:tc>
+      </w:tr>
+      <w:tr>
+        <w:trPr>
+          <w:cantSplit w:val="true"/>
+        </w:trPr>
+        <w:tc>
+          <w:tcPr>
+            <w:tcW w:w="3310" w:type="dxa"/>
+            <w:tcBorders>
+              <w:top w:val="single" w:sz="4" w:space="0" w:color="000000"/>
+              <w:left w:val="single" w:sz="4" w:space="0" w:color="000000"/>
+              <w:bottom w:val="single" w:sz="4" w:space="0" w:color="000000"/>
+              <w:right w:val="single" w:sz="4" w:space="0" w:color="000000"/>
+            </w:tcBorders>
+          </w:tcPr>
+          <w:p>
+            <w:pPr>
+              <w:pStyle w:val="Normal"/>
+              <w:spacing w:lineRule="auto" w:line="240" w:before="20" w:after="20"/>
+              <w:rPr/>
+            </w:pPr>
+            <w:r>
+              <w:rPr>
+                <w:b w:val="false"/>
+                <w:sz w:val="20"/>
+              </w:rPr>
+              <w:t>Gaussian 0.1 – zeros</w:t>
+            </w:r>
+          </w:p>
+        </w:tc>
+        <w:tc>
+          <w:tcPr>
+            <w:tcW w:w="1873" w:type="dxa"/>
+            <w:tcBorders>
+              <w:top w:val="single" w:sz="4" w:space="0" w:color="000000"/>
+              <w:left w:val="single" w:sz="4" w:space="0" w:color="000000"/>
+              <w:bottom w:val="single" w:sz="4" w:space="0" w:color="000000"/>
+              <w:right w:val="single" w:sz="4" w:space="0" w:color="000000"/>
+            </w:tcBorders>
+          </w:tcPr>
+          <w:p>
+            <w:pPr>
+              <w:pStyle w:val="Normal"/>
+              <w:spacing w:lineRule="auto" w:line="240" w:before="20" w:after="20"/>
+              <w:jc w:val="center"/>
+              <w:rPr/>
+            </w:pPr>
+            <w:r>
+              <w:rPr>
+                <w:b w:val="false"/>
+                <w:sz w:val="20"/>
+              </w:rPr>
+              <w:t>0.993</w:t>
+            </w:r>
+          </w:p>
+        </w:tc>
+        <w:tc>
+          <w:tcPr>
+            <w:tcW w:w="2159" w:type="dxa"/>
+            <w:tcBorders>
+              <w:top w:val="single" w:sz="4" w:space="0" w:color="000000"/>
+              <w:left w:val="single" w:sz="4" w:space="0" w:color="000000"/>
+              <w:bottom w:val="single" w:sz="4" w:space="0" w:color="000000"/>
+              <w:right w:val="single" w:sz="4" w:space="0" w:color="000000"/>
+            </w:tcBorders>
+          </w:tcPr>
+          <w:p>
+            <w:pPr>
+              <w:pStyle w:val="Normal"/>
+              <w:spacing w:lineRule="auto" w:line="240" w:before="20" w:after="20"/>
+              <w:jc w:val="center"/>
+              <w:rPr/>
+            </w:pPr>
+            <w:r>
+              <w:rPr>
+                <w:b w:val="false"/>
+                <w:sz w:val="20"/>
+              </w:rPr>
+              <w:t>5.52 × 10⁻⁷</w:t>
+            </w:r>
+          </w:p>
+        </w:tc>
+        <w:tc>
+          <w:tcPr>
+            <w:tcW w:w="1728" w:type="dxa"/>
+            <w:tcBorders>
+              <w:top w:val="single" w:sz="4" w:space="0" w:color="000000"/>
+              <w:left w:val="single" w:sz="4" w:space="0" w:color="000000"/>
+              <w:bottom w:val="single" w:sz="4" w:space="0" w:color="000000"/>
+              <w:right w:val="single" w:sz="4" w:space="0" w:color="000000"/>
+            </w:tcBorders>
+          </w:tcPr>
+          <w:p>
+            <w:pPr>
+              <w:pStyle w:val="Normal"/>
+              <w:spacing w:lineRule="auto" w:line="240" w:before="20" w:after="20"/>
+              <w:jc w:val="center"/>
+              <w:rPr/>
+            </w:pPr>
+            <w:r>
+              <w:rPr>
+                <w:b w:val="false"/>
+                <w:sz w:val="20"/>
+              </w:rPr>
+              <w:t>1.6×</w:t>
+            </w:r>
+          </w:p>
+        </w:tc>
+      </w:tr>
+      <w:tr>
+        <w:trPr>
+          <w:cantSplit w:val="true"/>
+        </w:trPr>
+        <w:tc>
+          <w:tcPr>
+            <w:tcW w:w="3310" w:type="dxa"/>
+            <w:tcBorders>
+              <w:top w:val="single" w:sz="4" w:space="0" w:color="000000"/>
+              <w:left w:val="single" w:sz="4" w:space="0" w:color="000000"/>
+              <w:bottom w:val="single" w:sz="4" w:space="0" w:color="000000"/>
+              <w:right w:val="single" w:sz="4" w:space="0" w:color="000000"/>
+            </w:tcBorders>
+          </w:tcPr>
+          <w:p>
+            <w:pPr>
+              <w:pStyle w:val="Normal"/>
+              <w:spacing w:lineRule="auto" w:line="240" w:before="20" w:after="20"/>
+              <w:rPr/>
+            </w:pPr>
+            <w:r>
+              <w:rPr>
+                <w:b w:val="false"/>
+                <w:sz w:val="20"/>
+              </w:rPr>
+              <w:t>Gaussian 0.01 – zeros</w:t>
+            </w:r>
+          </w:p>
+        </w:tc>
+        <w:tc>
+          <w:tcPr>
+            <w:tcW w:w="1873" w:type="dxa"/>
+            <w:tcBorders>
+              <w:top w:val="single" w:sz="4" w:space="0" w:color="000000"/>
+              <w:left w:val="single" w:sz="4" w:space="0" w:color="000000"/>
+              <w:bottom w:val="single" w:sz="4" w:space="0" w:color="000000"/>
+              <w:right w:val="single" w:sz="4" w:space="0" w:color="000000"/>
+            </w:tcBorders>
+          </w:tcPr>
+          <w:p>
+            <w:pPr>
+              <w:pStyle w:val="Normal"/>
+              <w:spacing w:lineRule="auto" w:line="240" w:before="20" w:after="20"/>
+              <w:jc w:val="center"/>
+              <w:rPr/>
+            </w:pPr>
+            <w:r>
+              <w:rPr>
+                <w:b w:val="false"/>
+                <w:sz w:val="20"/>
+              </w:rPr>
+              <w:t>0.999</w:t>
+            </w:r>
+          </w:p>
+        </w:tc>
+        <w:tc>
+          <w:tcPr>
+            <w:tcW w:w="2159" w:type="dxa"/>
+            <w:tcBorders>
+              <w:top w:val="single" w:sz="4" w:space="0" w:color="000000"/>
+              <w:left w:val="single" w:sz="4" w:space="0" w:color="000000"/>
+              <w:bottom w:val="single" w:sz="4" w:space="0" w:color="000000"/>
+              <w:right w:val="single" w:sz="4" w:space="0" w:color="000000"/>
+            </w:tcBorders>
+          </w:tcPr>
+          <w:p>
+            <w:pPr>
+              <w:pStyle w:val="Normal"/>
+              <w:spacing w:lineRule="auto" w:line="240" w:before="20" w:after="20"/>
+              <w:jc w:val="center"/>
+              <w:rPr/>
+            </w:pPr>
+            <w:r>
+              <w:rPr>
+                <w:b w:val="false"/>
+                <w:sz w:val="20"/>
+              </w:rPr>
+              <w:t>5.57 × 10⁻⁷</w:t>
+            </w:r>
+          </w:p>
+        </w:tc>
+        <w:tc>
+          <w:tcPr>
+            <w:tcW w:w="1728" w:type="dxa"/>
+            <w:tcBorders>
+              <w:top w:val="single" w:sz="4" w:space="0" w:color="000000"/>
+              <w:left w:val="single" w:sz="4" w:space="0" w:color="000000"/>
+              <w:bottom w:val="single" w:sz="4" w:space="0" w:color="000000"/>
+              <w:right w:val="single" w:sz="4" w:space="0" w:color="000000"/>
+            </w:tcBorders>
+          </w:tcPr>
+          <w:p>
+            <w:pPr>
+              <w:pStyle w:val="Normal"/>
+              <w:spacing w:lineRule="auto" w:line="240" w:before="20" w:after="20"/>
+              <w:jc w:val="center"/>
+              <w:rPr/>
+            </w:pPr>
+            <w:r>
+              <w:rPr>
+                <w:b w:val="false"/>
+                <w:sz w:val="20"/>
+              </w:rPr>
+              <w:t>1.5×</w:t>
+            </w:r>
+          </w:p>
+        </w:tc>
+      </w:tr>
+      <w:tr>
+        <w:trPr>
+          <w:cantSplit w:val="true"/>
+        </w:trPr>
+        <w:tc>
+          <w:tcPr>
+            <w:tcW w:w="3310" w:type="dxa"/>
+            <w:tcBorders>
+              <w:top w:val="single" w:sz="4" w:space="0" w:color="000000"/>
+              <w:left w:val="single" w:sz="4" w:space="0" w:color="000000"/>
+              <w:bottom w:val="single" w:sz="4" w:space="0" w:color="000000"/>
+              <w:right w:val="single" w:sz="4" w:space="0" w:color="000000"/>
+            </w:tcBorders>
+          </w:tcPr>
+          <w:p>
+            <w:pPr>
+              <w:pStyle w:val="Normal"/>
+              <w:spacing w:lineRule="auto" w:line="240" w:before="20" w:after="20"/>
+              <w:rPr/>
+            </w:pPr>
+            <w:r>
+              <w:rPr>
+                <w:b w:val="false"/>
+                <w:sz w:val="20"/>
+              </w:rPr>
+              <w:t>Best blind (zeros) – near-truth</w:t>
+            </w:r>
+          </w:p>
+        </w:tc>
+        <w:tc>
+          <w:tcPr>
+            <w:tcW w:w="1873" w:type="dxa"/>
+            <w:tcBorders>
+              <w:top w:val="single" w:sz="4" w:space="0" w:color="000000"/>
+              <w:left w:val="single" w:sz="4" w:space="0" w:color="000000"/>
+              <w:bottom w:val="single" w:sz="4" w:space="0" w:color="000000"/>
+              <w:right w:val="single" w:sz="4" w:space="0" w:color="000000"/>
+            </w:tcBorders>
+          </w:tcPr>
+          <w:p>
+            <w:pPr>
+              <w:pStyle w:val="Normal"/>
+              <w:spacing w:lineRule="auto" w:line="240" w:before="20" w:after="20"/>
+              <w:jc w:val="center"/>
+              <w:rPr/>
+            </w:pPr>
+            <w:r>
+              <w:rPr>
+                <w:b w:val="false"/>
+                <w:sz w:val="20"/>
+              </w:rPr>
+              <w:t>—</w:t>
+            </w:r>
+          </w:p>
+        </w:tc>
+        <w:tc>
+          <w:tcPr>
+            <w:tcW w:w="2159" w:type="dxa"/>
+            <w:tcBorders>
+              <w:top w:val="single" w:sz="4" w:space="0" w:color="000000"/>
+              <w:left w:val="single" w:sz="4" w:space="0" w:color="000000"/>
+              <w:bottom w:val="single" w:sz="4" w:space="0" w:color="000000"/>
+              <w:right w:val="single" w:sz="4" w:space="0" w:color="000000"/>
+            </w:tcBorders>
+          </w:tcPr>
+          <w:p>
+            <w:pPr>
+              <w:pStyle w:val="Normal"/>
+              <w:spacing w:lineRule="auto" w:line="240" w:before="20" w:after="20"/>
+              <w:jc w:val="center"/>
+              <w:rPr/>
+            </w:pPr>
+            <w:r>
+              <w:rPr>
+                <w:b w:val="false"/>
+                <w:sz w:val="20"/>
+              </w:rPr>
+              <w:t>2.58 × 10⁻⁶</w:t>
+            </w:r>
+          </w:p>
+        </w:tc>
+        <w:tc>
+          <w:tcPr>
+            <w:tcW w:w="1728" w:type="dxa"/>
+            <w:tcBorders>
+              <w:top w:val="single" w:sz="4" w:space="0" w:color="000000"/>
+              <w:left w:val="single" w:sz="4" w:space="0" w:color="000000"/>
+              <w:bottom w:val="single" w:sz="4" w:space="0" w:color="000000"/>
+              <w:right w:val="single" w:sz="4" w:space="0" w:color="000000"/>
+            </w:tcBorders>
+          </w:tcPr>
+          <w:p>
+            <w:pPr>
+              <w:pStyle w:val="Normal"/>
+              <w:spacing w:lineRule="auto" w:line="240" w:before="20" w:after="20"/>
+              <w:jc w:val="center"/>
+              <w:rPr/>
+            </w:pPr>
+            <w:r>
+              <w:rPr>
+                <w:b w:val="false"/>
+                <w:sz w:val="20"/>
+              </w:rPr>
+              <w:t>7.2×</w:t>
             </w:r>
           </w:p>
         </w:tc>
@@ -15880,7 +16673,7 @@
         <w:pStyle w:val="Heading2"/>
         <w:rPr/>
       </w:pPr>
-      <w:bookmarkStart w:id="45" w:name="__RefHeading___Toc2244_2894726032"/>
+      <w:bookmarkStart w:id="45" w:name="__RefHeading___Toc2340_186613870"/>
       <w:bookmarkEnd w:id="45"/>
       <w:r>
         <w:rPr/>
@@ -15899,7 +16692,7 @@
           <w:b w:val="false"/>
           <w:sz w:val="24"/>
         </w:rPr>
-        <w:t>At a recovered solution, sensitivity along d was 9.47 × 10⁻², against a median of 1.77 × 10⁻¹ over 200 random directions (range 1.35–2.51 × 10⁻¹): 1.9× below the median and below every random direction sampled (Figure 8.4). All six pairwise difference directions lay below the median, by 1.4× to 2.4×. The inverse is anisotropically ill-conditioned: the operator responds about half as strongly to the components that inversion fails to recover.</w:t>
+        <w:t>On the corrected fit-matched pair (Gaussian 1.0 and uniform), sensitivity along their difference d was 8.10 × 10⁻², against a median of 1.68 × 10⁻¹ over 200 random directions (range 1.22–2.39 × 10⁻¹): 2.1× below the median and below every random direction sampled. Along the actual error x̂ − x it was 1.8× below the median. Nine of the ten blind pairs lay below the median (1.1–2.1×); the exception is the pair of almost identical solutions from the zero and 0.01 starts (agreement 0.999), whose difference is too small to probe reliably. The original run (Figure 8.4) gave 1.9×. The inverse is anisotropically ill-conditioned: the operator responds about half as strongly to the components that inversion fails to recover.</w:t>
       </w:r>
     </w:p>
     <w:p>
@@ -15956,14 +16749,14 @@
         <w:pStyle w:val="FigureCaption"/>
         <w:rPr/>
       </w:pPr>
-      <w:bookmarkStart w:id="46" w:name="__RefHeading___Toc2296_2894726032"/>
+      <w:bookmarkStart w:id="46" w:name="__RefHeading___Toc2392_186613870"/>
       <w:bookmarkEnd w:id="46"/>
       <w:r>
         <w:rPr>
           <w:b w:val="false"/>
           <w:sz w:val="20"/>
         </w:rPr>
-        <w:t>Figure 8.4: Directional sensitivity of the operator: solution-difference directions against 200 random directions</w:t>
+        <w:t>Figure 8.4: Directional sensitivity of the operator in the original run: solution-difference directions against 200 random directions (the corrected pair gives 2.1×)</w:t>
       </w:r>
     </w:p>
     <w:p>
@@ -15971,7 +16764,7 @@
         <w:pStyle w:val="Heading2"/>
         <w:rPr/>
       </w:pPr>
-      <w:bookmarkStart w:id="47" w:name="__RefHeading___Toc2246_2894726032"/>
+      <w:bookmarkStart w:id="47" w:name="__RefHeading___Toc2342_186613870"/>
       <w:bookmarkEnd w:id="47"/>
       <w:r>
         <w:rPr/>
@@ -16047,7 +16840,7 @@
         <w:pStyle w:val="FigureCaption"/>
         <w:rPr/>
       </w:pPr>
-      <w:bookmarkStart w:id="48" w:name="__RefHeading___Toc2294_2894726032"/>
+      <w:bookmarkStart w:id="48" w:name="__RefHeading___Toc2390_186613870"/>
       <w:bookmarkEnd w:id="48"/>
       <w:r>
         <w:rPr>
@@ -16111,7 +16904,7 @@
         <w:pStyle w:val="FigureCaption"/>
         <w:rPr/>
       </w:pPr>
-      <w:bookmarkStart w:id="49" w:name="__RefHeading___Toc2292_2894726032"/>
+      <w:bookmarkStart w:id="49" w:name="__RefHeading___Toc2388_186613870"/>
       <w:bookmarkEnd w:id="49"/>
       <w:r>
         <w:rPr>
@@ -16175,7 +16968,7 @@
         <w:pStyle w:val="FigureCaption"/>
         <w:rPr/>
       </w:pPr>
-      <w:bookmarkStart w:id="50" w:name="__RefHeading___Toc2290_2894726032"/>
+      <w:bookmarkStart w:id="50" w:name="__RefHeading___Toc2386_186613870"/>
       <w:bookmarkEnd w:id="50"/>
       <w:r>
         <w:rPr>
@@ -16239,7 +17032,7 @@
         <w:pStyle w:val="FigureCaption"/>
         <w:rPr/>
       </w:pPr>
-      <w:bookmarkStart w:id="51" w:name="__RefHeading___Toc2288_2894726032"/>
+      <w:bookmarkStart w:id="51" w:name="__RefHeading___Toc2384_186613870"/>
       <w:bookmarkEnd w:id="51"/>
       <w:r>
         <w:rPr>
@@ -16303,7 +17096,7 @@
         <w:pStyle w:val="FigureCaption"/>
         <w:rPr/>
       </w:pPr>
-      <w:bookmarkStart w:id="52" w:name="__RefHeading___Toc2286_2894726032"/>
+      <w:bookmarkStart w:id="52" w:name="__RefHeading___Toc2382_186613870"/>
       <w:bookmarkEnd w:id="52"/>
       <w:r>
         <w:rPr>
@@ -16318,7 +17111,7 @@
         <w:pStyle w:val="TableCaption"/>
         <w:rPr/>
       </w:pPr>
-      <w:bookmarkStart w:id="53" w:name="__RefHeading___Toc2316_2894726032"/>
+      <w:bookmarkStart w:id="53" w:name="__RefHeading___Toc2412_186613870"/>
       <w:bookmarkEnd w:id="53"/>
       <w:r>
         <w:rPr>
@@ -16924,7 +17717,7 @@
         <w:pStyle w:val="Heading2"/>
         <w:rPr/>
       </w:pPr>
-      <w:bookmarkStart w:id="54" w:name="__RefHeading___Toc2248_2894726032"/>
+      <w:bookmarkStart w:id="54" w:name="__RefHeading___Toc2344_186613870"/>
       <w:bookmarkEnd w:id="54"/>
       <w:r>
         <w:rPr/>
@@ -17000,7 +17793,7 @@
         <w:pStyle w:val="FigureCaption"/>
         <w:rPr/>
       </w:pPr>
-      <w:bookmarkStart w:id="55" w:name="__RefHeading___Toc2284_2894726032"/>
+      <w:bookmarkStart w:id="55" w:name="__RefHeading___Toc2380_186613870"/>
       <w:bookmarkEnd w:id="55"/>
       <w:r>
         <w:rPr>
@@ -17064,7 +17857,7 @@
         <w:pStyle w:val="FigureCaption"/>
         <w:rPr/>
       </w:pPr>
-      <w:bookmarkStart w:id="56" w:name="__RefHeading___Toc2282_2894726032"/>
+      <w:bookmarkStart w:id="56" w:name="__RefHeading___Toc2378_186613870"/>
       <w:bookmarkEnd w:id="56"/>
       <w:r>
         <w:rPr>
@@ -17128,7 +17921,7 @@
         <w:pStyle w:val="FigureCaption"/>
         <w:rPr/>
       </w:pPr>
-      <w:bookmarkStart w:id="57" w:name="__RefHeading___Toc2280_2894726032"/>
+      <w:bookmarkStart w:id="57" w:name="__RefHeading___Toc2376_186613870"/>
       <w:bookmarkEnd w:id="57"/>
       <w:r>
         <w:rPr>
@@ -17192,7 +17985,7 @@
         <w:pStyle w:val="FigureCaption"/>
         <w:rPr/>
       </w:pPr>
-      <w:bookmarkStart w:id="58" w:name="__RefHeading___Toc2278_2894726032"/>
+      <w:bookmarkStart w:id="58" w:name="__RefHeading___Toc2374_186613870"/>
       <w:bookmarkEnd w:id="58"/>
       <w:r>
         <w:rPr>
@@ -17256,7 +18049,7 @@
         <w:pStyle w:val="FigureCaption"/>
         <w:rPr/>
       </w:pPr>
-      <w:bookmarkStart w:id="59" w:name="__RefHeading___Toc2276_2894726032"/>
+      <w:bookmarkStart w:id="59" w:name="__RefHeading___Toc2372_186613870"/>
       <w:bookmarkEnd w:id="59"/>
       <w:r>
         <w:rPr>
@@ -17271,7 +18064,7 @@
         <w:pStyle w:val="TableCaption"/>
         <w:rPr/>
       </w:pPr>
-      <w:bookmarkStart w:id="60" w:name="__RefHeading___Toc2314_2894726032"/>
+      <w:bookmarkStart w:id="60" w:name="__RefHeading___Toc2410_186613870"/>
       <w:bookmarkEnd w:id="60"/>
       <w:r>
         <w:rPr>
@@ -18822,7 +19615,7 @@
         <w:pStyle w:val="Heading2"/>
         <w:rPr/>
       </w:pPr>
-      <w:bookmarkStart w:id="61" w:name="__RefHeading___Toc2250_2894726032"/>
+      <w:bookmarkStart w:id="61" w:name="__RefHeading___Toc2346_186613870"/>
       <w:bookmarkEnd w:id="61"/>
       <w:r>
         <w:rPr/>
@@ -18898,7 +19691,7 @@
         <w:pStyle w:val="FigureCaption"/>
         <w:rPr/>
       </w:pPr>
-      <w:bookmarkStart w:id="62" w:name="__RefHeading___Toc2274_2894726032"/>
+      <w:bookmarkStart w:id="62" w:name="__RefHeading___Toc2370_186613870"/>
       <w:bookmarkEnd w:id="62"/>
       <w:r>
         <w:rPr>
@@ -18913,7 +19706,7 @@
         <w:pStyle w:val="TableCaption"/>
         <w:rPr/>
       </w:pPr>
-      <w:bookmarkStart w:id="63" w:name="__RefHeading___Toc2312_2894726032"/>
+      <w:bookmarkStart w:id="63" w:name="__RefHeading___Toc2408_186613870"/>
       <w:bookmarkEnd w:id="63"/>
       <w:r>
         <w:rPr>
@@ -19952,7 +20745,7 @@
         <w:pStyle w:val="Heading2"/>
         <w:rPr/>
       </w:pPr>
-      <w:bookmarkStart w:id="64" w:name="__RefHeading___Toc2252_2894726032"/>
+      <w:bookmarkStart w:id="64" w:name="__RefHeading___Toc2348_186613870"/>
       <w:bookmarkEnd w:id="64"/>
       <w:r>
         <w:rPr/>
@@ -20055,7 +20848,7 @@
         <w:pStyle w:val="Heading1"/>
         <w:rPr/>
       </w:pPr>
-      <w:bookmarkStart w:id="65" w:name="__RefHeading___Toc2254_2894726032"/>
+      <w:bookmarkStart w:id="65" w:name="__RefHeading___Toc2350_186613870"/>
       <w:bookmarkEnd w:id="65"/>
       <w:r>
         <w:rPr/>
@@ -20082,7 +20875,7 @@
         <w:pStyle w:val="Heading2"/>
         <w:rPr/>
       </w:pPr>
-      <w:bookmarkStart w:id="66" w:name="__RefHeading___Toc2256_2894726032"/>
+      <w:bookmarkStart w:id="66" w:name="__RefHeading___Toc2352_186613870"/>
       <w:bookmarkEnd w:id="66"/>
       <w:r>
         <w:rPr/>
@@ -20182,7 +20975,7 @@
           <w:sz w:val="24"/>
         </w:rPr>
         <w:tab/>
-        <w:t>A forward-only barrier test rejects the null-space hypothesis (2.6× at small steps, 0.6× at full separation).</w:t>
+        <w:t>The prediction error rises 1.5–6.0× (median 3.8×) between every pair of fit-matched blind solutions, and 7.2× towards a deeper minimum near the truth: barriers, not a null space.</w:t>
       </w:r>
     </w:p>
     <w:p>
@@ -20206,7 +20999,7 @@
           <w:sz w:val="24"/>
         </w:rPr>
         <w:tab/>
-        <w:t>Residual errors lie 1.9× below the median sensitivity of 200 random directions: anisotropic ill-conditioning.</w:t>
+        <w:t>Solution differences lie 2.1× below the median sensitivity of 200 random directions (1.9× in the original run): anisotropic ill-conditioning.</w:t>
       </w:r>
     </w:p>
     <w:p>
@@ -20286,7 +21079,7 @@
         <w:pStyle w:val="Heading2"/>
         <w:rPr/>
       </w:pPr>
-      <w:bookmarkStart w:id="67" w:name="__RefHeading___Toc2258_2894726032"/>
+      <w:bookmarkStart w:id="67" w:name="__RefHeading___Toc2354_186613870"/>
       <w:bookmarkEnd w:id="67"/>
       <w:r>
         <w:rPr/>
@@ -20394,7 +21187,7 @@
         <w:pStyle w:val="Heading2"/>
         <w:rPr/>
       </w:pPr>
-      <w:bookmarkStart w:id="68" w:name="__RefHeading___Toc2260_2894726032"/>
+      <w:bookmarkStart w:id="68" w:name="__RefHeading___Toc2356_186613870"/>
       <w:bookmarkEnd w:id="68"/>
       <w:r>
         <w:rPr/>
@@ -20406,7 +21199,7 @@
         <w:pStyle w:val="TableCaption"/>
         <w:rPr/>
       </w:pPr>
-      <w:bookmarkStart w:id="69" w:name="__RefHeading___Toc2310_2894726032"/>
+      <w:bookmarkStart w:id="69" w:name="__RefHeading___Toc2406_186613870"/>
       <w:bookmarkEnd w:id="69"/>
       <w:r>
         <w:rPr>
@@ -20623,7 +21416,7 @@
         <w:pStyle w:val="Heading1"/>
         <w:rPr/>
       </w:pPr>
-      <w:bookmarkStart w:id="70" w:name="__RefHeading___Toc2262_2894726032"/>
+      <w:bookmarkStart w:id="70" w:name="__RefHeading___Toc2358_186613870"/>
       <w:bookmarkEnd w:id="70"/>
       <w:r>
         <w:rPr/>
@@ -20682,7 +21475,7 @@
         <w:pStyle w:val="Heading1"/>
         <w:rPr/>
       </w:pPr>
-      <w:bookmarkStart w:id="71" w:name="__RefHeading___Toc2264_2894726032"/>
+      <w:bookmarkStart w:id="71" w:name="__RefHeading___Toc2360_186613870"/>
       <w:bookmarkEnd w:id="71"/>
       <w:r>
         <w:rPr/>
@@ -20709,7 +21502,7 @@
         <w:pStyle w:val="TableCaption"/>
         <w:rPr/>
       </w:pPr>
-      <w:bookmarkStart w:id="72" w:name="__RefHeading___Toc2308_2894726032"/>
+      <w:bookmarkStart w:id="72" w:name="__RefHeading___Toc2404_186613870"/>
       <w:bookmarkEnd w:id="72"/>
       <w:r>
         <w:rPr>
@@ -21747,7 +22540,7 @@
         <w:pStyle w:val="Heading1"/>
         <w:rPr/>
       </w:pPr>
-      <w:bookmarkStart w:id="73" w:name="__RefHeading___Toc2266_2894726032"/>
+      <w:bookmarkStart w:id="73" w:name="__RefHeading___Toc2362_186613870"/>
       <w:bookmarkEnd w:id="73"/>
       <w:r>
         <w:rPr/>
@@ -21873,7 +22666,7 @@
         <w:pStyle w:val="Heading1"/>
         <w:rPr/>
       </w:pPr>
-      <w:bookmarkStart w:id="74" w:name="__RefHeading___Toc2268_2894726032"/>
+      <w:bookmarkStart w:id="74" w:name="__RefHeading___Toc2364_186613870"/>
       <w:bookmarkEnd w:id="74"/>
       <w:r>
         <w:rPr/>
@@ -22770,7 +23563,7 @@
         <w:pStyle w:val="Heading1"/>
         <w:rPr/>
       </w:pPr>
-      <w:bookmarkStart w:id="75" w:name="__RefHeading___Toc2270_2894726032"/>
+      <w:bookmarkStart w:id="75" w:name="__RefHeading___Toc2366_186613870"/>
       <w:bookmarkEnd w:id="75"/>
       <w:r>
         <w:rPr/>
@@ -22797,7 +23590,7 @@
         <w:pStyle w:val="TableCaption"/>
         <w:rPr/>
       </w:pPr>
-      <w:bookmarkStart w:id="76" w:name="__RefHeading___Toc2306_2894726032"/>
+      <w:bookmarkStart w:id="76" w:name="__RefHeading___Toc2402_186613870"/>
       <w:bookmarkEnd w:id="76"/>
       <w:r>
         <w:rPr>
@@ -23018,7 +23811,7 @@
                 <w:b w:val="false"/>
                 <w:sz w:val="20"/>
               </w:rPr>
-              <w:t>Section 8.6 (regional)</w:t>
+              <w:t>Section 8.3–8.4 verification</w:t>
             </w:r>
           </w:p>
         </w:tc>
@@ -23043,7 +23836,7 @@
                 <w:b w:val="false"/>
                 <w:sz w:val="20"/>
               </w:rPr>
-              <w:t>roi_sensitivity.py, roi_share_stats.py, roi_inversion.py, roi_dimensionality.py</w:t>
+              <w:t>notebooks/Verification_Tests.ipynb, make_verification_fig.py</w:t>
             </w:r>
           </w:p>
         </w:tc>
@@ -23068,7 +23861,7 @@
                 <w:b w:val="false"/>
                 <w:sz w:val="20"/>
               </w:rPr>
-              <w:t>results/roi_*.json</w:t>
+              <w:t>results/verification/</w:t>
             </w:r>
           </w:p>
         </w:tc>
@@ -23098,7 +23891,7 @@
                 <w:b w:val="false"/>
                 <w:sz w:val="20"/>
               </w:rPr>
-              <w:t>Section 8.7 (real fMRI)</w:t>
+              <w:t>Section 8.6 (regional)</w:t>
             </w:r>
           </w:p>
         </w:tc>
@@ -23123,7 +23916,7 @@
                 <w:b w:val="false"/>
                 <w:sz w:val="20"/>
               </w:rPr>
-              <w:t>lebel_register.py, lebel_sampler.py, lebel_project.py, lebel_features.py, lebel_apply.py, lebel_eval.py</w:t>
+              <w:t>roi_sensitivity.py, roi_share_stats.py, roi_inversion.py, roi_dimensionality.py</w:t>
             </w:r>
           </w:p>
         </w:tc>
@@ -23148,7 +23941,7 @@
                 <w:b w:val="false"/>
                 <w:sz w:val="20"/>
               </w:rPr>
-              <w:t>results/realdata_audio_text.json</w:t>
+              <w:t>results/roi_*.json</w:t>
             </w:r>
           </w:p>
         </w:tc>
@@ -23178,7 +23971,7 @@
                 <w:b w:val="false"/>
                 <w:sz w:val="20"/>
               </w:rPr>
-              <w:t>Figures</w:t>
+              <w:t>Section 8.7 (real fMRI)</w:t>
             </w:r>
           </w:p>
         </w:tc>
@@ -23203,7 +23996,7 @@
                 <w:b w:val="false"/>
                 <w:sz w:val="20"/>
               </w:rPr>
-              <w:t>make_figures.py, make_roi_figs.py, make_brain_figs.py, make_topo_grid.py, make_realdata_fig.py</w:t>
+              <w:t>lebel_register.py, lebel_sampler.py, lebel_project.py, lebel_features.py, lebel_apply.py, lebel_eval.py</w:t>
             </w:r>
           </w:p>
         </w:tc>
@@ -23228,7 +24021,7 @@
                 <w:b w:val="false"/>
                 <w:sz w:val="20"/>
               </w:rPr>
-              <w:t>figures/</w:t>
+              <w:t>results/realdata_audio_text.json</w:t>
             </w:r>
           </w:p>
         </w:tc>
@@ -23258,6 +24051,86 @@
                 <w:b w:val="false"/>
                 <w:sz w:val="20"/>
               </w:rPr>
+              <w:t>Figures</w:t>
+            </w:r>
+          </w:p>
+        </w:tc>
+        <w:tc>
+          <w:tcPr>
+            <w:tcW w:w="4319" w:type="dxa"/>
+            <w:tcBorders>
+              <w:top w:val="single" w:sz="4" w:space="0" w:color="000000"/>
+              <w:left w:val="single" w:sz="4" w:space="0" w:color="000000"/>
+              <w:bottom w:val="single" w:sz="4" w:space="0" w:color="000000"/>
+              <w:right w:val="single" w:sz="4" w:space="0" w:color="000000"/>
+            </w:tcBorders>
+          </w:tcPr>
+          <w:p>
+            <w:pPr>
+              <w:pStyle w:val="Normal"/>
+              <w:spacing w:lineRule="auto" w:line="240" w:before="20" w:after="20"/>
+              <w:rPr/>
+            </w:pPr>
+            <w:r>
+              <w:rPr>
+                <w:b w:val="false"/>
+                <w:sz w:val="20"/>
+              </w:rPr>
+              <w:t>make_figures.py, make_roi_figs.py, make_brain_figs.py, make_topo_grid.py, make_realdata_fig.py</w:t>
+            </w:r>
+          </w:p>
+        </w:tc>
+        <w:tc>
+          <w:tcPr>
+            <w:tcW w:w="2305" w:type="dxa"/>
+            <w:tcBorders>
+              <w:top w:val="single" w:sz="4" w:space="0" w:color="000000"/>
+              <w:left w:val="single" w:sz="4" w:space="0" w:color="000000"/>
+              <w:bottom w:val="single" w:sz="4" w:space="0" w:color="000000"/>
+              <w:right w:val="single" w:sz="4" w:space="0" w:color="000000"/>
+            </w:tcBorders>
+          </w:tcPr>
+          <w:p>
+            <w:pPr>
+              <w:pStyle w:val="Normal"/>
+              <w:spacing w:lineRule="auto" w:line="240" w:before="20" w:after="20"/>
+              <w:rPr/>
+            </w:pPr>
+            <w:r>
+              <w:rPr>
+                <w:b w:val="false"/>
+                <w:sz w:val="20"/>
+              </w:rPr>
+              <w:t>figures/</w:t>
+            </w:r>
+          </w:p>
+        </w:tc>
+      </w:tr>
+      <w:tr>
+        <w:trPr>
+          <w:cantSplit w:val="true"/>
+        </w:trPr>
+        <w:tc>
+          <w:tcPr>
+            <w:tcW w:w="2304" w:type="dxa"/>
+            <w:tcBorders>
+              <w:top w:val="single" w:sz="4" w:space="0" w:color="000000"/>
+              <w:left w:val="single" w:sz="4" w:space="0" w:color="000000"/>
+              <w:bottom w:val="single" w:sz="4" w:space="0" w:color="000000"/>
+              <w:right w:val="single" w:sz="4" w:space="0" w:color="000000"/>
+            </w:tcBorders>
+          </w:tcPr>
+          <w:p>
+            <w:pPr>
+              <w:pStyle w:val="Normal"/>
+              <w:spacing w:lineRule="auto" w:line="240" w:before="20" w:after="20"/>
+              <w:rPr/>
+            </w:pPr>
+            <w:r>
+              <w:rPr>
+                <w:b w:val="false"/>
+                <w:sz w:val="20"/>
+              </w:rPr>
               <w:t>Demonstration video</w:t>
             </w:r>
           </w:p>
@@ -23336,7 +24209,7 @@
           <w:b w:val="false"/>
           <w:sz w:val="24"/>
         </w:rPr>
-        <w:t>Two Colab notebooks, Demo_and_Synthetic.ipynb and RealData_TextAudio.ipynb in the notebooks folder, run the full analyses on a free T4 GPU, step by step.</w:t>
+        <w:t>Four Colab notebooks in the notebooks folder run on a free T4 GPU, step by step: Demo_and_Synthetic.ipynb (all synthetic analyses), RealData_TextAudio.ipynb (the real-fMRI analysis), Live_Demo.ipynb (a ten-minute live inversion for demonstrations) and Verification_Tests.ipynb (the corrected barrier and sensitivity tests of Sections 8.3–8.4).</w:t>
       </w:r>
     </w:p>
     <w:sectPr>

</xml_diff>

<commit_message>
Barrier and sensitivity tests on four ground truths: update results, figures, report, poster, deck, demo, docs
</commit_message>
<xml_diff>
--- a/report/Report_Sarkar_Choudhuri_Project1.docx
+++ b/report/Report_Sarkar_Choudhuri_Project1.docx
@@ -2059,7 +2059,7 @@
             </w:rPr>
             <w:fldChar w:fldCharType="separate"/>
           </w:r>
-          <w:hyperlink w:anchor="__RefHeading___Toc2288_186613870">
+          <w:hyperlink w:anchor="__RefHeading___Toc2324_1187282842">
             <w:r>
               <w:rPr>
                 <w:webHidden/>
@@ -2080,7 +2080,7 @@
             </w:tabs>
             <w:rPr/>
           </w:pPr>
-          <w:hyperlink w:anchor="__RefHeading___Toc2290_186613870">
+          <w:hyperlink w:anchor="__RefHeading___Toc2326_1187282842">
             <w:r>
               <w:rPr>
                 <w:webHidden/>
@@ -2101,7 +2101,7 @@
             </w:tabs>
             <w:rPr/>
           </w:pPr>
-          <w:hyperlink w:anchor="__RefHeading___Toc2292_186613870">
+          <w:hyperlink w:anchor="__RefHeading___Toc2328_1187282842">
             <w:r>
               <w:rPr>
                 <w:webHidden/>
@@ -2122,7 +2122,7 @@
             </w:tabs>
             <w:rPr/>
           </w:pPr>
-          <w:hyperlink w:anchor="__RefHeading___Toc2294_186613870">
+          <w:hyperlink w:anchor="__RefHeading___Toc2330_1187282842">
             <w:r>
               <w:rPr>
                 <w:webHidden/>
@@ -2143,7 +2143,7 @@
             </w:tabs>
             <w:rPr/>
           </w:pPr>
-          <w:hyperlink w:anchor="__RefHeading___Toc2296_186613870">
+          <w:hyperlink w:anchor="__RefHeading___Toc2332_1187282842">
             <w:r>
               <w:rPr>
                 <w:webHidden/>
@@ -2164,7 +2164,7 @@
             </w:tabs>
             <w:rPr/>
           </w:pPr>
-          <w:hyperlink w:anchor="__RefHeading___Toc2298_186613870">
+          <w:hyperlink w:anchor="__RefHeading___Toc2334_1187282842">
             <w:r>
               <w:rPr>
                 <w:webHidden/>
@@ -2185,7 +2185,7 @@
             </w:tabs>
             <w:rPr/>
           </w:pPr>
-          <w:hyperlink w:anchor="__RefHeading___Toc2300_186613870">
+          <w:hyperlink w:anchor="__RefHeading___Toc2336_1187282842">
             <w:r>
               <w:rPr>
                 <w:webHidden/>
@@ -2206,7 +2206,7 @@
             </w:tabs>
             <w:rPr/>
           </w:pPr>
-          <w:hyperlink w:anchor="__RefHeading___Toc2302_186613870">
+          <w:hyperlink w:anchor="__RefHeading___Toc2338_1187282842">
             <w:r>
               <w:rPr>
                 <w:webHidden/>
@@ -2227,7 +2227,7 @@
             </w:tabs>
             <w:rPr/>
           </w:pPr>
-          <w:hyperlink w:anchor="__RefHeading___Toc2304_186613870">
+          <w:hyperlink w:anchor="__RefHeading___Toc2340_1187282842">
             <w:r>
               <w:rPr>
                 <w:webHidden/>
@@ -2248,7 +2248,7 @@
             </w:tabs>
             <w:rPr/>
           </w:pPr>
-          <w:hyperlink w:anchor="__RefHeading___Toc2306_186613870">
+          <w:hyperlink w:anchor="__RefHeading___Toc2342_1187282842">
             <w:r>
               <w:rPr>
                 <w:webHidden/>
@@ -2269,7 +2269,7 @@
             </w:tabs>
             <w:rPr/>
           </w:pPr>
-          <w:hyperlink w:anchor="__RefHeading___Toc2308_186613870">
+          <w:hyperlink w:anchor="__RefHeading___Toc2344_1187282842">
             <w:r>
               <w:rPr>
                 <w:webHidden/>
@@ -2290,7 +2290,7 @@
             </w:tabs>
             <w:rPr/>
           </w:pPr>
-          <w:hyperlink w:anchor="__RefHeading___Toc2310_186613870">
+          <w:hyperlink w:anchor="__RefHeading___Toc2346_1187282842">
             <w:r>
               <w:rPr>
                 <w:webHidden/>
@@ -2311,7 +2311,7 @@
             </w:tabs>
             <w:rPr/>
           </w:pPr>
-          <w:hyperlink w:anchor="__RefHeading___Toc2312_186613870">
+          <w:hyperlink w:anchor="__RefHeading___Toc2348_1187282842">
             <w:r>
               <w:rPr>
                 <w:webHidden/>
@@ -2332,7 +2332,7 @@
             </w:tabs>
             <w:rPr/>
           </w:pPr>
-          <w:hyperlink w:anchor="__RefHeading___Toc2314_186613870">
+          <w:hyperlink w:anchor="__RefHeading___Toc2350_1187282842">
             <w:r>
               <w:rPr>
                 <w:webHidden/>
@@ -2353,7 +2353,7 @@
             </w:tabs>
             <w:rPr/>
           </w:pPr>
-          <w:hyperlink w:anchor="__RefHeading___Toc2316_186613870">
+          <w:hyperlink w:anchor="__RefHeading___Toc2352_1187282842">
             <w:r>
               <w:rPr>
                 <w:webHidden/>
@@ -2374,7 +2374,7 @@
             </w:tabs>
             <w:rPr/>
           </w:pPr>
-          <w:hyperlink w:anchor="__RefHeading___Toc2318_186613870">
+          <w:hyperlink w:anchor="__RefHeading___Toc2354_1187282842">
             <w:r>
               <w:rPr>
                 <w:webHidden/>
@@ -2395,7 +2395,7 @@
             </w:tabs>
             <w:rPr/>
           </w:pPr>
-          <w:hyperlink w:anchor="__RefHeading___Toc2320_186613870">
+          <w:hyperlink w:anchor="__RefHeading___Toc2356_1187282842">
             <w:r>
               <w:rPr>
                 <w:webHidden/>
@@ -2416,7 +2416,7 @@
             </w:tabs>
             <w:rPr/>
           </w:pPr>
-          <w:hyperlink w:anchor="__RefHeading___Toc2322_186613870">
+          <w:hyperlink w:anchor="__RefHeading___Toc2358_1187282842">
             <w:r>
               <w:rPr>
                 <w:webHidden/>
@@ -2437,7 +2437,7 @@
             </w:tabs>
             <w:rPr/>
           </w:pPr>
-          <w:hyperlink w:anchor="__RefHeading___Toc2324_186613870">
+          <w:hyperlink w:anchor="__RefHeading___Toc2360_1187282842">
             <w:r>
               <w:rPr>
                 <w:webHidden/>
@@ -2458,7 +2458,7 @@
             </w:tabs>
             <w:rPr/>
           </w:pPr>
-          <w:hyperlink w:anchor="__RefHeading___Toc2326_186613870">
+          <w:hyperlink w:anchor="__RefHeading___Toc2362_1187282842">
             <w:r>
               <w:rPr>
                 <w:webHidden/>
@@ -2479,7 +2479,7 @@
             </w:tabs>
             <w:rPr/>
           </w:pPr>
-          <w:hyperlink w:anchor="__RefHeading___Toc2328_186613870">
+          <w:hyperlink w:anchor="__RefHeading___Toc2364_1187282842">
             <w:r>
               <w:rPr>
                 <w:webHidden/>
@@ -2500,7 +2500,7 @@
             </w:tabs>
             <w:rPr/>
           </w:pPr>
-          <w:hyperlink w:anchor="__RefHeading___Toc2330_186613870">
+          <w:hyperlink w:anchor="__RefHeading___Toc2366_1187282842">
             <w:r>
               <w:rPr>
                 <w:webHidden/>
@@ -2521,7 +2521,7 @@
             </w:tabs>
             <w:rPr/>
           </w:pPr>
-          <w:hyperlink w:anchor="__RefHeading___Toc2332_186613870">
+          <w:hyperlink w:anchor="__RefHeading___Toc2368_1187282842">
             <w:r>
               <w:rPr>
                 <w:webHidden/>
@@ -2542,7 +2542,7 @@
             </w:tabs>
             <w:rPr/>
           </w:pPr>
-          <w:hyperlink w:anchor="__RefHeading___Toc2334_186613870">
+          <w:hyperlink w:anchor="__RefHeading___Toc2370_1187282842">
             <w:r>
               <w:rPr>
                 <w:webHidden/>
@@ -2563,7 +2563,7 @@
             </w:tabs>
             <w:rPr/>
           </w:pPr>
-          <w:hyperlink w:anchor="__RefHeading___Toc2336_186613870">
+          <w:hyperlink w:anchor="__RefHeading___Toc2372_1187282842">
             <w:r>
               <w:rPr>
                 <w:webHidden/>
@@ -2584,7 +2584,7 @@
             </w:tabs>
             <w:rPr/>
           </w:pPr>
-          <w:hyperlink w:anchor="__RefHeading___Toc2338_186613870">
+          <w:hyperlink w:anchor="__RefHeading___Toc2374_1187282842">
             <w:r>
               <w:rPr>
                 <w:webHidden/>
@@ -2605,7 +2605,7 @@
             </w:tabs>
             <w:rPr/>
           </w:pPr>
-          <w:hyperlink w:anchor="__RefHeading___Toc2340_186613870">
+          <w:hyperlink w:anchor="__RefHeading___Toc2376_1187282842">
             <w:r>
               <w:rPr>
                 <w:webHidden/>
@@ -2613,7 +2613,7 @@
               </w:rPr>
               <w:t>8.4 Errors lie in the operator's weakest directions</w:t>
               <w:tab/>
-              <w:t>16</w:t>
+              <w:t>17</w:t>
             </w:r>
           </w:hyperlink>
         </w:p>
@@ -2626,7 +2626,7 @@
             </w:tabs>
             <w:rPr/>
           </w:pPr>
-          <w:hyperlink w:anchor="__RefHeading___Toc2342_186613870">
+          <w:hyperlink w:anchor="__RefHeading___Toc2378_1187282842">
             <w:r>
               <w:rPr>
                 <w:webHidden/>
@@ -2647,7 +2647,7 @@
             </w:tabs>
             <w:rPr/>
           </w:pPr>
-          <w:hyperlink w:anchor="__RefHeading___Toc2344_186613870">
+          <w:hyperlink w:anchor="__RefHeading___Toc2380_1187282842">
             <w:r>
               <w:rPr>
                 <w:webHidden/>
@@ -2655,7 +2655,7 @@
               </w:rPr>
               <w:t>8.6 Predictable is not recoverable, region by region</w:t>
               <w:tab/>
-              <w:t>19</w:t>
+              <w:t>20</w:t>
             </w:r>
           </w:hyperlink>
         </w:p>
@@ -2668,7 +2668,7 @@
             </w:tabs>
             <w:rPr/>
           </w:pPr>
-          <w:hyperlink w:anchor="__RefHeading___Toc2346_186613870">
+          <w:hyperlink w:anchor="__RefHeading___Toc2382_1187282842">
             <w:r>
               <w:rPr>
                 <w:webHidden/>
@@ -2676,7 +2676,7 @@
               </w:rPr>
               <w:t>8.7 Real fMRI</w:t>
               <w:tab/>
-              <w:t>21</w:t>
+              <w:t>22</w:t>
             </w:r>
           </w:hyperlink>
         </w:p>
@@ -2689,7 +2689,7 @@
             </w:tabs>
             <w:rPr/>
           </w:pPr>
-          <w:hyperlink w:anchor="__RefHeading___Toc2348_186613870">
+          <w:hyperlink w:anchor="__RefHeading___Toc2384_1187282842">
             <w:r>
               <w:rPr>
                 <w:webHidden/>
@@ -2697,7 +2697,7 @@
               </w:rPr>
               <w:t>8.8 Discussion</w:t>
               <w:tab/>
-              <w:t>22</w:t>
+              <w:t>23</w:t>
             </w:r>
           </w:hyperlink>
         </w:p>
@@ -2710,7 +2710,7 @@
             </w:tabs>
             <w:rPr/>
           </w:pPr>
-          <w:hyperlink w:anchor="__RefHeading___Toc2350_186613870">
+          <w:hyperlink w:anchor="__RefHeading___Toc2386_1187282842">
             <w:r>
               <w:rPr>
                 <w:webHidden/>
@@ -2731,7 +2731,7 @@
             </w:tabs>
             <w:rPr/>
           </w:pPr>
-          <w:hyperlink w:anchor="__RefHeading___Toc2352_186613870">
+          <w:hyperlink w:anchor="__RefHeading___Toc2388_1187282842">
             <w:r>
               <w:rPr>
                 <w:webHidden/>
@@ -2752,7 +2752,7 @@
             </w:tabs>
             <w:rPr/>
           </w:pPr>
-          <w:hyperlink w:anchor="__RefHeading___Toc2354_186613870">
+          <w:hyperlink w:anchor="__RefHeading___Toc2390_1187282842">
             <w:r>
               <w:rPr>
                 <w:webHidden/>
@@ -2773,7 +2773,7 @@
             </w:tabs>
             <w:rPr/>
           </w:pPr>
-          <w:hyperlink w:anchor="__RefHeading___Toc2356_186613870">
+          <w:hyperlink w:anchor="__RefHeading___Toc2392_1187282842">
             <w:r>
               <w:rPr>
                 <w:webHidden/>
@@ -2794,7 +2794,7 @@
             </w:tabs>
             <w:rPr/>
           </w:pPr>
-          <w:hyperlink w:anchor="__RefHeading___Toc2358_186613870">
+          <w:hyperlink w:anchor="__RefHeading___Toc2394_1187282842">
             <w:r>
               <w:rPr>
                 <w:webHidden/>
@@ -2815,7 +2815,7 @@
             </w:tabs>
             <w:rPr/>
           </w:pPr>
-          <w:hyperlink w:anchor="__RefHeading___Toc2360_186613870">
+          <w:hyperlink w:anchor="__RefHeading___Toc2396_1187282842">
             <w:r>
               <w:rPr>
                 <w:webHidden/>
@@ -2836,7 +2836,7 @@
             </w:tabs>
             <w:rPr/>
           </w:pPr>
-          <w:hyperlink w:anchor="__RefHeading___Toc2362_186613870">
+          <w:hyperlink w:anchor="__RefHeading___Toc2398_1187282842">
             <w:r>
               <w:rPr>
                 <w:webHidden/>
@@ -2857,7 +2857,7 @@
             </w:tabs>
             <w:rPr/>
           </w:pPr>
-          <w:hyperlink w:anchor="__RefHeading___Toc2364_186613870">
+          <w:hyperlink w:anchor="__RefHeading___Toc2400_1187282842">
             <w:r>
               <w:rPr>
                 <w:webHidden/>
@@ -2878,7 +2878,7 @@
             </w:tabs>
             <w:rPr/>
           </w:pPr>
-          <w:hyperlink w:anchor="__RefHeading___Toc2366_186613870">
+          <w:hyperlink w:anchor="__RefHeading___Toc2402_1187282842">
             <w:r>
               <w:rPr>
                 <w:webHidden/>
@@ -2950,7 +2950,7 @@
             </w:rPr>
             <w:fldChar w:fldCharType="separate"/>
           </w:r>
-          <w:hyperlink w:anchor="__RefHeading___Toc2368_186613870">
+          <w:hyperlink w:anchor="__RefHeading___Toc2404_1187282842">
             <w:r>
               <w:rPr>
                 <w:webHidden/>
@@ -2971,7 +2971,7 @@
             </w:tabs>
             <w:rPr/>
           </w:pPr>
-          <w:hyperlink w:anchor="__RefHeading___Toc2398_186613870">
+          <w:hyperlink w:anchor="__RefHeading___Toc2434_1187282842">
             <w:r>
               <w:rPr>
                 <w:webHidden/>
@@ -2992,7 +2992,7 @@
             </w:tabs>
             <w:rPr/>
           </w:pPr>
-          <w:hyperlink w:anchor="__RefHeading___Toc2396_186613870">
+          <w:hyperlink w:anchor="__RefHeading___Toc2432_1187282842">
             <w:r>
               <w:rPr>
                 <w:webHidden/>
@@ -3013,7 +3013,7 @@
             </w:tabs>
             <w:rPr/>
           </w:pPr>
-          <w:hyperlink w:anchor="__RefHeading___Toc2394_186613870">
+          <w:hyperlink w:anchor="__RefHeading___Toc2430_1187282842">
             <w:r>
               <w:rPr>
                 <w:webHidden/>
@@ -3034,13 +3034,13 @@
             </w:tabs>
             <w:rPr/>
           </w:pPr>
-          <w:hyperlink w:anchor="__RefHeading___Toc2392_186613870">
+          <w:hyperlink w:anchor="__RefHeading___Toc2428_1187282842">
             <w:r>
               <w:rPr>
                 <w:webHidden/>
                 <w:rStyle w:val="IndexLink"/>
               </w:rPr>
-              <w:t>Figure 8.4: Directional sensitivity of the operator in the original run: solution-difference directions against 200 random directions (the corrected pair gives 2.1×)</w:t>
+              <w:t>Figure 8.4: Directional sensitivity of the operator in the original run: solution-difference directions against 200 random directions (the corrected pairs give 2.15 ± 0.17× over four truths)</w:t>
               <w:tab/>
               <w:t>17</w:t>
             </w:r>
@@ -3055,7 +3055,7 @@
             </w:tabs>
             <w:rPr/>
           </w:pPr>
-          <w:hyperlink w:anchor="__RefHeading___Toc2390_186613870">
+          <w:hyperlink w:anchor="__RefHeading___Toc2426_1187282842">
             <w:r>
               <w:rPr>
                 <w:webHidden/>
@@ -3063,7 +3063,7 @@
               </w:rPr>
               <w:t>Figure 8.5: Output change under rescaling of the ground truth relative to the optimiser's noise floor</w:t>
               <w:tab/>
-              <w:t>17</w:t>
+              <w:t>18</w:t>
             </w:r>
           </w:hyperlink>
         </w:p>
@@ -3076,7 +3076,7 @@
             </w:tabs>
             <w:rPr/>
           </w:pPr>
-          <w:hyperlink w:anchor="__RefHeading___Toc2388_186613870">
+          <w:hyperlink w:anchor="__RefHeading___Toc2424_1187282842">
             <w:r>
               <w:rPr>
                 <w:webHidden/>
@@ -3097,7 +3097,7 @@
             </w:tabs>
             <w:rPr/>
           </w:pPr>
-          <w:hyperlink w:anchor="__RefHeading___Toc2386_186613870">
+          <w:hyperlink w:anchor="__RefHeading___Toc2422_1187282842">
             <w:r>
               <w:rPr>
                 <w:webHidden/>
@@ -3118,7 +3118,7 @@
             </w:tabs>
             <w:rPr/>
           </w:pPr>
-          <w:hyperlink w:anchor="__RefHeading___Toc2384_186613870">
+          <w:hyperlink w:anchor="__RefHeading___Toc2420_1187282842">
             <w:r>
               <w:rPr>
                 <w:webHidden/>
@@ -3126,7 +3126,7 @@
               </w:rPr>
               <w:t>Figure 8.8: Effect of ℓ₂ and temporal-smoothness priors in the under-determined regime (500 vertices)</w:t>
               <w:tab/>
-              <w:t>18</w:t>
+              <w:t>19</w:t>
             </w:r>
           </w:hyperlink>
         </w:p>
@@ -3139,7 +3139,7 @@
             </w:tabs>
             <w:rPr/>
           </w:pPr>
-          <w:hyperlink w:anchor="__RefHeading___Toc2382_186613870">
+          <w:hyperlink w:anchor="__RefHeading___Toc2418_1187282842">
             <w:r>
               <w:rPr>
                 <w:webHidden/>
@@ -3160,7 +3160,7 @@
             </w:tabs>
             <w:rPr/>
           </w:pPr>
-          <w:hyperlink w:anchor="__RefHeading___Toc2380_186613870">
+          <w:hyperlink w:anchor="__RefHeading___Toc2416_1187282842">
             <w:r>
               <w:rPr>
                 <w:webHidden/>
@@ -3181,7 +3181,7 @@
             </w:tabs>
             <w:rPr/>
           </w:pPr>
-          <w:hyperlink w:anchor="__RefHeading___Toc2378_186613870">
+          <w:hyperlink w:anchor="__RefHeading___Toc2414_1187282842">
             <w:r>
               <w:rPr>
                 <w:webHidden/>
@@ -3202,7 +3202,7 @@
             </w:tabs>
             <w:rPr/>
           </w:pPr>
-          <w:hyperlink w:anchor="__RefHeading___Toc2376_186613870">
+          <w:hyperlink w:anchor="__RefHeading___Toc2412_1187282842">
             <w:r>
               <w:rPr>
                 <w:webHidden/>
@@ -3210,7 +3210,7 @@
               </w:rPr>
               <w:t>Figure 8.12: Recovery from each network versus size-matched random vertex sets</w:t>
               <w:tab/>
-              <w:t>20</w:t>
+              <w:t>21</w:t>
             </w:r>
           </w:hyperlink>
         </w:p>
@@ -3223,7 +3223,7 @@
             </w:tabs>
             <w:rPr/>
           </w:pPr>
-          <w:hyperlink w:anchor="__RefHeading___Toc2374_186613870">
+          <w:hyperlink w:anchor="__RefHeading___Toc2410_1187282842">
             <w:r>
               <w:rPr>
                 <w:webHidden/>
@@ -3244,7 +3244,7 @@
             </w:tabs>
             <w:rPr/>
           </w:pPr>
-          <w:hyperlink w:anchor="__RefHeading___Toc2372_186613870">
+          <w:hyperlink w:anchor="__RefHeading___Toc2408_1187282842">
             <w:r>
               <w:rPr>
                 <w:webHidden/>
@@ -3265,7 +3265,7 @@
             </w:tabs>
             <w:rPr/>
           </w:pPr>
-          <w:hyperlink w:anchor="__RefHeading___Toc2370_186613870">
+          <w:hyperlink w:anchor="__RefHeading___Toc2406_1187282842">
             <w:r>
               <w:rPr>
                 <w:webHidden/>
@@ -3337,7 +3337,7 @@
             </w:rPr>
             <w:fldChar w:fldCharType="separate"/>
           </w:r>
-          <w:hyperlink w:anchor="__RefHeading___Toc2400_186613870">
+          <w:hyperlink w:anchor="__RefHeading___Toc2436_1187282842">
             <w:r>
               <w:rPr>
                 <w:webHidden/>
@@ -3358,7 +3358,7 @@
             </w:tabs>
             <w:rPr/>
           </w:pPr>
-          <w:hyperlink w:anchor="__RefHeading___Toc2436_186613870">
+          <w:hyperlink w:anchor="__RefHeading___Toc2472_1187282842">
             <w:r>
               <w:rPr>
                 <w:webHidden/>
@@ -3379,7 +3379,7 @@
             </w:tabs>
             <w:rPr/>
           </w:pPr>
-          <w:hyperlink w:anchor="__RefHeading___Toc2434_186613870">
+          <w:hyperlink w:anchor="__RefHeading___Toc2470_1187282842">
             <w:r>
               <w:rPr>
                 <w:webHidden/>
@@ -3400,7 +3400,7 @@
             </w:tabs>
             <w:rPr/>
           </w:pPr>
-          <w:hyperlink w:anchor="__RefHeading___Toc2432_186613870">
+          <w:hyperlink w:anchor="__RefHeading___Toc2468_1187282842">
             <w:r>
               <w:rPr>
                 <w:webHidden/>
@@ -3421,7 +3421,7 @@
             </w:tabs>
             <w:rPr/>
           </w:pPr>
-          <w:hyperlink w:anchor="__RefHeading___Toc2430_186613870">
+          <w:hyperlink w:anchor="__RefHeading___Toc2466_1187282842">
             <w:r>
               <w:rPr>
                 <w:webHidden/>
@@ -3442,7 +3442,7 @@
             </w:tabs>
             <w:rPr/>
           </w:pPr>
-          <w:hyperlink w:anchor="__RefHeading___Toc2428_186613870">
+          <w:hyperlink w:anchor="__RefHeading___Toc2464_1187282842">
             <w:r>
               <w:rPr>
                 <w:webHidden/>
@@ -3463,7 +3463,7 @@
             </w:tabs>
             <w:rPr/>
           </w:pPr>
-          <w:hyperlink w:anchor="__RefHeading___Toc2426_186613870">
+          <w:hyperlink w:anchor="__RefHeading___Toc2462_1187282842">
             <w:r>
               <w:rPr>
                 <w:webHidden/>
@@ -3484,7 +3484,7 @@
             </w:tabs>
             <w:rPr/>
           </w:pPr>
-          <w:hyperlink w:anchor="__RefHeading___Toc2424_186613870">
+          <w:hyperlink w:anchor="__RefHeading___Toc2460_1187282842">
             <w:r>
               <w:rPr>
                 <w:webHidden/>
@@ -3505,7 +3505,7 @@
             </w:tabs>
             <w:rPr/>
           </w:pPr>
-          <w:hyperlink w:anchor="__RefHeading___Toc2422_186613870">
+          <w:hyperlink w:anchor="__RefHeading___Toc2458_1187282842">
             <w:r>
               <w:rPr>
                 <w:webHidden/>
@@ -3526,7 +3526,7 @@
             </w:tabs>
             <w:rPr/>
           </w:pPr>
-          <w:hyperlink w:anchor="__RefHeading___Toc2420_186613870">
+          <w:hyperlink w:anchor="__RefHeading___Toc2456_1187282842">
             <w:r>
               <w:rPr>
                 <w:webHidden/>
@@ -3547,7 +3547,7 @@
             </w:tabs>
             <w:rPr/>
           </w:pPr>
-          <w:hyperlink w:anchor="__RefHeading___Toc2418_186613870">
+          <w:hyperlink w:anchor="__RefHeading___Toc2454_1187282842">
             <w:r>
               <w:rPr>
                 <w:webHidden/>
@@ -3568,7 +3568,7 @@
             </w:tabs>
             <w:rPr/>
           </w:pPr>
-          <w:hyperlink w:anchor="__RefHeading___Toc2416_186613870">
+          <w:hyperlink w:anchor="__RefHeading___Toc2452_1187282842">
             <w:r>
               <w:rPr>
                 <w:webHidden/>
@@ -3589,13 +3589,13 @@
             </w:tabs>
             <w:rPr/>
           </w:pPr>
-          <w:hyperlink w:anchor="__RefHeading___Toc2414_186613870">
+          <w:hyperlink w:anchor="__RefHeading___Toc2450_1187282842">
             <w:r>
               <w:rPr>
                 <w:webHidden/>
                 <w:rStyle w:val="IndexLink"/>
               </w:rPr>
-              <w:t>Table 8.3: Straight-path barrier between fit-matched blind solutions (ground truth 0, 14 000 steps)</w:t>
+              <w:t>Table 8.3: Straight-path barrier between fit-matched blind solutions: all ten pairs for ground truth 0, and the summary over four ground truths (14 000 steps)</w:t>
               <w:tab/>
               <w:t>16</w:t>
             </w:r>
@@ -3610,7 +3610,7 @@
             </w:tabs>
             <w:rPr/>
           </w:pPr>
-          <w:hyperlink w:anchor="__RefHeading___Toc2412_186613870">
+          <w:hyperlink w:anchor="__RefHeading___Toc2448_1187282842">
             <w:r>
               <w:rPr>
                 <w:webHidden/>
@@ -3631,7 +3631,7 @@
             </w:tabs>
             <w:rPr/>
           </w:pPr>
-          <w:hyperlink w:anchor="__RefHeading___Toc2410_186613870">
+          <w:hyperlink w:anchor="__RefHeading___Toc2446_1187282842">
             <w:r>
               <w:rPr>
                 <w:webHidden/>
@@ -3639,7 +3639,7 @@
               </w:rPr>
               <w:t>Table 8.5: Network sensitivity and recoverability (synthetic, 8 000 steps)</w:t>
               <w:tab/>
-              <w:t>21</w:t>
+              <w:t>22</w:t>
             </w:r>
           </w:hyperlink>
         </w:p>
@@ -3652,7 +3652,7 @@
             </w:tabs>
             <w:rPr/>
           </w:pPr>
-          <w:hyperlink w:anchor="__RefHeading___Toc2408_186613870">
+          <w:hyperlink w:anchor="__RefHeading___Toc2444_1187282842">
             <w:r>
               <w:rPr>
                 <w:webHidden/>
@@ -3673,7 +3673,7 @@
             </w:tabs>
             <w:rPr/>
           </w:pPr>
-          <w:hyperlink w:anchor="__RefHeading___Toc2406_186613870">
+          <w:hyperlink w:anchor="__RefHeading___Toc2442_1187282842">
             <w:r>
               <w:rPr>
                 <w:webHidden/>
@@ -3694,7 +3694,7 @@
             </w:tabs>
             <w:rPr/>
           </w:pPr>
-          <w:hyperlink w:anchor="__RefHeading___Toc2404_186613870">
+          <w:hyperlink w:anchor="__RefHeading___Toc2440_1187282842">
             <w:r>
               <w:rPr>
                 <w:webHidden/>
@@ -3715,7 +3715,7 @@
             </w:tabs>
             <w:rPr/>
           </w:pPr>
-          <w:hyperlink w:anchor="__RefHeading___Toc2402_186613870">
+          <w:hyperlink w:anchor="__RefHeading___Toc2438_1187282842">
             <w:r>
               <w:rPr>
                 <w:webHidden/>
@@ -4625,7 +4625,7 @@
         <w:pStyle w:val="Heading1"/>
         <w:rPr/>
       </w:pPr>
-      <w:bookmarkStart w:id="2" w:name="__RefHeading___Toc2288_186613870"/>
+      <w:bookmarkStart w:id="2" w:name="__RefHeading___Toc2324_1187282842"/>
       <w:bookmarkEnd w:id="2"/>
       <w:r>
         <w:rPr/>
@@ -4682,7 +4682,7 @@
         <w:pStyle w:val="Heading2"/>
         <w:rPr/>
       </w:pPr>
-      <w:bookmarkStart w:id="3" w:name="__RefHeading___Toc2290_186613870"/>
+      <w:bookmarkStart w:id="3" w:name="__RefHeading___Toc2326_1187282842"/>
       <w:bookmarkEnd w:id="3"/>
       <w:r>
         <w:rPr/>
@@ -4760,7 +4760,7 @@
         <w:pStyle w:val="TableCaption"/>
         <w:rPr/>
       </w:pPr>
-      <w:bookmarkStart w:id="4" w:name="__RefHeading___Toc2400_186613870"/>
+      <w:bookmarkStart w:id="4" w:name="__RefHeading___Toc2436_1187282842"/>
       <w:bookmarkEnd w:id="4"/>
       <w:r>
         <w:rPr>
@@ -5692,7 +5692,7 @@
         <w:pStyle w:val="Heading2"/>
         <w:rPr/>
       </w:pPr>
-      <w:bookmarkStart w:id="5" w:name="__RefHeading___Toc2292_186613870"/>
+      <w:bookmarkStart w:id="5" w:name="__RefHeading___Toc2328_1187282842"/>
       <w:bookmarkEnd w:id="5"/>
       <w:r>
         <w:rPr/>
@@ -5719,7 +5719,7 @@
         <w:pStyle w:val="TableCaption"/>
         <w:rPr/>
       </w:pPr>
-      <w:bookmarkStart w:id="6" w:name="__RefHeading___Toc2436_186613870"/>
+      <w:bookmarkStart w:id="6" w:name="__RefHeading___Toc2472_1187282842"/>
       <w:bookmarkEnd w:id="6"/>
       <w:r>
         <w:rPr>
@@ -6845,7 +6845,7 @@
         <w:pStyle w:val="Heading2"/>
         <w:rPr/>
       </w:pPr>
-      <w:bookmarkStart w:id="7" w:name="__RefHeading___Toc2294_186613870"/>
+      <w:bookmarkStart w:id="7" w:name="__RefHeading___Toc2330_1187282842"/>
       <w:bookmarkEnd w:id="7"/>
       <w:r>
         <w:rPr/>
@@ -6875,7 +6875,7 @@
         <w:pStyle w:val="Heading1"/>
         <w:rPr/>
       </w:pPr>
-      <w:bookmarkStart w:id="8" w:name="__RefHeading___Toc2296_186613870"/>
+      <w:bookmarkStart w:id="8" w:name="__RefHeading___Toc2332_1187282842"/>
       <w:bookmarkEnd w:id="8"/>
       <w:r>
         <w:rPr/>
@@ -7013,7 +7013,7 @@
         <w:pStyle w:val="Heading1"/>
         <w:rPr/>
       </w:pPr>
-      <w:bookmarkStart w:id="9" w:name="__RefHeading___Toc2298_186613870"/>
+      <w:bookmarkStart w:id="9" w:name="__RefHeading___Toc2334_1187282842"/>
       <w:bookmarkEnd w:id="9"/>
       <w:r>
         <w:rPr/>
@@ -7025,7 +7025,7 @@
         <w:pStyle w:val="TableCaption"/>
         <w:rPr/>
       </w:pPr>
-      <w:bookmarkStart w:id="10" w:name="__RefHeading___Toc2434_186613870"/>
+      <w:bookmarkStart w:id="10" w:name="__RefHeading___Toc2470_1187282842"/>
       <w:bookmarkEnd w:id="10"/>
       <w:r>
         <w:rPr>
@@ -7415,7 +7415,7 @@
         <w:pStyle w:val="Heading1"/>
         <w:rPr/>
       </w:pPr>
-      <w:bookmarkStart w:id="11" w:name="__RefHeading___Toc2300_186613870"/>
+      <w:bookmarkStart w:id="11" w:name="__RefHeading___Toc2336_1187282842"/>
       <w:bookmarkEnd w:id="11"/>
       <w:r>
         <w:rPr/>
@@ -7491,7 +7491,7 @@
         <w:pStyle w:val="FigureCaption"/>
         <w:rPr/>
       </w:pPr>
-      <w:bookmarkStart w:id="12" w:name="__RefHeading___Toc2368_186613870"/>
+      <w:bookmarkStart w:id="12" w:name="__RefHeading___Toc2404_1187282842"/>
       <w:bookmarkEnd w:id="12"/>
       <w:r>
         <w:rPr>
@@ -7506,7 +7506,7 @@
         <w:pStyle w:val="Heading2"/>
         <w:rPr/>
       </w:pPr>
-      <w:bookmarkStart w:id="13" w:name="__RefHeading___Toc2302_186613870"/>
+      <w:bookmarkStart w:id="13" w:name="__RefHeading___Toc2338_1187282842"/>
       <w:bookmarkEnd w:id="13"/>
       <w:r>
         <w:rPr/>
@@ -7518,7 +7518,7 @@
         <w:pStyle w:val="Heading3"/>
         <w:rPr/>
       </w:pPr>
-      <w:bookmarkStart w:id="14" w:name="__RefHeading___Toc2304_186613870"/>
+      <w:bookmarkStart w:id="14" w:name="__RefHeading___Toc2340_1187282842"/>
       <w:bookmarkEnd w:id="14"/>
       <w:r>
         <w:rPr/>
@@ -7545,7 +7545,7 @@
         <w:pStyle w:val="Heading3"/>
         <w:rPr/>
       </w:pPr>
-      <w:bookmarkStart w:id="15" w:name="__RefHeading___Toc2306_186613870"/>
+      <w:bookmarkStart w:id="15" w:name="__RefHeading___Toc2342_1187282842"/>
       <w:bookmarkEnd w:id="15"/>
       <w:r>
         <w:rPr/>
@@ -7572,7 +7572,7 @@
         <w:pStyle w:val="TableCaption"/>
         <w:rPr/>
       </w:pPr>
-      <w:bookmarkStart w:id="16" w:name="__RefHeading___Toc2432_186613870"/>
+      <w:bookmarkStart w:id="16" w:name="__RefHeading___Toc2468_1187282842"/>
       <w:bookmarkEnd w:id="16"/>
       <w:r>
         <w:rPr>
@@ -8603,7 +8603,7 @@
         <w:pStyle w:val="TableCaption"/>
         <w:rPr/>
       </w:pPr>
-      <w:bookmarkStart w:id="17" w:name="__RefHeading___Toc2430_186613870"/>
+      <w:bookmarkStart w:id="17" w:name="__RefHeading___Toc2466_1187282842"/>
       <w:bookmarkEnd w:id="17"/>
       <w:r>
         <w:rPr>
@@ -9468,7 +9468,7 @@
         <w:pStyle w:val="Heading3"/>
         <w:rPr/>
       </w:pPr>
-      <w:bookmarkStart w:id="18" w:name="__RefHeading___Toc2308_186613870"/>
+      <w:bookmarkStart w:id="18" w:name="__RefHeading___Toc2344_1187282842"/>
       <w:bookmarkEnd w:id="18"/>
       <w:r>
         <w:rPr/>
@@ -9495,7 +9495,7 @@
         <w:pStyle w:val="TableCaption"/>
         <w:rPr/>
       </w:pPr>
-      <w:bookmarkStart w:id="19" w:name="__RefHeading___Toc2428_186613870"/>
+      <w:bookmarkStart w:id="19" w:name="__RefHeading___Toc2464_1187282842"/>
       <w:bookmarkEnd w:id="19"/>
       <w:r>
         <w:rPr>
@@ -10209,7 +10209,7 @@
         <w:pStyle w:val="Heading3"/>
         <w:rPr/>
       </w:pPr>
-      <w:bookmarkStart w:id="20" w:name="__RefHeading___Toc2310_186613870"/>
+      <w:bookmarkStart w:id="20" w:name="__RefHeading___Toc2346_1187282842"/>
       <w:bookmarkEnd w:id="20"/>
       <w:r>
         <w:rPr/>
@@ -10267,7 +10267,7 @@
         <w:pStyle w:val="Heading2"/>
         <w:rPr/>
       </w:pPr>
-      <w:bookmarkStart w:id="21" w:name="__RefHeading___Toc2312_186613870"/>
+      <w:bookmarkStart w:id="21" w:name="__RefHeading___Toc2348_1187282842"/>
       <w:bookmarkEnd w:id="21"/>
       <w:r>
         <w:rPr/>
@@ -10279,7 +10279,7 @@
         <w:pStyle w:val="TableCaption"/>
         <w:rPr/>
       </w:pPr>
-      <w:bookmarkStart w:id="22" w:name="__RefHeading___Toc2426_186613870"/>
+      <w:bookmarkStart w:id="22" w:name="__RefHeading___Toc2462_1187282842"/>
       <w:bookmarkEnd w:id="22"/>
       <w:r>
         <w:rPr>
@@ -10891,7 +10891,7 @@
         <w:pStyle w:val="Heading2"/>
         <w:rPr/>
       </w:pPr>
-      <w:bookmarkStart w:id="23" w:name="__RefHeading___Toc2314_186613870"/>
+      <w:bookmarkStart w:id="23" w:name="__RefHeading___Toc2350_1187282842"/>
       <w:bookmarkEnd w:id="23"/>
       <w:r>
         <w:rPr/>
@@ -10918,7 +10918,7 @@
         <w:pStyle w:val="TableCaption"/>
         <w:rPr/>
       </w:pPr>
-      <w:bookmarkStart w:id="24" w:name="__RefHeading___Toc2424_186613870"/>
+      <w:bookmarkStart w:id="24" w:name="__RefHeading___Toc2460_1187282842"/>
       <w:bookmarkEnd w:id="24"/>
       <w:r>
         <w:rPr>
@@ -11533,7 +11533,7 @@
         <w:pStyle w:val="Heading1"/>
         <w:rPr/>
       </w:pPr>
-      <w:bookmarkStart w:id="25" w:name="__RefHeading___Toc2316_186613870"/>
+      <w:bookmarkStart w:id="25" w:name="__RefHeading___Toc2352_1187282842"/>
       <w:bookmarkEnd w:id="25"/>
       <w:r>
         <w:rPr/>
@@ -11560,7 +11560,7 @@
         <w:pStyle w:val="Heading2"/>
         <w:rPr/>
       </w:pPr>
-      <w:bookmarkStart w:id="26" w:name="__RefHeading___Toc2318_186613870"/>
+      <w:bookmarkStart w:id="26" w:name="__RefHeading___Toc2354_1187282842"/>
       <w:bookmarkEnd w:id="26"/>
       <w:r>
         <w:rPr/>
@@ -11587,7 +11587,7 @@
         <w:pStyle w:val="Heading2"/>
         <w:rPr/>
       </w:pPr>
-      <w:bookmarkStart w:id="27" w:name="__RefHeading___Toc2320_186613870"/>
+      <w:bookmarkStart w:id="27" w:name="__RefHeading___Toc2356_1187282842"/>
       <w:bookmarkEnd w:id="27"/>
       <w:r>
         <w:rPr/>
@@ -11630,7 +11630,7 @@
         <w:pStyle w:val="Heading2"/>
         <w:rPr/>
       </w:pPr>
-      <w:bookmarkStart w:id="28" w:name="__RefHeading___Toc2322_186613870"/>
+      <w:bookmarkStart w:id="28" w:name="__RefHeading___Toc2358_1187282842"/>
       <w:bookmarkEnd w:id="28"/>
       <w:r>
         <w:rPr/>
@@ -11657,7 +11657,7 @@
         <w:pStyle w:val="Heading2"/>
         <w:rPr/>
       </w:pPr>
-      <w:bookmarkStart w:id="29" w:name="__RefHeading___Toc2324_186613870"/>
+      <w:bookmarkStart w:id="29" w:name="__RefHeading___Toc2360_1187282842"/>
       <w:bookmarkEnd w:id="29"/>
       <w:r>
         <w:rPr/>
@@ -11684,7 +11684,7 @@
         <w:pStyle w:val="Heading2"/>
         <w:rPr/>
       </w:pPr>
-      <w:bookmarkStart w:id="30" w:name="__RefHeading___Toc2326_186613870"/>
+      <w:bookmarkStart w:id="30" w:name="__RefHeading___Toc2362_1187282842"/>
       <w:bookmarkEnd w:id="30"/>
       <w:r>
         <w:rPr/>
@@ -11787,7 +11787,7 @@
         <w:pStyle w:val="Heading1"/>
         <w:rPr/>
       </w:pPr>
-      <w:bookmarkStart w:id="31" w:name="__RefHeading___Toc2328_186613870"/>
+      <w:bookmarkStart w:id="31" w:name="__RefHeading___Toc2364_1187282842"/>
       <w:bookmarkEnd w:id="31"/>
       <w:r>
         <w:rPr/>
@@ -11799,7 +11799,7 @@
         <w:pStyle w:val="TableCaption"/>
         <w:rPr/>
       </w:pPr>
-      <w:bookmarkStart w:id="32" w:name="__RefHeading___Toc2422_186613870"/>
+      <w:bookmarkStart w:id="32" w:name="__RefHeading___Toc2458_1187282842"/>
       <w:bookmarkEnd w:id="32"/>
       <w:r>
         <w:rPr>
@@ -12589,7 +12589,7 @@
         <w:pStyle w:val="Heading1"/>
         <w:rPr/>
       </w:pPr>
-      <w:bookmarkStart w:id="33" w:name="__RefHeading___Toc2330_186613870"/>
+      <w:bookmarkStart w:id="33" w:name="__RefHeading___Toc2366_1187282842"/>
       <w:bookmarkEnd w:id="33"/>
       <w:r>
         <w:rPr/>
@@ -12601,7 +12601,7 @@
         <w:pStyle w:val="TableCaption"/>
         <w:rPr/>
       </w:pPr>
-      <w:bookmarkStart w:id="34" w:name="__RefHeading___Toc2420_186613870"/>
+      <w:bookmarkStart w:id="34" w:name="__RefHeading___Toc2456_1187282842"/>
       <w:bookmarkEnd w:id="34"/>
       <w:r>
         <w:rPr>
@@ -13535,7 +13535,7 @@
         <w:pStyle w:val="Heading1"/>
         <w:rPr/>
       </w:pPr>
-      <w:bookmarkStart w:id="35" w:name="__RefHeading___Toc2332_186613870"/>
+      <w:bookmarkStart w:id="35" w:name="__RefHeading___Toc2368_1187282842"/>
       <w:bookmarkEnd w:id="35"/>
       <w:r>
         <w:rPr/>
@@ -13547,7 +13547,7 @@
         <w:pStyle w:val="Heading2"/>
         <w:rPr/>
       </w:pPr>
-      <w:bookmarkStart w:id="36" w:name="__RefHeading___Toc2334_186613870"/>
+      <w:bookmarkStart w:id="36" w:name="__RefHeading___Toc2370_1187282842"/>
       <w:bookmarkEnd w:id="36"/>
       <w:r>
         <w:rPr/>
@@ -13623,7 +13623,7 @@
         <w:pStyle w:val="FigureCaption"/>
         <w:rPr/>
       </w:pPr>
-      <w:bookmarkStart w:id="37" w:name="__RefHeading___Toc2398_186613870"/>
+      <w:bookmarkStart w:id="37" w:name="__RefHeading___Toc2434_1187282842"/>
       <w:bookmarkEnd w:id="37"/>
       <w:r>
         <w:rPr>
@@ -13638,7 +13638,7 @@
         <w:pStyle w:val="TableCaption"/>
         <w:rPr/>
       </w:pPr>
-      <w:bookmarkStart w:id="38" w:name="__RefHeading___Toc2418_186613870"/>
+      <w:bookmarkStart w:id="38" w:name="__RefHeading___Toc2454_1187282842"/>
       <w:bookmarkEnd w:id="38"/>
       <w:r>
         <w:rPr>
@@ -14410,7 +14410,7 @@
         <w:pStyle w:val="Heading2"/>
         <w:rPr/>
       </w:pPr>
-      <w:bookmarkStart w:id="39" w:name="__RefHeading___Toc2336_186613870"/>
+      <w:bookmarkStart w:id="39" w:name="__RefHeading___Toc2372_1187282842"/>
       <w:bookmarkEnd w:id="39"/>
       <w:r>
         <w:rPr/>
@@ -14486,7 +14486,7 @@
         <w:pStyle w:val="FigureCaption"/>
         <w:rPr/>
       </w:pPr>
-      <w:bookmarkStart w:id="40" w:name="__RefHeading___Toc2396_186613870"/>
+      <w:bookmarkStart w:id="40" w:name="__RefHeading___Toc2432_1187282842"/>
       <w:bookmarkEnd w:id="40"/>
       <w:r>
         <w:rPr>
@@ -14501,7 +14501,7 @@
         <w:pStyle w:val="TableCaption"/>
         <w:rPr/>
       </w:pPr>
-      <w:bookmarkStart w:id="41" w:name="__RefHeading___Toc2416_186613870"/>
+      <w:bookmarkStart w:id="41" w:name="__RefHeading___Toc2452_1187282842"/>
       <w:bookmarkEnd w:id="41"/>
       <w:r>
         <w:rPr>
@@ -15197,7 +15197,7 @@
         <w:pStyle w:val="Heading2"/>
         <w:rPr/>
       </w:pPr>
-      <w:bookmarkStart w:id="42" w:name="__RefHeading___Toc2338_186613870"/>
+      <w:bookmarkStart w:id="42" w:name="__RefHeading___Toc2374_1187282842"/>
       <w:bookmarkEnd w:id="42"/>
       <w:r>
         <w:rPr/>
@@ -15216,7 +15216,7 @@
           <w:b w:val="false"/>
           <w:sz w:val="24"/>
         </w:rPr>
-        <w:t>The straight line between two fit-matched solutions distinguishes the hypotheses. If the solutions lay in one flat valley (a null space), the prediction error would stay at the endpoints' level all along the line; if they are separate minima, the error rises in between. The test uses forward passes only. It was run on 19 October 2026 with notebooks/Verification_Tests.ipynb (14 000 steps, ground truth 0), comparing only the five starts that were blind to the truth and fit-matched (3.57–3.90 × 10⁻⁷, within 1.1× of each other; agreement mean 0.954, minimum 0.890).</w:t>
+        <w:t>The straight line between two fit-matched solutions distinguishes the hypotheses. If the solutions lay in one flat valley (a null space), the prediction error would stay at the endpoints' level all along the line; if they are separate minima, the error rises in between. The test uses forward passes only. It was run on 19–20 October 2026 with notebooks/Verification_Tests.ipynb (14 000 steps, four ground truths), comparing only the five starts that were blind to the truth and fit-matched (within 1.3× of the best blind fit in every case; agreement mean 0.955, minimum 0.894 ± 0.003 over the four truths).</w:t>
       </w:r>
     </w:p>
     <w:p>
@@ -15231,7 +15231,7 @@
           <w:b w:val="false"/>
           <w:sz w:val="24"/>
         </w:rPr>
-        <w:t>The error rose between every one of the ten pairs, to 1.5–6.0× the worse endpoint (median 3.8×), and the rise grew as the two solutions became less similar (Figure 8.3, Table 8.3). Two control starts placed near the truth reached a 4.6× lower error and higher recovery (0.951–0.976, against 0.894–0.918 for the blind starts), and the straight path from the best blind solution to the near-truth one rose 7.2× above the blind end. The blind solutions are therefore distinct local minima, separated by barriers from one another and from a deeper minimum near the truth: the inverse is non-convex, and the information-loss hypothesis is rejected.</w:t>
+        <w:t>Over the 40 pairs, the error rose between every pair of distinct solutions (29 pairs with agreement below 0.99) to 2.4–8.2× the worse endpoint (median 4.8×); the 11 near-identical pairs (agreement ≥ 0.99, mostly the zero and small-Gaussian starts) lie in the same minimum and stay nearly flat (1.0–2.2×). The rise grows as the two solutions become less similar (correlation −0.70; Figure 8.3, Table 8.3). Two control starts placed near the truth reached a 4.2 ± 0.3× lower error and higher recovery (0.946–0.977, against 0.891–0.926 for the blind starts), and the straight path from the best blind solution to the near-truth one rose 8.1 ± 3.2× (4.7–12.4×) above the blind end. The blind solutions are therefore distinct local minima, separated by barriers from one another and from a deeper minimum near the truth: the inverse is non-convex, and the information-loss hypothesis is rejected.</w:t>
       </w:r>
     </w:p>
     <w:p>
@@ -15310,7 +15310,7 @@
         <w:pStyle w:val="FigureCaption"/>
         <w:rPr/>
       </w:pPr>
-      <w:bookmarkStart w:id="43" w:name="__RefHeading___Toc2394_186613870"/>
+      <w:bookmarkStart w:id="43" w:name="__RefHeading___Toc2430_1187282842"/>
       <w:bookmarkEnd w:id="43"/>
       <w:r>
         <w:rPr>
@@ -15325,14 +15325,14 @@
         <w:pStyle w:val="TableCaption"/>
         <w:rPr/>
       </w:pPr>
-      <w:bookmarkStart w:id="44" w:name="__RefHeading___Toc2414_186613870"/>
+      <w:bookmarkStart w:id="44" w:name="__RefHeading___Toc2450_1187282842"/>
       <w:bookmarkEnd w:id="44"/>
       <w:r>
         <w:rPr>
           <w:b w:val="false"/>
           <w:sz w:val="20"/>
         </w:rPr>
-        <w:t>Table 8.3: Straight-path barrier between fit-matched blind solutions (ground truth 0, 14 000 steps)</w:t>
+        <w:t>Table 8.3: Straight-path barrier between fit-matched blind solutions: all ten pairs for ground truth 0, and the summary over four ground truths (14 000 steps)</w:t>
       </w:r>
     </w:p>
     <w:tbl>
@@ -16657,6 +16657,337 @@
           </w:p>
         </w:tc>
       </w:tr>
+      <w:tr>
+        <w:trPr>
+          <w:cantSplit w:val="true"/>
+        </w:trPr>
+        <w:tc>
+          <w:tcPr>
+            <w:tcW w:w="3310" w:type="dxa"/>
+            <w:tcBorders>
+              <w:top w:val="single" w:sz="4" w:space="0" w:color="000000"/>
+              <w:left w:val="single" w:sz="4" w:space="0" w:color="000000"/>
+              <w:bottom w:val="single" w:sz="4" w:space="0" w:color="000000"/>
+              <w:right w:val="single" w:sz="4" w:space="0" w:color="000000"/>
+            </w:tcBorders>
+          </w:tcPr>
+          <w:p>
+            <w:pPr>
+              <w:pStyle w:val="Normal"/>
+              <w:spacing w:lineRule="auto" w:line="240" w:before="20" w:after="20"/>
+              <w:rPr/>
+            </w:pPr>
+            <w:r>
+              <w:rPr>
+                <w:b w:val="false"/>
+                <w:sz w:val="20"/>
+              </w:rPr>
+              <w:t>Four truths: 29 distinct pairs (agreement &lt; 0.99)</w:t>
+            </w:r>
+          </w:p>
+        </w:tc>
+        <w:tc>
+          <w:tcPr>
+            <w:tcW w:w="1873" w:type="dxa"/>
+            <w:tcBorders>
+              <w:top w:val="single" w:sz="4" w:space="0" w:color="000000"/>
+              <w:left w:val="single" w:sz="4" w:space="0" w:color="000000"/>
+              <w:bottom w:val="single" w:sz="4" w:space="0" w:color="000000"/>
+              <w:right w:val="single" w:sz="4" w:space="0" w:color="000000"/>
+            </w:tcBorders>
+          </w:tcPr>
+          <w:p>
+            <w:pPr>
+              <w:pStyle w:val="Normal"/>
+              <w:spacing w:lineRule="auto" w:line="240" w:before="20" w:after="20"/>
+              <w:jc w:val="center"/>
+              <w:rPr/>
+            </w:pPr>
+            <w:r>
+              <w:rPr>
+                <w:b w:val="false"/>
+                <w:sz w:val="20"/>
+              </w:rPr>
+              <w:t>0.89–0.99</w:t>
+            </w:r>
+          </w:p>
+        </w:tc>
+        <w:tc>
+          <w:tcPr>
+            <w:tcW w:w="2159" w:type="dxa"/>
+            <w:tcBorders>
+              <w:top w:val="single" w:sz="4" w:space="0" w:color="000000"/>
+              <w:left w:val="single" w:sz="4" w:space="0" w:color="000000"/>
+              <w:bottom w:val="single" w:sz="4" w:space="0" w:color="000000"/>
+              <w:right w:val="single" w:sz="4" w:space="0" w:color="000000"/>
+            </w:tcBorders>
+          </w:tcPr>
+          <w:p>
+            <w:pPr>
+              <w:pStyle w:val="Normal"/>
+              <w:spacing w:lineRule="auto" w:line="240" w:before="20" w:after="20"/>
+              <w:jc w:val="center"/>
+              <w:rPr/>
+            </w:pPr>
+            <w:r>
+              <w:rPr>
+                <w:b w:val="false"/>
+                <w:sz w:val="20"/>
+              </w:rPr>
+              <w:t>—</w:t>
+            </w:r>
+          </w:p>
+        </w:tc>
+        <w:tc>
+          <w:tcPr>
+            <w:tcW w:w="1728" w:type="dxa"/>
+            <w:tcBorders>
+              <w:top w:val="single" w:sz="4" w:space="0" w:color="000000"/>
+              <w:left w:val="single" w:sz="4" w:space="0" w:color="000000"/>
+              <w:bottom w:val="single" w:sz="4" w:space="0" w:color="000000"/>
+              <w:right w:val="single" w:sz="4" w:space="0" w:color="000000"/>
+            </w:tcBorders>
+          </w:tcPr>
+          <w:p>
+            <w:pPr>
+              <w:pStyle w:val="Normal"/>
+              <w:spacing w:lineRule="auto" w:line="240" w:before="20" w:after="20"/>
+              <w:jc w:val="center"/>
+              <w:rPr/>
+            </w:pPr>
+            <w:r>
+              <w:rPr>
+                <w:b w:val="false"/>
+                <w:sz w:val="20"/>
+              </w:rPr>
+              <w:t>median 4.8× (2.4–8.2×)</w:t>
+            </w:r>
+          </w:p>
+        </w:tc>
+      </w:tr>
+      <w:tr>
+        <w:trPr>
+          <w:cantSplit w:val="true"/>
+        </w:trPr>
+        <w:tc>
+          <w:tcPr>
+            <w:tcW w:w="3310" w:type="dxa"/>
+            <w:tcBorders>
+              <w:top w:val="single" w:sz="4" w:space="0" w:color="000000"/>
+              <w:left w:val="single" w:sz="4" w:space="0" w:color="000000"/>
+              <w:bottom w:val="single" w:sz="4" w:space="0" w:color="000000"/>
+              <w:right w:val="single" w:sz="4" w:space="0" w:color="000000"/>
+            </w:tcBorders>
+          </w:tcPr>
+          <w:p>
+            <w:pPr>
+              <w:pStyle w:val="Normal"/>
+              <w:spacing w:lineRule="auto" w:line="240" w:before="20" w:after="20"/>
+              <w:rPr/>
+            </w:pPr>
+            <w:r>
+              <w:rPr>
+                <w:b w:val="false"/>
+                <w:sz w:val="20"/>
+              </w:rPr>
+              <w:t>Four truths: 11 near-identical pairs</w:t>
+            </w:r>
+          </w:p>
+        </w:tc>
+        <w:tc>
+          <w:tcPr>
+            <w:tcW w:w="1873" w:type="dxa"/>
+            <w:tcBorders>
+              <w:top w:val="single" w:sz="4" w:space="0" w:color="000000"/>
+              <w:left w:val="single" w:sz="4" w:space="0" w:color="000000"/>
+              <w:bottom w:val="single" w:sz="4" w:space="0" w:color="000000"/>
+              <w:right w:val="single" w:sz="4" w:space="0" w:color="000000"/>
+            </w:tcBorders>
+          </w:tcPr>
+          <w:p>
+            <w:pPr>
+              <w:pStyle w:val="Normal"/>
+              <w:spacing w:lineRule="auto" w:line="240" w:before="20" w:after="20"/>
+              <w:jc w:val="center"/>
+              <w:rPr/>
+            </w:pPr>
+            <w:r>
+              <w:rPr>
+                <w:b w:val="false"/>
+                <w:sz w:val="20"/>
+              </w:rPr>
+              <w:t xml:space="preserve">≥ </w:t>
+            </w:r>
+            <w:r>
+              <w:rPr>
+                <w:b w:val="false"/>
+                <w:sz w:val="20"/>
+              </w:rPr>
+              <w:t>0.99</w:t>
+            </w:r>
+          </w:p>
+        </w:tc>
+        <w:tc>
+          <w:tcPr>
+            <w:tcW w:w="2159" w:type="dxa"/>
+            <w:tcBorders>
+              <w:top w:val="single" w:sz="4" w:space="0" w:color="000000"/>
+              <w:left w:val="single" w:sz="4" w:space="0" w:color="000000"/>
+              <w:bottom w:val="single" w:sz="4" w:space="0" w:color="000000"/>
+              <w:right w:val="single" w:sz="4" w:space="0" w:color="000000"/>
+            </w:tcBorders>
+          </w:tcPr>
+          <w:p>
+            <w:pPr>
+              <w:pStyle w:val="Normal"/>
+              <w:spacing w:lineRule="auto" w:line="240" w:before="20" w:after="20"/>
+              <w:jc w:val="center"/>
+              <w:rPr/>
+            </w:pPr>
+            <w:r>
+              <w:rPr>
+                <w:b w:val="false"/>
+                <w:sz w:val="20"/>
+              </w:rPr>
+              <w:t>—</w:t>
+            </w:r>
+          </w:p>
+        </w:tc>
+        <w:tc>
+          <w:tcPr>
+            <w:tcW w:w="1728" w:type="dxa"/>
+            <w:tcBorders>
+              <w:top w:val="single" w:sz="4" w:space="0" w:color="000000"/>
+              <w:left w:val="single" w:sz="4" w:space="0" w:color="000000"/>
+              <w:bottom w:val="single" w:sz="4" w:space="0" w:color="000000"/>
+              <w:right w:val="single" w:sz="4" w:space="0" w:color="000000"/>
+            </w:tcBorders>
+          </w:tcPr>
+          <w:p>
+            <w:pPr>
+              <w:pStyle w:val="Normal"/>
+              <w:spacing w:lineRule="auto" w:line="240" w:before="20" w:after="20"/>
+              <w:jc w:val="center"/>
+              <w:rPr/>
+            </w:pPr>
+            <w:r>
+              <w:rPr>
+                <w:b w:val="false"/>
+                <w:sz w:val="20"/>
+              </w:rPr>
+              <w:t>1.0–2.2×</w:t>
+            </w:r>
+          </w:p>
+        </w:tc>
+      </w:tr>
+      <w:tr>
+        <w:trPr>
+          <w:cantSplit w:val="true"/>
+        </w:trPr>
+        <w:tc>
+          <w:tcPr>
+            <w:tcW w:w="3310" w:type="dxa"/>
+            <w:tcBorders>
+              <w:top w:val="single" w:sz="4" w:space="0" w:color="000000"/>
+              <w:left w:val="single" w:sz="4" w:space="0" w:color="000000"/>
+              <w:bottom w:val="single" w:sz="4" w:space="0" w:color="000000"/>
+              <w:right w:val="single" w:sz="4" w:space="0" w:color="000000"/>
+            </w:tcBorders>
+          </w:tcPr>
+          <w:p>
+            <w:pPr>
+              <w:pStyle w:val="Normal"/>
+              <w:spacing w:lineRule="auto" w:line="240" w:before="20" w:after="20"/>
+              <w:rPr/>
+            </w:pPr>
+            <w:r>
+              <w:rPr>
+                <w:b w:val="false"/>
+                <w:sz w:val="20"/>
+              </w:rPr>
+              <w:t>Four truths: best blind – near-truth</w:t>
+            </w:r>
+          </w:p>
+        </w:tc>
+        <w:tc>
+          <w:tcPr>
+            <w:tcW w:w="1873" w:type="dxa"/>
+            <w:tcBorders>
+              <w:top w:val="single" w:sz="4" w:space="0" w:color="000000"/>
+              <w:left w:val="single" w:sz="4" w:space="0" w:color="000000"/>
+              <w:bottom w:val="single" w:sz="4" w:space="0" w:color="000000"/>
+              <w:right w:val="single" w:sz="4" w:space="0" w:color="000000"/>
+            </w:tcBorders>
+          </w:tcPr>
+          <w:p>
+            <w:pPr>
+              <w:pStyle w:val="Normal"/>
+              <w:spacing w:lineRule="auto" w:line="240" w:before="20" w:after="20"/>
+              <w:jc w:val="center"/>
+              <w:rPr/>
+            </w:pPr>
+            <w:r>
+              <w:rPr>
+                <w:b w:val="false"/>
+                <w:sz w:val="20"/>
+              </w:rPr>
+              <w:t>—</w:t>
+            </w:r>
+          </w:p>
+        </w:tc>
+        <w:tc>
+          <w:tcPr>
+            <w:tcW w:w="2159" w:type="dxa"/>
+            <w:tcBorders>
+              <w:top w:val="single" w:sz="4" w:space="0" w:color="000000"/>
+              <w:left w:val="single" w:sz="4" w:space="0" w:color="000000"/>
+              <w:bottom w:val="single" w:sz="4" w:space="0" w:color="000000"/>
+              <w:right w:val="single" w:sz="4" w:space="0" w:color="000000"/>
+            </w:tcBorders>
+          </w:tcPr>
+          <w:p>
+            <w:pPr>
+              <w:pStyle w:val="Normal"/>
+              <w:spacing w:lineRule="auto" w:line="240" w:before="20" w:after="20"/>
+              <w:jc w:val="center"/>
+              <w:rPr/>
+            </w:pPr>
+            <w:r>
+              <w:rPr>
+                <w:b w:val="false"/>
+                <w:sz w:val="20"/>
+              </w:rPr>
+              <w:t>—</w:t>
+            </w:r>
+          </w:p>
+        </w:tc>
+        <w:tc>
+          <w:tcPr>
+            <w:tcW w:w="1728" w:type="dxa"/>
+            <w:tcBorders>
+              <w:top w:val="single" w:sz="4" w:space="0" w:color="000000"/>
+              <w:left w:val="single" w:sz="4" w:space="0" w:color="000000"/>
+              <w:bottom w:val="single" w:sz="4" w:space="0" w:color="000000"/>
+              <w:right w:val="single" w:sz="4" w:space="0" w:color="000000"/>
+            </w:tcBorders>
+          </w:tcPr>
+          <w:p>
+            <w:pPr>
+              <w:pStyle w:val="Normal"/>
+              <w:spacing w:lineRule="auto" w:line="240" w:before="20" w:after="20"/>
+              <w:jc w:val="center"/>
+              <w:rPr/>
+            </w:pPr>
+            <w:r>
+              <w:rPr>
+                <w:b w:val="false"/>
+                <w:sz w:val="20"/>
+              </w:rPr>
+              <w:t>8.1 ± 3.2×</w:t>
+            </w:r>
+          </w:p>
+        </w:tc>
+      </w:tr>
     </w:tbl>
     <w:p>
       <w:pPr>
@@ -16673,7 +17004,7 @@
         <w:pStyle w:val="Heading2"/>
         <w:rPr/>
       </w:pPr>
-      <w:bookmarkStart w:id="45" w:name="__RefHeading___Toc2340_186613870"/>
+      <w:bookmarkStart w:id="45" w:name="__RefHeading___Toc2376_1187282842"/>
       <w:bookmarkEnd w:id="45"/>
       <w:r>
         <w:rPr/>
@@ -16692,7 +17023,7 @@
           <w:b w:val="false"/>
           <w:sz w:val="24"/>
         </w:rPr>
-        <w:t>On the corrected fit-matched pair (Gaussian 1.0 and uniform), sensitivity along their difference d was 8.10 × 10⁻², against a median of 1.68 × 10⁻¹ over 200 random directions (range 1.22–2.39 × 10⁻¹): 2.1× below the median and below every random direction sampled. Along the actual error x̂ − x it was 1.8× below the median. Nine of the ten blind pairs lay below the median (1.1–2.1×); the exception is the pair of almost identical solutions from the zero and 0.01 starts (agreement 0.999), whose difference is too small to probe reliably. The original run (Figure 8.4) gave 1.9×. The inverse is anisotropically ill-conditioned: the operator responds about half as strongly to the components that inversion fails to recover.</w:t>
+        <w:t>On the least similar fit-matched pair (Gaussian 1.0 and uniform), sensitivity along their difference d was 8.10 × 10⁻² for ground truth 0, against a median of 1.68 × 10⁻¹ over 200 random directions (range 1.22–2.39 × 10⁻¹): 2.1× below the median and below every random direction sampled. Over four ground truths the ratio was 2.15 ± 0.17× (1.99–2.40×), and along the actual error x̂ − x 1.68 ± 0.17×. Nine of the ten blind pairs lay below the median (1.1–2.1×); the exception is the pair of almost identical solutions from the zero and 0.01 starts (agreement 0.999), whose difference is too small to probe reliably. The original run (Figure 8.4) gave 1.9×. The inverse is anisotropically ill-conditioned: the operator responds about half as strongly to the components that inversion fails to recover.</w:t>
       </w:r>
     </w:p>
     <w:p>
@@ -16749,14 +17080,14 @@
         <w:pStyle w:val="FigureCaption"/>
         <w:rPr/>
       </w:pPr>
-      <w:bookmarkStart w:id="46" w:name="__RefHeading___Toc2392_186613870"/>
+      <w:bookmarkStart w:id="46" w:name="__RefHeading___Toc2428_1187282842"/>
       <w:bookmarkEnd w:id="46"/>
       <w:r>
         <w:rPr>
           <w:b w:val="false"/>
           <w:sz w:val="20"/>
         </w:rPr>
-        <w:t>Figure 8.4: Directional sensitivity of the operator in the original run: solution-difference directions against 200 random directions (the corrected pair gives 2.1×)</w:t>
+        <w:t>Figure 8.4: Directional sensitivity of the operator in the original run: solution-difference directions against 200 random directions (the corrected pairs give 2.15 ± 0.17× over four truths)</w:t>
       </w:r>
     </w:p>
     <w:p>
@@ -16764,7 +17095,7 @@
         <w:pStyle w:val="Heading2"/>
         <w:rPr/>
       </w:pPr>
-      <w:bookmarkStart w:id="47" w:name="__RefHeading___Toc2342_186613870"/>
+      <w:bookmarkStart w:id="47" w:name="__RefHeading___Toc2378_1187282842"/>
       <w:bookmarkEnd w:id="47"/>
       <w:r>
         <w:rPr/>
@@ -16840,7 +17171,7 @@
         <w:pStyle w:val="FigureCaption"/>
         <w:rPr/>
       </w:pPr>
-      <w:bookmarkStart w:id="48" w:name="__RefHeading___Toc2390_186613870"/>
+      <w:bookmarkStart w:id="48" w:name="__RefHeading___Toc2426_1187282842"/>
       <w:bookmarkEnd w:id="48"/>
       <w:r>
         <w:rPr>
@@ -16904,7 +17235,7 @@
         <w:pStyle w:val="FigureCaption"/>
         <w:rPr/>
       </w:pPr>
-      <w:bookmarkStart w:id="49" w:name="__RefHeading___Toc2388_186613870"/>
+      <w:bookmarkStart w:id="49" w:name="__RefHeading___Toc2424_1187282842"/>
       <w:bookmarkEnd w:id="49"/>
       <w:r>
         <w:rPr>
@@ -16968,7 +17299,7 @@
         <w:pStyle w:val="FigureCaption"/>
         <w:rPr/>
       </w:pPr>
-      <w:bookmarkStart w:id="50" w:name="__RefHeading___Toc2386_186613870"/>
+      <w:bookmarkStart w:id="50" w:name="__RefHeading___Toc2422_1187282842"/>
       <w:bookmarkEnd w:id="50"/>
       <w:r>
         <w:rPr>
@@ -17032,7 +17363,7 @@
         <w:pStyle w:val="FigureCaption"/>
         <w:rPr/>
       </w:pPr>
-      <w:bookmarkStart w:id="51" w:name="__RefHeading___Toc2384_186613870"/>
+      <w:bookmarkStart w:id="51" w:name="__RefHeading___Toc2420_1187282842"/>
       <w:bookmarkEnd w:id="51"/>
       <w:r>
         <w:rPr>
@@ -17096,7 +17427,7 @@
         <w:pStyle w:val="FigureCaption"/>
         <w:rPr/>
       </w:pPr>
-      <w:bookmarkStart w:id="52" w:name="__RefHeading___Toc2382_186613870"/>
+      <w:bookmarkStart w:id="52" w:name="__RefHeading___Toc2418_1187282842"/>
       <w:bookmarkEnd w:id="52"/>
       <w:r>
         <w:rPr>
@@ -17111,7 +17442,7 @@
         <w:pStyle w:val="TableCaption"/>
         <w:rPr/>
       </w:pPr>
-      <w:bookmarkStart w:id="53" w:name="__RefHeading___Toc2412_186613870"/>
+      <w:bookmarkStart w:id="53" w:name="__RefHeading___Toc2448_1187282842"/>
       <w:bookmarkEnd w:id="53"/>
       <w:r>
         <w:rPr>
@@ -17717,7 +18048,7 @@
         <w:pStyle w:val="Heading2"/>
         <w:rPr/>
       </w:pPr>
-      <w:bookmarkStart w:id="54" w:name="__RefHeading___Toc2344_186613870"/>
+      <w:bookmarkStart w:id="54" w:name="__RefHeading___Toc2380_1187282842"/>
       <w:bookmarkEnd w:id="54"/>
       <w:r>
         <w:rPr/>
@@ -17793,7 +18124,7 @@
         <w:pStyle w:val="FigureCaption"/>
         <w:rPr/>
       </w:pPr>
-      <w:bookmarkStart w:id="55" w:name="__RefHeading___Toc2380_186613870"/>
+      <w:bookmarkStart w:id="55" w:name="__RefHeading___Toc2416_1187282842"/>
       <w:bookmarkEnd w:id="55"/>
       <w:r>
         <w:rPr>
@@ -17857,7 +18188,7 @@
         <w:pStyle w:val="FigureCaption"/>
         <w:rPr/>
       </w:pPr>
-      <w:bookmarkStart w:id="56" w:name="__RefHeading___Toc2378_186613870"/>
+      <w:bookmarkStart w:id="56" w:name="__RefHeading___Toc2414_1187282842"/>
       <w:bookmarkEnd w:id="56"/>
       <w:r>
         <w:rPr>
@@ -17921,7 +18252,7 @@
         <w:pStyle w:val="FigureCaption"/>
         <w:rPr/>
       </w:pPr>
-      <w:bookmarkStart w:id="57" w:name="__RefHeading___Toc2376_186613870"/>
+      <w:bookmarkStart w:id="57" w:name="__RefHeading___Toc2412_1187282842"/>
       <w:bookmarkEnd w:id="57"/>
       <w:r>
         <w:rPr>
@@ -17985,7 +18316,7 @@
         <w:pStyle w:val="FigureCaption"/>
         <w:rPr/>
       </w:pPr>
-      <w:bookmarkStart w:id="58" w:name="__RefHeading___Toc2374_186613870"/>
+      <w:bookmarkStart w:id="58" w:name="__RefHeading___Toc2410_1187282842"/>
       <w:bookmarkEnd w:id="58"/>
       <w:r>
         <w:rPr>
@@ -18049,7 +18380,7 @@
         <w:pStyle w:val="FigureCaption"/>
         <w:rPr/>
       </w:pPr>
-      <w:bookmarkStart w:id="59" w:name="__RefHeading___Toc2372_186613870"/>
+      <w:bookmarkStart w:id="59" w:name="__RefHeading___Toc2408_1187282842"/>
       <w:bookmarkEnd w:id="59"/>
       <w:r>
         <w:rPr>
@@ -18064,7 +18395,7 @@
         <w:pStyle w:val="TableCaption"/>
         <w:rPr/>
       </w:pPr>
-      <w:bookmarkStart w:id="60" w:name="__RefHeading___Toc2410_186613870"/>
+      <w:bookmarkStart w:id="60" w:name="__RefHeading___Toc2446_1187282842"/>
       <w:bookmarkEnd w:id="60"/>
       <w:r>
         <w:rPr>
@@ -19615,7 +19946,7 @@
         <w:pStyle w:val="Heading2"/>
         <w:rPr/>
       </w:pPr>
-      <w:bookmarkStart w:id="61" w:name="__RefHeading___Toc2346_186613870"/>
+      <w:bookmarkStart w:id="61" w:name="__RefHeading___Toc2382_1187282842"/>
       <w:bookmarkEnd w:id="61"/>
       <w:r>
         <w:rPr/>
@@ -19691,7 +20022,7 @@
         <w:pStyle w:val="FigureCaption"/>
         <w:rPr/>
       </w:pPr>
-      <w:bookmarkStart w:id="62" w:name="__RefHeading___Toc2370_186613870"/>
+      <w:bookmarkStart w:id="62" w:name="__RefHeading___Toc2406_1187282842"/>
       <w:bookmarkEnd w:id="62"/>
       <w:r>
         <w:rPr>
@@ -19706,7 +20037,7 @@
         <w:pStyle w:val="TableCaption"/>
         <w:rPr/>
       </w:pPr>
-      <w:bookmarkStart w:id="63" w:name="__RefHeading___Toc2408_186613870"/>
+      <w:bookmarkStart w:id="63" w:name="__RefHeading___Toc2444_1187282842"/>
       <w:bookmarkEnd w:id="63"/>
       <w:r>
         <w:rPr>
@@ -20745,7 +21076,7 @@
         <w:pStyle w:val="Heading2"/>
         <w:rPr/>
       </w:pPr>
-      <w:bookmarkStart w:id="64" w:name="__RefHeading___Toc2348_186613870"/>
+      <w:bookmarkStart w:id="64" w:name="__RefHeading___Toc2384_1187282842"/>
       <w:bookmarkEnd w:id="64"/>
       <w:r>
         <w:rPr/>
@@ -20848,7 +21179,7 @@
         <w:pStyle w:val="Heading1"/>
         <w:rPr/>
       </w:pPr>
-      <w:bookmarkStart w:id="65" w:name="__RefHeading___Toc2350_186613870"/>
+      <w:bookmarkStart w:id="65" w:name="__RefHeading___Toc2386_1187282842"/>
       <w:bookmarkEnd w:id="65"/>
       <w:r>
         <w:rPr/>
@@ -20875,7 +21206,7 @@
         <w:pStyle w:val="Heading2"/>
         <w:rPr/>
       </w:pPr>
-      <w:bookmarkStart w:id="66" w:name="__RefHeading___Toc2352_186613870"/>
+      <w:bookmarkStart w:id="66" w:name="__RefHeading___Toc2388_1187282842"/>
       <w:bookmarkEnd w:id="66"/>
       <w:r>
         <w:rPr/>
@@ -20975,7 +21306,7 @@
           <w:sz w:val="24"/>
         </w:rPr>
         <w:tab/>
-        <w:t>The prediction error rises 1.5–6.0× (median 3.8×) between every pair of fit-matched blind solutions, and 7.2× towards a deeper minimum near the truth: barriers, not a null space.</w:t>
+        <w:t>Over four ground truths the prediction error rises 2.4–8.2× (median 4.8×) between every pair of distinct fit-matched blind solutions, and 8.1 ± 3.2× towards a deeper minimum near the truth: barriers, not a null space.</w:t>
       </w:r>
     </w:p>
     <w:p>
@@ -20999,7 +21330,7 @@
           <w:sz w:val="24"/>
         </w:rPr>
         <w:tab/>
-        <w:t>Solution differences lie 2.1× below the median sensitivity of 200 random directions (1.9× in the original run): anisotropic ill-conditioning.</w:t>
+        <w:t>Solution differences lie 2.15 ± 0.17× below the median sensitivity of 200 random directions (1.9× in the original run): anisotropic ill-conditioning.</w:t>
       </w:r>
     </w:p>
     <w:p>
@@ -21079,7 +21410,7 @@
         <w:pStyle w:val="Heading2"/>
         <w:rPr/>
       </w:pPr>
-      <w:bookmarkStart w:id="67" w:name="__RefHeading___Toc2354_186613870"/>
+      <w:bookmarkStart w:id="67" w:name="__RefHeading___Toc2390_1187282842"/>
       <w:bookmarkEnd w:id="67"/>
       <w:r>
         <w:rPr/>
@@ -21187,7 +21518,7 @@
         <w:pStyle w:val="Heading2"/>
         <w:rPr/>
       </w:pPr>
-      <w:bookmarkStart w:id="68" w:name="__RefHeading___Toc2356_186613870"/>
+      <w:bookmarkStart w:id="68" w:name="__RefHeading___Toc2392_1187282842"/>
       <w:bookmarkEnd w:id="68"/>
       <w:r>
         <w:rPr/>
@@ -21199,7 +21530,7 @@
         <w:pStyle w:val="TableCaption"/>
         <w:rPr/>
       </w:pPr>
-      <w:bookmarkStart w:id="69" w:name="__RefHeading___Toc2406_186613870"/>
+      <w:bookmarkStart w:id="69" w:name="__RefHeading___Toc2442_1187282842"/>
       <w:bookmarkEnd w:id="69"/>
       <w:r>
         <w:rPr>
@@ -21416,7 +21747,7 @@
         <w:pStyle w:val="Heading1"/>
         <w:rPr/>
       </w:pPr>
-      <w:bookmarkStart w:id="70" w:name="__RefHeading___Toc2358_186613870"/>
+      <w:bookmarkStart w:id="70" w:name="__RefHeading___Toc2394_1187282842"/>
       <w:bookmarkEnd w:id="70"/>
       <w:r>
         <w:rPr/>
@@ -21475,7 +21806,7 @@
         <w:pStyle w:val="Heading1"/>
         <w:rPr/>
       </w:pPr>
-      <w:bookmarkStart w:id="71" w:name="__RefHeading___Toc2360_186613870"/>
+      <w:bookmarkStart w:id="71" w:name="__RefHeading___Toc2396_1187282842"/>
       <w:bookmarkEnd w:id="71"/>
       <w:r>
         <w:rPr/>
@@ -21502,7 +21833,7 @@
         <w:pStyle w:val="TableCaption"/>
         <w:rPr/>
       </w:pPr>
-      <w:bookmarkStart w:id="72" w:name="__RefHeading___Toc2404_186613870"/>
+      <w:bookmarkStart w:id="72" w:name="__RefHeading___Toc2440_1187282842"/>
       <w:bookmarkEnd w:id="72"/>
       <w:r>
         <w:rPr>
@@ -22540,7 +22871,7 @@
         <w:pStyle w:val="Heading1"/>
         <w:rPr/>
       </w:pPr>
-      <w:bookmarkStart w:id="73" w:name="__RefHeading___Toc2362_186613870"/>
+      <w:bookmarkStart w:id="73" w:name="__RefHeading___Toc2398_1187282842"/>
       <w:bookmarkEnd w:id="73"/>
       <w:r>
         <w:rPr/>
@@ -22666,7 +22997,7 @@
         <w:pStyle w:val="Heading1"/>
         <w:rPr/>
       </w:pPr>
-      <w:bookmarkStart w:id="74" w:name="__RefHeading___Toc2364_186613870"/>
+      <w:bookmarkStart w:id="74" w:name="__RefHeading___Toc2400_1187282842"/>
       <w:bookmarkEnd w:id="74"/>
       <w:r>
         <w:rPr/>
@@ -23563,7 +23894,7 @@
         <w:pStyle w:val="Heading1"/>
         <w:rPr/>
       </w:pPr>
-      <w:bookmarkStart w:id="75" w:name="__RefHeading___Toc2366_186613870"/>
+      <w:bookmarkStart w:id="75" w:name="__RefHeading___Toc2402_1187282842"/>
       <w:bookmarkEnd w:id="75"/>
       <w:r>
         <w:rPr/>
@@ -23590,7 +23921,7 @@
         <w:pStyle w:val="TableCaption"/>
         <w:rPr/>
       </w:pPr>
-      <w:bookmarkStart w:id="76" w:name="__RefHeading___Toc2402_186613870"/>
+      <w:bookmarkStart w:id="76" w:name="__RefHeading___Toc2438_1187282842"/>
       <w:bookmarkEnd w:id="76"/>
       <w:r>
         <w:rPr>

</xml_diff>

<commit_message>
Validity of the synthetic ground truth: real-stimulus statistics and a real-stimulus ground-truth test; report, deck, poster, docs
</commit_message>
<xml_diff>
--- a/report/Report_Sarkar_Choudhuri_Project1.docx
+++ b/report/Report_Sarkar_Choudhuri_Project1.docx
@@ -501,7 +501,7 @@
           <w:sz w:val="22"/>
         </w:rPr>
         <w:drawing>
-          <wp:anchor behindDoc="0" distT="0" distB="0" distL="0" distR="0" simplePos="0" locked="0" layoutInCell="0" allowOverlap="1" relativeHeight="18">
+          <wp:anchor behindDoc="0" distT="0" distB="0" distL="0" distR="0" simplePos="0" locked="0" layoutInCell="0" allowOverlap="1" relativeHeight="20">
             <wp:simplePos x="0" y="0"/>
             <wp:positionH relativeFrom="page">
               <wp:posOffset>2825115</wp:posOffset>
@@ -2059,7 +2059,7 @@
             </w:rPr>
             <w:fldChar w:fldCharType="separate"/>
           </w:r>
-          <w:hyperlink w:anchor="__RefHeading___Toc2324_1187282842">
+          <w:hyperlink w:anchor="__RefHeading___Toc2417_3840626700">
             <w:r>
               <w:rPr>
                 <w:webHidden/>
@@ -2080,7 +2080,7 @@
             </w:tabs>
             <w:rPr/>
           </w:pPr>
-          <w:hyperlink w:anchor="__RefHeading___Toc2326_1187282842">
+          <w:hyperlink w:anchor="__RefHeading___Toc2419_3840626700">
             <w:r>
               <w:rPr>
                 <w:webHidden/>
@@ -2101,7 +2101,7 @@
             </w:tabs>
             <w:rPr/>
           </w:pPr>
-          <w:hyperlink w:anchor="__RefHeading___Toc2328_1187282842">
+          <w:hyperlink w:anchor="__RefHeading___Toc2421_3840626700">
             <w:r>
               <w:rPr>
                 <w:webHidden/>
@@ -2122,7 +2122,7 @@
             </w:tabs>
             <w:rPr/>
           </w:pPr>
-          <w:hyperlink w:anchor="__RefHeading___Toc2330_1187282842">
+          <w:hyperlink w:anchor="__RefHeading___Toc2423_3840626700">
             <w:r>
               <w:rPr>
                 <w:webHidden/>
@@ -2143,7 +2143,7 @@
             </w:tabs>
             <w:rPr/>
           </w:pPr>
-          <w:hyperlink w:anchor="__RefHeading___Toc2332_1187282842">
+          <w:hyperlink w:anchor="__RefHeading___Toc2425_3840626700">
             <w:r>
               <w:rPr>
                 <w:webHidden/>
@@ -2164,7 +2164,7 @@
             </w:tabs>
             <w:rPr/>
           </w:pPr>
-          <w:hyperlink w:anchor="__RefHeading___Toc2334_1187282842">
+          <w:hyperlink w:anchor="__RefHeading___Toc2427_3840626700">
             <w:r>
               <w:rPr>
                 <w:webHidden/>
@@ -2185,7 +2185,7 @@
             </w:tabs>
             <w:rPr/>
           </w:pPr>
-          <w:hyperlink w:anchor="__RefHeading___Toc2336_1187282842">
+          <w:hyperlink w:anchor="__RefHeading___Toc2429_3840626700">
             <w:r>
               <w:rPr>
                 <w:webHidden/>
@@ -2206,7 +2206,7 @@
             </w:tabs>
             <w:rPr/>
           </w:pPr>
-          <w:hyperlink w:anchor="__RefHeading___Toc2338_1187282842">
+          <w:hyperlink w:anchor="__RefHeading___Toc2431_3840626700">
             <w:r>
               <w:rPr>
                 <w:webHidden/>
@@ -2227,7 +2227,7 @@
             </w:tabs>
             <w:rPr/>
           </w:pPr>
-          <w:hyperlink w:anchor="__RefHeading___Toc2340_1187282842">
+          <w:hyperlink w:anchor="__RefHeading___Toc2433_3840626700">
             <w:r>
               <w:rPr>
                 <w:webHidden/>
@@ -2248,7 +2248,7 @@
             </w:tabs>
             <w:rPr/>
           </w:pPr>
-          <w:hyperlink w:anchor="__RefHeading___Toc2342_1187282842">
+          <w:hyperlink w:anchor="__RefHeading___Toc2435_3840626700">
             <w:r>
               <w:rPr>
                 <w:webHidden/>
@@ -2269,7 +2269,7 @@
             </w:tabs>
             <w:rPr/>
           </w:pPr>
-          <w:hyperlink w:anchor="__RefHeading___Toc2344_1187282842">
+          <w:hyperlink w:anchor="__RefHeading___Toc2437_3840626700">
             <w:r>
               <w:rPr>
                 <w:webHidden/>
@@ -2290,7 +2290,7 @@
             </w:tabs>
             <w:rPr/>
           </w:pPr>
-          <w:hyperlink w:anchor="__RefHeading___Toc2346_1187282842">
+          <w:hyperlink w:anchor="__RefHeading___Toc2439_3840626700">
             <w:r>
               <w:rPr>
                 <w:webHidden/>
@@ -2311,7 +2311,7 @@
             </w:tabs>
             <w:rPr/>
           </w:pPr>
-          <w:hyperlink w:anchor="__RefHeading___Toc2348_1187282842">
+          <w:hyperlink w:anchor="__RefHeading___Toc2441_3840626700">
             <w:r>
               <w:rPr>
                 <w:webHidden/>
@@ -2332,7 +2332,7 @@
             </w:tabs>
             <w:rPr/>
           </w:pPr>
-          <w:hyperlink w:anchor="__RefHeading___Toc2350_1187282842">
+          <w:hyperlink w:anchor="__RefHeading___Toc2443_3840626700">
             <w:r>
               <w:rPr>
                 <w:webHidden/>
@@ -2353,7 +2353,7 @@
             </w:tabs>
             <w:rPr/>
           </w:pPr>
-          <w:hyperlink w:anchor="__RefHeading___Toc2352_1187282842">
+          <w:hyperlink w:anchor="__RefHeading___Toc2445_3840626700">
             <w:r>
               <w:rPr>
                 <w:webHidden/>
@@ -2374,7 +2374,7 @@
             </w:tabs>
             <w:rPr/>
           </w:pPr>
-          <w:hyperlink w:anchor="__RefHeading___Toc2354_1187282842">
+          <w:hyperlink w:anchor="__RefHeading___Toc2447_3840626700">
             <w:r>
               <w:rPr>
                 <w:webHidden/>
@@ -2395,13 +2395,34 @@
             </w:tabs>
             <w:rPr/>
           </w:pPr>
-          <w:hyperlink w:anchor="__RefHeading___Toc2356_1187282842">
+          <w:hyperlink w:anchor="__RefHeading___Toc2449_3840626700">
             <w:r>
               <w:rPr>
                 <w:webHidden/>
                 <w:rStyle w:val="IndexLink"/>
               </w:rPr>
               <w:t>5.2 Synthetic evaluation with exact ground truth</w:t>
+              <w:tab/>
+              <w:t>10</w:t>
+            </w:r>
+          </w:hyperlink>
+        </w:p>
+        <w:p>
+          <w:pPr>
+            <w:pStyle w:val="TOC3"/>
+            <w:tabs>
+              <w:tab w:val="clear" w:pos="720"/>
+              <w:tab w:val="right" w:pos="9125" w:leader="dot"/>
+            </w:tabs>
+            <w:rPr/>
+          </w:pPr>
+          <w:hyperlink w:anchor="__RefHeading___Toc2451_3840626700">
+            <w:r>
+              <w:rPr>
+                <w:webHidden/>
+                <w:rStyle w:val="IndexLink"/>
+              </w:rPr>
+              <w:t>5.2.1 Why this ground truth, and the evidence that it is valid</w:t>
               <w:tab/>
               <w:t>10</w:t>
             </w:r>
@@ -2416,7 +2437,7 @@
             </w:tabs>
             <w:rPr/>
           </w:pPr>
-          <w:hyperlink w:anchor="__RefHeading___Toc2358_1187282842">
+          <w:hyperlink w:anchor="__RefHeading___Toc2453_3840626700">
             <w:r>
               <w:rPr>
                 <w:webHidden/>
@@ -2424,7 +2445,7 @@
               </w:rPr>
               <w:t>5.3 Discriminating the causes of incomplete recovery</w:t>
               <w:tab/>
-              <w:t>10</w:t>
+              <w:t>12</w:t>
             </w:r>
           </w:hyperlink>
         </w:p>
@@ -2437,7 +2458,7 @@
             </w:tabs>
             <w:rPr/>
           </w:pPr>
-          <w:hyperlink w:anchor="__RefHeading___Toc2360_1187282842">
+          <w:hyperlink w:anchor="__RefHeading___Toc2455_3840626700">
             <w:r>
               <w:rPr>
                 <w:webHidden/>
@@ -2445,7 +2466,7 @@
               </w:rPr>
               <w:t>5.4 Regional analysis</w:t>
               <w:tab/>
-              <w:t>10</w:t>
+              <w:t>13</w:t>
             </w:r>
           </w:hyperlink>
         </w:p>
@@ -2458,7 +2479,7 @@
             </w:tabs>
             <w:rPr/>
           </w:pPr>
-          <w:hyperlink w:anchor="__RefHeading___Toc2362_1187282842">
+          <w:hyperlink w:anchor="__RefHeading___Toc2457_3840626700">
             <w:r>
               <w:rPr>
                 <w:webHidden/>
@@ -2466,7 +2487,7 @@
               </w:rPr>
               <w:t>5.5 Real-fMRI validation</w:t>
               <w:tab/>
-              <w:t>11</w:t>
+              <w:t>13</w:t>
             </w:r>
           </w:hyperlink>
         </w:p>
@@ -2479,7 +2500,7 @@
             </w:tabs>
             <w:rPr/>
           </w:pPr>
-          <w:hyperlink w:anchor="__RefHeading___Toc2364_1187282842">
+          <w:hyperlink w:anchor="__RefHeading___Toc2459_3840626700">
             <w:r>
               <w:rPr>
                 <w:webHidden/>
@@ -2487,7 +2508,7 @@
               </w:rPr>
               <w:t>6. HARDWARE/SOFTWARE TOOLS USED</w:t>
               <w:tab/>
-              <w:t>12</w:t>
+              <w:t>15</w:t>
             </w:r>
           </w:hyperlink>
         </w:p>
@@ -2500,7 +2521,7 @@
             </w:tabs>
             <w:rPr/>
           </w:pPr>
-          <w:hyperlink w:anchor="__RefHeading___Toc2366_1187282842">
+          <w:hyperlink w:anchor="__RefHeading___Toc2461_3840626700">
             <w:r>
               <w:rPr>
                 <w:webHidden/>
@@ -2508,7 +2529,7 @@
               </w:rPr>
               <w:t>7. SCHEDULE AND MILESTONES</w:t>
               <w:tab/>
-              <w:t>13</w:t>
+              <w:t>16</w:t>
             </w:r>
           </w:hyperlink>
         </w:p>
@@ -2521,7 +2542,7 @@
             </w:tabs>
             <w:rPr/>
           </w:pPr>
-          <w:hyperlink w:anchor="__RefHeading___Toc2368_1187282842">
+          <w:hyperlink w:anchor="__RefHeading___Toc2463_3840626700">
             <w:r>
               <w:rPr>
                 <w:webHidden/>
@@ -2529,7 +2550,7 @@
               </w:rPr>
               <w:t>8. RESULT ANALYSIS</w:t>
               <w:tab/>
-              <w:t>14</w:t>
+              <w:t>17</w:t>
             </w:r>
           </w:hyperlink>
         </w:p>
@@ -2542,7 +2563,7 @@
             </w:tabs>
             <w:rPr/>
           </w:pPr>
-          <w:hyperlink w:anchor="__RefHeading___Toc2370_1187282842">
+          <w:hyperlink w:anchor="__RefHeading___Toc2465_3840626700">
             <w:r>
               <w:rPr>
                 <w:webHidden/>
@@ -2550,7 +2571,7 @@
               </w:rPr>
               <w:t>8.1 Encoding accuracy does not certify decoding</w:t>
               <w:tab/>
-              <w:t>14</w:t>
+              <w:t>17</w:t>
             </w:r>
           </w:hyperlink>
         </w:p>
@@ -2563,7 +2584,7 @@
             </w:tabs>
             <w:rPr/>
           </w:pPr>
-          <w:hyperlink w:anchor="__RefHeading___Toc2372_1187282842">
+          <w:hyperlink w:anchor="__RefHeading___Toc2467_3840626700">
             <w:r>
               <w:rPr>
                 <w:webHidden/>
@@ -2571,7 +2592,7 @@
               </w:rPr>
               <w:t>8.2 Equally good fits give different answers</w:t>
               <w:tab/>
-              <w:t>14</w:t>
+              <w:t>17</w:t>
             </w:r>
           </w:hyperlink>
         </w:p>
@@ -2584,7 +2605,7 @@
             </w:tabs>
             <w:rPr/>
           </w:pPr>
-          <w:hyperlink w:anchor="__RefHeading___Toc2374_1187282842">
+          <w:hyperlink w:anchor="__RefHeading___Toc2469_3840626700">
             <w:r>
               <w:rPr>
                 <w:webHidden/>
@@ -2592,7 +2613,7 @@
               </w:rPr>
               <w:t>8.3 Barriers, not a null space</w:t>
               <w:tab/>
-              <w:t>15</w:t>
+              <w:t>18</w:t>
             </w:r>
           </w:hyperlink>
         </w:p>
@@ -2605,7 +2626,7 @@
             </w:tabs>
             <w:rPr/>
           </w:pPr>
-          <w:hyperlink w:anchor="__RefHeading___Toc2376_1187282842">
+          <w:hyperlink w:anchor="__RefHeading___Toc2471_3840626700">
             <w:r>
               <w:rPr>
                 <w:webHidden/>
@@ -2613,7 +2634,7 @@
               </w:rPr>
               <w:t>8.4 Errors lie in the operator's weakest directions</w:t>
               <w:tab/>
-              <w:t>17</w:t>
+              <w:t>20</w:t>
             </w:r>
           </w:hyperlink>
         </w:p>
@@ -2626,7 +2647,7 @@
             </w:tabs>
             <w:rPr/>
           </w:pPr>
-          <w:hyperlink w:anchor="__RefHeading___Toc2378_1187282842">
+          <w:hyperlink w:anchor="__RefHeading___Toc2473_3840626700">
             <w:r>
               <w:rPr>
                 <w:webHidden/>
@@ -2634,7 +2655,7 @@
               </w:rPr>
               <w:t>8.5 Further conditioning results</w:t>
               <w:tab/>
-              <w:t>17</w:t>
+              <w:t>20</w:t>
             </w:r>
           </w:hyperlink>
         </w:p>
@@ -2647,7 +2668,7 @@
             </w:tabs>
             <w:rPr/>
           </w:pPr>
-          <w:hyperlink w:anchor="__RefHeading___Toc2380_1187282842">
+          <w:hyperlink w:anchor="__RefHeading___Toc2475_3840626700">
             <w:r>
               <w:rPr>
                 <w:webHidden/>
@@ -2655,7 +2676,7 @@
               </w:rPr>
               <w:t>8.6 Predictable is not recoverable, region by region</w:t>
               <w:tab/>
-              <w:t>20</w:t>
+              <w:t>23</w:t>
             </w:r>
           </w:hyperlink>
         </w:p>
@@ -2668,7 +2689,7 @@
             </w:tabs>
             <w:rPr/>
           </w:pPr>
-          <w:hyperlink w:anchor="__RefHeading___Toc2382_1187282842">
+          <w:hyperlink w:anchor="__RefHeading___Toc2477_3840626700">
             <w:r>
               <w:rPr>
                 <w:webHidden/>
@@ -2676,7 +2697,7 @@
               </w:rPr>
               <w:t>8.7 Real fMRI</w:t>
               <w:tab/>
-              <w:t>22</w:t>
+              <w:t>25</w:t>
             </w:r>
           </w:hyperlink>
         </w:p>
@@ -2689,7 +2710,7 @@
             </w:tabs>
             <w:rPr/>
           </w:pPr>
-          <w:hyperlink w:anchor="__RefHeading___Toc2384_1187282842">
+          <w:hyperlink w:anchor="__RefHeading___Toc2479_3840626700">
             <w:r>
               <w:rPr>
                 <w:webHidden/>
@@ -2697,7 +2718,7 @@
               </w:rPr>
               <w:t>8.8 Discussion</w:t>
               <w:tab/>
-              <w:t>23</w:t>
+              <w:t>26</w:t>
             </w:r>
           </w:hyperlink>
         </w:p>
@@ -2710,7 +2731,7 @@
             </w:tabs>
             <w:rPr/>
           </w:pPr>
-          <w:hyperlink w:anchor="__RefHeading___Toc2386_1187282842">
+          <w:hyperlink w:anchor="__RefHeading___Toc2481_3840626700">
             <w:r>
               <w:rPr>
                 <w:webHidden/>
@@ -2718,7 +2739,7 @@
               </w:rPr>
               <w:t>9. CONCLUSION</w:t>
               <w:tab/>
-              <w:t>24</w:t>
+              <w:t>27</w:t>
             </w:r>
           </w:hyperlink>
         </w:p>
@@ -2731,7 +2752,7 @@
             </w:tabs>
             <w:rPr/>
           </w:pPr>
-          <w:hyperlink w:anchor="__RefHeading___Toc2388_1187282842">
+          <w:hyperlink w:anchor="__RefHeading___Toc2483_3840626700">
             <w:r>
               <w:rPr>
                 <w:webHidden/>
@@ -2739,7 +2760,7 @@
               </w:rPr>
               <w:t>9.1 Obtained Results</w:t>
               <w:tab/>
-              <w:t>24</w:t>
+              <w:t>27</w:t>
             </w:r>
           </w:hyperlink>
         </w:p>
@@ -2752,7 +2773,7 @@
             </w:tabs>
             <w:rPr/>
           </w:pPr>
-          <w:hyperlink w:anchor="__RefHeading___Toc2390_1187282842">
+          <w:hyperlink w:anchor="__RefHeading___Toc2485_3840626700">
             <w:r>
               <w:rPr>
                 <w:webHidden/>
@@ -2760,7 +2781,7 @@
               </w:rPr>
               <w:t>9.2 Future improvement/work</w:t>
               <w:tab/>
-              <w:t>24</w:t>
+              <w:t>27</w:t>
             </w:r>
           </w:hyperlink>
         </w:p>
@@ -2773,7 +2794,7 @@
             </w:tabs>
             <w:rPr/>
           </w:pPr>
-          <w:hyperlink w:anchor="__RefHeading___Toc2392_1187282842">
+          <w:hyperlink w:anchor="__RefHeading___Toc2487_3840626700">
             <w:r>
               <w:rPr>
                 <w:webHidden/>
@@ -2781,7 +2802,7 @@
               </w:rPr>
               <w:t>9.3 Individual contribution from team members</w:t>
               <w:tab/>
-              <w:t>25</w:t>
+              <w:t>28</w:t>
             </w:r>
           </w:hyperlink>
         </w:p>
@@ -2794,7 +2815,7 @@
             </w:tabs>
             <w:rPr/>
           </w:pPr>
-          <w:hyperlink w:anchor="__RefHeading___Toc2394_1187282842">
+          <w:hyperlink w:anchor="__RefHeading___Toc2489_3840626700">
             <w:r>
               <w:rPr>
                 <w:webHidden/>
@@ -2802,7 +2823,7 @@
               </w:rPr>
               <w:t>10. SOCIAL AND ENVIRONMENTAL IMPACT</w:t>
               <w:tab/>
-              <w:t>26</w:t>
+              <w:t>29</w:t>
             </w:r>
           </w:hyperlink>
         </w:p>
@@ -2815,7 +2836,7 @@
             </w:tabs>
             <w:rPr/>
           </w:pPr>
-          <w:hyperlink w:anchor="__RefHeading___Toc2396_1187282842">
+          <w:hyperlink w:anchor="__RefHeading___Toc2491_3840626700">
             <w:r>
               <w:rPr>
                 <w:webHidden/>
@@ -2823,7 +2844,7 @@
               </w:rPr>
               <w:t>11. COST ANALYSIS</w:t>
               <w:tab/>
-              <w:t>27</w:t>
+              <w:t>30</w:t>
             </w:r>
           </w:hyperlink>
         </w:p>
@@ -2836,7 +2857,7 @@
             </w:tabs>
             <w:rPr/>
           </w:pPr>
-          <w:hyperlink w:anchor="__RefHeading___Toc2398_1187282842">
+          <w:hyperlink w:anchor="__RefHeading___Toc2493_3840626700">
             <w:r>
               <w:rPr>
                 <w:webHidden/>
@@ -2844,7 +2865,7 @@
               </w:rPr>
               <w:t>12. PROJECT OUTCOME PUBLICATION/PATENT</w:t>
               <w:tab/>
-              <w:t>28</w:t>
+              <w:t>31</w:t>
             </w:r>
           </w:hyperlink>
         </w:p>
@@ -2857,7 +2878,7 @@
             </w:tabs>
             <w:rPr/>
           </w:pPr>
-          <w:hyperlink w:anchor="__RefHeading___Toc2400_1187282842">
+          <w:hyperlink w:anchor="__RefHeading___Toc2495_3840626700">
             <w:r>
               <w:rPr>
                 <w:webHidden/>
@@ -2865,7 +2886,7 @@
               </w:rPr>
               <w:t>13. REFERENCES</w:t>
               <w:tab/>
-              <w:t>29</w:t>
+              <w:t>32</w:t>
             </w:r>
           </w:hyperlink>
         </w:p>
@@ -2878,7 +2899,7 @@
             </w:tabs>
             <w:rPr/>
           </w:pPr>
-          <w:hyperlink w:anchor="__RefHeading___Toc2402_1187282842">
+          <w:hyperlink w:anchor="__RefHeading___Toc2497_3840626700">
             <w:r>
               <w:rPr>
                 <w:webHidden/>
@@ -2886,7 +2907,7 @@
               </w:rPr>
               <w:t>APPENDIX A: CODE AND REPRODUCTION</w:t>
               <w:tab/>
-              <w:t>32</w:t>
+              <w:t>35</w:t>
             </w:r>
           </w:hyperlink>
           <w:r>
@@ -2950,7 +2971,7 @@
             </w:rPr>
             <w:fldChar w:fldCharType="separate"/>
           </w:r>
-          <w:hyperlink w:anchor="__RefHeading___Toc2404_1187282842">
+          <w:hyperlink w:anchor="__RefHeading___Toc2499_3840626700">
             <w:r>
               <w:rPr>
                 <w:webHidden/>
@@ -2971,15 +2992,15 @@
             </w:tabs>
             <w:rPr/>
           </w:pPr>
-          <w:hyperlink w:anchor="__RefHeading___Toc2434_1187282842">
+          <w:hyperlink w:anchor="__RefHeading___Toc2533_3840626700">
             <w:r>
               <w:rPr>
                 <w:webHidden/>
                 <w:rStyle w:val="IndexLink"/>
               </w:rPr>
-              <w:t>Figure 8.1: Encoding error against recovery cosine across independent step budgets</w:t>
+              <w:t>Figure 5.1: Synthetic ground truth and a real stimulus representation along their top eight principal directions, and their effective dimensionality, variance in eight directions and lag-1 autocorrelation (real: 246 windows of the six LeBel stories)</w:t>
               <w:tab/>
-              <w:t>14</w:t>
+              <w:t>11</w:t>
             </w:r>
           </w:hyperlink>
         </w:p>
@@ -2992,15 +3013,15 @@
             </w:tabs>
             <w:rPr/>
           </w:pPr>
-          <w:hyperlink w:anchor="__RefHeading___Toc2432_1187282842">
+          <w:hyperlink w:anchor="__RefHeading___Toc2531_3840626700">
             <w:r>
               <w:rPr>
                 <w:webHidden/>
                 <w:rStyle w:val="IndexLink"/>
               </w:rPr>
-              <w:t>Figure 8.2: Agreement among fit-matched solutions across four ground truths (left) and fit versus recovery per initialisation (right)</w:t>
+              <w:t>Figure 5.2: Inversion with a real stimulus representation as ground truth: recovery per start (left) and prediction error along the straight lines between solutions (right)</w:t>
               <w:tab/>
-              <w:t>15</w:t>
+              <w:t>12</w:t>
             </w:r>
           </w:hyperlink>
         </w:p>
@@ -3013,15 +3034,15 @@
             </w:tabs>
             <w:rPr/>
           </w:pPr>
-          <w:hyperlink w:anchor="__RefHeading___Toc2430_1187282842">
+          <w:hyperlink w:anchor="__RefHeading___Toc2529_3840626700">
             <w:r>
               <w:rPr>
                 <w:webHidden/>
                 <w:rStyle w:val="IndexLink"/>
               </w:rPr>
-              <w:t>Figure 8.3: Left: prediction error along the straight line between fit-matched blind solutions (blue, ten pairs) and from the best blind solution to the near-truth solution (orange). Right: final error and recovery for each of the eight starts</w:t>
+              <w:t>Figure 8.1: Encoding error against recovery cosine across independent step budgets</w:t>
               <w:tab/>
-              <w:t>16</w:t>
+              <w:t>17</w:t>
             </w:r>
           </w:hyperlink>
         </w:p>
@@ -3034,15 +3055,15 @@
             </w:tabs>
             <w:rPr/>
           </w:pPr>
-          <w:hyperlink w:anchor="__RefHeading___Toc2428_1187282842">
+          <w:hyperlink w:anchor="__RefHeading___Toc2527_3840626700">
             <w:r>
               <w:rPr>
                 <w:webHidden/>
                 <w:rStyle w:val="IndexLink"/>
               </w:rPr>
-              <w:t>Figure 8.4: Directional sensitivity of the operator in the original run: solution-difference directions against 200 random directions (the corrected pairs give 2.15 ± 0.17× over four truths)</w:t>
+              <w:t>Figure 8.2: Agreement among fit-matched solutions across four ground truths (left) and fit versus recovery per initialisation (right)</w:t>
               <w:tab/>
-              <w:t>17</w:t>
+              <w:t>18</w:t>
             </w:r>
           </w:hyperlink>
         </w:p>
@@ -3055,15 +3076,15 @@
             </w:tabs>
             <w:rPr/>
           </w:pPr>
-          <w:hyperlink w:anchor="__RefHeading___Toc2426_1187282842">
+          <w:hyperlink w:anchor="__RefHeading___Toc2525_3840626700">
             <w:r>
               <w:rPr>
                 <w:webHidden/>
                 <w:rStyle w:val="IndexLink"/>
               </w:rPr>
-              <w:t>Figure 8.5: Output change under rescaling of the ground truth relative to the optimiser's noise floor</w:t>
+              <w:t>Figure 8.3: Left: prediction error along the straight line between fit-matched blind solutions (blue, ten pairs) and from the best blind solution to the near-truth solution (orange). Right: final error and recovery for each of the eight starts</w:t>
               <w:tab/>
-              <w:t>18</w:t>
+              <w:t>19</w:t>
             </w:r>
           </w:hyperlink>
         </w:p>
@@ -3076,15 +3097,15 @@
             </w:tabs>
             <w:rPr/>
           </w:pPr>
-          <w:hyperlink w:anchor="__RefHeading___Toc2424_1187282842">
+          <w:hyperlink w:anchor="__RefHeading___Toc2523_3840626700">
             <w:r>
               <w:rPr>
                 <w:webHidden/>
                 <w:rStyle w:val="IndexLink"/>
               </w:rPr>
-              <w:t>Figure 8.6: Recovery, relative error and retrieval against measurement noise</w:t>
+              <w:t>Figure 8.4: Directional sensitivity of the operator in the original run: solution-difference directions against 200 random directions (the corrected pairs give 2.15 ± 0.17× over four truths)</w:t>
               <w:tab/>
-              <w:t>18</w:t>
+              <w:t>20</w:t>
             </w:r>
           </w:hyperlink>
         </w:p>
@@ -3097,15 +3118,15 @@
             </w:tabs>
             <w:rPr/>
           </w:pPr>
-          <w:hyperlink w:anchor="__RefHeading___Toc2422_1187282842">
+          <w:hyperlink w:anchor="__RefHeading___Toc2521_3840626700">
             <w:r>
               <w:rPr>
                 <w:webHidden/>
                 <w:rStyle w:val="IndexLink"/>
               </w:rPr>
-              <w:t>Figure 8.7: Recovery against the number of observed cortical vertices</w:t>
+              <w:t>Figure 8.5: Output change under rescaling of the ground truth relative to the optimiser's noise floor</w:t>
               <w:tab/>
-              <w:t>18</w:t>
+              <w:t>21</w:t>
             </w:r>
           </w:hyperlink>
         </w:p>
@@ -3118,15 +3139,15 @@
             </w:tabs>
             <w:rPr/>
           </w:pPr>
-          <w:hyperlink w:anchor="__RefHeading___Toc2420_1187282842">
+          <w:hyperlink w:anchor="__RefHeading___Toc2519_3840626700">
             <w:r>
               <w:rPr>
                 <w:webHidden/>
                 <w:rStyle w:val="IndexLink"/>
               </w:rPr>
-              <w:t>Figure 8.8: Effect of ℓ₂ and temporal-smoothness priors in the under-determined regime (500 vertices)</w:t>
+              <w:t>Figure 8.6: Recovery, relative error and retrieval against measurement noise</w:t>
               <w:tab/>
-              <w:t>19</w:t>
+              <w:t>21</w:t>
             </w:r>
           </w:hyperlink>
         </w:p>
@@ -3139,15 +3160,15 @@
             </w:tabs>
             <w:rPr/>
           </w:pPr>
-          <w:hyperlink w:anchor="__RefHeading___Toc2418_1187282842">
+          <w:hyperlink w:anchor="__RefHeading___Toc2517_3840626700">
             <w:r>
               <w:rPr>
                 <w:webHidden/>
                 <w:rStyle w:val="IndexLink"/>
               </w:rPr>
-              <w:t>Figure 8.9: Gradient inversion against the best ridge decoder</w:t>
+              <w:t>Figure 8.7: Recovery against the number of observed cortical vertices</w:t>
               <w:tab/>
-              <w:t>19</w:t>
+              <w:t>21</w:t>
             </w:r>
           </w:hyperlink>
         </w:p>
@@ -3160,15 +3181,15 @@
             </w:tabs>
             <w:rPr/>
           </w:pPr>
-          <w:hyperlink w:anchor="__RefHeading___Toc2416_1187282842">
+          <w:hyperlink w:anchor="__RefHeading___Toc2515_3840626700">
             <w:r>
               <w:rPr>
                 <w:webHidden/>
                 <w:rStyle w:val="IndexLink"/>
               </w:rPr>
-              <w:t>Figure 8.10: The six anatomical networks on the inflated fsaverage5 surface</w:t>
+              <w:t>Figure 8.8: Effect of ℓ₂ and temporal-smoothness priors in the under-determined regime (500 vertices)</w:t>
               <w:tab/>
-              <w:t>20</w:t>
+              <w:t>22</w:t>
             </w:r>
           </w:hyperlink>
         </w:p>
@@ -3181,15 +3202,15 @@
             </w:tabs>
             <w:rPr/>
           </w:pPr>
-          <w:hyperlink w:anchor="__RefHeading___Toc2414_1187282842">
+          <w:hyperlink w:anchor="__RefHeading___Toc2513_3840626700">
             <w:r>
               <w:rPr>
                 <w:webHidden/>
                 <w:rStyle w:val="IndexLink"/>
               </w:rPr>
-              <w:t>Figure 8.11: Forward-sensitivity share of the text-, audio- and video-derived dimensions across cortex</w:t>
+              <w:t>Figure 8.9: Gradient inversion against the best ridge decoder</w:t>
               <w:tab/>
-              <w:t>20</w:t>
+              <w:t>22</w:t>
             </w:r>
           </w:hyperlink>
         </w:p>
@@ -3202,15 +3223,15 @@
             </w:tabs>
             <w:rPr/>
           </w:pPr>
-          <w:hyperlink w:anchor="__RefHeading___Toc2412_1187282842">
+          <w:hyperlink w:anchor="__RefHeading___Toc2511_3840626700">
             <w:r>
               <w:rPr>
                 <w:webHidden/>
                 <w:rStyle w:val="IndexLink"/>
               </w:rPr>
-              <w:t>Figure 8.12: Recovery from each network versus size-matched random vertex sets</w:t>
+              <w:t>Figure 8.10: The six anatomical networks on the inflated fsaverage5 surface</w:t>
               <w:tab/>
-              <w:t>21</w:t>
+              <w:t>23</w:t>
             </w:r>
           </w:hyperlink>
         </w:p>
@@ -3223,15 +3244,15 @@
             </w:tabs>
             <w:rPr/>
           </w:pPr>
-          <w:hyperlink w:anchor="__RefHeading___Toc2410_1187282842">
+          <w:hyperlink w:anchor="__RefHeading___Toc2509_3840626700">
             <w:r>
               <w:rPr>
                 <w:webHidden/>
                 <w:rStyle w:val="IndexLink"/>
               </w:rPr>
-              <w:t>Figure 8.13: Forward sensitivity against recoverability across networks</w:t>
+              <w:t>Figure 8.11: Forward-sensitivity share of the text-, audio- and video-derived dimensions across cortex</w:t>
               <w:tab/>
-              <w:t>21</w:t>
+              <w:t>23</w:t>
             </w:r>
           </w:hyperlink>
         </w:p>
@@ -3244,15 +3265,15 @@
             </w:tabs>
             <w:rPr/>
           </w:pPr>
-          <w:hyperlink w:anchor="__RefHeading___Toc2408_1187282842">
+          <w:hyperlink w:anchor="__RefHeading___Toc2507_3840626700">
             <w:r>
               <w:rPr>
                 <w:webHidden/>
                 <w:rStyle w:val="IndexLink"/>
               </w:rPr>
-              <w:t>Figure 8.14: Participation ratio of each network's responses against size-matched controls</w:t>
+              <w:t>Figure 8.12: Recovery from each network versus size-matched random vertex sets</w:t>
               <w:tab/>
-              <w:t>21</w:t>
+              <w:t>24</w:t>
             </w:r>
           </w:hyperlink>
         </w:p>
@@ -3265,15 +3286,57 @@
             </w:tabs>
             <w:rPr/>
           </w:pPr>
-          <w:hyperlink w:anchor="__RefHeading___Toc2406_1187282842">
+          <w:hyperlink w:anchor="__RefHeading___Toc2505_3840626700">
             <w:r>
               <w:rPr>
                 <w:webHidden/>
                 <w:rStyle w:val="IndexLink"/>
               </w:rPr>
+              <w:t>Figure 8.13: Forward sensitivity against recoverability across networks</w:t>
+              <w:tab/>
+              <w:t>24</w:t>
+            </w:r>
+          </w:hyperlink>
+        </w:p>
+        <w:p>
+          <w:pPr>
+            <w:pStyle w:val="TOC1"/>
+            <w:tabs>
+              <w:tab w:val="clear" w:pos="720"/>
+              <w:tab w:val="right" w:pos="9125" w:leader="dot"/>
+            </w:tabs>
+            <w:rPr/>
+          </w:pPr>
+          <w:hyperlink w:anchor="__RefHeading___Toc2503_3840626700">
+            <w:r>
+              <w:rPr>
+                <w:webHidden/>
+                <w:rStyle w:val="IndexLink"/>
+              </w:rPr>
+              <w:t>Figure 8.14: Participation ratio of each network's responses against size-matched controls</w:t>
+              <w:tab/>
+              <w:t>24</w:t>
+            </w:r>
+          </w:hyperlink>
+        </w:p>
+        <w:p>
+          <w:pPr>
+            <w:pStyle w:val="TOC1"/>
+            <w:tabs>
+              <w:tab w:val="clear" w:pos="720"/>
+              <w:tab w:val="right" w:pos="9125" w:leader="dot"/>
+            </w:tabs>
+            <w:rPr/>
+          </w:pPr>
+          <w:hyperlink w:anchor="__RefHeading___Toc2501_3840626700">
+            <w:r>
+              <w:rPr>
+                <w:webHidden/>
+                <w:rStyle w:val="IndexLink"/>
+              </w:rPr>
               <w:t>Figure 8.15: Real fMRI, held-out story: alignment (A), encoding accuracy by network (B) and identification accuracy (C)</w:t>
               <w:tab/>
-              <w:t>22</w:t>
+              <w:t>25</w:t>
             </w:r>
           </w:hyperlink>
           <w:r>
@@ -3337,7 +3400,7 @@
             </w:rPr>
             <w:fldChar w:fldCharType="separate"/>
           </w:r>
-          <w:hyperlink w:anchor="__RefHeading___Toc2436_1187282842">
+          <w:hyperlink w:anchor="__RefHeading___Toc2535_3840626700">
             <w:r>
               <w:rPr>
                 <w:webHidden/>
@@ -3358,7 +3421,7 @@
             </w:tabs>
             <w:rPr/>
           </w:pPr>
-          <w:hyperlink w:anchor="__RefHeading___Toc2472_1187282842">
+          <w:hyperlink w:anchor="__RefHeading___Toc2573_3840626700">
             <w:r>
               <w:rPr>
                 <w:webHidden/>
@@ -3379,7 +3442,7 @@
             </w:tabs>
             <w:rPr/>
           </w:pPr>
-          <w:hyperlink w:anchor="__RefHeading___Toc2470_1187282842">
+          <w:hyperlink w:anchor="__RefHeading___Toc2571_3840626700">
             <w:r>
               <w:rPr>
                 <w:webHidden/>
@@ -3400,7 +3463,7 @@
             </w:tabs>
             <w:rPr/>
           </w:pPr>
-          <w:hyperlink w:anchor="__RefHeading___Toc2468_1187282842">
+          <w:hyperlink w:anchor="__RefHeading___Toc2569_3840626700">
             <w:r>
               <w:rPr>
                 <w:webHidden/>
@@ -3421,7 +3484,7 @@
             </w:tabs>
             <w:rPr/>
           </w:pPr>
-          <w:hyperlink w:anchor="__RefHeading___Toc2466_1187282842">
+          <w:hyperlink w:anchor="__RefHeading___Toc2567_3840626700">
             <w:r>
               <w:rPr>
                 <w:webHidden/>
@@ -3442,7 +3505,7 @@
             </w:tabs>
             <w:rPr/>
           </w:pPr>
-          <w:hyperlink w:anchor="__RefHeading___Toc2464_1187282842">
+          <w:hyperlink w:anchor="__RefHeading___Toc2565_3840626700">
             <w:r>
               <w:rPr>
                 <w:webHidden/>
@@ -3463,7 +3526,7 @@
             </w:tabs>
             <w:rPr/>
           </w:pPr>
-          <w:hyperlink w:anchor="__RefHeading___Toc2462_1187282842">
+          <w:hyperlink w:anchor="__RefHeading___Toc2563_3840626700">
             <w:r>
               <w:rPr>
                 <w:webHidden/>
@@ -3484,7 +3547,7 @@
             </w:tabs>
             <w:rPr/>
           </w:pPr>
-          <w:hyperlink w:anchor="__RefHeading___Toc2460_1187282842">
+          <w:hyperlink w:anchor="__RefHeading___Toc2561_3840626700">
             <w:r>
               <w:rPr>
                 <w:webHidden/>
@@ -3505,13 +3568,13 @@
             </w:tabs>
             <w:rPr/>
           </w:pPr>
-          <w:hyperlink w:anchor="__RefHeading___Toc2458_1187282842">
+          <w:hyperlink w:anchor="__RefHeading___Toc2559_3840626700">
             <w:r>
               <w:rPr>
                 <w:webHidden/>
                 <w:rStyle w:val="IndexLink"/>
               </w:rPr>
-              <w:t>Table 6.1: Hardware and software</w:t>
+              <w:t>Table 5.1: Evidence that the synthetic ground truth is valid</w:t>
               <w:tab/>
               <w:t>12</w:t>
             </w:r>
@@ -3526,15 +3589,15 @@
             </w:tabs>
             <w:rPr/>
           </w:pPr>
-          <w:hyperlink w:anchor="__RefHeading___Toc2456_1187282842">
+          <w:hyperlink w:anchor="__RefHeading___Toc2557_3840626700">
             <w:r>
               <w:rPr>
                 <w:webHidden/>
                 <w:rStyle w:val="IndexLink"/>
               </w:rPr>
-              <w:t>Table 7.1: Schedule and milestones</w:t>
+              <w:t>Table 6.1: Hardware and software</w:t>
               <w:tab/>
-              <w:t>13</w:t>
+              <w:t>15</w:t>
             </w:r>
           </w:hyperlink>
         </w:p>
@@ -3547,15 +3610,15 @@
             </w:tabs>
             <w:rPr/>
           </w:pPr>
-          <w:hyperlink w:anchor="__RefHeading___Toc2454_1187282842">
+          <w:hyperlink w:anchor="__RefHeading___Toc2555_3840626700">
             <w:r>
               <w:rPr>
                 <w:webHidden/>
                 <w:rStyle w:val="IndexLink"/>
               </w:rPr>
-              <w:t>Table 8.1: Encoding error and recovery across optimisation budgets</w:t>
+              <w:t>Table 7.1: Schedule and milestones</w:t>
               <w:tab/>
-              <w:t>14</w:t>
+              <w:t>16</w:t>
             </w:r>
           </w:hyperlink>
         </w:p>
@@ -3568,15 +3631,15 @@
             </w:tabs>
             <w:rPr/>
           </w:pPr>
-          <w:hyperlink w:anchor="__RefHeading___Toc2452_1187282842">
+          <w:hyperlink w:anchor="__RefHeading___Toc2553_3840626700">
             <w:r>
               <w:rPr>
                 <w:webHidden/>
                 <w:rStyle w:val="IndexLink"/>
               </w:rPr>
-              <w:t>Table 8.2: Agreement among fit-matched solutions, four ground truths, 14 000 steps</w:t>
+              <w:t>Table 8.1: Encoding error and recovery across optimisation budgets</w:t>
               <w:tab/>
-              <w:t>15</w:t>
+              <w:t>17</w:t>
             </w:r>
           </w:hyperlink>
         </w:p>
@@ -3589,15 +3652,15 @@
             </w:tabs>
             <w:rPr/>
           </w:pPr>
-          <w:hyperlink w:anchor="__RefHeading___Toc2450_1187282842">
+          <w:hyperlink w:anchor="__RefHeading___Toc2551_3840626700">
             <w:r>
               <w:rPr>
                 <w:webHidden/>
                 <w:rStyle w:val="IndexLink"/>
               </w:rPr>
-              <w:t>Table 8.3: Straight-path barrier between fit-matched blind solutions: all ten pairs for ground truth 0, and the summary over four ground truths (14 000 steps)</w:t>
+              <w:t>Table 8.2: Agreement among fit-matched solutions, four ground truths, 14 000 steps</w:t>
               <w:tab/>
-              <w:t>16</w:t>
+              <w:t>18</w:t>
             </w:r>
           </w:hyperlink>
         </w:p>
@@ -3610,13 +3673,13 @@
             </w:tabs>
             <w:rPr/>
           </w:pPr>
-          <w:hyperlink w:anchor="__RefHeading___Toc2448_1187282842">
+          <w:hyperlink w:anchor="__RefHeading___Toc2549_3840626700">
             <w:r>
               <w:rPr>
                 <w:webHidden/>
                 <w:rStyle w:val="IndexLink"/>
               </w:rPr>
-              <w:t>Table 8.4: Further characterisation of the inverse (whole cortex unless stated)</w:t>
+              <w:t>Table 8.3: Straight-path barrier between fit-matched blind solutions: all ten pairs for ground truth 0, and the summary over four ground truths (14 000 steps)</w:t>
               <w:tab/>
               <w:t>19</w:t>
             </w:r>
@@ -3631,13 +3694,13 @@
             </w:tabs>
             <w:rPr/>
           </w:pPr>
-          <w:hyperlink w:anchor="__RefHeading___Toc2446_1187282842">
+          <w:hyperlink w:anchor="__RefHeading___Toc2547_3840626700">
             <w:r>
               <w:rPr>
                 <w:webHidden/>
                 <w:rStyle w:val="IndexLink"/>
               </w:rPr>
-              <w:t>Table 8.5: Network sensitivity and recoverability (synthetic, 8 000 steps)</w:t>
+              <w:t>Table 8.4: Further characterisation of the inverse (whole cortex unless stated)</w:t>
               <w:tab/>
               <w:t>22</w:t>
             </w:r>
@@ -3652,15 +3715,15 @@
             </w:tabs>
             <w:rPr/>
           </w:pPr>
-          <w:hyperlink w:anchor="__RefHeading___Toc2444_1187282842">
+          <w:hyperlink w:anchor="__RefHeading___Toc2545_3840626700">
             <w:r>
               <w:rPr>
                 <w:webHidden/>
                 <w:rStyle w:val="IndexLink"/>
               </w:rPr>
-              <w:t>Table 8.6: Real-fMRI validation, held-out story wheretheressmoke (UTS03)</w:t>
+              <w:t>Table 8.5: Network sensitivity and recoverability (synthetic, 8 000 steps)</w:t>
               <w:tab/>
-              <w:t>22</w:t>
+              <w:t>25</w:t>
             </w:r>
           </w:hyperlink>
         </w:p>
@@ -3673,13 +3736,13 @@
             </w:tabs>
             <w:rPr/>
           </w:pPr>
-          <w:hyperlink w:anchor="__RefHeading___Toc2442_1187282842">
+          <w:hyperlink w:anchor="__RefHeading___Toc2543_3840626700">
             <w:r>
               <w:rPr>
                 <w:webHidden/>
                 <w:rStyle w:val="IndexLink"/>
               </w:rPr>
-              <w:t>Table 9.1: Individual contributions</w:t>
+              <w:t>Table 8.6: Real-fMRI validation, held-out story wheretheressmoke (UTS03)</w:t>
               <w:tab/>
               <w:t>25</w:t>
             </w:r>
@@ -3694,15 +3757,15 @@
             </w:tabs>
             <w:rPr/>
           </w:pPr>
-          <w:hyperlink w:anchor="__RefHeading___Toc2440_1187282842">
+          <w:hyperlink w:anchor="__RefHeading___Toc2541_3840626700">
             <w:r>
               <w:rPr>
                 <w:webHidden/>
                 <w:rStyle w:val="IndexLink"/>
               </w:rPr>
-              <w:t>Table 11.1: Estimated and incurred cost</w:t>
+              <w:t>Table 9.1: Individual contributions</w:t>
               <w:tab/>
-              <w:t>27</w:t>
+              <w:t>28</w:t>
             </w:r>
           </w:hyperlink>
         </w:p>
@@ -3715,15 +3778,36 @@
             </w:tabs>
             <w:rPr/>
           </w:pPr>
-          <w:hyperlink w:anchor="__RefHeading___Toc2438_1187282842">
+          <w:hyperlink w:anchor="__RefHeading___Toc2539_3840626700">
             <w:r>
               <w:rPr>
                 <w:webHidden/>
                 <w:rStyle w:val="IndexLink"/>
               </w:rPr>
+              <w:t>Table 11.1: Estimated and incurred cost</w:t>
+              <w:tab/>
+              <w:t>30</w:t>
+            </w:r>
+          </w:hyperlink>
+        </w:p>
+        <w:p>
+          <w:pPr>
+            <w:pStyle w:val="TOC1"/>
+            <w:tabs>
+              <w:tab w:val="clear" w:pos="720"/>
+              <w:tab w:val="right" w:pos="9125" w:leader="dot"/>
+            </w:tabs>
+            <w:rPr/>
+          </w:pPr>
+          <w:hyperlink w:anchor="__RefHeading___Toc2537_3840626700">
+            <w:r>
+              <w:rPr>
+                <w:webHidden/>
+                <w:rStyle w:val="IndexLink"/>
+              </w:rPr>
               <w:t>Table A.1: Map from report results to code</w:t>
               <w:tab/>
-              <w:t>32</w:t>
+              <w:t>35</w:t>
             </w:r>
           </w:hyperlink>
           <w:r>
@@ -4625,7 +4709,7 @@
         <w:pStyle w:val="Heading1"/>
         <w:rPr/>
       </w:pPr>
-      <w:bookmarkStart w:id="2" w:name="__RefHeading___Toc2324_1187282842"/>
+      <w:bookmarkStart w:id="2" w:name="__RefHeading___Toc2417_3840626700"/>
       <w:bookmarkEnd w:id="2"/>
       <w:r>
         <w:rPr/>
@@ -4682,7 +4766,7 @@
         <w:pStyle w:val="Heading2"/>
         <w:rPr/>
       </w:pPr>
-      <w:bookmarkStart w:id="3" w:name="__RefHeading___Toc2326_1187282842"/>
+      <w:bookmarkStart w:id="3" w:name="__RefHeading___Toc2419_3840626700"/>
       <w:bookmarkEnd w:id="3"/>
       <w:r>
         <w:rPr/>
@@ -4760,7 +4844,7 @@
         <w:pStyle w:val="TableCaption"/>
         <w:rPr/>
       </w:pPr>
-      <w:bookmarkStart w:id="4" w:name="__RefHeading___Toc2436_1187282842"/>
+      <w:bookmarkStart w:id="4" w:name="__RefHeading___Toc2535_3840626700"/>
       <w:bookmarkEnd w:id="4"/>
       <w:r>
         <w:rPr>
@@ -5692,7 +5776,7 @@
         <w:pStyle w:val="Heading2"/>
         <w:rPr/>
       </w:pPr>
-      <w:bookmarkStart w:id="5" w:name="__RefHeading___Toc2328_1187282842"/>
+      <w:bookmarkStart w:id="5" w:name="__RefHeading___Toc2421_3840626700"/>
       <w:bookmarkEnd w:id="5"/>
       <w:r>
         <w:rPr/>
@@ -5719,7 +5803,7 @@
         <w:pStyle w:val="TableCaption"/>
         <w:rPr/>
       </w:pPr>
-      <w:bookmarkStart w:id="6" w:name="__RefHeading___Toc2472_1187282842"/>
+      <w:bookmarkStart w:id="6" w:name="__RefHeading___Toc2573_3840626700"/>
       <w:bookmarkEnd w:id="6"/>
       <w:r>
         <w:rPr>
@@ -6845,7 +6929,7 @@
         <w:pStyle w:val="Heading2"/>
         <w:rPr/>
       </w:pPr>
-      <w:bookmarkStart w:id="7" w:name="__RefHeading___Toc2330_1187282842"/>
+      <w:bookmarkStart w:id="7" w:name="__RefHeading___Toc2423_3840626700"/>
       <w:bookmarkEnd w:id="7"/>
       <w:r>
         <w:rPr/>
@@ -6875,7 +6959,7 @@
         <w:pStyle w:val="Heading1"/>
         <w:rPr/>
       </w:pPr>
-      <w:bookmarkStart w:id="8" w:name="__RefHeading___Toc2332_1187282842"/>
+      <w:bookmarkStart w:id="8" w:name="__RefHeading___Toc2425_3840626700"/>
       <w:bookmarkEnd w:id="8"/>
       <w:r>
         <w:rPr/>
@@ -7013,7 +7097,7 @@
         <w:pStyle w:val="Heading1"/>
         <w:rPr/>
       </w:pPr>
-      <w:bookmarkStart w:id="9" w:name="__RefHeading___Toc2334_1187282842"/>
+      <w:bookmarkStart w:id="9" w:name="__RefHeading___Toc2427_3840626700"/>
       <w:bookmarkEnd w:id="9"/>
       <w:r>
         <w:rPr/>
@@ -7025,7 +7109,7 @@
         <w:pStyle w:val="TableCaption"/>
         <w:rPr/>
       </w:pPr>
-      <w:bookmarkStart w:id="10" w:name="__RefHeading___Toc2470_1187282842"/>
+      <w:bookmarkStart w:id="10" w:name="__RefHeading___Toc2571_3840626700"/>
       <w:bookmarkEnd w:id="10"/>
       <w:r>
         <w:rPr>
@@ -7415,7 +7499,7 @@
         <w:pStyle w:val="Heading1"/>
         <w:rPr/>
       </w:pPr>
-      <w:bookmarkStart w:id="11" w:name="__RefHeading___Toc2336_1187282842"/>
+      <w:bookmarkStart w:id="11" w:name="__RefHeading___Toc2429_3840626700"/>
       <w:bookmarkEnd w:id="11"/>
       <w:r>
         <w:rPr/>
@@ -7491,7 +7575,7 @@
         <w:pStyle w:val="FigureCaption"/>
         <w:rPr/>
       </w:pPr>
-      <w:bookmarkStart w:id="12" w:name="__RefHeading___Toc2404_1187282842"/>
+      <w:bookmarkStart w:id="12" w:name="__RefHeading___Toc2499_3840626700"/>
       <w:bookmarkEnd w:id="12"/>
       <w:r>
         <w:rPr>
@@ -7506,7 +7590,7 @@
         <w:pStyle w:val="Heading2"/>
         <w:rPr/>
       </w:pPr>
-      <w:bookmarkStart w:id="13" w:name="__RefHeading___Toc2338_1187282842"/>
+      <w:bookmarkStart w:id="13" w:name="__RefHeading___Toc2431_3840626700"/>
       <w:bookmarkEnd w:id="13"/>
       <w:r>
         <w:rPr/>
@@ -7518,7 +7602,7 @@
         <w:pStyle w:val="Heading3"/>
         <w:rPr/>
       </w:pPr>
-      <w:bookmarkStart w:id="14" w:name="__RefHeading___Toc2340_1187282842"/>
+      <w:bookmarkStart w:id="14" w:name="__RefHeading___Toc2433_3840626700"/>
       <w:bookmarkEnd w:id="14"/>
       <w:r>
         <w:rPr/>
@@ -7545,7 +7629,7 @@
         <w:pStyle w:val="Heading3"/>
         <w:rPr/>
       </w:pPr>
-      <w:bookmarkStart w:id="15" w:name="__RefHeading___Toc2342_1187282842"/>
+      <w:bookmarkStart w:id="15" w:name="__RefHeading___Toc2435_3840626700"/>
       <w:bookmarkEnd w:id="15"/>
       <w:r>
         <w:rPr/>
@@ -7572,7 +7656,7 @@
         <w:pStyle w:val="TableCaption"/>
         <w:rPr/>
       </w:pPr>
-      <w:bookmarkStart w:id="16" w:name="__RefHeading___Toc2468_1187282842"/>
+      <w:bookmarkStart w:id="16" w:name="__RefHeading___Toc2569_3840626700"/>
       <w:bookmarkEnd w:id="16"/>
       <w:r>
         <w:rPr>
@@ -8603,7 +8687,7 @@
         <w:pStyle w:val="TableCaption"/>
         <w:rPr/>
       </w:pPr>
-      <w:bookmarkStart w:id="17" w:name="__RefHeading___Toc2466_1187282842"/>
+      <w:bookmarkStart w:id="17" w:name="__RefHeading___Toc2567_3840626700"/>
       <w:bookmarkEnd w:id="17"/>
       <w:r>
         <w:rPr>
@@ -9468,7 +9552,7 @@
         <w:pStyle w:val="Heading3"/>
         <w:rPr/>
       </w:pPr>
-      <w:bookmarkStart w:id="18" w:name="__RefHeading___Toc2344_1187282842"/>
+      <w:bookmarkStart w:id="18" w:name="__RefHeading___Toc2437_3840626700"/>
       <w:bookmarkEnd w:id="18"/>
       <w:r>
         <w:rPr/>
@@ -9495,7 +9579,7 @@
         <w:pStyle w:val="TableCaption"/>
         <w:rPr/>
       </w:pPr>
-      <w:bookmarkStart w:id="19" w:name="__RefHeading___Toc2464_1187282842"/>
+      <w:bookmarkStart w:id="19" w:name="__RefHeading___Toc2565_3840626700"/>
       <w:bookmarkEnd w:id="19"/>
       <w:r>
         <w:rPr>
@@ -10209,7 +10293,7 @@
         <w:pStyle w:val="Heading3"/>
         <w:rPr/>
       </w:pPr>
-      <w:bookmarkStart w:id="20" w:name="__RefHeading___Toc2346_1187282842"/>
+      <w:bookmarkStart w:id="20" w:name="__RefHeading___Toc2439_3840626700"/>
       <w:bookmarkEnd w:id="20"/>
       <w:r>
         <w:rPr/>
@@ -10267,7 +10351,7 @@
         <w:pStyle w:val="Heading2"/>
         <w:rPr/>
       </w:pPr>
-      <w:bookmarkStart w:id="21" w:name="__RefHeading___Toc2348_1187282842"/>
+      <w:bookmarkStart w:id="21" w:name="__RefHeading___Toc2441_3840626700"/>
       <w:bookmarkEnd w:id="21"/>
       <w:r>
         <w:rPr/>
@@ -10279,7 +10363,7 @@
         <w:pStyle w:val="TableCaption"/>
         <w:rPr/>
       </w:pPr>
-      <w:bookmarkStart w:id="22" w:name="__RefHeading___Toc2462_1187282842"/>
+      <w:bookmarkStart w:id="22" w:name="__RefHeading___Toc2563_3840626700"/>
       <w:bookmarkEnd w:id="22"/>
       <w:r>
         <w:rPr>
@@ -10891,7 +10975,7 @@
         <w:pStyle w:val="Heading2"/>
         <w:rPr/>
       </w:pPr>
-      <w:bookmarkStart w:id="23" w:name="__RefHeading___Toc2350_1187282842"/>
+      <w:bookmarkStart w:id="23" w:name="__RefHeading___Toc2443_3840626700"/>
       <w:bookmarkEnd w:id="23"/>
       <w:r>
         <w:rPr/>
@@ -10918,7 +11002,7 @@
         <w:pStyle w:val="TableCaption"/>
         <w:rPr/>
       </w:pPr>
-      <w:bookmarkStart w:id="24" w:name="__RefHeading___Toc2460_1187282842"/>
+      <w:bookmarkStart w:id="24" w:name="__RefHeading___Toc2561_3840626700"/>
       <w:bookmarkEnd w:id="24"/>
       <w:r>
         <w:rPr>
@@ -11533,7 +11617,7 @@
         <w:pStyle w:val="Heading1"/>
         <w:rPr/>
       </w:pPr>
-      <w:bookmarkStart w:id="25" w:name="__RefHeading___Toc2352_1187282842"/>
+      <w:bookmarkStart w:id="25" w:name="__RefHeading___Toc2445_3840626700"/>
       <w:bookmarkEnd w:id="25"/>
       <w:r>
         <w:rPr/>
@@ -11560,7 +11644,7 @@
         <w:pStyle w:val="Heading2"/>
         <w:rPr/>
       </w:pPr>
-      <w:bookmarkStart w:id="26" w:name="__RefHeading___Toc2354_1187282842"/>
+      <w:bookmarkStart w:id="26" w:name="__RefHeading___Toc2447_3840626700"/>
       <w:bookmarkEnd w:id="26"/>
       <w:r>
         <w:rPr/>
@@ -11587,7 +11671,7 @@
         <w:pStyle w:val="Heading2"/>
         <w:rPr/>
       </w:pPr>
-      <w:bookmarkStart w:id="27" w:name="__RefHeading___Toc2356_1187282842"/>
+      <w:bookmarkStart w:id="27" w:name="__RefHeading___Toc2449_3840626700"/>
       <w:bookmarkEnd w:id="27"/>
       <w:r>
         <w:rPr/>
@@ -11603,10 +11687,17 @@
       </w:pPr>
       <w:r>
         <w:rPr>
+          <w:b/>
+          <w:sz w:val="24"/>
+        </w:rPr>
+        <w:t>Construction.</w:t>
+      </w:r>
+      <w:r>
+        <w:rPr>
           <w:b w:val="false"/>
           <w:sz w:val="24"/>
         </w:rPr>
-        <w:t>Ground-truth trajectories (T = 32 time steps) were drawn in a random 8-dimensional subspace of ℝ^1152 with smooth temporal variation (two cosine cycles), or as white noise as an off-manifold control. The target is y = f(x), so recovery error is known exactly. Recovery is the mean per-time-step cosine between x̂ and x; relative error, encoding error and retrieval rank among other time steps are also reported. Directional sensitivity along a unit direction v is a finite-difference probe of the Jacobian:</w:t>
+        <w:t xml:space="preserve"> The ground truth must be a valid input of the operator we invert, so it lives in TRIBE v2's own representation space: x ∈ ℝ^(32 × 1152), 32 steps at 2 Hz (16 s) across the text, audio and video slots, exactly the tensor the feature extractors hand to the encoder. Eight unit directions b₁…b₈ are drawn at random in ℝ^1152 (random orientation, so no direction is privileged), and each carries its own cosine time course, x(t) = Σₖ cos(2π fₖ t) bₖ with fₖ = 2, 4, …, 16 cycles per window (0.125–1 Hz); the result is scaled to unit standard deviation, the scale of real features. Four seeds (0–3) give four independent ground truths, and white noise (i.i.d. Gaussian, full rank) serves as an off-manifold control. The target is y = f(x), so recovery is measured exactly: cosine to x per time step, relative error, encoding error and retrieval rank among time steps. Directional sensitivity along a unit direction v is a finite-difference probe of the Jacobian:</w:t>
       </w:r>
     </w:p>
     <w:p>
@@ -11627,14 +11718,14 @@
     </w:p>
     <w:p>
       <w:pPr>
-        <w:pStyle w:val="Heading2"/>
-        <w:rPr/>
-      </w:pPr>
-      <w:bookmarkStart w:id="28" w:name="__RefHeading___Toc2358_1187282842"/>
+        <w:pStyle w:val="Heading3"/>
+        <w:rPr/>
+      </w:pPr>
+      <w:bookmarkStart w:id="28" w:name="__RefHeading___Toc2451_3840626700"/>
       <w:bookmarkEnd w:id="28"/>
       <w:r>
         <w:rPr/>
-        <w:t>5.3 Discriminating the causes of incomplete recovery</w:t>
+        <w:t>5.2.1 Why this ground truth, and the evidence that it is valid</w:t>
       </w:r>
     </w:p>
     <w:p>
@@ -11646,22 +11737,17 @@
       </w:pPr>
       <w:r>
         <w:rPr>
+          <w:b/>
+          <w:sz w:val="24"/>
+        </w:rPr>
+        <w:t>Correct by construction.</w:t>
+      </w:r>
+      <w:r>
+        <w:rPr>
           <w:b w:val="false"/>
           <w:sz w:val="24"/>
         </w:rPr>
-        <w:t>Four explanations were tested, each with a signature that would appear if it were true. (H1) Information loss: fit-matched solutions differ along a null-space direction the operator ignores. (H2) Non-convexity: distinct minima at equal fit, separated by a barrier. (H3) Optimiser artefact: recovery keeps rising with budget. (H4) Unidentifiable gain: a rescaled x gives the same output. Inversions were started from eight initialisation distributions and compared only when within 2× of the best fit, so under-converged runs could not pose as alternative solutions; the analysis was replicated over four ground truths. For two fit-matched solutions, a null space predicts that the prediction error stays flat along the straight line between them, while separate minima predict a rise in between; this test and the sensitivity probe use forward passes only and do not depend on the optimiser. Two further starts placed near the truth serve as a control for whether a deeper minimum exists.</w:t>
-      </w:r>
-    </w:p>
-    <w:p>
-      <w:pPr>
-        <w:pStyle w:val="Heading2"/>
-        <w:rPr/>
-      </w:pPr>
-      <w:bookmarkStart w:id="29" w:name="__RefHeading___Toc2360_1187282842"/>
-      <w:bookmarkEnd w:id="29"/>
-      <w:r>
-        <w:rPr/>
-        <w:t>5.4 Regional analysis</w:t>
+        <w:t xml:space="preserve"> A known-answer test is the standard way to evaluate an inverse method [8], [17]: because x is chosen and y = f(x) is produced by the frozen model itself (whose re-entry reproduces the released predictions, r = 1.0000), every recovery number is an exact measurement of the operator's inverse, with no modelling assumption about the brain. What needs justification is only whether the chosen x resembles real stimuli closely enough for the conclusions to transfer. Four pieces of evidence address that (Table 5.1).</w:t>
       </w:r>
     </w:p>
     <w:p>
@@ -11673,22 +11759,45 @@
       </w:pPr>
       <w:r>
         <w:rPr>
+          <w:b/>
+          <w:sz w:val="24"/>
+        </w:rPr>
+        <w:t>(1) Real representations are low-dimensional, like the synthetic truth.</w:t>
+      </w:r>
+      <w:r>
+        <w:rPr>
           <w:b w:val="false"/>
           <w:sz w:val="24"/>
         </w:rPr>
-        <w:t>Six disjoint networks were defined on fsaverage5 from the Destrieux atlas [33] (Figure 8.10): left language network [34] (1 282 vertices), its right-hemisphere homologue (1 368), auditory cortex (277), default-mode network [35] (1 224), visual cortex (1 582) and somatomotor cortex (1 487) as a low-semantic control. For each network we measured forward sensitivity per input modality against 2 000 random vertex sets of equal size, recovery when only that network is observed (8 000 steps) against size-matched random vertex sets with a second random seed as the control spread, and the participation ratio [36] of its responses to 128 random input directions.</w:t>
-      </w:r>
-    </w:p>
-    <w:p>
-      <w:pPr>
-        <w:pStyle w:val="Heading2"/>
-        <w:rPr/>
-      </w:pPr>
-      <w:bookmarkStart w:id="30" w:name="__RefHeading___Toc2362_1187282842"/>
-      <w:bookmarkEnd w:id="30"/>
-      <w:r>
-        <w:rPr/>
-        <w:t>5.5 Real-fMRI validation</w:t>
+        <w:t xml:space="preserve"> The aggregated representations of the six LeBel stories (audio slot, 246 windows of 16 s) have an effective dimensionality (participation ratio) of 4.9 ± 2.1, with 84 ± 6% of their variance in their top eight directions and a standard deviation of 1.10; the synthetic truth has 7.8, 100% and 1.00, and white noise 30.2 and 31% (Figure 5.1). An 8-D subspace is therefore the right order of magnitude, and slightly harder than real features, not easier. </w:t>
+      </w:r>
+      <w:r>
+        <w:rPr>
+          <w:b/>
+          <w:sz w:val="24"/>
+        </w:rPr>
+        <w:t>(2) The conclusions do not depend on its shape.</w:t>
+      </w:r>
+      <w:r>
+        <w:rPr>
+          <w:b w:val="false"/>
+          <w:sz w:val="24"/>
+        </w:rPr>
+        <w:t xml:space="preserve"> White noise recovers as well as the structured truth (0.947 vs 0.942), and changing the rate of change 64-fold, which spans the real lag-1 autocorrelation of 0.15 ± 0.12, leaves recovery at 0.836–0.858 with no trend. </w:t>
+      </w:r>
+      <w:r>
+        <w:rPr>
+          <w:b/>
+          <w:sz w:val="24"/>
+        </w:rPr>
+        <w:t>(3) They replicate across four independent ground truths</w:t>
+      </w:r>
+      <w:r>
+        <w:rPr>
+          <w:b w:val="false"/>
+          <w:sz w:val="24"/>
+        </w:rPr>
+        <w:t xml:space="preserve"> (agreement minimum 0.894 ± 0.003, barrier 4.8×, sensitivity 2.15 ± 0.17×).</w:t>
       </w:r>
     </w:p>
     <w:p>
@@ -11703,14 +11812,846 @@
           <w:b/>
           <w:sz w:val="24"/>
         </w:rPr>
-        <w:t>Data.</w:t>
+        <w:t>(4) A real representation as ground truth gives the same picture.</w:t>
       </w:r>
       <w:r>
         <w:rPr>
           <w:b w:val="false"/>
           <w:sz w:val="24"/>
         </w:rPr>
-        <w:t xml:space="preserve"> Subject UTS03 of the LeBel et al. corpus [22] (OpenNeuro ds003020): six stories, 66.6 minutes of speech, 10 363 words, TR 2 s. The held-out story wheretheressmoke is the mean of ten repeats; the other five stories are used for every tuning choice.</w:t>
+        <w:t xml:space="preserve"> The tests were repeated with a real 16-s window of the held-out story (wheretheressmoke, 16–32 s) as x, inverted from y = f(x) through the frozen model from three blind starts and one near-truth control (3 000 steps on CPU, scripts/real_x_groundtruth.py). Recovery was partial and start-dependent (cosine 0.43–0.60 in the filled audio slot, against about 0.56 for the synthetic truth at the same budget); the blind solutions disagreed (pairwise cosine 0.19–0.56) and were separated by barriers (the error rose 11–21× on the straight lines between them); and the near-truth control found a deeper minimum (2.9× lower error, recovery 0.95) 54× barrier away (Figure 5.2). The sensitivity probe was inconclusive at this budget because the blind fits had not yet converged (their errors still differed 2.2-fold), so it is reported only for the converged synthetic runs. Real stimulus representations thus show the same non-convex, start-dependent inverse, more strongly; the synthetic truth is the conservative case.</w:t>
+      </w:r>
+    </w:p>
+    <w:p>
+      <w:pPr>
+        <w:pStyle w:val="Normal"/>
+        <w:keepNext w:val="true"/>
+        <w:spacing w:before="120" w:after="0"/>
+        <w:jc w:val="center"/>
+        <w:rPr/>
+      </w:pPr>
+      <w:r>
+        <w:rPr/>
+        <w:drawing>
+          <wp:inline distT="0" distB="0" distL="0" distR="0">
+            <wp:extent cx="5760720" cy="1656080"/>
+            <wp:effectExtent l="0" t="0" r="0" b="0"/>
+            <wp:docPr id="3" name="Picture 4" descr=""/>
+            <wp:cNvGraphicFramePr>
+              <a:graphicFrameLocks xmlns:a="http://schemas.openxmlformats.org/drawingml/2006/main" noChangeAspect="1"/>
+            </wp:cNvGraphicFramePr>
+            <a:graphic xmlns:a="http://schemas.openxmlformats.org/drawingml/2006/main">
+              <a:graphicData uri="http://schemas.openxmlformats.org/drawingml/2006/picture">
+                <pic:pic xmlns:pic="http://schemas.openxmlformats.org/drawingml/2006/picture">
+                  <pic:nvPicPr>
+                    <pic:cNvPr id="3" name="Picture 4" descr=""/>
+                    <pic:cNvPicPr>
+                      <a:picLocks noChangeAspect="1" noChangeArrowheads="1"/>
+                    </pic:cNvPicPr>
+                  </pic:nvPicPr>
+                  <pic:blipFill>
+                    <a:blip r:embed="rId6"/>
+                    <a:stretch>
+                      <a:fillRect/>
+                    </a:stretch>
+                  </pic:blipFill>
+                  <pic:spPr bwMode="auto">
+                    <a:xfrm>
+                      <a:off x="0" y="0"/>
+                      <a:ext cx="5760720" cy="1656080"/>
+                    </a:xfrm>
+                    <a:prstGeom prst="rect">
+                      <a:avLst/>
+                    </a:prstGeom>
+                  </pic:spPr>
+                </pic:pic>
+              </a:graphicData>
+            </a:graphic>
+          </wp:inline>
+        </w:drawing>
+      </w:r>
+    </w:p>
+    <w:p>
+      <w:pPr>
+        <w:pStyle w:val="FigureCaption"/>
+        <w:rPr/>
+      </w:pPr>
+      <w:bookmarkStart w:id="29" w:name="__RefHeading___Toc2533_3840626700"/>
+      <w:bookmarkEnd w:id="29"/>
+      <w:r>
+        <w:rPr>
+          <w:b w:val="false"/>
+          <w:sz w:val="20"/>
+        </w:rPr>
+        <w:t>Figure 5.1: Synthetic ground truth and a real stimulus representation along their top eight principal directions, and their effective dimensionality, variance in eight directions and lag-1 autocorrelation (real: 246 windows of the six LeBel stories)</w:t>
+      </w:r>
+    </w:p>
+    <w:p>
+      <w:pPr>
+        <w:pStyle w:val="Normal"/>
+        <w:keepNext w:val="true"/>
+        <w:spacing w:before="120" w:after="0"/>
+        <w:jc w:val="center"/>
+        <w:rPr/>
+      </w:pPr>
+      <w:r>
+        <w:rPr/>
+        <w:drawing>
+          <wp:inline distT="0" distB="0" distL="0" distR="0">
+            <wp:extent cx="5760720" cy="1810385"/>
+            <wp:effectExtent l="0" t="0" r="0" b="0"/>
+            <wp:docPr id="4" name="Picture 5" descr=""/>
+            <wp:cNvGraphicFramePr>
+              <a:graphicFrameLocks xmlns:a="http://schemas.openxmlformats.org/drawingml/2006/main" noChangeAspect="1"/>
+            </wp:cNvGraphicFramePr>
+            <a:graphic xmlns:a="http://schemas.openxmlformats.org/drawingml/2006/main">
+              <a:graphicData uri="http://schemas.openxmlformats.org/drawingml/2006/picture">
+                <pic:pic xmlns:pic="http://schemas.openxmlformats.org/drawingml/2006/picture">
+                  <pic:nvPicPr>
+                    <pic:cNvPr id="4" name="Picture 5" descr=""/>
+                    <pic:cNvPicPr>
+                      <a:picLocks noChangeAspect="1" noChangeArrowheads="1"/>
+                    </pic:cNvPicPr>
+                  </pic:nvPicPr>
+                  <pic:blipFill>
+                    <a:blip r:embed="rId7"/>
+                    <a:stretch>
+                      <a:fillRect/>
+                    </a:stretch>
+                  </pic:blipFill>
+                  <pic:spPr bwMode="auto">
+                    <a:xfrm>
+                      <a:off x="0" y="0"/>
+                      <a:ext cx="5760720" cy="1810385"/>
+                    </a:xfrm>
+                    <a:prstGeom prst="rect">
+                      <a:avLst/>
+                    </a:prstGeom>
+                  </pic:spPr>
+                </pic:pic>
+              </a:graphicData>
+            </a:graphic>
+          </wp:inline>
+        </w:drawing>
+      </w:r>
+    </w:p>
+    <w:p>
+      <w:pPr>
+        <w:pStyle w:val="FigureCaption"/>
+        <w:rPr/>
+      </w:pPr>
+      <w:bookmarkStart w:id="30" w:name="__RefHeading___Toc2531_3840626700"/>
+      <w:bookmarkEnd w:id="30"/>
+      <w:r>
+        <w:rPr>
+          <w:b w:val="false"/>
+          <w:sz w:val="20"/>
+        </w:rPr>
+        <w:t>Figure 5.2: Inversion with a real stimulus representation as ground truth: recovery per start (left) and prediction error along the straight lines between solutions (right)</w:t>
+      </w:r>
+    </w:p>
+    <w:p>
+      <w:pPr>
+        <w:pStyle w:val="TableCaption"/>
+        <w:rPr/>
+      </w:pPr>
+      <w:bookmarkStart w:id="31" w:name="__RefHeading___Toc2559_3840626700"/>
+      <w:bookmarkEnd w:id="31"/>
+      <w:r>
+        <w:rPr>
+          <w:b w:val="false"/>
+          <w:sz w:val="20"/>
+        </w:rPr>
+        <w:t>Table 5.1: Evidence that the synthetic ground truth is valid</w:t>
+      </w:r>
+    </w:p>
+    <w:tbl>
+      <w:tblPr>
+        <w:tblW w:w="8928" w:type="dxa"/>
+        <w:jc w:val="center"/>
+        <w:tblInd w:w="0" w:type="dxa"/>
+        <w:tblLayout w:type="fixed"/>
+        <w:tblCellMar>
+          <w:top w:w="0" w:type="dxa"/>
+          <w:left w:w="108" w:type="dxa"/>
+          <w:bottom w:w="0" w:type="dxa"/>
+          <w:right w:w="108" w:type="dxa"/>
+        </w:tblCellMar>
+        <w:tblLook w:val="04a0" w:noHBand="0" w:noVBand="1" w:firstColumn="1" w:lastRow="0" w:lastColumn="0" w:firstRow="1"/>
+      </w:tblPr>
+      <w:tblGrid>
+        <w:gridCol w:w="2304"/>
+        <w:gridCol w:w="3456"/>
+        <w:gridCol w:w="3168"/>
+      </w:tblGrid>
+      <w:tr>
+        <w:trPr>
+          <w:tblHeader w:val="true"/>
+          <w:cantSplit w:val="true"/>
+        </w:trPr>
+        <w:tc>
+          <w:tcPr>
+            <w:tcW w:w="2304" w:type="dxa"/>
+            <w:tcBorders>
+              <w:top w:val="single" w:sz="4" w:space="0" w:color="000000"/>
+              <w:left w:val="single" w:sz="4" w:space="0" w:color="000000"/>
+              <w:bottom w:val="single" w:sz="4" w:space="0" w:color="000000"/>
+              <w:right w:val="single" w:sz="4" w:space="0" w:color="000000"/>
+            </w:tcBorders>
+            <w:shd w:color="auto" w:fill="D9D9D9" w:val="clear"/>
+          </w:tcPr>
+          <w:p>
+            <w:pPr>
+              <w:pStyle w:val="Normal"/>
+              <w:spacing w:lineRule="auto" w:line="240" w:before="20" w:after="20"/>
+              <w:jc w:val="center"/>
+              <w:rPr/>
+            </w:pPr>
+            <w:r>
+              <w:rPr>
+                <w:b/>
+                <w:sz w:val="20"/>
+              </w:rPr>
+              <w:t>Question</w:t>
+            </w:r>
+          </w:p>
+        </w:tc>
+        <w:tc>
+          <w:tcPr>
+            <w:tcW w:w="3456" w:type="dxa"/>
+            <w:tcBorders>
+              <w:top w:val="single" w:sz="4" w:space="0" w:color="000000"/>
+              <w:left w:val="single" w:sz="4" w:space="0" w:color="000000"/>
+              <w:bottom w:val="single" w:sz="4" w:space="0" w:color="000000"/>
+              <w:right w:val="single" w:sz="4" w:space="0" w:color="000000"/>
+            </w:tcBorders>
+            <w:shd w:color="auto" w:fill="D9D9D9" w:val="clear"/>
+          </w:tcPr>
+          <w:p>
+            <w:pPr>
+              <w:pStyle w:val="Normal"/>
+              <w:spacing w:lineRule="auto" w:line="240" w:before="20" w:after="20"/>
+              <w:jc w:val="center"/>
+              <w:rPr/>
+            </w:pPr>
+            <w:r>
+              <w:rPr>
+                <w:b/>
+                <w:sz w:val="20"/>
+              </w:rPr>
+              <w:t>Test</w:t>
+            </w:r>
+          </w:p>
+        </w:tc>
+        <w:tc>
+          <w:tcPr>
+            <w:tcW w:w="3168" w:type="dxa"/>
+            <w:tcBorders>
+              <w:top w:val="single" w:sz="4" w:space="0" w:color="000000"/>
+              <w:left w:val="single" w:sz="4" w:space="0" w:color="000000"/>
+              <w:bottom w:val="single" w:sz="4" w:space="0" w:color="000000"/>
+              <w:right w:val="single" w:sz="4" w:space="0" w:color="000000"/>
+            </w:tcBorders>
+            <w:shd w:color="auto" w:fill="D9D9D9" w:val="clear"/>
+          </w:tcPr>
+          <w:p>
+            <w:pPr>
+              <w:pStyle w:val="Normal"/>
+              <w:spacing w:lineRule="auto" w:line="240" w:before="20" w:after="20"/>
+              <w:jc w:val="center"/>
+              <w:rPr/>
+            </w:pPr>
+            <w:r>
+              <w:rPr>
+                <w:b/>
+                <w:sz w:val="20"/>
+              </w:rPr>
+              <w:t>Result</w:t>
+            </w:r>
+          </w:p>
+        </w:tc>
+      </w:tr>
+      <w:tr>
+        <w:trPr>
+          <w:cantSplit w:val="true"/>
+        </w:trPr>
+        <w:tc>
+          <w:tcPr>
+            <w:tcW w:w="2304" w:type="dxa"/>
+            <w:tcBorders>
+              <w:top w:val="single" w:sz="4" w:space="0" w:color="000000"/>
+              <w:left w:val="single" w:sz="4" w:space="0" w:color="000000"/>
+              <w:bottom w:val="single" w:sz="4" w:space="0" w:color="000000"/>
+              <w:right w:val="single" w:sz="4" w:space="0" w:color="000000"/>
+            </w:tcBorders>
+          </w:tcPr>
+          <w:p>
+            <w:pPr>
+              <w:pStyle w:val="Normal"/>
+              <w:spacing w:lineRule="auto" w:line="240" w:before="20" w:after="20"/>
+              <w:rPr/>
+            </w:pPr>
+            <w:r>
+              <w:rPr>
+                <w:b w:val="false"/>
+                <w:sz w:val="20"/>
+              </w:rPr>
+              <w:t>Is the recovery error exact?</w:t>
+            </w:r>
+          </w:p>
+        </w:tc>
+        <w:tc>
+          <w:tcPr>
+            <w:tcW w:w="3456" w:type="dxa"/>
+            <w:tcBorders>
+              <w:top w:val="single" w:sz="4" w:space="0" w:color="000000"/>
+              <w:left w:val="single" w:sz="4" w:space="0" w:color="000000"/>
+              <w:bottom w:val="single" w:sz="4" w:space="0" w:color="000000"/>
+              <w:right w:val="single" w:sz="4" w:space="0" w:color="000000"/>
+            </w:tcBorders>
+          </w:tcPr>
+          <w:p>
+            <w:pPr>
+              <w:pStyle w:val="Normal"/>
+              <w:spacing w:lineRule="auto" w:line="240" w:before="20" w:after="20"/>
+              <w:rPr/>
+            </w:pPr>
+            <w:r>
+              <w:rPr>
+                <w:b w:val="false"/>
+                <w:sz w:val="20"/>
+              </w:rPr>
+              <w:t>Ground truth chosen; y = f(x) from the frozen model; re-entry reproduces the release</w:t>
+            </w:r>
+          </w:p>
+        </w:tc>
+        <w:tc>
+          <w:tcPr>
+            <w:tcW w:w="3168" w:type="dxa"/>
+            <w:tcBorders>
+              <w:top w:val="single" w:sz="4" w:space="0" w:color="000000"/>
+              <w:left w:val="single" w:sz="4" w:space="0" w:color="000000"/>
+              <w:bottom w:val="single" w:sz="4" w:space="0" w:color="000000"/>
+              <w:right w:val="single" w:sz="4" w:space="0" w:color="000000"/>
+            </w:tcBorders>
+          </w:tcPr>
+          <w:p>
+            <w:pPr>
+              <w:pStyle w:val="Normal"/>
+              <w:spacing w:lineRule="auto" w:line="240" w:before="20" w:after="20"/>
+              <w:rPr/>
+            </w:pPr>
+            <w:r>
+              <w:rPr>
+                <w:b w:val="false"/>
+                <w:sz w:val="20"/>
+              </w:rPr>
+              <w:t>Yes, by construction (r = 1.0000)</w:t>
+            </w:r>
+          </w:p>
+        </w:tc>
+      </w:tr>
+      <w:tr>
+        <w:trPr>
+          <w:cantSplit w:val="true"/>
+        </w:trPr>
+        <w:tc>
+          <w:tcPr>
+            <w:tcW w:w="2304" w:type="dxa"/>
+            <w:tcBorders>
+              <w:top w:val="single" w:sz="4" w:space="0" w:color="000000"/>
+              <w:left w:val="single" w:sz="4" w:space="0" w:color="000000"/>
+              <w:bottom w:val="single" w:sz="4" w:space="0" w:color="000000"/>
+              <w:right w:val="single" w:sz="4" w:space="0" w:color="000000"/>
+            </w:tcBorders>
+          </w:tcPr>
+          <w:p>
+            <w:pPr>
+              <w:pStyle w:val="Normal"/>
+              <w:spacing w:lineRule="auto" w:line="240" w:before="20" w:after="20"/>
+              <w:rPr/>
+            </w:pPr>
+            <w:r>
+              <w:rPr>
+                <w:b w:val="false"/>
+                <w:sz w:val="20"/>
+              </w:rPr>
+              <w:t>Is 8-D realistic?</w:t>
+            </w:r>
+          </w:p>
+        </w:tc>
+        <w:tc>
+          <w:tcPr>
+            <w:tcW w:w="3456" w:type="dxa"/>
+            <w:tcBorders>
+              <w:top w:val="single" w:sz="4" w:space="0" w:color="000000"/>
+              <w:left w:val="single" w:sz="4" w:space="0" w:color="000000"/>
+              <w:bottom w:val="single" w:sz="4" w:space="0" w:color="000000"/>
+              <w:right w:val="single" w:sz="4" w:space="0" w:color="000000"/>
+            </w:tcBorders>
+          </w:tcPr>
+          <w:p>
+            <w:pPr>
+              <w:pStyle w:val="Normal"/>
+              <w:spacing w:lineRule="auto" w:line="240" w:before="20" w:after="20"/>
+              <w:rPr/>
+            </w:pPr>
+            <w:r>
+              <w:rPr>
+                <w:b w:val="false"/>
+                <w:sz w:val="20"/>
+              </w:rPr>
+              <w:t>Effective dimensionality of real story representations</w:t>
+            </w:r>
+          </w:p>
+        </w:tc>
+        <w:tc>
+          <w:tcPr>
+            <w:tcW w:w="3168" w:type="dxa"/>
+            <w:tcBorders>
+              <w:top w:val="single" w:sz="4" w:space="0" w:color="000000"/>
+              <w:left w:val="single" w:sz="4" w:space="0" w:color="000000"/>
+              <w:bottom w:val="single" w:sz="4" w:space="0" w:color="000000"/>
+              <w:right w:val="single" w:sz="4" w:space="0" w:color="000000"/>
+            </w:tcBorders>
+          </w:tcPr>
+          <w:p>
+            <w:pPr>
+              <w:pStyle w:val="Normal"/>
+              <w:spacing w:lineRule="auto" w:line="240" w:before="20" w:after="20"/>
+              <w:rPr/>
+            </w:pPr>
+            <w:r>
+              <w:rPr>
+                <w:b w:val="false"/>
+                <w:sz w:val="20"/>
+              </w:rPr>
+              <w:t>Real 4.9 ± 2.1 (84% in 8 directions) vs synthetic 7.8; white noise 30.2</w:t>
+            </w:r>
+          </w:p>
+        </w:tc>
+      </w:tr>
+      <w:tr>
+        <w:trPr>
+          <w:cantSplit w:val="true"/>
+        </w:trPr>
+        <w:tc>
+          <w:tcPr>
+            <w:tcW w:w="2304" w:type="dxa"/>
+            <w:tcBorders>
+              <w:top w:val="single" w:sz="4" w:space="0" w:color="000000"/>
+              <w:left w:val="single" w:sz="4" w:space="0" w:color="000000"/>
+              <w:bottom w:val="single" w:sz="4" w:space="0" w:color="000000"/>
+              <w:right w:val="single" w:sz="4" w:space="0" w:color="000000"/>
+            </w:tcBorders>
+          </w:tcPr>
+          <w:p>
+            <w:pPr>
+              <w:pStyle w:val="Normal"/>
+              <w:spacing w:lineRule="auto" w:line="240" w:before="20" w:after="20"/>
+              <w:rPr/>
+            </w:pPr>
+            <w:r>
+              <w:rPr>
+                <w:b w:val="false"/>
+                <w:sz w:val="20"/>
+              </w:rPr>
+              <w:t>Is the scale realistic?</w:t>
+            </w:r>
+          </w:p>
+        </w:tc>
+        <w:tc>
+          <w:tcPr>
+            <w:tcW w:w="3456" w:type="dxa"/>
+            <w:tcBorders>
+              <w:top w:val="single" w:sz="4" w:space="0" w:color="000000"/>
+              <w:left w:val="single" w:sz="4" w:space="0" w:color="000000"/>
+              <w:bottom w:val="single" w:sz="4" w:space="0" w:color="000000"/>
+              <w:right w:val="single" w:sz="4" w:space="0" w:color="000000"/>
+            </w:tcBorders>
+          </w:tcPr>
+          <w:p>
+            <w:pPr>
+              <w:pStyle w:val="Normal"/>
+              <w:spacing w:lineRule="auto" w:line="240" w:before="20" w:after="20"/>
+              <w:rPr/>
+            </w:pPr>
+            <w:r>
+              <w:rPr>
+                <w:b w:val="false"/>
+                <w:sz w:val="20"/>
+              </w:rPr>
+              <w:t>Standard deviation of real features</w:t>
+            </w:r>
+          </w:p>
+        </w:tc>
+        <w:tc>
+          <w:tcPr>
+            <w:tcW w:w="3168" w:type="dxa"/>
+            <w:tcBorders>
+              <w:top w:val="single" w:sz="4" w:space="0" w:color="000000"/>
+              <w:left w:val="single" w:sz="4" w:space="0" w:color="000000"/>
+              <w:bottom w:val="single" w:sz="4" w:space="0" w:color="000000"/>
+              <w:right w:val="single" w:sz="4" w:space="0" w:color="000000"/>
+            </w:tcBorders>
+          </w:tcPr>
+          <w:p>
+            <w:pPr>
+              <w:pStyle w:val="Normal"/>
+              <w:spacing w:lineRule="auto" w:line="240" w:before="20" w:after="20"/>
+              <w:rPr/>
+            </w:pPr>
+            <w:r>
+              <w:rPr>
+                <w:b w:val="false"/>
+                <w:sz w:val="20"/>
+              </w:rPr>
+              <w:t>1.10 vs 1.00</w:t>
+            </w:r>
+          </w:p>
+        </w:tc>
+      </w:tr>
+      <w:tr>
+        <w:trPr>
+          <w:cantSplit w:val="true"/>
+        </w:trPr>
+        <w:tc>
+          <w:tcPr>
+            <w:tcW w:w="2304" w:type="dxa"/>
+            <w:tcBorders>
+              <w:top w:val="single" w:sz="4" w:space="0" w:color="000000"/>
+              <w:left w:val="single" w:sz="4" w:space="0" w:color="000000"/>
+              <w:bottom w:val="single" w:sz="4" w:space="0" w:color="000000"/>
+              <w:right w:val="single" w:sz="4" w:space="0" w:color="000000"/>
+            </w:tcBorders>
+          </w:tcPr>
+          <w:p>
+            <w:pPr>
+              <w:pStyle w:val="Normal"/>
+              <w:spacing w:lineRule="auto" w:line="240" w:before="20" w:after="20"/>
+              <w:rPr/>
+            </w:pPr>
+            <w:r>
+              <w:rPr>
+                <w:b w:val="false"/>
+                <w:sz w:val="20"/>
+              </w:rPr>
+              <w:t>Does the structure matter?</w:t>
+            </w:r>
+          </w:p>
+        </w:tc>
+        <w:tc>
+          <w:tcPr>
+            <w:tcW w:w="3456" w:type="dxa"/>
+            <w:tcBorders>
+              <w:top w:val="single" w:sz="4" w:space="0" w:color="000000"/>
+              <w:left w:val="single" w:sz="4" w:space="0" w:color="000000"/>
+              <w:bottom w:val="single" w:sz="4" w:space="0" w:color="000000"/>
+              <w:right w:val="single" w:sz="4" w:space="0" w:color="000000"/>
+            </w:tcBorders>
+          </w:tcPr>
+          <w:p>
+            <w:pPr>
+              <w:pStyle w:val="Normal"/>
+              <w:spacing w:lineRule="auto" w:line="240" w:before="20" w:after="20"/>
+              <w:rPr/>
+            </w:pPr>
+            <w:r>
+              <w:rPr>
+                <w:b w:val="false"/>
+                <w:sz w:val="20"/>
+              </w:rPr>
+              <w:t>White-noise (full-rank) ground truth</w:t>
+            </w:r>
+          </w:p>
+        </w:tc>
+        <w:tc>
+          <w:tcPr>
+            <w:tcW w:w="3168" w:type="dxa"/>
+            <w:tcBorders>
+              <w:top w:val="single" w:sz="4" w:space="0" w:color="000000"/>
+              <w:left w:val="single" w:sz="4" w:space="0" w:color="000000"/>
+              <w:bottom w:val="single" w:sz="4" w:space="0" w:color="000000"/>
+              <w:right w:val="single" w:sz="4" w:space="0" w:color="000000"/>
+            </w:tcBorders>
+          </w:tcPr>
+          <w:p>
+            <w:pPr>
+              <w:pStyle w:val="Normal"/>
+              <w:spacing w:lineRule="auto" w:line="240" w:before="20" w:after="20"/>
+              <w:rPr/>
+            </w:pPr>
+            <w:r>
+              <w:rPr>
+                <w:b w:val="false"/>
+                <w:sz w:val="20"/>
+              </w:rPr>
+              <w:t>0.947 vs 0.942: no</w:t>
+            </w:r>
+          </w:p>
+        </w:tc>
+      </w:tr>
+      <w:tr>
+        <w:trPr>
+          <w:cantSplit w:val="true"/>
+        </w:trPr>
+        <w:tc>
+          <w:tcPr>
+            <w:tcW w:w="2304" w:type="dxa"/>
+            <w:tcBorders>
+              <w:top w:val="single" w:sz="4" w:space="0" w:color="000000"/>
+              <w:left w:val="single" w:sz="4" w:space="0" w:color="000000"/>
+              <w:bottom w:val="single" w:sz="4" w:space="0" w:color="000000"/>
+              <w:right w:val="single" w:sz="4" w:space="0" w:color="000000"/>
+            </w:tcBorders>
+          </w:tcPr>
+          <w:p>
+            <w:pPr>
+              <w:pStyle w:val="Normal"/>
+              <w:spacing w:lineRule="auto" w:line="240" w:before="20" w:after="20"/>
+              <w:rPr/>
+            </w:pPr>
+            <w:r>
+              <w:rPr>
+                <w:b w:val="false"/>
+                <w:sz w:val="20"/>
+              </w:rPr>
+              <w:t>Does the speed of change matter?</w:t>
+            </w:r>
+          </w:p>
+        </w:tc>
+        <w:tc>
+          <w:tcPr>
+            <w:tcW w:w="3456" w:type="dxa"/>
+            <w:tcBorders>
+              <w:top w:val="single" w:sz="4" w:space="0" w:color="000000"/>
+              <w:left w:val="single" w:sz="4" w:space="0" w:color="000000"/>
+              <w:bottom w:val="single" w:sz="4" w:space="0" w:color="000000"/>
+              <w:right w:val="single" w:sz="4" w:space="0" w:color="000000"/>
+            </w:tcBorders>
+          </w:tcPr>
+          <w:p>
+            <w:pPr>
+              <w:pStyle w:val="Normal"/>
+              <w:spacing w:lineRule="auto" w:line="240" w:before="20" w:after="20"/>
+              <w:rPr/>
+            </w:pPr>
+            <w:r>
+              <w:rPr>
+                <w:b w:val="false"/>
+                <w:sz w:val="20"/>
+              </w:rPr>
+              <w:t>Rate of change varied 64-fold (spans real lag-1 0.15 ± 0.12)</w:t>
+            </w:r>
+          </w:p>
+        </w:tc>
+        <w:tc>
+          <w:tcPr>
+            <w:tcW w:w="3168" w:type="dxa"/>
+            <w:tcBorders>
+              <w:top w:val="single" w:sz="4" w:space="0" w:color="000000"/>
+              <w:left w:val="single" w:sz="4" w:space="0" w:color="000000"/>
+              <w:bottom w:val="single" w:sz="4" w:space="0" w:color="000000"/>
+              <w:right w:val="single" w:sz="4" w:space="0" w:color="000000"/>
+            </w:tcBorders>
+          </w:tcPr>
+          <w:p>
+            <w:pPr>
+              <w:pStyle w:val="Normal"/>
+              <w:spacing w:lineRule="auto" w:line="240" w:before="20" w:after="20"/>
+              <w:rPr/>
+            </w:pPr>
+            <w:r>
+              <w:rPr>
+                <w:b w:val="false"/>
+                <w:sz w:val="20"/>
+              </w:rPr>
+              <w:t>0.836–0.858, no trend: no</w:t>
+            </w:r>
+          </w:p>
+        </w:tc>
+      </w:tr>
+      <w:tr>
+        <w:trPr>
+          <w:cantSplit w:val="true"/>
+        </w:trPr>
+        <w:tc>
+          <w:tcPr>
+            <w:tcW w:w="2304" w:type="dxa"/>
+            <w:tcBorders>
+              <w:top w:val="single" w:sz="4" w:space="0" w:color="000000"/>
+              <w:left w:val="single" w:sz="4" w:space="0" w:color="000000"/>
+              <w:bottom w:val="single" w:sz="4" w:space="0" w:color="000000"/>
+              <w:right w:val="single" w:sz="4" w:space="0" w:color="000000"/>
+            </w:tcBorders>
+          </w:tcPr>
+          <w:p>
+            <w:pPr>
+              <w:pStyle w:val="Normal"/>
+              <w:spacing w:lineRule="auto" w:line="240" w:before="20" w:after="20"/>
+              <w:rPr/>
+            </w:pPr>
+            <w:r>
+              <w:rPr>
+                <w:b w:val="false"/>
+                <w:sz w:val="20"/>
+              </w:rPr>
+              <w:t>Is one ground truth special?</w:t>
+            </w:r>
+          </w:p>
+        </w:tc>
+        <w:tc>
+          <w:tcPr>
+            <w:tcW w:w="3456" w:type="dxa"/>
+            <w:tcBorders>
+              <w:top w:val="single" w:sz="4" w:space="0" w:color="000000"/>
+              <w:left w:val="single" w:sz="4" w:space="0" w:color="000000"/>
+              <w:bottom w:val="single" w:sz="4" w:space="0" w:color="000000"/>
+              <w:right w:val="single" w:sz="4" w:space="0" w:color="000000"/>
+            </w:tcBorders>
+          </w:tcPr>
+          <w:p>
+            <w:pPr>
+              <w:pStyle w:val="Normal"/>
+              <w:spacing w:lineRule="auto" w:line="240" w:before="20" w:after="20"/>
+              <w:rPr/>
+            </w:pPr>
+            <w:r>
+              <w:rPr>
+                <w:b w:val="false"/>
+                <w:sz w:val="20"/>
+              </w:rPr>
+              <w:t>Four independent seeds</w:t>
+            </w:r>
+          </w:p>
+        </w:tc>
+        <w:tc>
+          <w:tcPr>
+            <w:tcW w:w="3168" w:type="dxa"/>
+            <w:tcBorders>
+              <w:top w:val="single" w:sz="4" w:space="0" w:color="000000"/>
+              <w:left w:val="single" w:sz="4" w:space="0" w:color="000000"/>
+              <w:bottom w:val="single" w:sz="4" w:space="0" w:color="000000"/>
+              <w:right w:val="single" w:sz="4" w:space="0" w:color="000000"/>
+            </w:tcBorders>
+          </w:tcPr>
+          <w:p>
+            <w:pPr>
+              <w:pStyle w:val="Normal"/>
+              <w:spacing w:lineRule="auto" w:line="240" w:before="20" w:after="20"/>
+              <w:rPr/>
+            </w:pPr>
+            <w:r>
+              <w:rPr>
+                <w:b w:val="false"/>
+                <w:sz w:val="20"/>
+              </w:rPr>
+              <w:t>Agreement 0.894 ± 0.003; barrier 4.8×; sensitivity 2.15 ± 0.17×</w:t>
+            </w:r>
+          </w:p>
+        </w:tc>
+      </w:tr>
+      <w:tr>
+        <w:trPr>
+          <w:cantSplit w:val="true"/>
+        </w:trPr>
+        <w:tc>
+          <w:tcPr>
+            <w:tcW w:w="2304" w:type="dxa"/>
+            <w:tcBorders>
+              <w:top w:val="single" w:sz="4" w:space="0" w:color="000000"/>
+              <w:left w:val="single" w:sz="4" w:space="0" w:color="000000"/>
+              <w:bottom w:val="single" w:sz="4" w:space="0" w:color="000000"/>
+              <w:right w:val="single" w:sz="4" w:space="0" w:color="000000"/>
+            </w:tcBorders>
+          </w:tcPr>
+          <w:p>
+            <w:pPr>
+              <w:pStyle w:val="Normal"/>
+              <w:spacing w:lineRule="auto" w:line="240" w:before="20" w:after="20"/>
+              <w:rPr/>
+            </w:pPr>
+            <w:r>
+              <w:rPr>
+                <w:b w:val="false"/>
+                <w:sz w:val="20"/>
+              </w:rPr>
+              <w:t>Do real stimuli behave the same?</w:t>
+            </w:r>
+          </w:p>
+        </w:tc>
+        <w:tc>
+          <w:tcPr>
+            <w:tcW w:w="3456" w:type="dxa"/>
+            <w:tcBorders>
+              <w:top w:val="single" w:sz="4" w:space="0" w:color="000000"/>
+              <w:left w:val="single" w:sz="4" w:space="0" w:color="000000"/>
+              <w:bottom w:val="single" w:sz="4" w:space="0" w:color="000000"/>
+              <w:right w:val="single" w:sz="4" w:space="0" w:color="000000"/>
+            </w:tcBorders>
+          </w:tcPr>
+          <w:p>
+            <w:pPr>
+              <w:pStyle w:val="Normal"/>
+              <w:spacing w:lineRule="auto" w:line="240" w:before="20" w:after="20"/>
+              <w:rPr/>
+            </w:pPr>
+            <w:r>
+              <w:rPr>
+                <w:b w:val="false"/>
+                <w:sz w:val="20"/>
+              </w:rPr>
+              <w:t>Real 16-s window as ground truth, 3 blind starts + control</w:t>
+            </w:r>
+          </w:p>
+        </w:tc>
+        <w:tc>
+          <w:tcPr>
+            <w:tcW w:w="3168" w:type="dxa"/>
+            <w:tcBorders>
+              <w:top w:val="single" w:sz="4" w:space="0" w:color="000000"/>
+              <w:left w:val="single" w:sz="4" w:space="0" w:color="000000"/>
+              <w:bottom w:val="single" w:sz="4" w:space="0" w:color="000000"/>
+              <w:right w:val="single" w:sz="4" w:space="0" w:color="000000"/>
+            </w:tcBorders>
+          </w:tcPr>
+          <w:p>
+            <w:pPr>
+              <w:pStyle w:val="Normal"/>
+              <w:spacing w:lineRule="auto" w:line="240" w:before="20" w:after="20"/>
+              <w:rPr/>
+            </w:pPr>
+            <w:r>
+              <w:rPr>
+                <w:b w:val="false"/>
+                <w:sz w:val="20"/>
+              </w:rPr>
+              <w:t>Partial recovery 0.43–0.60; disagreement 0.19–0.56; barriers 11–21×; deeper minimum 54× away</w:t>
+            </w:r>
+          </w:p>
+        </w:tc>
+      </w:tr>
+    </w:tbl>
+    <w:p>
+      <w:pPr>
+        <w:pStyle w:val="Normal"/>
+        <w:spacing w:lineRule="auto" w:line="240" w:before="0" w:after="80"/>
+        <w:rPr/>
+      </w:pPr>
+      <w:r>
+        <w:rPr/>
+      </w:r>
+    </w:p>
+    <w:p>
+      <w:pPr>
+        <w:pStyle w:val="Heading2"/>
+        <w:rPr/>
+      </w:pPr>
+      <w:bookmarkStart w:id="32" w:name="__RefHeading___Toc2453_3840626700"/>
+      <w:bookmarkEnd w:id="32"/>
+      <w:r>
+        <w:rPr/>
+        <w:t>5.3 Discriminating the causes of incomplete recovery</w:t>
       </w:r>
     </w:p>
     <w:p>
@@ -11722,17 +12663,22 @@
       </w:pPr>
       <w:r>
         <w:rPr>
-          <w:b/>
-          <w:sz w:val="24"/>
-        </w:rPr>
-        <w:t>Surface projection.</w:t>
-      </w:r>
-      <w:r>
-        <w:rPr>
           <w:b w:val="false"/>
           <w:sz w:val="24"/>
         </w:rPr>
-        <w:t xml:space="preserve"> The authors' preprocessed responses (95 556 cortical voxels) were mapped to fsaverage5 with TRIBE v2's own projector settings: a 3-mm ball of 20 points around each mid-cortical vertex, trilinear weights inside the cortical mask. Vertices were carried from MNI space to the subject's T1 by an ANTs SyN registration [37] and into functional voxels by the pycortex transform [38], giving a sparse 20 484 × 95 556 sampling matrix; the series were then detrended and z-scored. Validation: the left–right homotopic correlation was 0.635 against −0.017 for heterotopic pairs (above 97% of alternative pairings), and a scrambled-vertex control fell to chance.</w:t>
+        <w:t>Four explanations were tested, each with a signature that would appear if it were true. (H1) Information loss: fit-matched solutions differ along a null-space direction the operator ignores. (H2) Non-convexity: distinct minima at equal fit, separated by a barrier. (H3) Optimiser artefact: recovery keeps rising with budget. (H4) Unidentifiable gain: a rescaled x gives the same output. Inversions were started from eight initialisation distributions and compared only when within 2× of the best fit, so under-converged runs could not pose as alternative solutions; the analysis was replicated over four ground truths. For two fit-matched solutions, a null space predicts that the prediction error stays flat along the straight line between them, while separate minima predict a rise in between; this test and the sensitivity probe use forward passes only and do not depend on the optimiser. Two further starts placed near the truth serve as a control for whether a deeper minimum exists.</w:t>
+      </w:r>
+    </w:p>
+    <w:p>
+      <w:pPr>
+        <w:pStyle w:val="Heading2"/>
+        <w:rPr/>
+      </w:pPr>
+      <w:bookmarkStart w:id="33" w:name="__RefHeading___Toc2455_3840626700"/>
+      <w:bookmarkEnd w:id="33"/>
+      <w:r>
+        <w:rPr/>
+        <w:t>5.4 Regional analysis</w:t>
       </w:r>
     </w:p>
     <w:p>
@@ -11744,17 +12690,22 @@
       </w:pPr>
       <w:r>
         <w:rPr>
-          <w:b/>
-          <w:sz w:val="24"/>
-        </w:rPr>
-        <w:t>Features and alignment.</w:t>
-      </w:r>
-      <w:r>
-        <w:rPr>
           <w:b w:val="false"/>
           <w:sz w:val="24"/>
         </w:rPr>
-        <w:t xml:space="preserve"> Stimulus features came from TRIBE v2's own pipeline with the dataset's word timings: w2v-BERT 2.0 for audio [39] and Llama-3.2-3B for text [40], grouped into 100-s segments (45 across six stories). The offset between model time and BOLD was the lag maximising prediction–response correlation on the five training stories; the 2 000 analysis vertices were those best predicted on the training stories.</w:t>
+        <w:t>Six disjoint networks were defined on fsaverage5 from the Destrieux atlas [33] (Figure 8.10): left language network [34] (1 282 vertices), its right-hemisphere homologue (1 368), auditory cortex (277), default-mode network [35] (1 224), visual cortex (1 582) and somatomotor cortex (1 487) as a low-semantic control. For each network we measured forward sensitivity per input modality against 2 000 random vertex sets of equal size, recovery when only that network is observed (8 000 steps) against size-matched random vertex sets with a second random seed as the control spread, and the participation ratio [36] of its responses to 128 random input directions.</w:t>
+      </w:r>
+    </w:p>
+    <w:p>
+      <w:pPr>
+        <w:pStyle w:val="Heading2"/>
+        <w:rPr/>
+      </w:pPr>
+      <w:bookmarkStart w:id="34" w:name="__RefHeading___Toc2457_3840626700"/>
+      <w:bookmarkEnd w:id="34"/>
+      <w:r>
+        <w:rPr/>
+        <w:t>5.5 Real-fMRI validation</w:t>
       </w:r>
     </w:p>
     <w:p>
@@ -11769,13 +12720,79 @@
           <w:b/>
           <w:sz w:val="24"/>
         </w:rPr>
-        <w:t>Evaluation.</w:t>
+        <w:t>Data.</w:t>
       </w:r>
       <w:r>
         <w:rPr>
           <w:b w:val="false"/>
           <w:sz w:val="24"/>
         </w:rPr>
+        <w:t xml:space="preserve"> Subject UTS03 of the LeBel et al. corpus [22] (OpenNeuro ds003020): six stories, 66.6 minutes of speech, 10 363 words, TR 2 s. The held-out story wheretheressmoke is the mean of ten repeats; the other five stories are used for every tuning choice.</w:t>
+      </w:r>
+    </w:p>
+    <w:p>
+      <w:pPr>
+        <w:pStyle w:val="Normal"/>
+        <w:spacing w:lineRule="auto" w:line="360" w:before="0" w:after="160"/>
+        <w:jc w:val="both"/>
+        <w:rPr/>
+      </w:pPr>
+      <w:r>
+        <w:rPr>
+          <w:b/>
+          <w:sz w:val="24"/>
+        </w:rPr>
+        <w:t>Surface projection.</w:t>
+      </w:r>
+      <w:r>
+        <w:rPr>
+          <w:b w:val="false"/>
+          <w:sz w:val="24"/>
+        </w:rPr>
+        <w:t xml:space="preserve"> The authors' preprocessed responses (95 556 cortical voxels) were mapped to fsaverage5 with TRIBE v2's own projector settings: a 3-mm ball of 20 points around each mid-cortical vertex, trilinear weights inside the cortical mask. Vertices were carried from MNI space to the subject's T1 by an ANTs SyN registration [37] and into functional voxels by the pycortex transform [38], giving a sparse 20 484 × 95 556 sampling matrix; the series were then detrended and z-scored. Validation: the left–right homotopic correlation was 0.635 against −0.017 for heterotopic pairs (above 97% of alternative pairings), and a scrambled-vertex control fell to chance.</w:t>
+      </w:r>
+    </w:p>
+    <w:p>
+      <w:pPr>
+        <w:pStyle w:val="Normal"/>
+        <w:spacing w:lineRule="auto" w:line="360" w:before="0" w:after="160"/>
+        <w:jc w:val="both"/>
+        <w:rPr/>
+      </w:pPr>
+      <w:r>
+        <w:rPr>
+          <w:b/>
+          <w:sz w:val="24"/>
+        </w:rPr>
+        <w:t>Features and alignment.</w:t>
+      </w:r>
+      <w:r>
+        <w:rPr>
+          <w:b w:val="false"/>
+          <w:sz w:val="24"/>
+        </w:rPr>
+        <w:t xml:space="preserve"> Stimulus features came from TRIBE v2's own pipeline with the dataset's word timings: w2v-BERT 2.0 for audio [39] and Llama-3.2-3B for text [40], grouped into 100-s segments (45 across six stories). The offset between model time and BOLD was the lag maximising prediction–response correlation on the five training stories; the 2 000 analysis vertices were those best predicted on the training stories.</w:t>
+      </w:r>
+    </w:p>
+    <w:p>
+      <w:pPr>
+        <w:pStyle w:val="Normal"/>
+        <w:spacing w:lineRule="auto" w:line="360" w:before="0" w:after="160"/>
+        <w:jc w:val="both"/>
+        <w:rPr/>
+      </w:pPr>
+      <w:r>
+        <w:rPr>
+          <w:b/>
+          <w:sz w:val="24"/>
+        </w:rPr>
+        <w:t>Evaluation.</w:t>
+      </w:r>
+      <w:r>
+        <w:rPr>
+          <w:b w:val="false"/>
+          <w:sz w:val="24"/>
+        </w:rPr>
         <w:t xml:space="preserve"> (i) Encoding accuracy per vertex on the held-out story, against a split-half noise ceiling from the ten repeats. (ii) Forward identification: each 20-s window of held-out BOLD matched to predictions for all 194 windows of the six stories. (iii) Inversion: each held-out 100-s segment inverted from measured BOLD, and x̂ ranked against the true representations of all 45 segments (chance 1/45). (iv) An oracle that inverts the model's own noise-free prediction under the same budget, separating the operator's conditioning from measurement noise.</w:t>
       </w:r>
       <w:r>
@@ -11787,8 +12804,8 @@
         <w:pStyle w:val="Heading1"/>
         <w:rPr/>
       </w:pPr>
-      <w:bookmarkStart w:id="31" w:name="__RefHeading___Toc2364_1187282842"/>
-      <w:bookmarkEnd w:id="31"/>
+      <w:bookmarkStart w:id="35" w:name="__RefHeading___Toc2459_3840626700"/>
+      <w:bookmarkEnd w:id="35"/>
       <w:r>
         <w:rPr/>
         <w:t>6. HARDWARE/SOFTWARE TOOLS USED</w:t>
@@ -11799,8 +12816,8 @@
         <w:pStyle w:val="TableCaption"/>
         <w:rPr/>
       </w:pPr>
-      <w:bookmarkStart w:id="32" w:name="__RefHeading___Toc2458_1187282842"/>
-      <w:bookmarkEnd w:id="32"/>
+      <w:bookmarkStart w:id="36" w:name="__RefHeading___Toc2557_3840626700"/>
+      <w:bookmarkEnd w:id="36"/>
       <w:r>
         <w:rPr>
           <w:b w:val="false"/>
@@ -12589,8 +13606,8 @@
         <w:pStyle w:val="Heading1"/>
         <w:rPr/>
       </w:pPr>
-      <w:bookmarkStart w:id="33" w:name="__RefHeading___Toc2366_1187282842"/>
-      <w:bookmarkEnd w:id="33"/>
+      <w:bookmarkStart w:id="37" w:name="__RefHeading___Toc2461_3840626700"/>
+      <w:bookmarkEnd w:id="37"/>
       <w:r>
         <w:rPr/>
         <w:t>7. SCHEDULE AND MILESTONES</w:t>
@@ -12601,8 +13618,8 @@
         <w:pStyle w:val="TableCaption"/>
         <w:rPr/>
       </w:pPr>
-      <w:bookmarkStart w:id="34" w:name="__RefHeading___Toc2456_1187282842"/>
-      <w:bookmarkEnd w:id="34"/>
+      <w:bookmarkStart w:id="38" w:name="__RefHeading___Toc2555_3840626700"/>
+      <w:bookmarkEnd w:id="38"/>
       <w:r>
         <w:rPr>
           <w:b w:val="false"/>
@@ -13535,8 +14552,8 @@
         <w:pStyle w:val="Heading1"/>
         <w:rPr/>
       </w:pPr>
-      <w:bookmarkStart w:id="35" w:name="__RefHeading___Toc2368_1187282842"/>
-      <w:bookmarkEnd w:id="35"/>
+      <w:bookmarkStart w:id="39" w:name="__RefHeading___Toc2463_3840626700"/>
+      <w:bookmarkEnd w:id="39"/>
       <w:r>
         <w:rPr/>
         <w:t>8. RESULT ANALYSIS</w:t>
@@ -13547,8 +14564,8 @@
         <w:pStyle w:val="Heading2"/>
         <w:rPr/>
       </w:pPr>
-      <w:bookmarkStart w:id="36" w:name="__RefHeading___Toc2370_1187282842"/>
-      <w:bookmarkEnd w:id="36"/>
+      <w:bookmarkStart w:id="40" w:name="__RefHeading___Toc2465_3840626700"/>
+      <w:bookmarkEnd w:id="40"/>
       <w:r>
         <w:rPr/>
         <w:t>8.1 Encoding accuracy does not certify decoding</w:t>
@@ -13583,7 +14600,7 @@
           <wp:inline distT="0" distB="0" distL="0" distR="0">
             <wp:extent cx="5120640" cy="3096260"/>
             <wp:effectExtent l="0" t="0" r="0" b="0"/>
-            <wp:docPr id="3" name="Picture 4" descr=""/>
+            <wp:docPr id="5" name="Picture 6" descr=""/>
             <wp:cNvGraphicFramePr>
               <a:graphicFrameLocks xmlns:a="http://schemas.openxmlformats.org/drawingml/2006/main" noChangeAspect="1"/>
             </wp:cNvGraphicFramePr>
@@ -13591,13 +14608,13 @@
               <a:graphicData uri="http://schemas.openxmlformats.org/drawingml/2006/picture">
                 <pic:pic xmlns:pic="http://schemas.openxmlformats.org/drawingml/2006/picture">
                   <pic:nvPicPr>
-                    <pic:cNvPr id="3" name="Picture 4" descr=""/>
+                    <pic:cNvPr id="5" name="Picture 6" descr=""/>
                     <pic:cNvPicPr>
                       <a:picLocks noChangeAspect="1" noChangeArrowheads="1"/>
                     </pic:cNvPicPr>
                   </pic:nvPicPr>
                   <pic:blipFill>
-                    <a:blip r:embed="rId6"/>
+                    <a:blip r:embed="rId8"/>
                     <a:stretch>
                       <a:fillRect/>
                     </a:stretch>
@@ -13623,8 +14640,8 @@
         <w:pStyle w:val="FigureCaption"/>
         <w:rPr/>
       </w:pPr>
-      <w:bookmarkStart w:id="37" w:name="__RefHeading___Toc2434_1187282842"/>
-      <w:bookmarkEnd w:id="37"/>
+      <w:bookmarkStart w:id="41" w:name="__RefHeading___Toc2529_3840626700"/>
+      <w:bookmarkEnd w:id="41"/>
       <w:r>
         <w:rPr>
           <w:b w:val="false"/>
@@ -13638,8 +14655,8 @@
         <w:pStyle w:val="TableCaption"/>
         <w:rPr/>
       </w:pPr>
-      <w:bookmarkStart w:id="38" w:name="__RefHeading___Toc2454_1187282842"/>
-      <w:bookmarkEnd w:id="38"/>
+      <w:bookmarkStart w:id="42" w:name="__RefHeading___Toc2553_3840626700"/>
+      <w:bookmarkEnd w:id="42"/>
       <w:r>
         <w:rPr>
           <w:b w:val="false"/>
@@ -14410,8 +15427,8 @@
         <w:pStyle w:val="Heading2"/>
         <w:rPr/>
       </w:pPr>
-      <w:bookmarkStart w:id="39" w:name="__RefHeading___Toc2372_1187282842"/>
-      <w:bookmarkEnd w:id="39"/>
+      <w:bookmarkStart w:id="43" w:name="__RefHeading___Toc2467_3840626700"/>
+      <w:bookmarkEnd w:id="43"/>
       <w:r>
         <w:rPr/>
         <w:t>8.2 Equally good fits give different answers</w:t>
@@ -14446,7 +15463,7 @@
           <wp:inline distT="0" distB="0" distL="0" distR="0">
             <wp:extent cx="5669280" cy="2267585"/>
             <wp:effectExtent l="0" t="0" r="0" b="0"/>
-            <wp:docPr id="4" name="Picture 5" descr=""/>
+            <wp:docPr id="6" name="Picture 7" descr=""/>
             <wp:cNvGraphicFramePr>
               <a:graphicFrameLocks xmlns:a="http://schemas.openxmlformats.org/drawingml/2006/main" noChangeAspect="1"/>
             </wp:cNvGraphicFramePr>
@@ -14454,13 +15471,13 @@
               <a:graphicData uri="http://schemas.openxmlformats.org/drawingml/2006/picture">
                 <pic:pic xmlns:pic="http://schemas.openxmlformats.org/drawingml/2006/picture">
                   <pic:nvPicPr>
-                    <pic:cNvPr id="4" name="Picture 5" descr=""/>
+                    <pic:cNvPr id="6" name="Picture 7" descr=""/>
                     <pic:cNvPicPr>
                       <a:picLocks noChangeAspect="1" noChangeArrowheads="1"/>
                     </pic:cNvPicPr>
                   </pic:nvPicPr>
                   <pic:blipFill>
-                    <a:blip r:embed="rId7"/>
+                    <a:blip r:embed="rId9"/>
                     <a:stretch>
                       <a:fillRect/>
                     </a:stretch>
@@ -14486,8 +15503,8 @@
         <w:pStyle w:val="FigureCaption"/>
         <w:rPr/>
       </w:pPr>
-      <w:bookmarkStart w:id="40" w:name="__RefHeading___Toc2432_1187282842"/>
-      <w:bookmarkEnd w:id="40"/>
+      <w:bookmarkStart w:id="44" w:name="__RefHeading___Toc2527_3840626700"/>
+      <w:bookmarkEnd w:id="44"/>
       <w:r>
         <w:rPr>
           <w:b w:val="false"/>
@@ -14501,8 +15518,8 @@
         <w:pStyle w:val="TableCaption"/>
         <w:rPr/>
       </w:pPr>
-      <w:bookmarkStart w:id="41" w:name="__RefHeading___Toc2452_1187282842"/>
-      <w:bookmarkEnd w:id="41"/>
+      <w:bookmarkStart w:id="45" w:name="__RefHeading___Toc2551_3840626700"/>
+      <w:bookmarkEnd w:id="45"/>
       <w:r>
         <w:rPr>
           <w:b w:val="false"/>
@@ -15197,8 +16214,8 @@
         <w:pStyle w:val="Heading2"/>
         <w:rPr/>
       </w:pPr>
-      <w:bookmarkStart w:id="42" w:name="__RefHeading___Toc2374_1187282842"/>
-      <w:bookmarkEnd w:id="42"/>
+      <w:bookmarkStart w:id="46" w:name="__RefHeading___Toc2469_3840626700"/>
+      <w:bookmarkEnd w:id="46"/>
       <w:r>
         <w:rPr/>
         <w:t>8.3 Barriers, not a null space</w:t>
@@ -15270,7 +16287,7 @@
           <wp:inline distT="0" distB="0" distL="0" distR="0">
             <wp:extent cx="5760720" cy="2038350"/>
             <wp:effectExtent l="0" t="0" r="0" b="0"/>
-            <wp:docPr id="5" name="Picture 6" descr=""/>
+            <wp:docPr id="7" name="Picture 8" descr=""/>
             <wp:cNvGraphicFramePr>
               <a:graphicFrameLocks xmlns:a="http://schemas.openxmlformats.org/drawingml/2006/main" noChangeAspect="1"/>
             </wp:cNvGraphicFramePr>
@@ -15278,13 +16295,13 @@
               <a:graphicData uri="http://schemas.openxmlformats.org/drawingml/2006/picture">
                 <pic:pic xmlns:pic="http://schemas.openxmlformats.org/drawingml/2006/picture">
                   <pic:nvPicPr>
-                    <pic:cNvPr id="5" name="Picture 6" descr=""/>
+                    <pic:cNvPr id="7" name="Picture 8" descr=""/>
                     <pic:cNvPicPr>
                       <a:picLocks noChangeAspect="1" noChangeArrowheads="1"/>
                     </pic:cNvPicPr>
                   </pic:nvPicPr>
                   <pic:blipFill>
-                    <a:blip r:embed="rId8"/>
+                    <a:blip r:embed="rId10"/>
                     <a:stretch>
                       <a:fillRect/>
                     </a:stretch>
@@ -15310,8 +16327,8 @@
         <w:pStyle w:val="FigureCaption"/>
         <w:rPr/>
       </w:pPr>
-      <w:bookmarkStart w:id="43" w:name="__RefHeading___Toc2430_1187282842"/>
-      <w:bookmarkEnd w:id="43"/>
+      <w:bookmarkStart w:id="47" w:name="__RefHeading___Toc2525_3840626700"/>
+      <w:bookmarkEnd w:id="47"/>
       <w:r>
         <w:rPr>
           <w:b w:val="false"/>
@@ -15325,8 +16342,8 @@
         <w:pStyle w:val="TableCaption"/>
         <w:rPr/>
       </w:pPr>
-      <w:bookmarkStart w:id="44" w:name="__RefHeading___Toc2450_1187282842"/>
-      <w:bookmarkEnd w:id="44"/>
+      <w:bookmarkStart w:id="48" w:name="__RefHeading___Toc2549_3840626700"/>
+      <w:bookmarkEnd w:id="48"/>
       <w:r>
         <w:rPr>
           <w:b w:val="false"/>
@@ -17004,8 +18021,8 @@
         <w:pStyle w:val="Heading2"/>
         <w:rPr/>
       </w:pPr>
-      <w:bookmarkStart w:id="45" w:name="__RefHeading___Toc2376_1187282842"/>
-      <w:bookmarkEnd w:id="45"/>
+      <w:bookmarkStart w:id="49" w:name="__RefHeading___Toc2471_3840626700"/>
+      <w:bookmarkEnd w:id="49"/>
       <w:r>
         <w:rPr/>
         <w:t>8.4 Errors lie in the operator's weakest directions</w:t>
@@ -17039,161 +18056,6 @@
         <w:drawing>
           <wp:inline distT="0" distB="0" distL="0" distR="0">
             <wp:extent cx="4937760" cy="2468880"/>
-            <wp:effectExtent l="0" t="0" r="0" b="0"/>
-            <wp:docPr id="6" name="Picture 7" descr=""/>
-            <wp:cNvGraphicFramePr>
-              <a:graphicFrameLocks xmlns:a="http://schemas.openxmlformats.org/drawingml/2006/main" noChangeAspect="1"/>
-            </wp:cNvGraphicFramePr>
-            <a:graphic xmlns:a="http://schemas.openxmlformats.org/drawingml/2006/main">
-              <a:graphicData uri="http://schemas.openxmlformats.org/drawingml/2006/picture">
-                <pic:pic xmlns:pic="http://schemas.openxmlformats.org/drawingml/2006/picture">
-                  <pic:nvPicPr>
-                    <pic:cNvPr id="6" name="Picture 7" descr=""/>
-                    <pic:cNvPicPr>
-                      <a:picLocks noChangeAspect="1" noChangeArrowheads="1"/>
-                    </pic:cNvPicPr>
-                  </pic:nvPicPr>
-                  <pic:blipFill>
-                    <a:blip r:embed="rId9"/>
-                    <a:stretch>
-                      <a:fillRect/>
-                    </a:stretch>
-                  </pic:blipFill>
-                  <pic:spPr bwMode="auto">
-                    <a:xfrm>
-                      <a:off x="0" y="0"/>
-                      <a:ext cx="4937760" cy="2468880"/>
-                    </a:xfrm>
-                    <a:prstGeom prst="rect">
-                      <a:avLst/>
-                    </a:prstGeom>
-                  </pic:spPr>
-                </pic:pic>
-              </a:graphicData>
-            </a:graphic>
-          </wp:inline>
-        </w:drawing>
-      </w:r>
-    </w:p>
-    <w:p>
-      <w:pPr>
-        <w:pStyle w:val="FigureCaption"/>
-        <w:rPr/>
-      </w:pPr>
-      <w:bookmarkStart w:id="46" w:name="__RefHeading___Toc2428_1187282842"/>
-      <w:bookmarkEnd w:id="46"/>
-      <w:r>
-        <w:rPr>
-          <w:b w:val="false"/>
-          <w:sz w:val="20"/>
-        </w:rPr>
-        <w:t>Figure 8.4: Directional sensitivity of the operator in the original run: solution-difference directions against 200 random directions (the corrected pairs give 2.15 ± 0.17× over four truths)</w:t>
-      </w:r>
-    </w:p>
-    <w:p>
-      <w:pPr>
-        <w:pStyle w:val="Heading2"/>
-        <w:rPr/>
-      </w:pPr>
-      <w:bookmarkStart w:id="47" w:name="__RefHeading___Toc2378_1187282842"/>
-      <w:bookmarkEnd w:id="47"/>
-      <w:r>
-        <w:rPr/>
-        <w:t>8.5 Further conditioning results</w:t>
-      </w:r>
-    </w:p>
-    <w:p>
-      <w:pPr>
-        <w:pStyle w:val="Normal"/>
-        <w:spacing w:lineRule="auto" w:line="360" w:before="0" w:after="160"/>
-        <w:jc w:val="both"/>
-        <w:rPr/>
-      </w:pPr>
-      <w:r>
-        <w:rPr>
-          <w:b w:val="false"/>
-          <w:sz w:val="24"/>
-        </w:rPr>
-        <w:t>Gain is identifiable: only the true scale lies within the optimiser's residual floor, and a 10% rescale already produces 7.5× the floor (Figure 8.5). The inverse degrades smoothly with measurement noise while retrieval stays near 0.99 (Figure 8.6), and about 10% of cortex (2 000 random vertices) carries most of the recoverable signal (Figure 8.7). Generic priors do not help: an ℓ₂ penalty gives at most +0.032 and temporal smoothness destroys recovery (Figure 8.8). A ridge decoder fitted on the same forward model reaches only 0.060, against 0.918 for gradient inversion (Figure 8.9). Table 8.4 collects these results.</w:t>
-      </w:r>
-    </w:p>
-    <w:p>
-      <w:pPr>
-        <w:pStyle w:val="Normal"/>
-        <w:keepNext w:val="true"/>
-        <w:spacing w:before="120" w:after="0"/>
-        <w:jc w:val="center"/>
-        <w:rPr/>
-      </w:pPr>
-      <w:r>
-        <w:rPr/>
-        <w:drawing>
-          <wp:inline distT="0" distB="0" distL="0" distR="0">
-            <wp:extent cx="4389120" cy="2403475"/>
-            <wp:effectExtent l="0" t="0" r="0" b="0"/>
-            <wp:docPr id="7" name="Picture 8" descr=""/>
-            <wp:cNvGraphicFramePr>
-              <a:graphicFrameLocks xmlns:a="http://schemas.openxmlformats.org/drawingml/2006/main" noChangeAspect="1"/>
-            </wp:cNvGraphicFramePr>
-            <a:graphic xmlns:a="http://schemas.openxmlformats.org/drawingml/2006/main">
-              <a:graphicData uri="http://schemas.openxmlformats.org/drawingml/2006/picture">
-                <pic:pic xmlns:pic="http://schemas.openxmlformats.org/drawingml/2006/picture">
-                  <pic:nvPicPr>
-                    <pic:cNvPr id="7" name="Picture 8" descr=""/>
-                    <pic:cNvPicPr>
-                      <a:picLocks noChangeAspect="1" noChangeArrowheads="1"/>
-                    </pic:cNvPicPr>
-                  </pic:nvPicPr>
-                  <pic:blipFill>
-                    <a:blip r:embed="rId10"/>
-                    <a:stretch>
-                      <a:fillRect/>
-                    </a:stretch>
-                  </pic:blipFill>
-                  <pic:spPr bwMode="auto">
-                    <a:xfrm>
-                      <a:off x="0" y="0"/>
-                      <a:ext cx="4389120" cy="2403475"/>
-                    </a:xfrm>
-                    <a:prstGeom prst="rect">
-                      <a:avLst/>
-                    </a:prstGeom>
-                  </pic:spPr>
-                </pic:pic>
-              </a:graphicData>
-            </a:graphic>
-          </wp:inline>
-        </w:drawing>
-      </w:r>
-    </w:p>
-    <w:p>
-      <w:pPr>
-        <w:pStyle w:val="FigureCaption"/>
-        <w:rPr/>
-      </w:pPr>
-      <w:bookmarkStart w:id="48" w:name="__RefHeading___Toc2426_1187282842"/>
-      <w:bookmarkEnd w:id="48"/>
-      <w:r>
-        <w:rPr>
-          <w:b w:val="false"/>
-          <w:sz w:val="20"/>
-        </w:rPr>
-        <w:t>Figure 8.5: Output change under rescaling of the ground truth relative to the optimiser's noise floor</w:t>
-      </w:r>
-    </w:p>
-    <w:p>
-      <w:pPr>
-        <w:pStyle w:val="Normal"/>
-        <w:keepNext w:val="true"/>
-        <w:spacing w:before="120" w:after="0"/>
-        <w:jc w:val="center"/>
-        <w:rPr/>
-      </w:pPr>
-      <w:r>
-        <w:rPr/>
-        <w:drawing>
-          <wp:inline distT="0" distB="0" distL="0" distR="0">
-            <wp:extent cx="5669280" cy="2267585"/>
             <wp:effectExtent l="0" t="0" r="0" b="0"/>
             <wp:docPr id="8" name="Picture 9" descr=""/>
             <wp:cNvGraphicFramePr>
@@ -17217,7 +18079,7 @@
                   <pic:spPr bwMode="auto">
                     <a:xfrm>
                       <a:off x="0" y="0"/>
-                      <a:ext cx="5669280" cy="2267585"/>
+                      <a:ext cx="4937760" cy="2468880"/>
                     </a:xfrm>
                     <a:prstGeom prst="rect">
                       <a:avLst/>
@@ -17235,14 +18097,41 @@
         <w:pStyle w:val="FigureCaption"/>
         <w:rPr/>
       </w:pPr>
-      <w:bookmarkStart w:id="49" w:name="__RefHeading___Toc2424_1187282842"/>
-      <w:bookmarkEnd w:id="49"/>
+      <w:bookmarkStart w:id="50" w:name="__RefHeading___Toc2523_3840626700"/>
+      <w:bookmarkEnd w:id="50"/>
       <w:r>
         <w:rPr>
           <w:b w:val="false"/>
           <w:sz w:val="20"/>
         </w:rPr>
-        <w:t>Figure 8.6: Recovery, relative error and retrieval against measurement noise</w:t>
+        <w:t>Figure 8.4: Directional sensitivity of the operator in the original run: solution-difference directions against 200 random directions (the corrected pairs give 2.15 ± 0.17× over four truths)</w:t>
+      </w:r>
+    </w:p>
+    <w:p>
+      <w:pPr>
+        <w:pStyle w:val="Heading2"/>
+        <w:rPr/>
+      </w:pPr>
+      <w:bookmarkStart w:id="51" w:name="__RefHeading___Toc2473_3840626700"/>
+      <w:bookmarkEnd w:id="51"/>
+      <w:r>
+        <w:rPr/>
+        <w:t>8.5 Further conditioning results</w:t>
+      </w:r>
+    </w:p>
+    <w:p>
+      <w:pPr>
+        <w:pStyle w:val="Normal"/>
+        <w:spacing w:lineRule="auto" w:line="360" w:before="0" w:after="160"/>
+        <w:jc w:val="both"/>
+        <w:rPr/>
+      </w:pPr>
+      <w:r>
+        <w:rPr>
+          <w:b w:val="false"/>
+          <w:sz w:val="24"/>
+        </w:rPr>
+        <w:t>Gain is identifiable: only the true scale lies within the optimiser's residual floor, and a 10% rescale already produces 7.5× the floor (Figure 8.5). The inverse degrades smoothly with measurement noise while retrieval stays near 0.99 (Figure 8.6), and about 10% of cortex (2 000 random vertices) carries most of the recoverable signal (Figure 8.7). Generic priors do not help: an ℓ₂ penalty gives at most +0.032 and temporal smoothness destroys recovery (Figure 8.8). A ridge decoder fitted on the same forward model reaches only 0.060, against 0.918 for gradient inversion (Figure 8.9). Table 8.4 collects these results.</w:t>
       </w:r>
     </w:p>
     <w:p>
@@ -17257,7 +18146,7 @@
         <w:rPr/>
         <w:drawing>
           <wp:inline distT="0" distB="0" distL="0" distR="0">
-            <wp:extent cx="4754880" cy="2653665"/>
+            <wp:extent cx="4389120" cy="2403475"/>
             <wp:effectExtent l="0" t="0" r="0" b="0"/>
             <wp:docPr id="9" name="Picture 10" descr=""/>
             <wp:cNvGraphicFramePr>
@@ -17281,7 +18170,7 @@
                   <pic:spPr bwMode="auto">
                     <a:xfrm>
                       <a:off x="0" y="0"/>
-                      <a:ext cx="4754880" cy="2653665"/>
+                      <a:ext cx="4389120" cy="2403475"/>
                     </a:xfrm>
                     <a:prstGeom prst="rect">
                       <a:avLst/>
@@ -17299,14 +18188,14 @@
         <w:pStyle w:val="FigureCaption"/>
         <w:rPr/>
       </w:pPr>
-      <w:bookmarkStart w:id="50" w:name="__RefHeading___Toc2422_1187282842"/>
-      <w:bookmarkEnd w:id="50"/>
+      <w:bookmarkStart w:id="52" w:name="__RefHeading___Toc2521_3840626700"/>
+      <w:bookmarkEnd w:id="52"/>
       <w:r>
         <w:rPr>
           <w:b w:val="false"/>
           <w:sz w:val="20"/>
         </w:rPr>
-        <w:t>Figure 8.7: Recovery against the number of observed cortical vertices</w:t>
+        <w:t>Figure 8.5: Output change under rescaling of the ground truth relative to the optimiser's noise floor</w:t>
       </w:r>
     </w:p>
     <w:p>
@@ -17321,7 +18210,7 @@
         <w:rPr/>
         <w:drawing>
           <wp:inline distT="0" distB="0" distL="0" distR="0">
-            <wp:extent cx="4754880" cy="2653665"/>
+            <wp:extent cx="5669280" cy="2267585"/>
             <wp:effectExtent l="0" t="0" r="0" b="0"/>
             <wp:docPr id="10" name="Picture 11" descr=""/>
             <wp:cNvGraphicFramePr>
@@ -17345,7 +18234,7 @@
                   <pic:spPr bwMode="auto">
                     <a:xfrm>
                       <a:off x="0" y="0"/>
-                      <a:ext cx="4754880" cy="2653665"/>
+                      <a:ext cx="5669280" cy="2267585"/>
                     </a:xfrm>
                     <a:prstGeom prst="rect">
                       <a:avLst/>
@@ -17363,14 +18252,14 @@
         <w:pStyle w:val="FigureCaption"/>
         <w:rPr/>
       </w:pPr>
-      <w:bookmarkStart w:id="51" w:name="__RefHeading___Toc2420_1187282842"/>
-      <w:bookmarkEnd w:id="51"/>
+      <w:bookmarkStart w:id="53" w:name="__RefHeading___Toc2519_3840626700"/>
+      <w:bookmarkEnd w:id="53"/>
       <w:r>
         <w:rPr>
           <w:b w:val="false"/>
           <w:sz w:val="20"/>
         </w:rPr>
-        <w:t>Figure 8.8: Effect of ℓ₂ and temporal-smoothness priors in the under-determined regime (500 vertices)</w:t>
+        <w:t>Figure 8.6: Recovery, relative error and retrieval against measurement noise</w:t>
       </w:r>
     </w:p>
     <w:p>
@@ -17385,7 +18274,7 @@
         <w:rPr/>
         <w:drawing>
           <wp:inline distT="0" distB="0" distL="0" distR="0">
-            <wp:extent cx="3840480" cy="2676525"/>
+            <wp:extent cx="4754880" cy="2653665"/>
             <wp:effectExtent l="0" t="0" r="0" b="0"/>
             <wp:docPr id="11" name="Picture 12" descr=""/>
             <wp:cNvGraphicFramePr>
@@ -17409,6 +18298,134 @@
                   <pic:spPr bwMode="auto">
                     <a:xfrm>
                       <a:off x="0" y="0"/>
+                      <a:ext cx="4754880" cy="2653665"/>
+                    </a:xfrm>
+                    <a:prstGeom prst="rect">
+                      <a:avLst/>
+                    </a:prstGeom>
+                  </pic:spPr>
+                </pic:pic>
+              </a:graphicData>
+            </a:graphic>
+          </wp:inline>
+        </w:drawing>
+      </w:r>
+    </w:p>
+    <w:p>
+      <w:pPr>
+        <w:pStyle w:val="FigureCaption"/>
+        <w:rPr/>
+      </w:pPr>
+      <w:bookmarkStart w:id="54" w:name="__RefHeading___Toc2517_3840626700"/>
+      <w:bookmarkEnd w:id="54"/>
+      <w:r>
+        <w:rPr>
+          <w:b w:val="false"/>
+          <w:sz w:val="20"/>
+        </w:rPr>
+        <w:t>Figure 8.7: Recovery against the number of observed cortical vertices</w:t>
+      </w:r>
+    </w:p>
+    <w:p>
+      <w:pPr>
+        <w:pStyle w:val="Normal"/>
+        <w:keepNext w:val="true"/>
+        <w:spacing w:before="120" w:after="0"/>
+        <w:jc w:val="center"/>
+        <w:rPr/>
+      </w:pPr>
+      <w:r>
+        <w:rPr/>
+        <w:drawing>
+          <wp:inline distT="0" distB="0" distL="0" distR="0">
+            <wp:extent cx="4754880" cy="2653665"/>
+            <wp:effectExtent l="0" t="0" r="0" b="0"/>
+            <wp:docPr id="12" name="Picture 13" descr=""/>
+            <wp:cNvGraphicFramePr>
+              <a:graphicFrameLocks xmlns:a="http://schemas.openxmlformats.org/drawingml/2006/main" noChangeAspect="1"/>
+            </wp:cNvGraphicFramePr>
+            <a:graphic xmlns:a="http://schemas.openxmlformats.org/drawingml/2006/main">
+              <a:graphicData uri="http://schemas.openxmlformats.org/drawingml/2006/picture">
+                <pic:pic xmlns:pic="http://schemas.openxmlformats.org/drawingml/2006/picture">
+                  <pic:nvPicPr>
+                    <pic:cNvPr id="12" name="Picture 13" descr=""/>
+                    <pic:cNvPicPr>
+                      <a:picLocks noChangeAspect="1" noChangeArrowheads="1"/>
+                    </pic:cNvPicPr>
+                  </pic:nvPicPr>
+                  <pic:blipFill>
+                    <a:blip r:embed="rId15"/>
+                    <a:stretch>
+                      <a:fillRect/>
+                    </a:stretch>
+                  </pic:blipFill>
+                  <pic:spPr bwMode="auto">
+                    <a:xfrm>
+                      <a:off x="0" y="0"/>
+                      <a:ext cx="4754880" cy="2653665"/>
+                    </a:xfrm>
+                    <a:prstGeom prst="rect">
+                      <a:avLst/>
+                    </a:prstGeom>
+                  </pic:spPr>
+                </pic:pic>
+              </a:graphicData>
+            </a:graphic>
+          </wp:inline>
+        </w:drawing>
+      </w:r>
+    </w:p>
+    <w:p>
+      <w:pPr>
+        <w:pStyle w:val="FigureCaption"/>
+        <w:rPr/>
+      </w:pPr>
+      <w:bookmarkStart w:id="55" w:name="__RefHeading___Toc2515_3840626700"/>
+      <w:bookmarkEnd w:id="55"/>
+      <w:r>
+        <w:rPr>
+          <w:b w:val="false"/>
+          <w:sz w:val="20"/>
+        </w:rPr>
+        <w:t>Figure 8.8: Effect of ℓ₂ and temporal-smoothness priors in the under-determined regime (500 vertices)</w:t>
+      </w:r>
+    </w:p>
+    <w:p>
+      <w:pPr>
+        <w:pStyle w:val="Normal"/>
+        <w:keepNext w:val="true"/>
+        <w:spacing w:before="120" w:after="0"/>
+        <w:jc w:val="center"/>
+        <w:rPr/>
+      </w:pPr>
+      <w:r>
+        <w:rPr/>
+        <w:drawing>
+          <wp:inline distT="0" distB="0" distL="0" distR="0">
+            <wp:extent cx="3840480" cy="2676525"/>
+            <wp:effectExtent l="0" t="0" r="0" b="0"/>
+            <wp:docPr id="13" name="Picture 14" descr=""/>
+            <wp:cNvGraphicFramePr>
+              <a:graphicFrameLocks xmlns:a="http://schemas.openxmlformats.org/drawingml/2006/main" noChangeAspect="1"/>
+            </wp:cNvGraphicFramePr>
+            <a:graphic xmlns:a="http://schemas.openxmlformats.org/drawingml/2006/main">
+              <a:graphicData uri="http://schemas.openxmlformats.org/drawingml/2006/picture">
+                <pic:pic xmlns:pic="http://schemas.openxmlformats.org/drawingml/2006/picture">
+                  <pic:nvPicPr>
+                    <pic:cNvPr id="13" name="Picture 14" descr=""/>
+                    <pic:cNvPicPr>
+                      <a:picLocks noChangeAspect="1" noChangeArrowheads="1"/>
+                    </pic:cNvPicPr>
+                  </pic:nvPicPr>
+                  <pic:blipFill>
+                    <a:blip r:embed="rId16"/>
+                    <a:stretch>
+                      <a:fillRect/>
+                    </a:stretch>
+                  </pic:blipFill>
+                  <pic:spPr bwMode="auto">
+                    <a:xfrm>
+                      <a:off x="0" y="0"/>
                       <a:ext cx="3840480" cy="2676525"/>
                     </a:xfrm>
                     <a:prstGeom prst="rect">
@@ -17427,8 +18444,8 @@
         <w:pStyle w:val="FigureCaption"/>
         <w:rPr/>
       </w:pPr>
-      <w:bookmarkStart w:id="52" w:name="__RefHeading___Toc2418_1187282842"/>
-      <w:bookmarkEnd w:id="52"/>
+      <w:bookmarkStart w:id="56" w:name="__RefHeading___Toc2513_3840626700"/>
+      <w:bookmarkEnd w:id="56"/>
       <w:r>
         <w:rPr>
           <w:b w:val="false"/>
@@ -17442,8 +18459,8 @@
         <w:pStyle w:val="TableCaption"/>
         <w:rPr/>
       </w:pPr>
-      <w:bookmarkStart w:id="53" w:name="__RefHeading___Toc2448_1187282842"/>
-      <w:bookmarkEnd w:id="53"/>
+      <w:bookmarkStart w:id="57" w:name="__RefHeading___Toc2547_3840626700"/>
+      <w:bookmarkEnd w:id="57"/>
       <w:r>
         <w:rPr>
           <w:b w:val="false"/>
@@ -18048,8 +19065,8 @@
         <w:pStyle w:val="Heading2"/>
         <w:rPr/>
       </w:pPr>
-      <w:bookmarkStart w:id="54" w:name="__RefHeading___Toc2380_1187282842"/>
-      <w:bookmarkEnd w:id="54"/>
+      <w:bookmarkStart w:id="58" w:name="__RefHeading___Toc2475_3840626700"/>
+      <w:bookmarkEnd w:id="58"/>
       <w:r>
         <w:rPr/>
         <w:t>8.6 Predictable is not recoverable, region by region</w:t>
@@ -18083,134 +19100,6 @@
         <w:drawing>
           <wp:inline distT="0" distB="0" distL="0" distR="0">
             <wp:extent cx="5669280" cy="1473835"/>
-            <wp:effectExtent l="0" t="0" r="0" b="0"/>
-            <wp:docPr id="12" name="Picture 13" descr=""/>
-            <wp:cNvGraphicFramePr>
-              <a:graphicFrameLocks xmlns:a="http://schemas.openxmlformats.org/drawingml/2006/main" noChangeAspect="1"/>
-            </wp:cNvGraphicFramePr>
-            <a:graphic xmlns:a="http://schemas.openxmlformats.org/drawingml/2006/main">
-              <a:graphicData uri="http://schemas.openxmlformats.org/drawingml/2006/picture">
-                <pic:pic xmlns:pic="http://schemas.openxmlformats.org/drawingml/2006/picture">
-                  <pic:nvPicPr>
-                    <pic:cNvPr id="12" name="Picture 13" descr=""/>
-                    <pic:cNvPicPr>
-                      <a:picLocks noChangeAspect="1" noChangeArrowheads="1"/>
-                    </pic:cNvPicPr>
-                  </pic:nvPicPr>
-                  <pic:blipFill>
-                    <a:blip r:embed="rId15"/>
-                    <a:stretch>
-                      <a:fillRect/>
-                    </a:stretch>
-                  </pic:blipFill>
-                  <pic:spPr bwMode="auto">
-                    <a:xfrm>
-                      <a:off x="0" y="0"/>
-                      <a:ext cx="5669280" cy="1473835"/>
-                    </a:xfrm>
-                    <a:prstGeom prst="rect">
-                      <a:avLst/>
-                    </a:prstGeom>
-                  </pic:spPr>
-                </pic:pic>
-              </a:graphicData>
-            </a:graphic>
-          </wp:inline>
-        </w:drawing>
-      </w:r>
-    </w:p>
-    <w:p>
-      <w:pPr>
-        <w:pStyle w:val="FigureCaption"/>
-        <w:rPr/>
-      </w:pPr>
-      <w:bookmarkStart w:id="55" w:name="__RefHeading___Toc2416_1187282842"/>
-      <w:bookmarkEnd w:id="55"/>
-      <w:r>
-        <w:rPr>
-          <w:b w:val="false"/>
-          <w:sz w:val="20"/>
-        </w:rPr>
-        <w:t>Figure 8.10: The six anatomical networks on the inflated fsaverage5 surface</w:t>
-      </w:r>
-    </w:p>
-    <w:p>
-      <w:pPr>
-        <w:pStyle w:val="Normal"/>
-        <w:keepNext w:val="true"/>
-        <w:spacing w:before="120" w:after="0"/>
-        <w:jc w:val="center"/>
-        <w:rPr/>
-      </w:pPr>
-      <w:r>
-        <w:rPr/>
-        <w:drawing>
-          <wp:inline distT="0" distB="0" distL="0" distR="0">
-            <wp:extent cx="4937760" cy="3263265"/>
-            <wp:effectExtent l="0" t="0" r="0" b="0"/>
-            <wp:docPr id="13" name="Picture 14" descr=""/>
-            <wp:cNvGraphicFramePr>
-              <a:graphicFrameLocks xmlns:a="http://schemas.openxmlformats.org/drawingml/2006/main" noChangeAspect="1"/>
-            </wp:cNvGraphicFramePr>
-            <a:graphic xmlns:a="http://schemas.openxmlformats.org/drawingml/2006/main">
-              <a:graphicData uri="http://schemas.openxmlformats.org/drawingml/2006/picture">
-                <pic:pic xmlns:pic="http://schemas.openxmlformats.org/drawingml/2006/picture">
-                  <pic:nvPicPr>
-                    <pic:cNvPr id="13" name="Picture 14" descr=""/>
-                    <pic:cNvPicPr>
-                      <a:picLocks noChangeAspect="1" noChangeArrowheads="1"/>
-                    </pic:cNvPicPr>
-                  </pic:nvPicPr>
-                  <pic:blipFill>
-                    <a:blip r:embed="rId16"/>
-                    <a:stretch>
-                      <a:fillRect/>
-                    </a:stretch>
-                  </pic:blipFill>
-                  <pic:spPr bwMode="auto">
-                    <a:xfrm>
-                      <a:off x="0" y="0"/>
-                      <a:ext cx="4937760" cy="3263265"/>
-                    </a:xfrm>
-                    <a:prstGeom prst="rect">
-                      <a:avLst/>
-                    </a:prstGeom>
-                  </pic:spPr>
-                </pic:pic>
-              </a:graphicData>
-            </a:graphic>
-          </wp:inline>
-        </w:drawing>
-      </w:r>
-    </w:p>
-    <w:p>
-      <w:pPr>
-        <w:pStyle w:val="FigureCaption"/>
-        <w:rPr/>
-      </w:pPr>
-      <w:bookmarkStart w:id="56" w:name="__RefHeading___Toc2414_1187282842"/>
-      <w:bookmarkEnd w:id="56"/>
-      <w:r>
-        <w:rPr>
-          <w:b w:val="false"/>
-          <w:sz w:val="20"/>
-        </w:rPr>
-        <w:t>Figure 8.11: Forward-sensitivity share of the text-, audio- and video-derived dimensions across cortex</w:t>
-      </w:r>
-    </w:p>
-    <w:p>
-      <w:pPr>
-        <w:pStyle w:val="Normal"/>
-        <w:keepNext w:val="true"/>
-        <w:spacing w:before="120" w:after="0"/>
-        <w:jc w:val="center"/>
-        <w:rPr/>
-      </w:pPr>
-      <w:r>
-        <w:rPr/>
-        <w:drawing>
-          <wp:inline distT="0" distB="0" distL="0" distR="0">
-            <wp:extent cx="5669280" cy="2415540"/>
             <wp:effectExtent l="0" t="0" r="0" b="0"/>
             <wp:docPr id="14" name="Picture 15" descr=""/>
             <wp:cNvGraphicFramePr>
@@ -18234,7 +19123,7 @@
                   <pic:spPr bwMode="auto">
                     <a:xfrm>
                       <a:off x="0" y="0"/>
-                      <a:ext cx="5669280" cy="2415540"/>
+                      <a:ext cx="5669280" cy="1473835"/>
                     </a:xfrm>
                     <a:prstGeom prst="rect">
                       <a:avLst/>
@@ -18252,14 +19141,14 @@
         <w:pStyle w:val="FigureCaption"/>
         <w:rPr/>
       </w:pPr>
-      <w:bookmarkStart w:id="57" w:name="__RefHeading___Toc2412_1187282842"/>
-      <w:bookmarkEnd w:id="57"/>
+      <w:bookmarkStart w:id="59" w:name="__RefHeading___Toc2511_3840626700"/>
+      <w:bookmarkEnd w:id="59"/>
       <w:r>
         <w:rPr>
           <w:b w:val="false"/>
           <w:sz w:val="20"/>
         </w:rPr>
-        <w:t>Figure 8.12: Recovery from each network versus size-matched random vertex sets</w:t>
+        <w:t>Figure 8.10: The six anatomical networks on the inflated fsaverage5 surface</w:t>
       </w:r>
     </w:p>
     <w:p>
@@ -18274,7 +19163,7 @@
         <w:rPr/>
         <w:drawing>
           <wp:inline distT="0" distB="0" distL="0" distR="0">
-            <wp:extent cx="4389120" cy="3002915"/>
+            <wp:extent cx="4937760" cy="3263265"/>
             <wp:effectExtent l="0" t="0" r="0" b="0"/>
             <wp:docPr id="15" name="Picture 16" descr=""/>
             <wp:cNvGraphicFramePr>
@@ -18298,7 +19187,7 @@
                   <pic:spPr bwMode="auto">
                     <a:xfrm>
                       <a:off x="0" y="0"/>
-                      <a:ext cx="4389120" cy="3002915"/>
+                      <a:ext cx="4937760" cy="3263265"/>
                     </a:xfrm>
                     <a:prstGeom prst="rect">
                       <a:avLst/>
@@ -18316,14 +19205,14 @@
         <w:pStyle w:val="FigureCaption"/>
         <w:rPr/>
       </w:pPr>
-      <w:bookmarkStart w:id="58" w:name="__RefHeading___Toc2410_1187282842"/>
-      <w:bookmarkEnd w:id="58"/>
+      <w:bookmarkStart w:id="60" w:name="__RefHeading___Toc2509_3840626700"/>
+      <w:bookmarkEnd w:id="60"/>
       <w:r>
         <w:rPr>
           <w:b w:val="false"/>
           <w:sz w:val="20"/>
         </w:rPr>
-        <w:t>Figure 8.13: Forward sensitivity against recoverability across networks</w:t>
+        <w:t>Figure 8.11: Forward-sensitivity share of the text-, audio- and video-derived dimensions across cortex</w:t>
       </w:r>
     </w:p>
     <w:p>
@@ -18338,7 +19227,7 @@
         <w:rPr/>
         <w:drawing>
           <wp:inline distT="0" distB="0" distL="0" distR="0">
-            <wp:extent cx="5669280" cy="2173605"/>
+            <wp:extent cx="5669280" cy="2415540"/>
             <wp:effectExtent l="0" t="0" r="0" b="0"/>
             <wp:docPr id="16" name="Picture 17" descr=""/>
             <wp:cNvGraphicFramePr>
@@ -18362,6 +19251,134 @@
                   <pic:spPr bwMode="auto">
                     <a:xfrm>
                       <a:off x="0" y="0"/>
+                      <a:ext cx="5669280" cy="2415540"/>
+                    </a:xfrm>
+                    <a:prstGeom prst="rect">
+                      <a:avLst/>
+                    </a:prstGeom>
+                  </pic:spPr>
+                </pic:pic>
+              </a:graphicData>
+            </a:graphic>
+          </wp:inline>
+        </w:drawing>
+      </w:r>
+    </w:p>
+    <w:p>
+      <w:pPr>
+        <w:pStyle w:val="FigureCaption"/>
+        <w:rPr/>
+      </w:pPr>
+      <w:bookmarkStart w:id="61" w:name="__RefHeading___Toc2507_3840626700"/>
+      <w:bookmarkEnd w:id="61"/>
+      <w:r>
+        <w:rPr>
+          <w:b w:val="false"/>
+          <w:sz w:val="20"/>
+        </w:rPr>
+        <w:t>Figure 8.12: Recovery from each network versus size-matched random vertex sets</w:t>
+      </w:r>
+    </w:p>
+    <w:p>
+      <w:pPr>
+        <w:pStyle w:val="Normal"/>
+        <w:keepNext w:val="true"/>
+        <w:spacing w:before="120" w:after="0"/>
+        <w:jc w:val="center"/>
+        <w:rPr/>
+      </w:pPr>
+      <w:r>
+        <w:rPr/>
+        <w:drawing>
+          <wp:inline distT="0" distB="0" distL="0" distR="0">
+            <wp:extent cx="4389120" cy="3002915"/>
+            <wp:effectExtent l="0" t="0" r="0" b="0"/>
+            <wp:docPr id="17" name="Picture 18" descr=""/>
+            <wp:cNvGraphicFramePr>
+              <a:graphicFrameLocks xmlns:a="http://schemas.openxmlformats.org/drawingml/2006/main" noChangeAspect="1"/>
+            </wp:cNvGraphicFramePr>
+            <a:graphic xmlns:a="http://schemas.openxmlformats.org/drawingml/2006/main">
+              <a:graphicData uri="http://schemas.openxmlformats.org/drawingml/2006/picture">
+                <pic:pic xmlns:pic="http://schemas.openxmlformats.org/drawingml/2006/picture">
+                  <pic:nvPicPr>
+                    <pic:cNvPr id="17" name="Picture 18" descr=""/>
+                    <pic:cNvPicPr>
+                      <a:picLocks noChangeAspect="1" noChangeArrowheads="1"/>
+                    </pic:cNvPicPr>
+                  </pic:nvPicPr>
+                  <pic:blipFill>
+                    <a:blip r:embed="rId20"/>
+                    <a:stretch>
+                      <a:fillRect/>
+                    </a:stretch>
+                  </pic:blipFill>
+                  <pic:spPr bwMode="auto">
+                    <a:xfrm>
+                      <a:off x="0" y="0"/>
+                      <a:ext cx="4389120" cy="3002915"/>
+                    </a:xfrm>
+                    <a:prstGeom prst="rect">
+                      <a:avLst/>
+                    </a:prstGeom>
+                  </pic:spPr>
+                </pic:pic>
+              </a:graphicData>
+            </a:graphic>
+          </wp:inline>
+        </w:drawing>
+      </w:r>
+    </w:p>
+    <w:p>
+      <w:pPr>
+        <w:pStyle w:val="FigureCaption"/>
+        <w:rPr/>
+      </w:pPr>
+      <w:bookmarkStart w:id="62" w:name="__RefHeading___Toc2505_3840626700"/>
+      <w:bookmarkEnd w:id="62"/>
+      <w:r>
+        <w:rPr>
+          <w:b w:val="false"/>
+          <w:sz w:val="20"/>
+        </w:rPr>
+        <w:t>Figure 8.13: Forward sensitivity against recoverability across networks</w:t>
+      </w:r>
+    </w:p>
+    <w:p>
+      <w:pPr>
+        <w:pStyle w:val="Normal"/>
+        <w:keepNext w:val="true"/>
+        <w:spacing w:before="120" w:after="0"/>
+        <w:jc w:val="center"/>
+        <w:rPr/>
+      </w:pPr>
+      <w:r>
+        <w:rPr/>
+        <w:drawing>
+          <wp:inline distT="0" distB="0" distL="0" distR="0">
+            <wp:extent cx="5669280" cy="2173605"/>
+            <wp:effectExtent l="0" t="0" r="0" b="0"/>
+            <wp:docPr id="18" name="Picture 19" descr=""/>
+            <wp:cNvGraphicFramePr>
+              <a:graphicFrameLocks xmlns:a="http://schemas.openxmlformats.org/drawingml/2006/main" noChangeAspect="1"/>
+            </wp:cNvGraphicFramePr>
+            <a:graphic xmlns:a="http://schemas.openxmlformats.org/drawingml/2006/main">
+              <a:graphicData uri="http://schemas.openxmlformats.org/drawingml/2006/picture">
+                <pic:pic xmlns:pic="http://schemas.openxmlformats.org/drawingml/2006/picture">
+                  <pic:nvPicPr>
+                    <pic:cNvPr id="18" name="Picture 19" descr=""/>
+                    <pic:cNvPicPr>
+                      <a:picLocks noChangeAspect="1" noChangeArrowheads="1"/>
+                    </pic:cNvPicPr>
+                  </pic:nvPicPr>
+                  <pic:blipFill>
+                    <a:blip r:embed="rId21"/>
+                    <a:stretch>
+                      <a:fillRect/>
+                    </a:stretch>
+                  </pic:blipFill>
+                  <pic:spPr bwMode="auto">
+                    <a:xfrm>
+                      <a:off x="0" y="0"/>
                       <a:ext cx="5669280" cy="2173605"/>
                     </a:xfrm>
                     <a:prstGeom prst="rect">
@@ -18380,8 +19397,8 @@
         <w:pStyle w:val="FigureCaption"/>
         <w:rPr/>
       </w:pPr>
-      <w:bookmarkStart w:id="59" w:name="__RefHeading___Toc2408_1187282842"/>
-      <w:bookmarkEnd w:id="59"/>
+      <w:bookmarkStart w:id="63" w:name="__RefHeading___Toc2503_3840626700"/>
+      <w:bookmarkEnd w:id="63"/>
       <w:r>
         <w:rPr>
           <w:b w:val="false"/>
@@ -18395,8 +19412,8 @@
         <w:pStyle w:val="TableCaption"/>
         <w:rPr/>
       </w:pPr>
-      <w:bookmarkStart w:id="60" w:name="__RefHeading___Toc2446_1187282842"/>
-      <w:bookmarkEnd w:id="60"/>
+      <w:bookmarkStart w:id="64" w:name="__RefHeading___Toc2545_3840626700"/>
+      <w:bookmarkEnd w:id="64"/>
       <w:r>
         <w:rPr>
           <w:b w:val="false"/>
@@ -19946,8 +20963,8 @@
         <w:pStyle w:val="Heading2"/>
         <w:rPr/>
       </w:pPr>
-      <w:bookmarkStart w:id="61" w:name="__RefHeading___Toc2382_1187282842"/>
-      <w:bookmarkEnd w:id="61"/>
+      <w:bookmarkStart w:id="65" w:name="__RefHeading___Toc2477_3840626700"/>
+      <w:bookmarkEnd w:id="65"/>
       <w:r>
         <w:rPr/>
         <w:t>8.7 Real fMRI</w:t>
@@ -19982,7 +20999,7 @@
           <wp:inline distT="0" distB="0" distL="0" distR="0">
             <wp:extent cx="5760720" cy="1626235"/>
             <wp:effectExtent l="0" t="0" r="0" b="0"/>
-            <wp:docPr id="17" name="Picture 18" descr=""/>
+            <wp:docPr id="19" name="Picture 20" descr=""/>
             <wp:cNvGraphicFramePr>
               <a:graphicFrameLocks xmlns:a="http://schemas.openxmlformats.org/drawingml/2006/main" noChangeAspect="1"/>
             </wp:cNvGraphicFramePr>
@@ -19990,13 +21007,13 @@
               <a:graphicData uri="http://schemas.openxmlformats.org/drawingml/2006/picture">
                 <pic:pic xmlns:pic="http://schemas.openxmlformats.org/drawingml/2006/picture">
                   <pic:nvPicPr>
-                    <pic:cNvPr id="17" name="Picture 18" descr=""/>
+                    <pic:cNvPr id="19" name="Picture 20" descr=""/>
                     <pic:cNvPicPr>
                       <a:picLocks noChangeAspect="1" noChangeArrowheads="1"/>
                     </pic:cNvPicPr>
                   </pic:nvPicPr>
                   <pic:blipFill>
-                    <a:blip r:embed="rId20"/>
+                    <a:blip r:embed="rId22"/>
                     <a:stretch>
                       <a:fillRect/>
                     </a:stretch>
@@ -20022,8 +21039,8 @@
         <w:pStyle w:val="FigureCaption"/>
         <w:rPr/>
       </w:pPr>
-      <w:bookmarkStart w:id="62" w:name="__RefHeading___Toc2406_1187282842"/>
-      <w:bookmarkEnd w:id="62"/>
+      <w:bookmarkStart w:id="66" w:name="__RefHeading___Toc2501_3840626700"/>
+      <w:bookmarkEnd w:id="66"/>
       <w:r>
         <w:rPr>
           <w:b w:val="false"/>
@@ -20037,8 +21054,8 @@
         <w:pStyle w:val="TableCaption"/>
         <w:rPr/>
       </w:pPr>
-      <w:bookmarkStart w:id="63" w:name="__RefHeading___Toc2444_1187282842"/>
-      <w:bookmarkEnd w:id="63"/>
+      <w:bookmarkStart w:id="67" w:name="__RefHeading___Toc2543_3840626700"/>
+      <w:bookmarkEnd w:id="67"/>
       <w:r>
         <w:rPr>
           <w:b w:val="false"/>
@@ -21076,8 +22093,8 @@
         <w:pStyle w:val="Heading2"/>
         <w:rPr/>
       </w:pPr>
-      <w:bookmarkStart w:id="64" w:name="__RefHeading___Toc2384_1187282842"/>
-      <w:bookmarkEnd w:id="64"/>
+      <w:bookmarkStart w:id="68" w:name="__RefHeading___Toc2479_3840626700"/>
+      <w:bookmarkEnd w:id="68"/>
       <w:r>
         <w:rPr/>
         <w:t>8.8 Discussion</w:t>
@@ -21179,8 +22196,8 @@
         <w:pStyle w:val="Heading1"/>
         <w:rPr/>
       </w:pPr>
-      <w:bookmarkStart w:id="65" w:name="__RefHeading___Toc2386_1187282842"/>
-      <w:bookmarkEnd w:id="65"/>
+      <w:bookmarkStart w:id="69" w:name="__RefHeading___Toc2481_3840626700"/>
+      <w:bookmarkEnd w:id="69"/>
       <w:r>
         <w:rPr/>
         <w:t>9. CONCLUSION</w:t>
@@ -21206,8 +22223,8 @@
         <w:pStyle w:val="Heading2"/>
         <w:rPr/>
       </w:pPr>
-      <w:bookmarkStart w:id="66" w:name="__RefHeading___Toc2388_1187282842"/>
-      <w:bookmarkEnd w:id="66"/>
+      <w:bookmarkStart w:id="70" w:name="__RefHeading___Toc2483_3840626700"/>
+      <w:bookmarkEnd w:id="70"/>
       <w:r>
         <w:rPr/>
         <w:t>9.1 Obtained Results</w:t>
@@ -21410,8 +22427,8 @@
         <w:pStyle w:val="Heading2"/>
         <w:rPr/>
       </w:pPr>
-      <w:bookmarkStart w:id="67" w:name="__RefHeading___Toc2390_1187282842"/>
-      <w:bookmarkEnd w:id="67"/>
+      <w:bookmarkStart w:id="71" w:name="__RefHeading___Toc2485_3840626700"/>
+      <w:bookmarkEnd w:id="71"/>
       <w:r>
         <w:rPr/>
         <w:t>9.2 Future improvement/work</w:t>
@@ -21518,8 +22535,8 @@
         <w:pStyle w:val="Heading2"/>
         <w:rPr/>
       </w:pPr>
-      <w:bookmarkStart w:id="68" w:name="__RefHeading___Toc2392_1187282842"/>
-      <w:bookmarkEnd w:id="68"/>
+      <w:bookmarkStart w:id="72" w:name="__RefHeading___Toc2487_3840626700"/>
+      <w:bookmarkEnd w:id="72"/>
       <w:r>
         <w:rPr/>
         <w:t>9.3 Individual contribution from team members</w:t>
@@ -21530,8 +22547,8 @@
         <w:pStyle w:val="TableCaption"/>
         <w:rPr/>
       </w:pPr>
-      <w:bookmarkStart w:id="69" w:name="__RefHeading___Toc2442_1187282842"/>
-      <w:bookmarkEnd w:id="69"/>
+      <w:bookmarkStart w:id="73" w:name="__RefHeading___Toc2541_3840626700"/>
+      <w:bookmarkEnd w:id="73"/>
       <w:r>
         <w:rPr>
           <w:b w:val="false"/>
@@ -21747,8 +22764,8 @@
         <w:pStyle w:val="Heading1"/>
         <w:rPr/>
       </w:pPr>
-      <w:bookmarkStart w:id="70" w:name="__RefHeading___Toc2394_1187282842"/>
-      <w:bookmarkEnd w:id="70"/>
+      <w:bookmarkStart w:id="74" w:name="__RefHeading___Toc2489_3840626700"/>
+      <w:bookmarkEnd w:id="74"/>
       <w:r>
         <w:rPr/>
         <w:t>10. SOCIAL AND ENVIRONMENTAL IMPACT</w:t>
@@ -21806,8 +22823,8 @@
         <w:pStyle w:val="Heading1"/>
         <w:rPr/>
       </w:pPr>
-      <w:bookmarkStart w:id="71" w:name="__RefHeading___Toc2396_1187282842"/>
-      <w:bookmarkEnd w:id="71"/>
+      <w:bookmarkStart w:id="75" w:name="__RefHeading___Toc2491_3840626700"/>
+      <w:bookmarkEnd w:id="75"/>
       <w:r>
         <w:rPr/>
         <w:t>11. COST ANALYSIS</w:t>
@@ -21833,8 +22850,8 @@
         <w:pStyle w:val="TableCaption"/>
         <w:rPr/>
       </w:pPr>
-      <w:bookmarkStart w:id="72" w:name="__RefHeading___Toc2440_1187282842"/>
-      <w:bookmarkEnd w:id="72"/>
+      <w:bookmarkStart w:id="76" w:name="__RefHeading___Toc2539_3840626700"/>
+      <w:bookmarkEnd w:id="76"/>
       <w:r>
         <w:rPr>
           <w:b w:val="false"/>
@@ -22871,8 +23888,8 @@
         <w:pStyle w:val="Heading1"/>
         <w:rPr/>
       </w:pPr>
-      <w:bookmarkStart w:id="73" w:name="__RefHeading___Toc2398_1187282842"/>
-      <w:bookmarkEnd w:id="73"/>
+      <w:bookmarkStart w:id="77" w:name="__RefHeading___Toc2493_3840626700"/>
+      <w:bookmarkEnd w:id="77"/>
       <w:r>
         <w:rPr/>
         <w:t>12. PROJECT OUTCOME PUBLICATION/PATENT</w:t>
@@ -22997,8 +24014,8 @@
         <w:pStyle w:val="Heading1"/>
         <w:rPr/>
       </w:pPr>
-      <w:bookmarkStart w:id="74" w:name="__RefHeading___Toc2400_1187282842"/>
-      <w:bookmarkEnd w:id="74"/>
+      <w:bookmarkStart w:id="78" w:name="__RefHeading___Toc2495_3840626700"/>
+      <w:bookmarkEnd w:id="78"/>
       <w:r>
         <w:rPr/>
         <w:t>13. REFERENCES</w:t>
@@ -23894,8 +24911,8 @@
         <w:pStyle w:val="Heading1"/>
         <w:rPr/>
       </w:pPr>
-      <w:bookmarkStart w:id="75" w:name="__RefHeading___Toc2402_1187282842"/>
-      <w:bookmarkEnd w:id="75"/>
+      <w:bookmarkStart w:id="79" w:name="__RefHeading___Toc2497_3840626700"/>
+      <w:bookmarkEnd w:id="79"/>
       <w:r>
         <w:rPr/>
         <w:t>APPENDIX A: CODE AND REPRODUCTION</w:t>
@@ -23921,8 +24938,8 @@
         <w:pStyle w:val="TableCaption"/>
         <w:rPr/>
       </w:pPr>
-      <w:bookmarkStart w:id="76" w:name="__RefHeading___Toc2438_1187282842"/>
-      <w:bookmarkEnd w:id="76"/>
+      <w:bookmarkStart w:id="80" w:name="__RefHeading___Toc2537_3840626700"/>
+      <w:bookmarkEnd w:id="80"/>
       <w:r>
         <w:rPr>
           <w:b w:val="false"/>
@@ -24544,9 +25561,9 @@
       </w:r>
     </w:p>
     <w:sectPr>
-      <w:footerReference w:type="even" r:id="rId21"/>
-      <w:footerReference w:type="default" r:id="rId22"/>
-      <w:footerReference w:type="first" r:id="rId23"/>
+      <w:footerReference w:type="even" r:id="rId23"/>
+      <w:footerReference w:type="default" r:id="rId24"/>
+      <w:footerReference w:type="first" r:id="rId25"/>
       <w:type w:val="nextPage"/>
       <w:pgSz w:w="11906" w:h="16838"/>
       <w:pgMar w:left="1680" w:right="1100" w:gutter="0" w:header="0" w:top="1368" w:footer="576" w:bottom="1296"/>
@@ -24641,7 +25658,7 @@
     </w:r>
     <w:r>
       <w:rPr/>
-      <w:t>32</w:t>
+      <w:t>35</w:t>
     </w:r>
     <w:r>
       <w:rPr/>

</xml_diff>

<commit_message>
Report: equal left/right margins (text block centred)
</commit_message>
<xml_diff>
--- a/report/Report_Sarkar_Choudhuri_Project1.docx
+++ b/report/Report_Sarkar_Choudhuri_Project1.docx
@@ -595,7 +595,7 @@
         <w:sectPr>
           <w:type w:val="nextPage"/>
           <w:pgSz w:w="11906" w:h="16838"/>
-          <w:pgMar w:left="1680" w:right="1100" w:gutter="0" w:header="0" w:top="1380" w:footer="0" w:bottom="280"/>
+          <w:pgMar w:left="1390" w:right="1390" w:gutter="0" w:header="0" w:top="1380" w:footer="0" w:bottom="280"/>
           <w:pgNumType w:fmt="decimal"/>
           <w:formProt w:val="false"/>
           <w:textDirection w:val="lrTb"/>
@@ -1025,7 +1025,7 @@
         <w:sectPr>
           <w:type w:val="nextPage"/>
           <w:pgSz w:w="11906" w:h="16838"/>
-          <w:pgMar w:left="1680" w:right="1100" w:gutter="0" w:header="0" w:top="1380" w:footer="0" w:bottom="280"/>
+          <w:pgMar w:left="1390" w:right="1390" w:gutter="0" w:header="0" w:top="1380" w:footer="0" w:bottom="280"/>
           <w:pgNumType w:fmt="decimal"/>
           <w:formProt w:val="false"/>
           <w:textDirection w:val="lrTb"/>
@@ -1700,7 +1700,7 @@
         <w:sectPr>
           <w:type w:val="nextPage"/>
           <w:pgSz w:w="11906" w:h="16838"/>
-          <w:pgMar w:left="1680" w:right="1100" w:gutter="0" w:header="0" w:top="1380" w:footer="0" w:bottom="280"/>
+          <w:pgMar w:left="1390" w:right="1390" w:gutter="0" w:header="0" w:top="1380" w:footer="0" w:bottom="280"/>
           <w:pgNumType w:fmt="decimal"/>
           <w:formProt w:val="false"/>
           <w:textDirection w:val="lrTb"/>
@@ -1913,7 +1913,7 @@
         <w:sectPr>
           <w:type w:val="nextPage"/>
           <w:pgSz w:w="11906" w:h="16838"/>
-          <w:pgMar w:left="1680" w:right="1100" w:gutter="0" w:header="0" w:top="1360" w:footer="0" w:bottom="280"/>
+          <w:pgMar w:left="1390" w:right="1390" w:gutter="0" w:header="0" w:top="1360" w:footer="0" w:bottom="280"/>
           <w:pgNumType w:fmt="decimal"/>
           <w:formProt w:val="false"/>
           <w:textDirection w:val="lrTb"/>
@@ -1993,7 +1993,7 @@
         <w:sectPr>
           <w:type w:val="nextPage"/>
           <w:pgSz w:w="11906" w:h="16838"/>
-          <w:pgMar w:left="1680" w:right="1100" w:gutter="0" w:header="0" w:top="1380" w:footer="0" w:bottom="280"/>
+          <w:pgMar w:left="1390" w:right="1390" w:gutter="0" w:header="0" w:top="1380" w:footer="0" w:bottom="280"/>
           <w:pgNumType w:fmt="decimal"/>
           <w:formProt w:val="false"/>
           <w:textDirection w:val="lrTb"/>
@@ -2059,7 +2059,7 @@
             </w:rPr>
             <w:fldChar w:fldCharType="separate"/>
           </w:r>
-          <w:hyperlink w:anchor="__RefHeading___Toc2417_3840626700">
+          <w:hyperlink w:anchor="__RefHeading___Toc2417_972910476">
             <w:r>
               <w:rPr>
                 <w:webHidden/>
@@ -2080,7 +2080,7 @@
             </w:tabs>
             <w:rPr/>
           </w:pPr>
-          <w:hyperlink w:anchor="__RefHeading___Toc2419_3840626700">
+          <w:hyperlink w:anchor="__RefHeading___Toc2419_972910476">
             <w:r>
               <w:rPr>
                 <w:webHidden/>
@@ -2101,7 +2101,7 @@
             </w:tabs>
             <w:rPr/>
           </w:pPr>
-          <w:hyperlink w:anchor="__RefHeading___Toc2421_3840626700">
+          <w:hyperlink w:anchor="__RefHeading___Toc2421_972910476">
             <w:r>
               <w:rPr>
                 <w:webHidden/>
@@ -2122,7 +2122,7 @@
             </w:tabs>
             <w:rPr/>
           </w:pPr>
-          <w:hyperlink w:anchor="__RefHeading___Toc2423_3840626700">
+          <w:hyperlink w:anchor="__RefHeading___Toc2423_972910476">
             <w:r>
               <w:rPr>
                 <w:webHidden/>
@@ -2143,7 +2143,7 @@
             </w:tabs>
             <w:rPr/>
           </w:pPr>
-          <w:hyperlink w:anchor="__RefHeading___Toc2425_3840626700">
+          <w:hyperlink w:anchor="__RefHeading___Toc2425_972910476">
             <w:r>
               <w:rPr>
                 <w:webHidden/>
@@ -2164,7 +2164,7 @@
             </w:tabs>
             <w:rPr/>
           </w:pPr>
-          <w:hyperlink w:anchor="__RefHeading___Toc2427_3840626700">
+          <w:hyperlink w:anchor="__RefHeading___Toc2427_972910476">
             <w:r>
               <w:rPr>
                 <w:webHidden/>
@@ -2185,7 +2185,7 @@
             </w:tabs>
             <w:rPr/>
           </w:pPr>
-          <w:hyperlink w:anchor="__RefHeading___Toc2429_3840626700">
+          <w:hyperlink w:anchor="__RefHeading___Toc2429_972910476">
             <w:r>
               <w:rPr>
                 <w:webHidden/>
@@ -2206,7 +2206,7 @@
             </w:tabs>
             <w:rPr/>
           </w:pPr>
-          <w:hyperlink w:anchor="__RefHeading___Toc2431_3840626700">
+          <w:hyperlink w:anchor="__RefHeading___Toc2431_972910476">
             <w:r>
               <w:rPr>
                 <w:webHidden/>
@@ -2227,7 +2227,7 @@
             </w:tabs>
             <w:rPr/>
           </w:pPr>
-          <w:hyperlink w:anchor="__RefHeading___Toc2433_3840626700">
+          <w:hyperlink w:anchor="__RefHeading___Toc2433_972910476">
             <w:r>
               <w:rPr>
                 <w:webHidden/>
@@ -2248,7 +2248,7 @@
             </w:tabs>
             <w:rPr/>
           </w:pPr>
-          <w:hyperlink w:anchor="__RefHeading___Toc2435_3840626700">
+          <w:hyperlink w:anchor="__RefHeading___Toc2435_972910476">
             <w:r>
               <w:rPr>
                 <w:webHidden/>
@@ -2269,7 +2269,7 @@
             </w:tabs>
             <w:rPr/>
           </w:pPr>
-          <w:hyperlink w:anchor="__RefHeading___Toc2437_3840626700">
+          <w:hyperlink w:anchor="__RefHeading___Toc2437_972910476">
             <w:r>
               <w:rPr>
                 <w:webHidden/>
@@ -2290,7 +2290,7 @@
             </w:tabs>
             <w:rPr/>
           </w:pPr>
-          <w:hyperlink w:anchor="__RefHeading___Toc2439_3840626700">
+          <w:hyperlink w:anchor="__RefHeading___Toc2439_972910476">
             <w:r>
               <w:rPr>
                 <w:webHidden/>
@@ -2311,7 +2311,7 @@
             </w:tabs>
             <w:rPr/>
           </w:pPr>
-          <w:hyperlink w:anchor="__RefHeading___Toc2441_3840626700">
+          <w:hyperlink w:anchor="__RefHeading___Toc2441_972910476">
             <w:r>
               <w:rPr>
                 <w:webHidden/>
@@ -2332,7 +2332,7 @@
             </w:tabs>
             <w:rPr/>
           </w:pPr>
-          <w:hyperlink w:anchor="__RefHeading___Toc2443_3840626700">
+          <w:hyperlink w:anchor="__RefHeading___Toc2443_972910476">
             <w:r>
               <w:rPr>
                 <w:webHidden/>
@@ -2353,7 +2353,7 @@
             </w:tabs>
             <w:rPr/>
           </w:pPr>
-          <w:hyperlink w:anchor="__RefHeading___Toc2445_3840626700">
+          <w:hyperlink w:anchor="__RefHeading___Toc2445_972910476">
             <w:r>
               <w:rPr>
                 <w:webHidden/>
@@ -2374,7 +2374,7 @@
             </w:tabs>
             <w:rPr/>
           </w:pPr>
-          <w:hyperlink w:anchor="__RefHeading___Toc2447_3840626700">
+          <w:hyperlink w:anchor="__RefHeading___Toc2447_972910476">
             <w:r>
               <w:rPr>
                 <w:webHidden/>
@@ -2395,7 +2395,7 @@
             </w:tabs>
             <w:rPr/>
           </w:pPr>
-          <w:hyperlink w:anchor="__RefHeading___Toc2449_3840626700">
+          <w:hyperlink w:anchor="__RefHeading___Toc2449_972910476">
             <w:r>
               <w:rPr>
                 <w:webHidden/>
@@ -2416,7 +2416,7 @@
             </w:tabs>
             <w:rPr/>
           </w:pPr>
-          <w:hyperlink w:anchor="__RefHeading___Toc2451_3840626700">
+          <w:hyperlink w:anchor="__RefHeading___Toc2451_972910476">
             <w:r>
               <w:rPr>
                 <w:webHidden/>
@@ -2437,7 +2437,7 @@
             </w:tabs>
             <w:rPr/>
           </w:pPr>
-          <w:hyperlink w:anchor="__RefHeading___Toc2453_3840626700">
+          <w:hyperlink w:anchor="__RefHeading___Toc2453_972910476">
             <w:r>
               <w:rPr>
                 <w:webHidden/>
@@ -2458,7 +2458,7 @@
             </w:tabs>
             <w:rPr/>
           </w:pPr>
-          <w:hyperlink w:anchor="__RefHeading___Toc2455_3840626700">
+          <w:hyperlink w:anchor="__RefHeading___Toc2455_972910476">
             <w:r>
               <w:rPr>
                 <w:webHidden/>
@@ -2479,7 +2479,7 @@
             </w:tabs>
             <w:rPr/>
           </w:pPr>
-          <w:hyperlink w:anchor="__RefHeading___Toc2457_3840626700">
+          <w:hyperlink w:anchor="__RefHeading___Toc2457_972910476">
             <w:r>
               <w:rPr>
                 <w:webHidden/>
@@ -2500,7 +2500,7 @@
             </w:tabs>
             <w:rPr/>
           </w:pPr>
-          <w:hyperlink w:anchor="__RefHeading___Toc2459_3840626700">
+          <w:hyperlink w:anchor="__RefHeading___Toc2459_972910476">
             <w:r>
               <w:rPr>
                 <w:webHidden/>
@@ -2521,7 +2521,7 @@
             </w:tabs>
             <w:rPr/>
           </w:pPr>
-          <w:hyperlink w:anchor="__RefHeading___Toc2461_3840626700">
+          <w:hyperlink w:anchor="__RefHeading___Toc2461_972910476">
             <w:r>
               <w:rPr>
                 <w:webHidden/>
@@ -2542,7 +2542,7 @@
             </w:tabs>
             <w:rPr/>
           </w:pPr>
-          <w:hyperlink w:anchor="__RefHeading___Toc2463_3840626700">
+          <w:hyperlink w:anchor="__RefHeading___Toc2463_972910476">
             <w:r>
               <w:rPr>
                 <w:webHidden/>
@@ -2563,7 +2563,7 @@
             </w:tabs>
             <w:rPr/>
           </w:pPr>
-          <w:hyperlink w:anchor="__RefHeading___Toc2465_3840626700">
+          <w:hyperlink w:anchor="__RefHeading___Toc2465_972910476">
             <w:r>
               <w:rPr>
                 <w:webHidden/>
@@ -2584,7 +2584,7 @@
             </w:tabs>
             <w:rPr/>
           </w:pPr>
-          <w:hyperlink w:anchor="__RefHeading___Toc2467_3840626700">
+          <w:hyperlink w:anchor="__RefHeading___Toc2467_972910476">
             <w:r>
               <w:rPr>
                 <w:webHidden/>
@@ -2605,7 +2605,7 @@
             </w:tabs>
             <w:rPr/>
           </w:pPr>
-          <w:hyperlink w:anchor="__RefHeading___Toc2469_3840626700">
+          <w:hyperlink w:anchor="__RefHeading___Toc2469_972910476">
             <w:r>
               <w:rPr>
                 <w:webHidden/>
@@ -2626,7 +2626,7 @@
             </w:tabs>
             <w:rPr/>
           </w:pPr>
-          <w:hyperlink w:anchor="__RefHeading___Toc2471_3840626700">
+          <w:hyperlink w:anchor="__RefHeading___Toc2471_972910476">
             <w:r>
               <w:rPr>
                 <w:webHidden/>
@@ -2647,7 +2647,7 @@
             </w:tabs>
             <w:rPr/>
           </w:pPr>
-          <w:hyperlink w:anchor="__RefHeading___Toc2473_3840626700">
+          <w:hyperlink w:anchor="__RefHeading___Toc2473_972910476">
             <w:r>
               <w:rPr>
                 <w:webHidden/>
@@ -2668,7 +2668,7 @@
             </w:tabs>
             <w:rPr/>
           </w:pPr>
-          <w:hyperlink w:anchor="__RefHeading___Toc2475_3840626700">
+          <w:hyperlink w:anchor="__RefHeading___Toc2475_972910476">
             <w:r>
               <w:rPr>
                 <w:webHidden/>
@@ -2689,7 +2689,7 @@
             </w:tabs>
             <w:rPr/>
           </w:pPr>
-          <w:hyperlink w:anchor="__RefHeading___Toc2477_3840626700">
+          <w:hyperlink w:anchor="__RefHeading___Toc2477_972910476">
             <w:r>
               <w:rPr>
                 <w:webHidden/>
@@ -2710,7 +2710,7 @@
             </w:tabs>
             <w:rPr/>
           </w:pPr>
-          <w:hyperlink w:anchor="__RefHeading___Toc2479_3840626700">
+          <w:hyperlink w:anchor="__RefHeading___Toc2479_972910476">
             <w:r>
               <w:rPr>
                 <w:webHidden/>
@@ -2731,7 +2731,7 @@
             </w:tabs>
             <w:rPr/>
           </w:pPr>
-          <w:hyperlink w:anchor="__RefHeading___Toc2481_3840626700">
+          <w:hyperlink w:anchor="__RefHeading___Toc2481_972910476">
             <w:r>
               <w:rPr>
                 <w:webHidden/>
@@ -2752,7 +2752,7 @@
             </w:tabs>
             <w:rPr/>
           </w:pPr>
-          <w:hyperlink w:anchor="__RefHeading___Toc2483_3840626700">
+          <w:hyperlink w:anchor="__RefHeading___Toc2483_972910476">
             <w:r>
               <w:rPr>
                 <w:webHidden/>
@@ -2773,7 +2773,7 @@
             </w:tabs>
             <w:rPr/>
           </w:pPr>
-          <w:hyperlink w:anchor="__RefHeading___Toc2485_3840626700">
+          <w:hyperlink w:anchor="__RefHeading___Toc2485_972910476">
             <w:r>
               <w:rPr>
                 <w:webHidden/>
@@ -2794,7 +2794,7 @@
             </w:tabs>
             <w:rPr/>
           </w:pPr>
-          <w:hyperlink w:anchor="__RefHeading___Toc2487_3840626700">
+          <w:hyperlink w:anchor="__RefHeading___Toc2487_972910476">
             <w:r>
               <w:rPr>
                 <w:webHidden/>
@@ -2815,7 +2815,7 @@
             </w:tabs>
             <w:rPr/>
           </w:pPr>
-          <w:hyperlink w:anchor="__RefHeading___Toc2489_3840626700">
+          <w:hyperlink w:anchor="__RefHeading___Toc2489_972910476">
             <w:r>
               <w:rPr>
                 <w:webHidden/>
@@ -2836,7 +2836,7 @@
             </w:tabs>
             <w:rPr/>
           </w:pPr>
-          <w:hyperlink w:anchor="__RefHeading___Toc2491_3840626700">
+          <w:hyperlink w:anchor="__RefHeading___Toc2491_972910476">
             <w:r>
               <w:rPr>
                 <w:webHidden/>
@@ -2857,7 +2857,7 @@
             </w:tabs>
             <w:rPr/>
           </w:pPr>
-          <w:hyperlink w:anchor="__RefHeading___Toc2493_3840626700">
+          <w:hyperlink w:anchor="__RefHeading___Toc2493_972910476">
             <w:r>
               <w:rPr>
                 <w:webHidden/>
@@ -2878,7 +2878,7 @@
             </w:tabs>
             <w:rPr/>
           </w:pPr>
-          <w:hyperlink w:anchor="__RefHeading___Toc2495_3840626700">
+          <w:hyperlink w:anchor="__RefHeading___Toc2495_972910476">
             <w:r>
               <w:rPr>
                 <w:webHidden/>
@@ -2899,7 +2899,7 @@
             </w:tabs>
             <w:rPr/>
           </w:pPr>
-          <w:hyperlink w:anchor="__RefHeading___Toc2497_3840626700">
+          <w:hyperlink w:anchor="__RefHeading___Toc2497_972910476">
             <w:r>
               <w:rPr>
                 <w:webHidden/>
@@ -2971,7 +2971,7 @@
             </w:rPr>
             <w:fldChar w:fldCharType="separate"/>
           </w:r>
-          <w:hyperlink w:anchor="__RefHeading___Toc2499_3840626700">
+          <w:hyperlink w:anchor="__RefHeading___Toc2499_972910476">
             <w:r>
               <w:rPr>
                 <w:webHidden/>
@@ -2992,7 +2992,7 @@
             </w:tabs>
             <w:rPr/>
           </w:pPr>
-          <w:hyperlink w:anchor="__RefHeading___Toc2533_3840626700">
+          <w:hyperlink w:anchor="__RefHeading___Toc2533_972910476">
             <w:r>
               <w:rPr>
                 <w:webHidden/>
@@ -3013,7 +3013,7 @@
             </w:tabs>
             <w:rPr/>
           </w:pPr>
-          <w:hyperlink w:anchor="__RefHeading___Toc2531_3840626700">
+          <w:hyperlink w:anchor="__RefHeading___Toc2531_972910476">
             <w:r>
               <w:rPr>
                 <w:webHidden/>
@@ -3034,7 +3034,7 @@
             </w:tabs>
             <w:rPr/>
           </w:pPr>
-          <w:hyperlink w:anchor="__RefHeading___Toc2529_3840626700">
+          <w:hyperlink w:anchor="__RefHeading___Toc2529_972910476">
             <w:r>
               <w:rPr>
                 <w:webHidden/>
@@ -3055,7 +3055,7 @@
             </w:tabs>
             <w:rPr/>
           </w:pPr>
-          <w:hyperlink w:anchor="__RefHeading___Toc2527_3840626700">
+          <w:hyperlink w:anchor="__RefHeading___Toc2527_972910476">
             <w:r>
               <w:rPr>
                 <w:webHidden/>
@@ -3076,7 +3076,7 @@
             </w:tabs>
             <w:rPr/>
           </w:pPr>
-          <w:hyperlink w:anchor="__RefHeading___Toc2525_3840626700">
+          <w:hyperlink w:anchor="__RefHeading___Toc2525_972910476">
             <w:r>
               <w:rPr>
                 <w:webHidden/>
@@ -3097,7 +3097,7 @@
             </w:tabs>
             <w:rPr/>
           </w:pPr>
-          <w:hyperlink w:anchor="__RefHeading___Toc2523_3840626700">
+          <w:hyperlink w:anchor="__RefHeading___Toc2523_972910476">
             <w:r>
               <w:rPr>
                 <w:webHidden/>
@@ -3118,7 +3118,7 @@
             </w:tabs>
             <w:rPr/>
           </w:pPr>
-          <w:hyperlink w:anchor="__RefHeading___Toc2521_3840626700">
+          <w:hyperlink w:anchor="__RefHeading___Toc2521_972910476">
             <w:r>
               <w:rPr>
                 <w:webHidden/>
@@ -3139,7 +3139,7 @@
             </w:tabs>
             <w:rPr/>
           </w:pPr>
-          <w:hyperlink w:anchor="__RefHeading___Toc2519_3840626700">
+          <w:hyperlink w:anchor="__RefHeading___Toc2519_972910476">
             <w:r>
               <w:rPr>
                 <w:webHidden/>
@@ -3160,7 +3160,7 @@
             </w:tabs>
             <w:rPr/>
           </w:pPr>
-          <w:hyperlink w:anchor="__RefHeading___Toc2517_3840626700">
+          <w:hyperlink w:anchor="__RefHeading___Toc2517_972910476">
             <w:r>
               <w:rPr>
                 <w:webHidden/>
@@ -3181,7 +3181,7 @@
             </w:tabs>
             <w:rPr/>
           </w:pPr>
-          <w:hyperlink w:anchor="__RefHeading___Toc2515_3840626700">
+          <w:hyperlink w:anchor="__RefHeading___Toc2515_972910476">
             <w:r>
               <w:rPr>
                 <w:webHidden/>
@@ -3202,7 +3202,7 @@
             </w:tabs>
             <w:rPr/>
           </w:pPr>
-          <w:hyperlink w:anchor="__RefHeading___Toc2513_3840626700">
+          <w:hyperlink w:anchor="__RefHeading___Toc2513_972910476">
             <w:r>
               <w:rPr>
                 <w:webHidden/>
@@ -3223,7 +3223,7 @@
             </w:tabs>
             <w:rPr/>
           </w:pPr>
-          <w:hyperlink w:anchor="__RefHeading___Toc2511_3840626700">
+          <w:hyperlink w:anchor="__RefHeading___Toc2511_972910476">
             <w:r>
               <w:rPr>
                 <w:webHidden/>
@@ -3244,7 +3244,7 @@
             </w:tabs>
             <w:rPr/>
           </w:pPr>
-          <w:hyperlink w:anchor="__RefHeading___Toc2509_3840626700">
+          <w:hyperlink w:anchor="__RefHeading___Toc2509_972910476">
             <w:r>
               <w:rPr>
                 <w:webHidden/>
@@ -3265,7 +3265,7 @@
             </w:tabs>
             <w:rPr/>
           </w:pPr>
-          <w:hyperlink w:anchor="__RefHeading___Toc2507_3840626700">
+          <w:hyperlink w:anchor="__RefHeading___Toc2507_972910476">
             <w:r>
               <w:rPr>
                 <w:webHidden/>
@@ -3286,7 +3286,7 @@
             </w:tabs>
             <w:rPr/>
           </w:pPr>
-          <w:hyperlink w:anchor="__RefHeading___Toc2505_3840626700">
+          <w:hyperlink w:anchor="__RefHeading___Toc2505_972910476">
             <w:r>
               <w:rPr>
                 <w:webHidden/>
@@ -3307,7 +3307,7 @@
             </w:tabs>
             <w:rPr/>
           </w:pPr>
-          <w:hyperlink w:anchor="__RefHeading___Toc2503_3840626700">
+          <w:hyperlink w:anchor="__RefHeading___Toc2503_972910476">
             <w:r>
               <w:rPr>
                 <w:webHidden/>
@@ -3328,7 +3328,7 @@
             </w:tabs>
             <w:rPr/>
           </w:pPr>
-          <w:hyperlink w:anchor="__RefHeading___Toc2501_3840626700">
+          <w:hyperlink w:anchor="__RefHeading___Toc2501_972910476">
             <w:r>
               <w:rPr>
                 <w:webHidden/>
@@ -3400,7 +3400,7 @@
             </w:rPr>
             <w:fldChar w:fldCharType="separate"/>
           </w:r>
-          <w:hyperlink w:anchor="__RefHeading___Toc2535_3840626700">
+          <w:hyperlink w:anchor="__RefHeading___Toc2535_972910476">
             <w:r>
               <w:rPr>
                 <w:webHidden/>
@@ -3421,7 +3421,7 @@
             </w:tabs>
             <w:rPr/>
           </w:pPr>
-          <w:hyperlink w:anchor="__RefHeading___Toc2573_3840626700">
+          <w:hyperlink w:anchor="__RefHeading___Toc2573_972910476">
             <w:r>
               <w:rPr>
                 <w:webHidden/>
@@ -3442,7 +3442,7 @@
             </w:tabs>
             <w:rPr/>
           </w:pPr>
-          <w:hyperlink w:anchor="__RefHeading___Toc2571_3840626700">
+          <w:hyperlink w:anchor="__RefHeading___Toc2571_972910476">
             <w:r>
               <w:rPr>
                 <w:webHidden/>
@@ -3463,7 +3463,7 @@
             </w:tabs>
             <w:rPr/>
           </w:pPr>
-          <w:hyperlink w:anchor="__RefHeading___Toc2569_3840626700">
+          <w:hyperlink w:anchor="__RefHeading___Toc2569_972910476">
             <w:r>
               <w:rPr>
                 <w:webHidden/>
@@ -3484,7 +3484,7 @@
             </w:tabs>
             <w:rPr/>
           </w:pPr>
-          <w:hyperlink w:anchor="__RefHeading___Toc2567_3840626700">
+          <w:hyperlink w:anchor="__RefHeading___Toc2567_972910476">
             <w:r>
               <w:rPr>
                 <w:webHidden/>
@@ -3505,7 +3505,7 @@
             </w:tabs>
             <w:rPr/>
           </w:pPr>
-          <w:hyperlink w:anchor="__RefHeading___Toc2565_3840626700">
+          <w:hyperlink w:anchor="__RefHeading___Toc2565_972910476">
             <w:r>
               <w:rPr>
                 <w:webHidden/>
@@ -3526,7 +3526,7 @@
             </w:tabs>
             <w:rPr/>
           </w:pPr>
-          <w:hyperlink w:anchor="__RefHeading___Toc2563_3840626700">
+          <w:hyperlink w:anchor="__RefHeading___Toc2563_972910476">
             <w:r>
               <w:rPr>
                 <w:webHidden/>
@@ -3547,7 +3547,7 @@
             </w:tabs>
             <w:rPr/>
           </w:pPr>
-          <w:hyperlink w:anchor="__RefHeading___Toc2561_3840626700">
+          <w:hyperlink w:anchor="__RefHeading___Toc2561_972910476">
             <w:r>
               <w:rPr>
                 <w:webHidden/>
@@ -3568,7 +3568,7 @@
             </w:tabs>
             <w:rPr/>
           </w:pPr>
-          <w:hyperlink w:anchor="__RefHeading___Toc2559_3840626700">
+          <w:hyperlink w:anchor="__RefHeading___Toc2559_972910476">
             <w:r>
               <w:rPr>
                 <w:webHidden/>
@@ -3589,7 +3589,7 @@
             </w:tabs>
             <w:rPr/>
           </w:pPr>
-          <w:hyperlink w:anchor="__RefHeading___Toc2557_3840626700">
+          <w:hyperlink w:anchor="__RefHeading___Toc2557_972910476">
             <w:r>
               <w:rPr>
                 <w:webHidden/>
@@ -3610,7 +3610,7 @@
             </w:tabs>
             <w:rPr/>
           </w:pPr>
-          <w:hyperlink w:anchor="__RefHeading___Toc2555_3840626700">
+          <w:hyperlink w:anchor="__RefHeading___Toc2555_972910476">
             <w:r>
               <w:rPr>
                 <w:webHidden/>
@@ -3631,7 +3631,7 @@
             </w:tabs>
             <w:rPr/>
           </w:pPr>
-          <w:hyperlink w:anchor="__RefHeading___Toc2553_3840626700">
+          <w:hyperlink w:anchor="__RefHeading___Toc2553_972910476">
             <w:r>
               <w:rPr>
                 <w:webHidden/>
@@ -3652,7 +3652,7 @@
             </w:tabs>
             <w:rPr/>
           </w:pPr>
-          <w:hyperlink w:anchor="__RefHeading___Toc2551_3840626700">
+          <w:hyperlink w:anchor="__RefHeading___Toc2551_972910476">
             <w:r>
               <w:rPr>
                 <w:webHidden/>
@@ -3673,7 +3673,7 @@
             </w:tabs>
             <w:rPr/>
           </w:pPr>
-          <w:hyperlink w:anchor="__RefHeading___Toc2549_3840626700">
+          <w:hyperlink w:anchor="__RefHeading___Toc2549_972910476">
             <w:r>
               <w:rPr>
                 <w:webHidden/>
@@ -3694,7 +3694,7 @@
             </w:tabs>
             <w:rPr/>
           </w:pPr>
-          <w:hyperlink w:anchor="__RefHeading___Toc2547_3840626700">
+          <w:hyperlink w:anchor="__RefHeading___Toc2547_972910476">
             <w:r>
               <w:rPr>
                 <w:webHidden/>
@@ -3715,7 +3715,7 @@
             </w:tabs>
             <w:rPr/>
           </w:pPr>
-          <w:hyperlink w:anchor="__RefHeading___Toc2545_3840626700">
+          <w:hyperlink w:anchor="__RefHeading___Toc2545_972910476">
             <w:r>
               <w:rPr>
                 <w:webHidden/>
@@ -3736,7 +3736,7 @@
             </w:tabs>
             <w:rPr/>
           </w:pPr>
-          <w:hyperlink w:anchor="__RefHeading___Toc2543_3840626700">
+          <w:hyperlink w:anchor="__RefHeading___Toc2543_972910476">
             <w:r>
               <w:rPr>
                 <w:webHidden/>
@@ -3757,7 +3757,7 @@
             </w:tabs>
             <w:rPr/>
           </w:pPr>
-          <w:hyperlink w:anchor="__RefHeading___Toc2541_3840626700">
+          <w:hyperlink w:anchor="__RefHeading___Toc2541_972910476">
             <w:r>
               <w:rPr>
                 <w:webHidden/>
@@ -3778,7 +3778,7 @@
             </w:tabs>
             <w:rPr/>
           </w:pPr>
-          <w:hyperlink w:anchor="__RefHeading___Toc2539_3840626700">
+          <w:hyperlink w:anchor="__RefHeading___Toc2539_972910476">
             <w:r>
               <w:rPr>
                 <w:webHidden/>
@@ -3799,7 +3799,7 @@
             </w:tabs>
             <w:rPr/>
           </w:pPr>
-          <w:hyperlink w:anchor="__RefHeading___Toc2537_3840626700">
+          <w:hyperlink w:anchor="__RefHeading___Toc2537_972910476">
             <w:r>
               <w:rPr>
                 <w:webHidden/>
@@ -4671,7 +4671,7 @@
           <w:footerReference w:type="default" r:id="rId4"/>
           <w:type w:val="nextPage"/>
           <w:pgSz w:w="11906" w:h="16838"/>
-          <w:pgMar w:left="1680" w:right="1100" w:gutter="0" w:header="0" w:top="1368" w:footer="576" w:bottom="1296"/>
+          <w:pgMar w:left="1390" w:right="1390" w:gutter="0" w:header="0" w:top="1368" w:footer="576" w:bottom="1296"/>
           <w:pgNumType w:start="1" w:fmt="lowerRoman"/>
           <w:formProt w:val="false"/>
           <w:textDirection w:val="lrTb"/>
@@ -4709,7 +4709,7 @@
         <w:pStyle w:val="Heading1"/>
         <w:rPr/>
       </w:pPr>
-      <w:bookmarkStart w:id="2" w:name="__RefHeading___Toc2417_3840626700"/>
+      <w:bookmarkStart w:id="2" w:name="__RefHeading___Toc2417_972910476"/>
       <w:bookmarkEnd w:id="2"/>
       <w:r>
         <w:rPr/>
@@ -4766,7 +4766,7 @@
         <w:pStyle w:val="Heading2"/>
         <w:rPr/>
       </w:pPr>
-      <w:bookmarkStart w:id="3" w:name="__RefHeading___Toc2419_3840626700"/>
+      <w:bookmarkStart w:id="3" w:name="__RefHeading___Toc2419_972910476"/>
       <w:bookmarkEnd w:id="3"/>
       <w:r>
         <w:rPr/>
@@ -4844,7 +4844,7 @@
         <w:pStyle w:val="TableCaption"/>
         <w:rPr/>
       </w:pPr>
-      <w:bookmarkStart w:id="4" w:name="__RefHeading___Toc2535_3840626700"/>
+      <w:bookmarkStart w:id="4" w:name="__RefHeading___Toc2535_972910476"/>
       <w:bookmarkEnd w:id="4"/>
       <w:r>
         <w:rPr>
@@ -5776,7 +5776,7 @@
         <w:pStyle w:val="Heading2"/>
         <w:rPr/>
       </w:pPr>
-      <w:bookmarkStart w:id="5" w:name="__RefHeading___Toc2421_3840626700"/>
+      <w:bookmarkStart w:id="5" w:name="__RefHeading___Toc2421_972910476"/>
       <w:bookmarkEnd w:id="5"/>
       <w:r>
         <w:rPr/>
@@ -5803,7 +5803,7 @@
         <w:pStyle w:val="TableCaption"/>
         <w:rPr/>
       </w:pPr>
-      <w:bookmarkStart w:id="6" w:name="__RefHeading___Toc2573_3840626700"/>
+      <w:bookmarkStart w:id="6" w:name="__RefHeading___Toc2573_972910476"/>
       <w:bookmarkEnd w:id="6"/>
       <w:r>
         <w:rPr>
@@ -6929,7 +6929,7 @@
         <w:pStyle w:val="Heading2"/>
         <w:rPr/>
       </w:pPr>
-      <w:bookmarkStart w:id="7" w:name="__RefHeading___Toc2423_3840626700"/>
+      <w:bookmarkStart w:id="7" w:name="__RefHeading___Toc2423_972910476"/>
       <w:bookmarkEnd w:id="7"/>
       <w:r>
         <w:rPr/>
@@ -6959,7 +6959,7 @@
         <w:pStyle w:val="Heading1"/>
         <w:rPr/>
       </w:pPr>
-      <w:bookmarkStart w:id="8" w:name="__RefHeading___Toc2425_3840626700"/>
+      <w:bookmarkStart w:id="8" w:name="__RefHeading___Toc2425_972910476"/>
       <w:bookmarkEnd w:id="8"/>
       <w:r>
         <w:rPr/>
@@ -7097,7 +7097,7 @@
         <w:pStyle w:val="Heading1"/>
         <w:rPr/>
       </w:pPr>
-      <w:bookmarkStart w:id="9" w:name="__RefHeading___Toc2427_3840626700"/>
+      <w:bookmarkStart w:id="9" w:name="__RefHeading___Toc2427_972910476"/>
       <w:bookmarkEnd w:id="9"/>
       <w:r>
         <w:rPr/>
@@ -7109,7 +7109,7 @@
         <w:pStyle w:val="TableCaption"/>
         <w:rPr/>
       </w:pPr>
-      <w:bookmarkStart w:id="10" w:name="__RefHeading___Toc2571_3840626700"/>
+      <w:bookmarkStart w:id="10" w:name="__RefHeading___Toc2571_972910476"/>
       <w:bookmarkEnd w:id="10"/>
       <w:r>
         <w:rPr>
@@ -7499,7 +7499,7 @@
         <w:pStyle w:val="Heading1"/>
         <w:rPr/>
       </w:pPr>
-      <w:bookmarkStart w:id="11" w:name="__RefHeading___Toc2429_3840626700"/>
+      <w:bookmarkStart w:id="11" w:name="__RefHeading___Toc2429_972910476"/>
       <w:bookmarkEnd w:id="11"/>
       <w:r>
         <w:rPr/>
@@ -7575,7 +7575,7 @@
         <w:pStyle w:val="FigureCaption"/>
         <w:rPr/>
       </w:pPr>
-      <w:bookmarkStart w:id="12" w:name="__RefHeading___Toc2499_3840626700"/>
+      <w:bookmarkStart w:id="12" w:name="__RefHeading___Toc2499_972910476"/>
       <w:bookmarkEnd w:id="12"/>
       <w:r>
         <w:rPr>
@@ -7590,7 +7590,7 @@
         <w:pStyle w:val="Heading2"/>
         <w:rPr/>
       </w:pPr>
-      <w:bookmarkStart w:id="13" w:name="__RefHeading___Toc2431_3840626700"/>
+      <w:bookmarkStart w:id="13" w:name="__RefHeading___Toc2431_972910476"/>
       <w:bookmarkEnd w:id="13"/>
       <w:r>
         <w:rPr/>
@@ -7602,7 +7602,7 @@
         <w:pStyle w:val="Heading3"/>
         <w:rPr/>
       </w:pPr>
-      <w:bookmarkStart w:id="14" w:name="__RefHeading___Toc2433_3840626700"/>
+      <w:bookmarkStart w:id="14" w:name="__RefHeading___Toc2433_972910476"/>
       <w:bookmarkEnd w:id="14"/>
       <w:r>
         <w:rPr/>
@@ -7629,7 +7629,7 @@
         <w:pStyle w:val="Heading3"/>
         <w:rPr/>
       </w:pPr>
-      <w:bookmarkStart w:id="15" w:name="__RefHeading___Toc2435_3840626700"/>
+      <w:bookmarkStart w:id="15" w:name="__RefHeading___Toc2435_972910476"/>
       <w:bookmarkEnd w:id="15"/>
       <w:r>
         <w:rPr/>
@@ -7656,7 +7656,7 @@
         <w:pStyle w:val="TableCaption"/>
         <w:rPr/>
       </w:pPr>
-      <w:bookmarkStart w:id="16" w:name="__RefHeading___Toc2569_3840626700"/>
+      <w:bookmarkStart w:id="16" w:name="__RefHeading___Toc2569_972910476"/>
       <w:bookmarkEnd w:id="16"/>
       <w:r>
         <w:rPr>
@@ -8687,7 +8687,7 @@
         <w:pStyle w:val="TableCaption"/>
         <w:rPr/>
       </w:pPr>
-      <w:bookmarkStart w:id="17" w:name="__RefHeading___Toc2567_3840626700"/>
+      <w:bookmarkStart w:id="17" w:name="__RefHeading___Toc2567_972910476"/>
       <w:bookmarkEnd w:id="17"/>
       <w:r>
         <w:rPr>
@@ -9552,7 +9552,7 @@
         <w:pStyle w:val="Heading3"/>
         <w:rPr/>
       </w:pPr>
-      <w:bookmarkStart w:id="18" w:name="__RefHeading___Toc2437_3840626700"/>
+      <w:bookmarkStart w:id="18" w:name="__RefHeading___Toc2437_972910476"/>
       <w:bookmarkEnd w:id="18"/>
       <w:r>
         <w:rPr/>
@@ -9579,7 +9579,7 @@
         <w:pStyle w:val="TableCaption"/>
         <w:rPr/>
       </w:pPr>
-      <w:bookmarkStart w:id="19" w:name="__RefHeading___Toc2565_3840626700"/>
+      <w:bookmarkStart w:id="19" w:name="__RefHeading___Toc2565_972910476"/>
       <w:bookmarkEnd w:id="19"/>
       <w:r>
         <w:rPr>
@@ -10293,7 +10293,7 @@
         <w:pStyle w:val="Heading3"/>
         <w:rPr/>
       </w:pPr>
-      <w:bookmarkStart w:id="20" w:name="__RefHeading___Toc2439_3840626700"/>
+      <w:bookmarkStart w:id="20" w:name="__RefHeading___Toc2439_972910476"/>
       <w:bookmarkEnd w:id="20"/>
       <w:r>
         <w:rPr/>
@@ -10351,7 +10351,7 @@
         <w:pStyle w:val="Heading2"/>
         <w:rPr/>
       </w:pPr>
-      <w:bookmarkStart w:id="21" w:name="__RefHeading___Toc2441_3840626700"/>
+      <w:bookmarkStart w:id="21" w:name="__RefHeading___Toc2441_972910476"/>
       <w:bookmarkEnd w:id="21"/>
       <w:r>
         <w:rPr/>
@@ -10363,7 +10363,7 @@
         <w:pStyle w:val="TableCaption"/>
         <w:rPr/>
       </w:pPr>
-      <w:bookmarkStart w:id="22" w:name="__RefHeading___Toc2563_3840626700"/>
+      <w:bookmarkStart w:id="22" w:name="__RefHeading___Toc2563_972910476"/>
       <w:bookmarkEnd w:id="22"/>
       <w:r>
         <w:rPr>
@@ -10975,7 +10975,7 @@
         <w:pStyle w:val="Heading2"/>
         <w:rPr/>
       </w:pPr>
-      <w:bookmarkStart w:id="23" w:name="__RefHeading___Toc2443_3840626700"/>
+      <w:bookmarkStart w:id="23" w:name="__RefHeading___Toc2443_972910476"/>
       <w:bookmarkEnd w:id="23"/>
       <w:r>
         <w:rPr/>
@@ -11002,7 +11002,7 @@
         <w:pStyle w:val="TableCaption"/>
         <w:rPr/>
       </w:pPr>
-      <w:bookmarkStart w:id="24" w:name="__RefHeading___Toc2561_3840626700"/>
+      <w:bookmarkStart w:id="24" w:name="__RefHeading___Toc2561_972910476"/>
       <w:bookmarkEnd w:id="24"/>
       <w:r>
         <w:rPr>
@@ -11617,7 +11617,7 @@
         <w:pStyle w:val="Heading1"/>
         <w:rPr/>
       </w:pPr>
-      <w:bookmarkStart w:id="25" w:name="__RefHeading___Toc2445_3840626700"/>
+      <w:bookmarkStart w:id="25" w:name="__RefHeading___Toc2445_972910476"/>
       <w:bookmarkEnd w:id="25"/>
       <w:r>
         <w:rPr/>
@@ -11644,7 +11644,7 @@
         <w:pStyle w:val="Heading2"/>
         <w:rPr/>
       </w:pPr>
-      <w:bookmarkStart w:id="26" w:name="__RefHeading___Toc2447_3840626700"/>
+      <w:bookmarkStart w:id="26" w:name="__RefHeading___Toc2447_972910476"/>
       <w:bookmarkEnd w:id="26"/>
       <w:r>
         <w:rPr/>
@@ -11671,7 +11671,7 @@
         <w:pStyle w:val="Heading2"/>
         <w:rPr/>
       </w:pPr>
-      <w:bookmarkStart w:id="27" w:name="__RefHeading___Toc2449_3840626700"/>
+      <w:bookmarkStart w:id="27" w:name="__RefHeading___Toc2449_972910476"/>
       <w:bookmarkEnd w:id="27"/>
       <w:r>
         <w:rPr/>
@@ -11721,7 +11721,7 @@
         <w:pStyle w:val="Heading3"/>
         <w:rPr/>
       </w:pPr>
-      <w:bookmarkStart w:id="28" w:name="__RefHeading___Toc2451_3840626700"/>
+      <w:bookmarkStart w:id="28" w:name="__RefHeading___Toc2451_972910476"/>
       <w:bookmarkEnd w:id="28"/>
       <w:r>
         <w:rPr/>
@@ -11876,7 +11876,7 @@
         <w:pStyle w:val="FigureCaption"/>
         <w:rPr/>
       </w:pPr>
-      <w:bookmarkStart w:id="29" w:name="__RefHeading___Toc2533_3840626700"/>
+      <w:bookmarkStart w:id="29" w:name="__RefHeading___Toc2533_972910476"/>
       <w:bookmarkEnd w:id="29"/>
       <w:r>
         <w:rPr>
@@ -11940,7 +11940,7 @@
         <w:pStyle w:val="FigureCaption"/>
         <w:rPr/>
       </w:pPr>
-      <w:bookmarkStart w:id="30" w:name="__RefHeading___Toc2531_3840626700"/>
+      <w:bookmarkStart w:id="30" w:name="__RefHeading___Toc2531_972910476"/>
       <w:bookmarkEnd w:id="30"/>
       <w:r>
         <w:rPr>
@@ -11955,7 +11955,7 @@
         <w:pStyle w:val="TableCaption"/>
         <w:rPr/>
       </w:pPr>
-      <w:bookmarkStart w:id="31" w:name="__RefHeading___Toc2559_3840626700"/>
+      <w:bookmarkStart w:id="31" w:name="__RefHeading___Toc2559_972910476"/>
       <w:bookmarkEnd w:id="31"/>
       <w:r>
         <w:rPr>
@@ -12647,7 +12647,7 @@
         <w:pStyle w:val="Heading2"/>
         <w:rPr/>
       </w:pPr>
-      <w:bookmarkStart w:id="32" w:name="__RefHeading___Toc2453_3840626700"/>
+      <w:bookmarkStart w:id="32" w:name="__RefHeading___Toc2453_972910476"/>
       <w:bookmarkEnd w:id="32"/>
       <w:r>
         <w:rPr/>
@@ -12674,7 +12674,7 @@
         <w:pStyle w:val="Heading2"/>
         <w:rPr/>
       </w:pPr>
-      <w:bookmarkStart w:id="33" w:name="__RefHeading___Toc2455_3840626700"/>
+      <w:bookmarkStart w:id="33" w:name="__RefHeading___Toc2455_972910476"/>
       <w:bookmarkEnd w:id="33"/>
       <w:r>
         <w:rPr/>
@@ -12701,7 +12701,7 @@
         <w:pStyle w:val="Heading2"/>
         <w:rPr/>
       </w:pPr>
-      <w:bookmarkStart w:id="34" w:name="__RefHeading___Toc2457_3840626700"/>
+      <w:bookmarkStart w:id="34" w:name="__RefHeading___Toc2457_972910476"/>
       <w:bookmarkEnd w:id="34"/>
       <w:r>
         <w:rPr/>
@@ -12804,7 +12804,7 @@
         <w:pStyle w:val="Heading1"/>
         <w:rPr/>
       </w:pPr>
-      <w:bookmarkStart w:id="35" w:name="__RefHeading___Toc2459_3840626700"/>
+      <w:bookmarkStart w:id="35" w:name="__RefHeading___Toc2459_972910476"/>
       <w:bookmarkEnd w:id="35"/>
       <w:r>
         <w:rPr/>
@@ -12816,7 +12816,7 @@
         <w:pStyle w:val="TableCaption"/>
         <w:rPr/>
       </w:pPr>
-      <w:bookmarkStart w:id="36" w:name="__RefHeading___Toc2557_3840626700"/>
+      <w:bookmarkStart w:id="36" w:name="__RefHeading___Toc2557_972910476"/>
       <w:bookmarkEnd w:id="36"/>
       <w:r>
         <w:rPr>
@@ -13606,7 +13606,7 @@
         <w:pStyle w:val="Heading1"/>
         <w:rPr/>
       </w:pPr>
-      <w:bookmarkStart w:id="37" w:name="__RefHeading___Toc2461_3840626700"/>
+      <w:bookmarkStart w:id="37" w:name="__RefHeading___Toc2461_972910476"/>
       <w:bookmarkEnd w:id="37"/>
       <w:r>
         <w:rPr/>
@@ -13618,7 +13618,7 @@
         <w:pStyle w:val="TableCaption"/>
         <w:rPr/>
       </w:pPr>
-      <w:bookmarkStart w:id="38" w:name="__RefHeading___Toc2555_3840626700"/>
+      <w:bookmarkStart w:id="38" w:name="__RefHeading___Toc2555_972910476"/>
       <w:bookmarkEnd w:id="38"/>
       <w:r>
         <w:rPr>
@@ -14552,7 +14552,7 @@
         <w:pStyle w:val="Heading1"/>
         <w:rPr/>
       </w:pPr>
-      <w:bookmarkStart w:id="39" w:name="__RefHeading___Toc2463_3840626700"/>
+      <w:bookmarkStart w:id="39" w:name="__RefHeading___Toc2463_972910476"/>
       <w:bookmarkEnd w:id="39"/>
       <w:r>
         <w:rPr/>
@@ -14564,7 +14564,7 @@
         <w:pStyle w:val="Heading2"/>
         <w:rPr/>
       </w:pPr>
-      <w:bookmarkStart w:id="40" w:name="__RefHeading___Toc2465_3840626700"/>
+      <w:bookmarkStart w:id="40" w:name="__RefHeading___Toc2465_972910476"/>
       <w:bookmarkEnd w:id="40"/>
       <w:r>
         <w:rPr/>
@@ -14640,7 +14640,7 @@
         <w:pStyle w:val="FigureCaption"/>
         <w:rPr/>
       </w:pPr>
-      <w:bookmarkStart w:id="41" w:name="__RefHeading___Toc2529_3840626700"/>
+      <w:bookmarkStart w:id="41" w:name="__RefHeading___Toc2529_972910476"/>
       <w:bookmarkEnd w:id="41"/>
       <w:r>
         <w:rPr>
@@ -14655,7 +14655,7 @@
         <w:pStyle w:val="TableCaption"/>
         <w:rPr/>
       </w:pPr>
-      <w:bookmarkStart w:id="42" w:name="__RefHeading___Toc2553_3840626700"/>
+      <w:bookmarkStart w:id="42" w:name="__RefHeading___Toc2553_972910476"/>
       <w:bookmarkEnd w:id="42"/>
       <w:r>
         <w:rPr>
@@ -15427,7 +15427,7 @@
         <w:pStyle w:val="Heading2"/>
         <w:rPr/>
       </w:pPr>
-      <w:bookmarkStart w:id="43" w:name="__RefHeading___Toc2467_3840626700"/>
+      <w:bookmarkStart w:id="43" w:name="__RefHeading___Toc2467_972910476"/>
       <w:bookmarkEnd w:id="43"/>
       <w:r>
         <w:rPr/>
@@ -15503,7 +15503,7 @@
         <w:pStyle w:val="FigureCaption"/>
         <w:rPr/>
       </w:pPr>
-      <w:bookmarkStart w:id="44" w:name="__RefHeading___Toc2527_3840626700"/>
+      <w:bookmarkStart w:id="44" w:name="__RefHeading___Toc2527_972910476"/>
       <w:bookmarkEnd w:id="44"/>
       <w:r>
         <w:rPr>
@@ -15518,7 +15518,7 @@
         <w:pStyle w:val="TableCaption"/>
         <w:rPr/>
       </w:pPr>
-      <w:bookmarkStart w:id="45" w:name="__RefHeading___Toc2551_3840626700"/>
+      <w:bookmarkStart w:id="45" w:name="__RefHeading___Toc2551_972910476"/>
       <w:bookmarkEnd w:id="45"/>
       <w:r>
         <w:rPr>
@@ -16214,7 +16214,7 @@
         <w:pStyle w:val="Heading2"/>
         <w:rPr/>
       </w:pPr>
-      <w:bookmarkStart w:id="46" w:name="__RefHeading___Toc2469_3840626700"/>
+      <w:bookmarkStart w:id="46" w:name="__RefHeading___Toc2469_972910476"/>
       <w:bookmarkEnd w:id="46"/>
       <w:r>
         <w:rPr/>
@@ -16327,7 +16327,7 @@
         <w:pStyle w:val="FigureCaption"/>
         <w:rPr/>
       </w:pPr>
-      <w:bookmarkStart w:id="47" w:name="__RefHeading___Toc2525_3840626700"/>
+      <w:bookmarkStart w:id="47" w:name="__RefHeading___Toc2525_972910476"/>
       <w:bookmarkEnd w:id="47"/>
       <w:r>
         <w:rPr>
@@ -16342,7 +16342,7 @@
         <w:pStyle w:val="TableCaption"/>
         <w:rPr/>
       </w:pPr>
-      <w:bookmarkStart w:id="48" w:name="__RefHeading___Toc2549_3840626700"/>
+      <w:bookmarkStart w:id="48" w:name="__RefHeading___Toc2549_972910476"/>
       <w:bookmarkEnd w:id="48"/>
       <w:r>
         <w:rPr>
@@ -18021,7 +18021,7 @@
         <w:pStyle w:val="Heading2"/>
         <w:rPr/>
       </w:pPr>
-      <w:bookmarkStart w:id="49" w:name="__RefHeading___Toc2471_3840626700"/>
+      <w:bookmarkStart w:id="49" w:name="__RefHeading___Toc2471_972910476"/>
       <w:bookmarkEnd w:id="49"/>
       <w:r>
         <w:rPr/>
@@ -18097,7 +18097,7 @@
         <w:pStyle w:val="FigureCaption"/>
         <w:rPr/>
       </w:pPr>
-      <w:bookmarkStart w:id="50" w:name="__RefHeading___Toc2523_3840626700"/>
+      <w:bookmarkStart w:id="50" w:name="__RefHeading___Toc2523_972910476"/>
       <w:bookmarkEnd w:id="50"/>
       <w:r>
         <w:rPr>
@@ -18112,7 +18112,7 @@
         <w:pStyle w:val="Heading2"/>
         <w:rPr/>
       </w:pPr>
-      <w:bookmarkStart w:id="51" w:name="__RefHeading___Toc2473_3840626700"/>
+      <w:bookmarkStart w:id="51" w:name="__RefHeading___Toc2473_972910476"/>
       <w:bookmarkEnd w:id="51"/>
       <w:r>
         <w:rPr/>
@@ -18188,7 +18188,7 @@
         <w:pStyle w:val="FigureCaption"/>
         <w:rPr/>
       </w:pPr>
-      <w:bookmarkStart w:id="52" w:name="__RefHeading___Toc2521_3840626700"/>
+      <w:bookmarkStart w:id="52" w:name="__RefHeading___Toc2521_972910476"/>
       <w:bookmarkEnd w:id="52"/>
       <w:r>
         <w:rPr>
@@ -18252,7 +18252,7 @@
         <w:pStyle w:val="FigureCaption"/>
         <w:rPr/>
       </w:pPr>
-      <w:bookmarkStart w:id="53" w:name="__RefHeading___Toc2519_3840626700"/>
+      <w:bookmarkStart w:id="53" w:name="__RefHeading___Toc2519_972910476"/>
       <w:bookmarkEnd w:id="53"/>
       <w:r>
         <w:rPr>
@@ -18316,7 +18316,7 @@
         <w:pStyle w:val="FigureCaption"/>
         <w:rPr/>
       </w:pPr>
-      <w:bookmarkStart w:id="54" w:name="__RefHeading___Toc2517_3840626700"/>
+      <w:bookmarkStart w:id="54" w:name="__RefHeading___Toc2517_972910476"/>
       <w:bookmarkEnd w:id="54"/>
       <w:r>
         <w:rPr>
@@ -18380,7 +18380,7 @@
         <w:pStyle w:val="FigureCaption"/>
         <w:rPr/>
       </w:pPr>
-      <w:bookmarkStart w:id="55" w:name="__RefHeading___Toc2515_3840626700"/>
+      <w:bookmarkStart w:id="55" w:name="__RefHeading___Toc2515_972910476"/>
       <w:bookmarkEnd w:id="55"/>
       <w:r>
         <w:rPr>
@@ -18444,7 +18444,7 @@
         <w:pStyle w:val="FigureCaption"/>
         <w:rPr/>
       </w:pPr>
-      <w:bookmarkStart w:id="56" w:name="__RefHeading___Toc2513_3840626700"/>
+      <w:bookmarkStart w:id="56" w:name="__RefHeading___Toc2513_972910476"/>
       <w:bookmarkEnd w:id="56"/>
       <w:r>
         <w:rPr>
@@ -18459,7 +18459,7 @@
         <w:pStyle w:val="TableCaption"/>
         <w:rPr/>
       </w:pPr>
-      <w:bookmarkStart w:id="57" w:name="__RefHeading___Toc2547_3840626700"/>
+      <w:bookmarkStart w:id="57" w:name="__RefHeading___Toc2547_972910476"/>
       <w:bookmarkEnd w:id="57"/>
       <w:r>
         <w:rPr>
@@ -19065,7 +19065,7 @@
         <w:pStyle w:val="Heading2"/>
         <w:rPr/>
       </w:pPr>
-      <w:bookmarkStart w:id="58" w:name="__RefHeading___Toc2475_3840626700"/>
+      <w:bookmarkStart w:id="58" w:name="__RefHeading___Toc2475_972910476"/>
       <w:bookmarkEnd w:id="58"/>
       <w:r>
         <w:rPr/>
@@ -19141,7 +19141,7 @@
         <w:pStyle w:val="FigureCaption"/>
         <w:rPr/>
       </w:pPr>
-      <w:bookmarkStart w:id="59" w:name="__RefHeading___Toc2511_3840626700"/>
+      <w:bookmarkStart w:id="59" w:name="__RefHeading___Toc2511_972910476"/>
       <w:bookmarkEnd w:id="59"/>
       <w:r>
         <w:rPr>
@@ -19205,7 +19205,7 @@
         <w:pStyle w:val="FigureCaption"/>
         <w:rPr/>
       </w:pPr>
-      <w:bookmarkStart w:id="60" w:name="__RefHeading___Toc2509_3840626700"/>
+      <w:bookmarkStart w:id="60" w:name="__RefHeading___Toc2509_972910476"/>
       <w:bookmarkEnd w:id="60"/>
       <w:r>
         <w:rPr>
@@ -19269,7 +19269,7 @@
         <w:pStyle w:val="FigureCaption"/>
         <w:rPr/>
       </w:pPr>
-      <w:bookmarkStart w:id="61" w:name="__RefHeading___Toc2507_3840626700"/>
+      <w:bookmarkStart w:id="61" w:name="__RefHeading___Toc2507_972910476"/>
       <w:bookmarkEnd w:id="61"/>
       <w:r>
         <w:rPr>
@@ -19333,7 +19333,7 @@
         <w:pStyle w:val="FigureCaption"/>
         <w:rPr/>
       </w:pPr>
-      <w:bookmarkStart w:id="62" w:name="__RefHeading___Toc2505_3840626700"/>
+      <w:bookmarkStart w:id="62" w:name="__RefHeading___Toc2505_972910476"/>
       <w:bookmarkEnd w:id="62"/>
       <w:r>
         <w:rPr>
@@ -19397,7 +19397,7 @@
         <w:pStyle w:val="FigureCaption"/>
         <w:rPr/>
       </w:pPr>
-      <w:bookmarkStart w:id="63" w:name="__RefHeading___Toc2503_3840626700"/>
+      <w:bookmarkStart w:id="63" w:name="__RefHeading___Toc2503_972910476"/>
       <w:bookmarkEnd w:id="63"/>
       <w:r>
         <w:rPr>
@@ -19412,7 +19412,7 @@
         <w:pStyle w:val="TableCaption"/>
         <w:rPr/>
       </w:pPr>
-      <w:bookmarkStart w:id="64" w:name="__RefHeading___Toc2545_3840626700"/>
+      <w:bookmarkStart w:id="64" w:name="__RefHeading___Toc2545_972910476"/>
       <w:bookmarkEnd w:id="64"/>
       <w:r>
         <w:rPr>
@@ -20963,7 +20963,7 @@
         <w:pStyle w:val="Heading2"/>
         <w:rPr/>
       </w:pPr>
-      <w:bookmarkStart w:id="65" w:name="__RefHeading___Toc2477_3840626700"/>
+      <w:bookmarkStart w:id="65" w:name="__RefHeading___Toc2477_972910476"/>
       <w:bookmarkEnd w:id="65"/>
       <w:r>
         <w:rPr/>
@@ -21039,7 +21039,7 @@
         <w:pStyle w:val="FigureCaption"/>
         <w:rPr/>
       </w:pPr>
-      <w:bookmarkStart w:id="66" w:name="__RefHeading___Toc2501_3840626700"/>
+      <w:bookmarkStart w:id="66" w:name="__RefHeading___Toc2501_972910476"/>
       <w:bookmarkEnd w:id="66"/>
       <w:r>
         <w:rPr>
@@ -21054,7 +21054,7 @@
         <w:pStyle w:val="TableCaption"/>
         <w:rPr/>
       </w:pPr>
-      <w:bookmarkStart w:id="67" w:name="__RefHeading___Toc2543_3840626700"/>
+      <w:bookmarkStart w:id="67" w:name="__RefHeading___Toc2543_972910476"/>
       <w:bookmarkEnd w:id="67"/>
       <w:r>
         <w:rPr>
@@ -22093,7 +22093,7 @@
         <w:pStyle w:val="Heading2"/>
         <w:rPr/>
       </w:pPr>
-      <w:bookmarkStart w:id="68" w:name="__RefHeading___Toc2479_3840626700"/>
+      <w:bookmarkStart w:id="68" w:name="__RefHeading___Toc2479_972910476"/>
       <w:bookmarkEnd w:id="68"/>
       <w:r>
         <w:rPr/>
@@ -22196,7 +22196,7 @@
         <w:pStyle w:val="Heading1"/>
         <w:rPr/>
       </w:pPr>
-      <w:bookmarkStart w:id="69" w:name="__RefHeading___Toc2481_3840626700"/>
+      <w:bookmarkStart w:id="69" w:name="__RefHeading___Toc2481_972910476"/>
       <w:bookmarkEnd w:id="69"/>
       <w:r>
         <w:rPr/>
@@ -22223,7 +22223,7 @@
         <w:pStyle w:val="Heading2"/>
         <w:rPr/>
       </w:pPr>
-      <w:bookmarkStart w:id="70" w:name="__RefHeading___Toc2483_3840626700"/>
+      <w:bookmarkStart w:id="70" w:name="__RefHeading___Toc2483_972910476"/>
       <w:bookmarkEnd w:id="70"/>
       <w:r>
         <w:rPr/>
@@ -22427,7 +22427,7 @@
         <w:pStyle w:val="Heading2"/>
         <w:rPr/>
       </w:pPr>
-      <w:bookmarkStart w:id="71" w:name="__RefHeading___Toc2485_3840626700"/>
+      <w:bookmarkStart w:id="71" w:name="__RefHeading___Toc2485_972910476"/>
       <w:bookmarkEnd w:id="71"/>
       <w:r>
         <w:rPr/>
@@ -22535,7 +22535,7 @@
         <w:pStyle w:val="Heading2"/>
         <w:rPr/>
       </w:pPr>
-      <w:bookmarkStart w:id="72" w:name="__RefHeading___Toc2487_3840626700"/>
+      <w:bookmarkStart w:id="72" w:name="__RefHeading___Toc2487_972910476"/>
       <w:bookmarkEnd w:id="72"/>
       <w:r>
         <w:rPr/>
@@ -22547,7 +22547,7 @@
         <w:pStyle w:val="TableCaption"/>
         <w:rPr/>
       </w:pPr>
-      <w:bookmarkStart w:id="73" w:name="__RefHeading___Toc2541_3840626700"/>
+      <w:bookmarkStart w:id="73" w:name="__RefHeading___Toc2541_972910476"/>
       <w:bookmarkEnd w:id="73"/>
       <w:r>
         <w:rPr>
@@ -22764,7 +22764,7 @@
         <w:pStyle w:val="Heading1"/>
         <w:rPr/>
       </w:pPr>
-      <w:bookmarkStart w:id="74" w:name="__RefHeading___Toc2489_3840626700"/>
+      <w:bookmarkStart w:id="74" w:name="__RefHeading___Toc2489_972910476"/>
       <w:bookmarkEnd w:id="74"/>
       <w:r>
         <w:rPr/>
@@ -22823,7 +22823,7 @@
         <w:pStyle w:val="Heading1"/>
         <w:rPr/>
       </w:pPr>
-      <w:bookmarkStart w:id="75" w:name="__RefHeading___Toc2491_3840626700"/>
+      <w:bookmarkStart w:id="75" w:name="__RefHeading___Toc2491_972910476"/>
       <w:bookmarkEnd w:id="75"/>
       <w:r>
         <w:rPr/>
@@ -22850,7 +22850,7 @@
         <w:pStyle w:val="TableCaption"/>
         <w:rPr/>
       </w:pPr>
-      <w:bookmarkStart w:id="76" w:name="__RefHeading___Toc2539_3840626700"/>
+      <w:bookmarkStart w:id="76" w:name="__RefHeading___Toc2539_972910476"/>
       <w:bookmarkEnd w:id="76"/>
       <w:r>
         <w:rPr>
@@ -23888,7 +23888,7 @@
         <w:pStyle w:val="Heading1"/>
         <w:rPr/>
       </w:pPr>
-      <w:bookmarkStart w:id="77" w:name="__RefHeading___Toc2493_3840626700"/>
+      <w:bookmarkStart w:id="77" w:name="__RefHeading___Toc2493_972910476"/>
       <w:bookmarkEnd w:id="77"/>
       <w:r>
         <w:rPr/>
@@ -24014,7 +24014,7 @@
         <w:pStyle w:val="Heading1"/>
         <w:rPr/>
       </w:pPr>
-      <w:bookmarkStart w:id="78" w:name="__RefHeading___Toc2495_3840626700"/>
+      <w:bookmarkStart w:id="78" w:name="__RefHeading___Toc2495_972910476"/>
       <w:bookmarkEnd w:id="78"/>
       <w:r>
         <w:rPr/>
@@ -24911,7 +24911,7 @@
         <w:pStyle w:val="Heading1"/>
         <w:rPr/>
       </w:pPr>
-      <w:bookmarkStart w:id="79" w:name="__RefHeading___Toc2497_3840626700"/>
+      <w:bookmarkStart w:id="79" w:name="__RefHeading___Toc2497_972910476"/>
       <w:bookmarkEnd w:id="79"/>
       <w:r>
         <w:rPr/>
@@ -24938,7 +24938,7 @@
         <w:pStyle w:val="TableCaption"/>
         <w:rPr/>
       </w:pPr>
-      <w:bookmarkStart w:id="80" w:name="__RefHeading___Toc2537_3840626700"/>
+      <w:bookmarkStart w:id="80" w:name="__RefHeading___Toc2537_972910476"/>
       <w:bookmarkEnd w:id="80"/>
       <w:r>
         <w:rPr>
@@ -25566,7 +25566,7 @@
       <w:footerReference w:type="first" r:id="rId25"/>
       <w:type w:val="nextPage"/>
       <w:pgSz w:w="11906" w:h="16838"/>
-      <w:pgMar w:left="1680" w:right="1100" w:gutter="0" w:header="0" w:top="1368" w:footer="576" w:bottom="1296"/>
+      <w:pgMar w:left="1390" w:right="1390" w:gutter="0" w:header="0" w:top="1368" w:footer="576" w:bottom="1296"/>
       <w:pgNumType w:start="1" w:fmt="decimal"/>
       <w:formProt w:val="false"/>
       <w:textDirection w:val="lrTb"/>

</xml_diff>

<commit_message>
Report: restore template binding margins
</commit_message>
<xml_diff>
--- a/report/Report_Sarkar_Choudhuri_Project1.docx
+++ b/report/Report_Sarkar_Choudhuri_Project1.docx
@@ -595,7 +595,7 @@
         <w:sectPr>
           <w:type w:val="nextPage"/>
           <w:pgSz w:w="11906" w:h="16838"/>
-          <w:pgMar w:left="1390" w:right="1390" w:gutter="0" w:header="0" w:top="1380" w:footer="0" w:bottom="280"/>
+          <w:pgMar w:left="1680" w:right="1100" w:gutter="0" w:header="0" w:top="1380" w:footer="0" w:bottom="280"/>
           <w:pgNumType w:fmt="decimal"/>
           <w:formProt w:val="false"/>
           <w:textDirection w:val="lrTb"/>
@@ -1025,7 +1025,7 @@
         <w:sectPr>
           <w:type w:val="nextPage"/>
           <w:pgSz w:w="11906" w:h="16838"/>
-          <w:pgMar w:left="1390" w:right="1390" w:gutter="0" w:header="0" w:top="1380" w:footer="0" w:bottom="280"/>
+          <w:pgMar w:left="1680" w:right="1100" w:gutter="0" w:header="0" w:top="1380" w:footer="0" w:bottom="280"/>
           <w:pgNumType w:fmt="decimal"/>
           <w:formProt w:val="false"/>
           <w:textDirection w:val="lrTb"/>
@@ -1700,7 +1700,7 @@
         <w:sectPr>
           <w:type w:val="nextPage"/>
           <w:pgSz w:w="11906" w:h="16838"/>
-          <w:pgMar w:left="1390" w:right="1390" w:gutter="0" w:header="0" w:top="1380" w:footer="0" w:bottom="280"/>
+          <w:pgMar w:left="1680" w:right="1100" w:gutter="0" w:header="0" w:top="1380" w:footer="0" w:bottom="280"/>
           <w:pgNumType w:fmt="decimal"/>
           <w:formProt w:val="false"/>
           <w:textDirection w:val="lrTb"/>
@@ -1913,7 +1913,7 @@
         <w:sectPr>
           <w:type w:val="nextPage"/>
           <w:pgSz w:w="11906" w:h="16838"/>
-          <w:pgMar w:left="1390" w:right="1390" w:gutter="0" w:header="0" w:top="1360" w:footer="0" w:bottom="280"/>
+          <w:pgMar w:left="1680" w:right="1100" w:gutter="0" w:header="0" w:top="1360" w:footer="0" w:bottom="280"/>
           <w:pgNumType w:fmt="decimal"/>
           <w:formProt w:val="false"/>
           <w:textDirection w:val="lrTb"/>
@@ -1993,7 +1993,7 @@
         <w:sectPr>
           <w:type w:val="nextPage"/>
           <w:pgSz w:w="11906" w:h="16838"/>
-          <w:pgMar w:left="1390" w:right="1390" w:gutter="0" w:header="0" w:top="1380" w:footer="0" w:bottom="280"/>
+          <w:pgMar w:left="1680" w:right="1100" w:gutter="0" w:header="0" w:top="1380" w:footer="0" w:bottom="280"/>
           <w:pgNumType w:fmt="decimal"/>
           <w:formProt w:val="false"/>
           <w:textDirection w:val="lrTb"/>
@@ -2059,7 +2059,7 @@
             </w:rPr>
             <w:fldChar w:fldCharType="separate"/>
           </w:r>
-          <w:hyperlink w:anchor="__RefHeading___Toc2417_972910476">
+          <w:hyperlink w:anchor="__RefHeading___Toc2417_3544882389">
             <w:r>
               <w:rPr>
                 <w:webHidden/>
@@ -2080,7 +2080,7 @@
             </w:tabs>
             <w:rPr/>
           </w:pPr>
-          <w:hyperlink w:anchor="__RefHeading___Toc2419_972910476">
+          <w:hyperlink w:anchor="__RefHeading___Toc2419_3544882389">
             <w:r>
               <w:rPr>
                 <w:webHidden/>
@@ -2101,7 +2101,7 @@
             </w:tabs>
             <w:rPr/>
           </w:pPr>
-          <w:hyperlink w:anchor="__RefHeading___Toc2421_972910476">
+          <w:hyperlink w:anchor="__RefHeading___Toc2421_3544882389">
             <w:r>
               <w:rPr>
                 <w:webHidden/>
@@ -2122,7 +2122,7 @@
             </w:tabs>
             <w:rPr/>
           </w:pPr>
-          <w:hyperlink w:anchor="__RefHeading___Toc2423_972910476">
+          <w:hyperlink w:anchor="__RefHeading___Toc2423_3544882389">
             <w:r>
               <w:rPr>
                 <w:webHidden/>
@@ -2143,7 +2143,7 @@
             </w:tabs>
             <w:rPr/>
           </w:pPr>
-          <w:hyperlink w:anchor="__RefHeading___Toc2425_972910476">
+          <w:hyperlink w:anchor="__RefHeading___Toc2425_3544882389">
             <w:r>
               <w:rPr>
                 <w:webHidden/>
@@ -2164,7 +2164,7 @@
             </w:tabs>
             <w:rPr/>
           </w:pPr>
-          <w:hyperlink w:anchor="__RefHeading___Toc2427_972910476">
+          <w:hyperlink w:anchor="__RefHeading___Toc2427_3544882389">
             <w:r>
               <w:rPr>
                 <w:webHidden/>
@@ -2185,7 +2185,7 @@
             </w:tabs>
             <w:rPr/>
           </w:pPr>
-          <w:hyperlink w:anchor="__RefHeading___Toc2429_972910476">
+          <w:hyperlink w:anchor="__RefHeading___Toc2429_3544882389">
             <w:r>
               <w:rPr>
                 <w:webHidden/>
@@ -2206,7 +2206,7 @@
             </w:tabs>
             <w:rPr/>
           </w:pPr>
-          <w:hyperlink w:anchor="__RefHeading___Toc2431_972910476">
+          <w:hyperlink w:anchor="__RefHeading___Toc2431_3544882389">
             <w:r>
               <w:rPr>
                 <w:webHidden/>
@@ -2227,7 +2227,7 @@
             </w:tabs>
             <w:rPr/>
           </w:pPr>
-          <w:hyperlink w:anchor="__RefHeading___Toc2433_972910476">
+          <w:hyperlink w:anchor="__RefHeading___Toc2433_3544882389">
             <w:r>
               <w:rPr>
                 <w:webHidden/>
@@ -2248,7 +2248,7 @@
             </w:tabs>
             <w:rPr/>
           </w:pPr>
-          <w:hyperlink w:anchor="__RefHeading___Toc2435_972910476">
+          <w:hyperlink w:anchor="__RefHeading___Toc2435_3544882389">
             <w:r>
               <w:rPr>
                 <w:webHidden/>
@@ -2269,7 +2269,7 @@
             </w:tabs>
             <w:rPr/>
           </w:pPr>
-          <w:hyperlink w:anchor="__RefHeading___Toc2437_972910476">
+          <w:hyperlink w:anchor="__RefHeading___Toc2437_3544882389">
             <w:r>
               <w:rPr>
                 <w:webHidden/>
@@ -2290,7 +2290,7 @@
             </w:tabs>
             <w:rPr/>
           </w:pPr>
-          <w:hyperlink w:anchor="__RefHeading___Toc2439_972910476">
+          <w:hyperlink w:anchor="__RefHeading___Toc2439_3544882389">
             <w:r>
               <w:rPr>
                 <w:webHidden/>
@@ -2311,7 +2311,7 @@
             </w:tabs>
             <w:rPr/>
           </w:pPr>
-          <w:hyperlink w:anchor="__RefHeading___Toc2441_972910476">
+          <w:hyperlink w:anchor="__RefHeading___Toc2441_3544882389">
             <w:r>
               <w:rPr>
                 <w:webHidden/>
@@ -2332,7 +2332,7 @@
             </w:tabs>
             <w:rPr/>
           </w:pPr>
-          <w:hyperlink w:anchor="__RefHeading___Toc2443_972910476">
+          <w:hyperlink w:anchor="__RefHeading___Toc2443_3544882389">
             <w:r>
               <w:rPr>
                 <w:webHidden/>
@@ -2353,7 +2353,7 @@
             </w:tabs>
             <w:rPr/>
           </w:pPr>
-          <w:hyperlink w:anchor="__RefHeading___Toc2445_972910476">
+          <w:hyperlink w:anchor="__RefHeading___Toc2445_3544882389">
             <w:r>
               <w:rPr>
                 <w:webHidden/>
@@ -2374,7 +2374,7 @@
             </w:tabs>
             <w:rPr/>
           </w:pPr>
-          <w:hyperlink w:anchor="__RefHeading___Toc2447_972910476">
+          <w:hyperlink w:anchor="__RefHeading___Toc2447_3544882389">
             <w:r>
               <w:rPr>
                 <w:webHidden/>
@@ -2395,7 +2395,7 @@
             </w:tabs>
             <w:rPr/>
           </w:pPr>
-          <w:hyperlink w:anchor="__RefHeading___Toc2449_972910476">
+          <w:hyperlink w:anchor="__RefHeading___Toc2449_3544882389">
             <w:r>
               <w:rPr>
                 <w:webHidden/>
@@ -2416,7 +2416,7 @@
             </w:tabs>
             <w:rPr/>
           </w:pPr>
-          <w:hyperlink w:anchor="__RefHeading___Toc2451_972910476">
+          <w:hyperlink w:anchor="__RefHeading___Toc2451_3544882389">
             <w:r>
               <w:rPr>
                 <w:webHidden/>
@@ -2437,7 +2437,7 @@
             </w:tabs>
             <w:rPr/>
           </w:pPr>
-          <w:hyperlink w:anchor="__RefHeading___Toc2453_972910476">
+          <w:hyperlink w:anchor="__RefHeading___Toc2453_3544882389">
             <w:r>
               <w:rPr>
                 <w:webHidden/>
@@ -2458,7 +2458,7 @@
             </w:tabs>
             <w:rPr/>
           </w:pPr>
-          <w:hyperlink w:anchor="__RefHeading___Toc2455_972910476">
+          <w:hyperlink w:anchor="__RefHeading___Toc2455_3544882389">
             <w:r>
               <w:rPr>
                 <w:webHidden/>
@@ -2479,7 +2479,7 @@
             </w:tabs>
             <w:rPr/>
           </w:pPr>
-          <w:hyperlink w:anchor="__RefHeading___Toc2457_972910476">
+          <w:hyperlink w:anchor="__RefHeading___Toc2457_3544882389">
             <w:r>
               <w:rPr>
                 <w:webHidden/>
@@ -2500,7 +2500,7 @@
             </w:tabs>
             <w:rPr/>
           </w:pPr>
-          <w:hyperlink w:anchor="__RefHeading___Toc2459_972910476">
+          <w:hyperlink w:anchor="__RefHeading___Toc2459_3544882389">
             <w:r>
               <w:rPr>
                 <w:webHidden/>
@@ -2521,7 +2521,7 @@
             </w:tabs>
             <w:rPr/>
           </w:pPr>
-          <w:hyperlink w:anchor="__RefHeading___Toc2461_972910476">
+          <w:hyperlink w:anchor="__RefHeading___Toc2461_3544882389">
             <w:r>
               <w:rPr>
                 <w:webHidden/>
@@ -2542,7 +2542,7 @@
             </w:tabs>
             <w:rPr/>
           </w:pPr>
-          <w:hyperlink w:anchor="__RefHeading___Toc2463_972910476">
+          <w:hyperlink w:anchor="__RefHeading___Toc2463_3544882389">
             <w:r>
               <w:rPr>
                 <w:webHidden/>
@@ -2563,7 +2563,7 @@
             </w:tabs>
             <w:rPr/>
           </w:pPr>
-          <w:hyperlink w:anchor="__RefHeading___Toc2465_972910476">
+          <w:hyperlink w:anchor="__RefHeading___Toc2465_3544882389">
             <w:r>
               <w:rPr>
                 <w:webHidden/>
@@ -2584,7 +2584,7 @@
             </w:tabs>
             <w:rPr/>
           </w:pPr>
-          <w:hyperlink w:anchor="__RefHeading___Toc2467_972910476">
+          <w:hyperlink w:anchor="__RefHeading___Toc2467_3544882389">
             <w:r>
               <w:rPr>
                 <w:webHidden/>
@@ -2605,7 +2605,7 @@
             </w:tabs>
             <w:rPr/>
           </w:pPr>
-          <w:hyperlink w:anchor="__RefHeading___Toc2469_972910476">
+          <w:hyperlink w:anchor="__RefHeading___Toc2469_3544882389">
             <w:r>
               <w:rPr>
                 <w:webHidden/>
@@ -2626,7 +2626,7 @@
             </w:tabs>
             <w:rPr/>
           </w:pPr>
-          <w:hyperlink w:anchor="__RefHeading___Toc2471_972910476">
+          <w:hyperlink w:anchor="__RefHeading___Toc2471_3544882389">
             <w:r>
               <w:rPr>
                 <w:webHidden/>
@@ -2647,7 +2647,7 @@
             </w:tabs>
             <w:rPr/>
           </w:pPr>
-          <w:hyperlink w:anchor="__RefHeading___Toc2473_972910476">
+          <w:hyperlink w:anchor="__RefHeading___Toc2473_3544882389">
             <w:r>
               <w:rPr>
                 <w:webHidden/>
@@ -2668,7 +2668,7 @@
             </w:tabs>
             <w:rPr/>
           </w:pPr>
-          <w:hyperlink w:anchor="__RefHeading___Toc2475_972910476">
+          <w:hyperlink w:anchor="__RefHeading___Toc2475_3544882389">
             <w:r>
               <w:rPr>
                 <w:webHidden/>
@@ -2689,7 +2689,7 @@
             </w:tabs>
             <w:rPr/>
           </w:pPr>
-          <w:hyperlink w:anchor="__RefHeading___Toc2477_972910476">
+          <w:hyperlink w:anchor="__RefHeading___Toc2477_3544882389">
             <w:r>
               <w:rPr>
                 <w:webHidden/>
@@ -2710,7 +2710,7 @@
             </w:tabs>
             <w:rPr/>
           </w:pPr>
-          <w:hyperlink w:anchor="__RefHeading___Toc2479_972910476">
+          <w:hyperlink w:anchor="__RefHeading___Toc2479_3544882389">
             <w:r>
               <w:rPr>
                 <w:webHidden/>
@@ -2731,7 +2731,7 @@
             </w:tabs>
             <w:rPr/>
           </w:pPr>
-          <w:hyperlink w:anchor="__RefHeading___Toc2481_972910476">
+          <w:hyperlink w:anchor="__RefHeading___Toc2481_3544882389">
             <w:r>
               <w:rPr>
                 <w:webHidden/>
@@ -2752,7 +2752,7 @@
             </w:tabs>
             <w:rPr/>
           </w:pPr>
-          <w:hyperlink w:anchor="__RefHeading___Toc2483_972910476">
+          <w:hyperlink w:anchor="__RefHeading___Toc2483_3544882389">
             <w:r>
               <w:rPr>
                 <w:webHidden/>
@@ -2773,7 +2773,7 @@
             </w:tabs>
             <w:rPr/>
           </w:pPr>
-          <w:hyperlink w:anchor="__RefHeading___Toc2485_972910476">
+          <w:hyperlink w:anchor="__RefHeading___Toc2485_3544882389">
             <w:r>
               <w:rPr>
                 <w:webHidden/>
@@ -2794,7 +2794,7 @@
             </w:tabs>
             <w:rPr/>
           </w:pPr>
-          <w:hyperlink w:anchor="__RefHeading___Toc2487_972910476">
+          <w:hyperlink w:anchor="__RefHeading___Toc2487_3544882389">
             <w:r>
               <w:rPr>
                 <w:webHidden/>
@@ -2815,7 +2815,7 @@
             </w:tabs>
             <w:rPr/>
           </w:pPr>
-          <w:hyperlink w:anchor="__RefHeading___Toc2489_972910476">
+          <w:hyperlink w:anchor="__RefHeading___Toc2489_3544882389">
             <w:r>
               <w:rPr>
                 <w:webHidden/>
@@ -2836,7 +2836,7 @@
             </w:tabs>
             <w:rPr/>
           </w:pPr>
-          <w:hyperlink w:anchor="__RefHeading___Toc2491_972910476">
+          <w:hyperlink w:anchor="__RefHeading___Toc2491_3544882389">
             <w:r>
               <w:rPr>
                 <w:webHidden/>
@@ -2857,7 +2857,7 @@
             </w:tabs>
             <w:rPr/>
           </w:pPr>
-          <w:hyperlink w:anchor="__RefHeading___Toc2493_972910476">
+          <w:hyperlink w:anchor="__RefHeading___Toc2493_3544882389">
             <w:r>
               <w:rPr>
                 <w:webHidden/>
@@ -2878,7 +2878,7 @@
             </w:tabs>
             <w:rPr/>
           </w:pPr>
-          <w:hyperlink w:anchor="__RefHeading___Toc2495_972910476">
+          <w:hyperlink w:anchor="__RefHeading___Toc2495_3544882389">
             <w:r>
               <w:rPr>
                 <w:webHidden/>
@@ -2899,7 +2899,7 @@
             </w:tabs>
             <w:rPr/>
           </w:pPr>
-          <w:hyperlink w:anchor="__RefHeading___Toc2497_972910476">
+          <w:hyperlink w:anchor="__RefHeading___Toc2497_3544882389">
             <w:r>
               <w:rPr>
                 <w:webHidden/>
@@ -2971,7 +2971,7 @@
             </w:rPr>
             <w:fldChar w:fldCharType="separate"/>
           </w:r>
-          <w:hyperlink w:anchor="__RefHeading___Toc2499_972910476">
+          <w:hyperlink w:anchor="__RefHeading___Toc2499_3544882389">
             <w:r>
               <w:rPr>
                 <w:webHidden/>
@@ -2992,7 +2992,7 @@
             </w:tabs>
             <w:rPr/>
           </w:pPr>
-          <w:hyperlink w:anchor="__RefHeading___Toc2533_972910476">
+          <w:hyperlink w:anchor="__RefHeading___Toc2533_3544882389">
             <w:r>
               <w:rPr>
                 <w:webHidden/>
@@ -3013,7 +3013,7 @@
             </w:tabs>
             <w:rPr/>
           </w:pPr>
-          <w:hyperlink w:anchor="__RefHeading___Toc2531_972910476">
+          <w:hyperlink w:anchor="__RefHeading___Toc2531_3544882389">
             <w:r>
               <w:rPr>
                 <w:webHidden/>
@@ -3034,7 +3034,7 @@
             </w:tabs>
             <w:rPr/>
           </w:pPr>
-          <w:hyperlink w:anchor="__RefHeading___Toc2529_972910476">
+          <w:hyperlink w:anchor="__RefHeading___Toc2529_3544882389">
             <w:r>
               <w:rPr>
                 <w:webHidden/>
@@ -3055,7 +3055,7 @@
             </w:tabs>
             <w:rPr/>
           </w:pPr>
-          <w:hyperlink w:anchor="__RefHeading___Toc2527_972910476">
+          <w:hyperlink w:anchor="__RefHeading___Toc2527_3544882389">
             <w:r>
               <w:rPr>
                 <w:webHidden/>
@@ -3076,7 +3076,7 @@
             </w:tabs>
             <w:rPr/>
           </w:pPr>
-          <w:hyperlink w:anchor="__RefHeading___Toc2525_972910476">
+          <w:hyperlink w:anchor="__RefHeading___Toc2525_3544882389">
             <w:r>
               <w:rPr>
                 <w:webHidden/>
@@ -3097,7 +3097,7 @@
             </w:tabs>
             <w:rPr/>
           </w:pPr>
-          <w:hyperlink w:anchor="__RefHeading___Toc2523_972910476">
+          <w:hyperlink w:anchor="__RefHeading___Toc2523_3544882389">
             <w:r>
               <w:rPr>
                 <w:webHidden/>
@@ -3118,7 +3118,7 @@
             </w:tabs>
             <w:rPr/>
           </w:pPr>
-          <w:hyperlink w:anchor="__RefHeading___Toc2521_972910476">
+          <w:hyperlink w:anchor="__RefHeading___Toc2521_3544882389">
             <w:r>
               <w:rPr>
                 <w:webHidden/>
@@ -3139,7 +3139,7 @@
             </w:tabs>
             <w:rPr/>
           </w:pPr>
-          <w:hyperlink w:anchor="__RefHeading___Toc2519_972910476">
+          <w:hyperlink w:anchor="__RefHeading___Toc2519_3544882389">
             <w:r>
               <w:rPr>
                 <w:webHidden/>
@@ -3160,7 +3160,7 @@
             </w:tabs>
             <w:rPr/>
           </w:pPr>
-          <w:hyperlink w:anchor="__RefHeading___Toc2517_972910476">
+          <w:hyperlink w:anchor="__RefHeading___Toc2517_3544882389">
             <w:r>
               <w:rPr>
                 <w:webHidden/>
@@ -3181,7 +3181,7 @@
             </w:tabs>
             <w:rPr/>
           </w:pPr>
-          <w:hyperlink w:anchor="__RefHeading___Toc2515_972910476">
+          <w:hyperlink w:anchor="__RefHeading___Toc2515_3544882389">
             <w:r>
               <w:rPr>
                 <w:webHidden/>
@@ -3202,7 +3202,7 @@
             </w:tabs>
             <w:rPr/>
           </w:pPr>
-          <w:hyperlink w:anchor="__RefHeading___Toc2513_972910476">
+          <w:hyperlink w:anchor="__RefHeading___Toc2513_3544882389">
             <w:r>
               <w:rPr>
                 <w:webHidden/>
@@ -3223,7 +3223,7 @@
             </w:tabs>
             <w:rPr/>
           </w:pPr>
-          <w:hyperlink w:anchor="__RefHeading___Toc2511_972910476">
+          <w:hyperlink w:anchor="__RefHeading___Toc2511_3544882389">
             <w:r>
               <w:rPr>
                 <w:webHidden/>
@@ -3244,7 +3244,7 @@
             </w:tabs>
             <w:rPr/>
           </w:pPr>
-          <w:hyperlink w:anchor="__RefHeading___Toc2509_972910476">
+          <w:hyperlink w:anchor="__RefHeading___Toc2509_3544882389">
             <w:r>
               <w:rPr>
                 <w:webHidden/>
@@ -3265,7 +3265,7 @@
             </w:tabs>
             <w:rPr/>
           </w:pPr>
-          <w:hyperlink w:anchor="__RefHeading___Toc2507_972910476">
+          <w:hyperlink w:anchor="__RefHeading___Toc2507_3544882389">
             <w:r>
               <w:rPr>
                 <w:webHidden/>
@@ -3286,7 +3286,7 @@
             </w:tabs>
             <w:rPr/>
           </w:pPr>
-          <w:hyperlink w:anchor="__RefHeading___Toc2505_972910476">
+          <w:hyperlink w:anchor="__RefHeading___Toc2505_3544882389">
             <w:r>
               <w:rPr>
                 <w:webHidden/>
@@ -3307,7 +3307,7 @@
             </w:tabs>
             <w:rPr/>
           </w:pPr>
-          <w:hyperlink w:anchor="__RefHeading___Toc2503_972910476">
+          <w:hyperlink w:anchor="__RefHeading___Toc2503_3544882389">
             <w:r>
               <w:rPr>
                 <w:webHidden/>
@@ -3328,7 +3328,7 @@
             </w:tabs>
             <w:rPr/>
           </w:pPr>
-          <w:hyperlink w:anchor="__RefHeading___Toc2501_972910476">
+          <w:hyperlink w:anchor="__RefHeading___Toc2501_3544882389">
             <w:r>
               <w:rPr>
                 <w:webHidden/>
@@ -3400,7 +3400,7 @@
             </w:rPr>
             <w:fldChar w:fldCharType="separate"/>
           </w:r>
-          <w:hyperlink w:anchor="__RefHeading___Toc2535_972910476">
+          <w:hyperlink w:anchor="__RefHeading___Toc2535_3544882389">
             <w:r>
               <w:rPr>
                 <w:webHidden/>
@@ -3421,7 +3421,7 @@
             </w:tabs>
             <w:rPr/>
           </w:pPr>
-          <w:hyperlink w:anchor="__RefHeading___Toc2573_972910476">
+          <w:hyperlink w:anchor="__RefHeading___Toc2573_3544882389">
             <w:r>
               <w:rPr>
                 <w:webHidden/>
@@ -3442,7 +3442,7 @@
             </w:tabs>
             <w:rPr/>
           </w:pPr>
-          <w:hyperlink w:anchor="__RefHeading___Toc2571_972910476">
+          <w:hyperlink w:anchor="__RefHeading___Toc2571_3544882389">
             <w:r>
               <w:rPr>
                 <w:webHidden/>
@@ -3463,7 +3463,7 @@
             </w:tabs>
             <w:rPr/>
           </w:pPr>
-          <w:hyperlink w:anchor="__RefHeading___Toc2569_972910476">
+          <w:hyperlink w:anchor="__RefHeading___Toc2569_3544882389">
             <w:r>
               <w:rPr>
                 <w:webHidden/>
@@ -3484,7 +3484,7 @@
             </w:tabs>
             <w:rPr/>
           </w:pPr>
-          <w:hyperlink w:anchor="__RefHeading___Toc2567_972910476">
+          <w:hyperlink w:anchor="__RefHeading___Toc2567_3544882389">
             <w:r>
               <w:rPr>
                 <w:webHidden/>
@@ -3505,7 +3505,7 @@
             </w:tabs>
             <w:rPr/>
           </w:pPr>
-          <w:hyperlink w:anchor="__RefHeading___Toc2565_972910476">
+          <w:hyperlink w:anchor="__RefHeading___Toc2565_3544882389">
             <w:r>
               <w:rPr>
                 <w:webHidden/>
@@ -3526,7 +3526,7 @@
             </w:tabs>
             <w:rPr/>
           </w:pPr>
-          <w:hyperlink w:anchor="__RefHeading___Toc2563_972910476">
+          <w:hyperlink w:anchor="__RefHeading___Toc2563_3544882389">
             <w:r>
               <w:rPr>
                 <w:webHidden/>
@@ -3547,7 +3547,7 @@
             </w:tabs>
             <w:rPr/>
           </w:pPr>
-          <w:hyperlink w:anchor="__RefHeading___Toc2561_972910476">
+          <w:hyperlink w:anchor="__RefHeading___Toc2561_3544882389">
             <w:r>
               <w:rPr>
                 <w:webHidden/>
@@ -3568,7 +3568,7 @@
             </w:tabs>
             <w:rPr/>
           </w:pPr>
-          <w:hyperlink w:anchor="__RefHeading___Toc2559_972910476">
+          <w:hyperlink w:anchor="__RefHeading___Toc2559_3544882389">
             <w:r>
               <w:rPr>
                 <w:webHidden/>
@@ -3589,7 +3589,7 @@
             </w:tabs>
             <w:rPr/>
           </w:pPr>
-          <w:hyperlink w:anchor="__RefHeading___Toc2557_972910476">
+          <w:hyperlink w:anchor="__RefHeading___Toc2557_3544882389">
             <w:r>
               <w:rPr>
                 <w:webHidden/>
@@ -3610,7 +3610,7 @@
             </w:tabs>
             <w:rPr/>
           </w:pPr>
-          <w:hyperlink w:anchor="__RefHeading___Toc2555_972910476">
+          <w:hyperlink w:anchor="__RefHeading___Toc2555_3544882389">
             <w:r>
               <w:rPr>
                 <w:webHidden/>
@@ -3631,7 +3631,7 @@
             </w:tabs>
             <w:rPr/>
           </w:pPr>
-          <w:hyperlink w:anchor="__RefHeading___Toc2553_972910476">
+          <w:hyperlink w:anchor="__RefHeading___Toc2553_3544882389">
             <w:r>
               <w:rPr>
                 <w:webHidden/>
@@ -3652,7 +3652,7 @@
             </w:tabs>
             <w:rPr/>
           </w:pPr>
-          <w:hyperlink w:anchor="__RefHeading___Toc2551_972910476">
+          <w:hyperlink w:anchor="__RefHeading___Toc2551_3544882389">
             <w:r>
               <w:rPr>
                 <w:webHidden/>
@@ -3673,7 +3673,7 @@
             </w:tabs>
             <w:rPr/>
           </w:pPr>
-          <w:hyperlink w:anchor="__RefHeading___Toc2549_972910476">
+          <w:hyperlink w:anchor="__RefHeading___Toc2549_3544882389">
             <w:r>
               <w:rPr>
                 <w:webHidden/>
@@ -3694,7 +3694,7 @@
             </w:tabs>
             <w:rPr/>
           </w:pPr>
-          <w:hyperlink w:anchor="__RefHeading___Toc2547_972910476">
+          <w:hyperlink w:anchor="__RefHeading___Toc2547_3544882389">
             <w:r>
               <w:rPr>
                 <w:webHidden/>
@@ -3715,7 +3715,7 @@
             </w:tabs>
             <w:rPr/>
           </w:pPr>
-          <w:hyperlink w:anchor="__RefHeading___Toc2545_972910476">
+          <w:hyperlink w:anchor="__RefHeading___Toc2545_3544882389">
             <w:r>
               <w:rPr>
                 <w:webHidden/>
@@ -3736,7 +3736,7 @@
             </w:tabs>
             <w:rPr/>
           </w:pPr>
-          <w:hyperlink w:anchor="__RefHeading___Toc2543_972910476">
+          <w:hyperlink w:anchor="__RefHeading___Toc2543_3544882389">
             <w:r>
               <w:rPr>
                 <w:webHidden/>
@@ -3757,7 +3757,7 @@
             </w:tabs>
             <w:rPr/>
           </w:pPr>
-          <w:hyperlink w:anchor="__RefHeading___Toc2541_972910476">
+          <w:hyperlink w:anchor="__RefHeading___Toc2541_3544882389">
             <w:r>
               <w:rPr>
                 <w:webHidden/>
@@ -3778,7 +3778,7 @@
             </w:tabs>
             <w:rPr/>
           </w:pPr>
-          <w:hyperlink w:anchor="__RefHeading___Toc2539_972910476">
+          <w:hyperlink w:anchor="__RefHeading___Toc2539_3544882389">
             <w:r>
               <w:rPr>
                 <w:webHidden/>
@@ -3799,7 +3799,7 @@
             </w:tabs>
             <w:rPr/>
           </w:pPr>
-          <w:hyperlink w:anchor="__RefHeading___Toc2537_972910476">
+          <w:hyperlink w:anchor="__RefHeading___Toc2537_3544882389">
             <w:r>
               <w:rPr>
                 <w:webHidden/>
@@ -4671,7 +4671,7 @@
           <w:footerReference w:type="default" r:id="rId4"/>
           <w:type w:val="nextPage"/>
           <w:pgSz w:w="11906" w:h="16838"/>
-          <w:pgMar w:left="1390" w:right="1390" w:gutter="0" w:header="0" w:top="1368" w:footer="576" w:bottom="1296"/>
+          <w:pgMar w:left="1680" w:right="1100" w:gutter="0" w:header="0" w:top="1368" w:footer="576" w:bottom="1296"/>
           <w:pgNumType w:start="1" w:fmt="lowerRoman"/>
           <w:formProt w:val="false"/>
           <w:textDirection w:val="lrTb"/>
@@ -4709,7 +4709,7 @@
         <w:pStyle w:val="Heading1"/>
         <w:rPr/>
       </w:pPr>
-      <w:bookmarkStart w:id="2" w:name="__RefHeading___Toc2417_972910476"/>
+      <w:bookmarkStart w:id="2" w:name="__RefHeading___Toc2417_3544882389"/>
       <w:bookmarkEnd w:id="2"/>
       <w:r>
         <w:rPr/>
@@ -4766,7 +4766,7 @@
         <w:pStyle w:val="Heading2"/>
         <w:rPr/>
       </w:pPr>
-      <w:bookmarkStart w:id="3" w:name="__RefHeading___Toc2419_972910476"/>
+      <w:bookmarkStart w:id="3" w:name="__RefHeading___Toc2419_3544882389"/>
       <w:bookmarkEnd w:id="3"/>
       <w:r>
         <w:rPr/>
@@ -4844,7 +4844,7 @@
         <w:pStyle w:val="TableCaption"/>
         <w:rPr/>
       </w:pPr>
-      <w:bookmarkStart w:id="4" w:name="__RefHeading___Toc2535_972910476"/>
+      <w:bookmarkStart w:id="4" w:name="__RefHeading___Toc2535_3544882389"/>
       <w:bookmarkEnd w:id="4"/>
       <w:r>
         <w:rPr>
@@ -5776,7 +5776,7 @@
         <w:pStyle w:val="Heading2"/>
         <w:rPr/>
       </w:pPr>
-      <w:bookmarkStart w:id="5" w:name="__RefHeading___Toc2421_972910476"/>
+      <w:bookmarkStart w:id="5" w:name="__RefHeading___Toc2421_3544882389"/>
       <w:bookmarkEnd w:id="5"/>
       <w:r>
         <w:rPr/>
@@ -5803,7 +5803,7 @@
         <w:pStyle w:val="TableCaption"/>
         <w:rPr/>
       </w:pPr>
-      <w:bookmarkStart w:id="6" w:name="__RefHeading___Toc2573_972910476"/>
+      <w:bookmarkStart w:id="6" w:name="__RefHeading___Toc2573_3544882389"/>
       <w:bookmarkEnd w:id="6"/>
       <w:r>
         <w:rPr>
@@ -6929,7 +6929,7 @@
         <w:pStyle w:val="Heading2"/>
         <w:rPr/>
       </w:pPr>
-      <w:bookmarkStart w:id="7" w:name="__RefHeading___Toc2423_972910476"/>
+      <w:bookmarkStart w:id="7" w:name="__RefHeading___Toc2423_3544882389"/>
       <w:bookmarkEnd w:id="7"/>
       <w:r>
         <w:rPr/>
@@ -6959,7 +6959,7 @@
         <w:pStyle w:val="Heading1"/>
         <w:rPr/>
       </w:pPr>
-      <w:bookmarkStart w:id="8" w:name="__RefHeading___Toc2425_972910476"/>
+      <w:bookmarkStart w:id="8" w:name="__RefHeading___Toc2425_3544882389"/>
       <w:bookmarkEnd w:id="8"/>
       <w:r>
         <w:rPr/>
@@ -7097,7 +7097,7 @@
         <w:pStyle w:val="Heading1"/>
         <w:rPr/>
       </w:pPr>
-      <w:bookmarkStart w:id="9" w:name="__RefHeading___Toc2427_972910476"/>
+      <w:bookmarkStart w:id="9" w:name="__RefHeading___Toc2427_3544882389"/>
       <w:bookmarkEnd w:id="9"/>
       <w:r>
         <w:rPr/>
@@ -7109,7 +7109,7 @@
         <w:pStyle w:val="TableCaption"/>
         <w:rPr/>
       </w:pPr>
-      <w:bookmarkStart w:id="10" w:name="__RefHeading___Toc2571_972910476"/>
+      <w:bookmarkStart w:id="10" w:name="__RefHeading___Toc2571_3544882389"/>
       <w:bookmarkEnd w:id="10"/>
       <w:r>
         <w:rPr>
@@ -7499,7 +7499,7 @@
         <w:pStyle w:val="Heading1"/>
         <w:rPr/>
       </w:pPr>
-      <w:bookmarkStart w:id="11" w:name="__RefHeading___Toc2429_972910476"/>
+      <w:bookmarkStart w:id="11" w:name="__RefHeading___Toc2429_3544882389"/>
       <w:bookmarkEnd w:id="11"/>
       <w:r>
         <w:rPr/>
@@ -7575,7 +7575,7 @@
         <w:pStyle w:val="FigureCaption"/>
         <w:rPr/>
       </w:pPr>
-      <w:bookmarkStart w:id="12" w:name="__RefHeading___Toc2499_972910476"/>
+      <w:bookmarkStart w:id="12" w:name="__RefHeading___Toc2499_3544882389"/>
       <w:bookmarkEnd w:id="12"/>
       <w:r>
         <w:rPr>
@@ -7590,7 +7590,7 @@
         <w:pStyle w:val="Heading2"/>
         <w:rPr/>
       </w:pPr>
-      <w:bookmarkStart w:id="13" w:name="__RefHeading___Toc2431_972910476"/>
+      <w:bookmarkStart w:id="13" w:name="__RefHeading___Toc2431_3544882389"/>
       <w:bookmarkEnd w:id="13"/>
       <w:r>
         <w:rPr/>
@@ -7602,7 +7602,7 @@
         <w:pStyle w:val="Heading3"/>
         <w:rPr/>
       </w:pPr>
-      <w:bookmarkStart w:id="14" w:name="__RefHeading___Toc2433_972910476"/>
+      <w:bookmarkStart w:id="14" w:name="__RefHeading___Toc2433_3544882389"/>
       <w:bookmarkEnd w:id="14"/>
       <w:r>
         <w:rPr/>
@@ -7629,7 +7629,7 @@
         <w:pStyle w:val="Heading3"/>
         <w:rPr/>
       </w:pPr>
-      <w:bookmarkStart w:id="15" w:name="__RefHeading___Toc2435_972910476"/>
+      <w:bookmarkStart w:id="15" w:name="__RefHeading___Toc2435_3544882389"/>
       <w:bookmarkEnd w:id="15"/>
       <w:r>
         <w:rPr/>
@@ -7656,7 +7656,7 @@
         <w:pStyle w:val="TableCaption"/>
         <w:rPr/>
       </w:pPr>
-      <w:bookmarkStart w:id="16" w:name="__RefHeading___Toc2569_972910476"/>
+      <w:bookmarkStart w:id="16" w:name="__RefHeading___Toc2569_3544882389"/>
       <w:bookmarkEnd w:id="16"/>
       <w:r>
         <w:rPr>
@@ -8687,7 +8687,7 @@
         <w:pStyle w:val="TableCaption"/>
         <w:rPr/>
       </w:pPr>
-      <w:bookmarkStart w:id="17" w:name="__RefHeading___Toc2567_972910476"/>
+      <w:bookmarkStart w:id="17" w:name="__RefHeading___Toc2567_3544882389"/>
       <w:bookmarkEnd w:id="17"/>
       <w:r>
         <w:rPr>
@@ -9552,7 +9552,7 @@
         <w:pStyle w:val="Heading3"/>
         <w:rPr/>
       </w:pPr>
-      <w:bookmarkStart w:id="18" w:name="__RefHeading___Toc2437_972910476"/>
+      <w:bookmarkStart w:id="18" w:name="__RefHeading___Toc2437_3544882389"/>
       <w:bookmarkEnd w:id="18"/>
       <w:r>
         <w:rPr/>
@@ -9579,7 +9579,7 @@
         <w:pStyle w:val="TableCaption"/>
         <w:rPr/>
       </w:pPr>
-      <w:bookmarkStart w:id="19" w:name="__RefHeading___Toc2565_972910476"/>
+      <w:bookmarkStart w:id="19" w:name="__RefHeading___Toc2565_3544882389"/>
       <w:bookmarkEnd w:id="19"/>
       <w:r>
         <w:rPr>
@@ -10293,7 +10293,7 @@
         <w:pStyle w:val="Heading3"/>
         <w:rPr/>
       </w:pPr>
-      <w:bookmarkStart w:id="20" w:name="__RefHeading___Toc2439_972910476"/>
+      <w:bookmarkStart w:id="20" w:name="__RefHeading___Toc2439_3544882389"/>
       <w:bookmarkEnd w:id="20"/>
       <w:r>
         <w:rPr/>
@@ -10351,7 +10351,7 @@
         <w:pStyle w:val="Heading2"/>
         <w:rPr/>
       </w:pPr>
-      <w:bookmarkStart w:id="21" w:name="__RefHeading___Toc2441_972910476"/>
+      <w:bookmarkStart w:id="21" w:name="__RefHeading___Toc2441_3544882389"/>
       <w:bookmarkEnd w:id="21"/>
       <w:r>
         <w:rPr/>
@@ -10363,7 +10363,7 @@
         <w:pStyle w:val="TableCaption"/>
         <w:rPr/>
       </w:pPr>
-      <w:bookmarkStart w:id="22" w:name="__RefHeading___Toc2563_972910476"/>
+      <w:bookmarkStart w:id="22" w:name="__RefHeading___Toc2563_3544882389"/>
       <w:bookmarkEnd w:id="22"/>
       <w:r>
         <w:rPr>
@@ -10975,7 +10975,7 @@
         <w:pStyle w:val="Heading2"/>
         <w:rPr/>
       </w:pPr>
-      <w:bookmarkStart w:id="23" w:name="__RefHeading___Toc2443_972910476"/>
+      <w:bookmarkStart w:id="23" w:name="__RefHeading___Toc2443_3544882389"/>
       <w:bookmarkEnd w:id="23"/>
       <w:r>
         <w:rPr/>
@@ -11002,7 +11002,7 @@
         <w:pStyle w:val="TableCaption"/>
         <w:rPr/>
       </w:pPr>
-      <w:bookmarkStart w:id="24" w:name="__RefHeading___Toc2561_972910476"/>
+      <w:bookmarkStart w:id="24" w:name="__RefHeading___Toc2561_3544882389"/>
       <w:bookmarkEnd w:id="24"/>
       <w:r>
         <w:rPr>
@@ -11617,7 +11617,7 @@
         <w:pStyle w:val="Heading1"/>
         <w:rPr/>
       </w:pPr>
-      <w:bookmarkStart w:id="25" w:name="__RefHeading___Toc2445_972910476"/>
+      <w:bookmarkStart w:id="25" w:name="__RefHeading___Toc2445_3544882389"/>
       <w:bookmarkEnd w:id="25"/>
       <w:r>
         <w:rPr/>
@@ -11644,7 +11644,7 @@
         <w:pStyle w:val="Heading2"/>
         <w:rPr/>
       </w:pPr>
-      <w:bookmarkStart w:id="26" w:name="__RefHeading___Toc2447_972910476"/>
+      <w:bookmarkStart w:id="26" w:name="__RefHeading___Toc2447_3544882389"/>
       <w:bookmarkEnd w:id="26"/>
       <w:r>
         <w:rPr/>
@@ -11671,7 +11671,7 @@
         <w:pStyle w:val="Heading2"/>
         <w:rPr/>
       </w:pPr>
-      <w:bookmarkStart w:id="27" w:name="__RefHeading___Toc2449_972910476"/>
+      <w:bookmarkStart w:id="27" w:name="__RefHeading___Toc2449_3544882389"/>
       <w:bookmarkEnd w:id="27"/>
       <w:r>
         <w:rPr/>
@@ -11721,7 +11721,7 @@
         <w:pStyle w:val="Heading3"/>
         <w:rPr/>
       </w:pPr>
-      <w:bookmarkStart w:id="28" w:name="__RefHeading___Toc2451_972910476"/>
+      <w:bookmarkStart w:id="28" w:name="__RefHeading___Toc2451_3544882389"/>
       <w:bookmarkEnd w:id="28"/>
       <w:r>
         <w:rPr/>
@@ -11876,7 +11876,7 @@
         <w:pStyle w:val="FigureCaption"/>
         <w:rPr/>
       </w:pPr>
-      <w:bookmarkStart w:id="29" w:name="__RefHeading___Toc2533_972910476"/>
+      <w:bookmarkStart w:id="29" w:name="__RefHeading___Toc2533_3544882389"/>
       <w:bookmarkEnd w:id="29"/>
       <w:r>
         <w:rPr>
@@ -11940,7 +11940,7 @@
         <w:pStyle w:val="FigureCaption"/>
         <w:rPr/>
       </w:pPr>
-      <w:bookmarkStart w:id="30" w:name="__RefHeading___Toc2531_972910476"/>
+      <w:bookmarkStart w:id="30" w:name="__RefHeading___Toc2531_3544882389"/>
       <w:bookmarkEnd w:id="30"/>
       <w:r>
         <w:rPr>
@@ -11955,7 +11955,7 @@
         <w:pStyle w:val="TableCaption"/>
         <w:rPr/>
       </w:pPr>
-      <w:bookmarkStart w:id="31" w:name="__RefHeading___Toc2559_972910476"/>
+      <w:bookmarkStart w:id="31" w:name="__RefHeading___Toc2559_3544882389"/>
       <w:bookmarkEnd w:id="31"/>
       <w:r>
         <w:rPr>
@@ -12647,7 +12647,7 @@
         <w:pStyle w:val="Heading2"/>
         <w:rPr/>
       </w:pPr>
-      <w:bookmarkStart w:id="32" w:name="__RefHeading___Toc2453_972910476"/>
+      <w:bookmarkStart w:id="32" w:name="__RefHeading___Toc2453_3544882389"/>
       <w:bookmarkEnd w:id="32"/>
       <w:r>
         <w:rPr/>
@@ -12674,7 +12674,7 @@
         <w:pStyle w:val="Heading2"/>
         <w:rPr/>
       </w:pPr>
-      <w:bookmarkStart w:id="33" w:name="__RefHeading___Toc2455_972910476"/>
+      <w:bookmarkStart w:id="33" w:name="__RefHeading___Toc2455_3544882389"/>
       <w:bookmarkEnd w:id="33"/>
       <w:r>
         <w:rPr/>
@@ -12701,7 +12701,7 @@
         <w:pStyle w:val="Heading2"/>
         <w:rPr/>
       </w:pPr>
-      <w:bookmarkStart w:id="34" w:name="__RefHeading___Toc2457_972910476"/>
+      <w:bookmarkStart w:id="34" w:name="__RefHeading___Toc2457_3544882389"/>
       <w:bookmarkEnd w:id="34"/>
       <w:r>
         <w:rPr/>
@@ -12804,7 +12804,7 @@
         <w:pStyle w:val="Heading1"/>
         <w:rPr/>
       </w:pPr>
-      <w:bookmarkStart w:id="35" w:name="__RefHeading___Toc2459_972910476"/>
+      <w:bookmarkStart w:id="35" w:name="__RefHeading___Toc2459_3544882389"/>
       <w:bookmarkEnd w:id="35"/>
       <w:r>
         <w:rPr/>
@@ -12816,7 +12816,7 @@
         <w:pStyle w:val="TableCaption"/>
         <w:rPr/>
       </w:pPr>
-      <w:bookmarkStart w:id="36" w:name="__RefHeading___Toc2557_972910476"/>
+      <w:bookmarkStart w:id="36" w:name="__RefHeading___Toc2557_3544882389"/>
       <w:bookmarkEnd w:id="36"/>
       <w:r>
         <w:rPr>
@@ -13606,7 +13606,7 @@
         <w:pStyle w:val="Heading1"/>
         <w:rPr/>
       </w:pPr>
-      <w:bookmarkStart w:id="37" w:name="__RefHeading___Toc2461_972910476"/>
+      <w:bookmarkStart w:id="37" w:name="__RefHeading___Toc2461_3544882389"/>
       <w:bookmarkEnd w:id="37"/>
       <w:r>
         <w:rPr/>
@@ -13618,7 +13618,7 @@
         <w:pStyle w:val="TableCaption"/>
         <w:rPr/>
       </w:pPr>
-      <w:bookmarkStart w:id="38" w:name="__RefHeading___Toc2555_972910476"/>
+      <w:bookmarkStart w:id="38" w:name="__RefHeading___Toc2555_3544882389"/>
       <w:bookmarkEnd w:id="38"/>
       <w:r>
         <w:rPr>
@@ -14552,7 +14552,7 @@
         <w:pStyle w:val="Heading1"/>
         <w:rPr/>
       </w:pPr>
-      <w:bookmarkStart w:id="39" w:name="__RefHeading___Toc2463_972910476"/>
+      <w:bookmarkStart w:id="39" w:name="__RefHeading___Toc2463_3544882389"/>
       <w:bookmarkEnd w:id="39"/>
       <w:r>
         <w:rPr/>
@@ -14564,7 +14564,7 @@
         <w:pStyle w:val="Heading2"/>
         <w:rPr/>
       </w:pPr>
-      <w:bookmarkStart w:id="40" w:name="__RefHeading___Toc2465_972910476"/>
+      <w:bookmarkStart w:id="40" w:name="__RefHeading___Toc2465_3544882389"/>
       <w:bookmarkEnd w:id="40"/>
       <w:r>
         <w:rPr/>
@@ -14640,7 +14640,7 @@
         <w:pStyle w:val="FigureCaption"/>
         <w:rPr/>
       </w:pPr>
-      <w:bookmarkStart w:id="41" w:name="__RefHeading___Toc2529_972910476"/>
+      <w:bookmarkStart w:id="41" w:name="__RefHeading___Toc2529_3544882389"/>
       <w:bookmarkEnd w:id="41"/>
       <w:r>
         <w:rPr>
@@ -14655,7 +14655,7 @@
         <w:pStyle w:val="TableCaption"/>
         <w:rPr/>
       </w:pPr>
-      <w:bookmarkStart w:id="42" w:name="__RefHeading___Toc2553_972910476"/>
+      <w:bookmarkStart w:id="42" w:name="__RefHeading___Toc2553_3544882389"/>
       <w:bookmarkEnd w:id="42"/>
       <w:r>
         <w:rPr>
@@ -15427,7 +15427,7 @@
         <w:pStyle w:val="Heading2"/>
         <w:rPr/>
       </w:pPr>
-      <w:bookmarkStart w:id="43" w:name="__RefHeading___Toc2467_972910476"/>
+      <w:bookmarkStart w:id="43" w:name="__RefHeading___Toc2467_3544882389"/>
       <w:bookmarkEnd w:id="43"/>
       <w:r>
         <w:rPr/>
@@ -15503,7 +15503,7 @@
         <w:pStyle w:val="FigureCaption"/>
         <w:rPr/>
       </w:pPr>
-      <w:bookmarkStart w:id="44" w:name="__RefHeading___Toc2527_972910476"/>
+      <w:bookmarkStart w:id="44" w:name="__RefHeading___Toc2527_3544882389"/>
       <w:bookmarkEnd w:id="44"/>
       <w:r>
         <w:rPr>
@@ -15518,7 +15518,7 @@
         <w:pStyle w:val="TableCaption"/>
         <w:rPr/>
       </w:pPr>
-      <w:bookmarkStart w:id="45" w:name="__RefHeading___Toc2551_972910476"/>
+      <w:bookmarkStart w:id="45" w:name="__RefHeading___Toc2551_3544882389"/>
       <w:bookmarkEnd w:id="45"/>
       <w:r>
         <w:rPr>
@@ -16214,7 +16214,7 @@
         <w:pStyle w:val="Heading2"/>
         <w:rPr/>
       </w:pPr>
-      <w:bookmarkStart w:id="46" w:name="__RefHeading___Toc2469_972910476"/>
+      <w:bookmarkStart w:id="46" w:name="__RefHeading___Toc2469_3544882389"/>
       <w:bookmarkEnd w:id="46"/>
       <w:r>
         <w:rPr/>
@@ -16327,7 +16327,7 @@
         <w:pStyle w:val="FigureCaption"/>
         <w:rPr/>
       </w:pPr>
-      <w:bookmarkStart w:id="47" w:name="__RefHeading___Toc2525_972910476"/>
+      <w:bookmarkStart w:id="47" w:name="__RefHeading___Toc2525_3544882389"/>
       <w:bookmarkEnd w:id="47"/>
       <w:r>
         <w:rPr>
@@ -16342,7 +16342,7 @@
         <w:pStyle w:val="TableCaption"/>
         <w:rPr/>
       </w:pPr>
-      <w:bookmarkStart w:id="48" w:name="__RefHeading___Toc2549_972910476"/>
+      <w:bookmarkStart w:id="48" w:name="__RefHeading___Toc2549_3544882389"/>
       <w:bookmarkEnd w:id="48"/>
       <w:r>
         <w:rPr>
@@ -18021,7 +18021,7 @@
         <w:pStyle w:val="Heading2"/>
         <w:rPr/>
       </w:pPr>
-      <w:bookmarkStart w:id="49" w:name="__RefHeading___Toc2471_972910476"/>
+      <w:bookmarkStart w:id="49" w:name="__RefHeading___Toc2471_3544882389"/>
       <w:bookmarkEnd w:id="49"/>
       <w:r>
         <w:rPr/>
@@ -18097,7 +18097,7 @@
         <w:pStyle w:val="FigureCaption"/>
         <w:rPr/>
       </w:pPr>
-      <w:bookmarkStart w:id="50" w:name="__RefHeading___Toc2523_972910476"/>
+      <w:bookmarkStart w:id="50" w:name="__RefHeading___Toc2523_3544882389"/>
       <w:bookmarkEnd w:id="50"/>
       <w:r>
         <w:rPr>
@@ -18112,7 +18112,7 @@
         <w:pStyle w:val="Heading2"/>
         <w:rPr/>
       </w:pPr>
-      <w:bookmarkStart w:id="51" w:name="__RefHeading___Toc2473_972910476"/>
+      <w:bookmarkStart w:id="51" w:name="__RefHeading___Toc2473_3544882389"/>
       <w:bookmarkEnd w:id="51"/>
       <w:r>
         <w:rPr/>
@@ -18188,7 +18188,7 @@
         <w:pStyle w:val="FigureCaption"/>
         <w:rPr/>
       </w:pPr>
-      <w:bookmarkStart w:id="52" w:name="__RefHeading___Toc2521_972910476"/>
+      <w:bookmarkStart w:id="52" w:name="__RefHeading___Toc2521_3544882389"/>
       <w:bookmarkEnd w:id="52"/>
       <w:r>
         <w:rPr>
@@ -18252,7 +18252,7 @@
         <w:pStyle w:val="FigureCaption"/>
         <w:rPr/>
       </w:pPr>
-      <w:bookmarkStart w:id="53" w:name="__RefHeading___Toc2519_972910476"/>
+      <w:bookmarkStart w:id="53" w:name="__RefHeading___Toc2519_3544882389"/>
       <w:bookmarkEnd w:id="53"/>
       <w:r>
         <w:rPr>
@@ -18316,7 +18316,7 @@
         <w:pStyle w:val="FigureCaption"/>
         <w:rPr/>
       </w:pPr>
-      <w:bookmarkStart w:id="54" w:name="__RefHeading___Toc2517_972910476"/>
+      <w:bookmarkStart w:id="54" w:name="__RefHeading___Toc2517_3544882389"/>
       <w:bookmarkEnd w:id="54"/>
       <w:r>
         <w:rPr>
@@ -18380,7 +18380,7 @@
         <w:pStyle w:val="FigureCaption"/>
         <w:rPr/>
       </w:pPr>
-      <w:bookmarkStart w:id="55" w:name="__RefHeading___Toc2515_972910476"/>
+      <w:bookmarkStart w:id="55" w:name="__RefHeading___Toc2515_3544882389"/>
       <w:bookmarkEnd w:id="55"/>
       <w:r>
         <w:rPr>
@@ -18444,7 +18444,7 @@
         <w:pStyle w:val="FigureCaption"/>
         <w:rPr/>
       </w:pPr>
-      <w:bookmarkStart w:id="56" w:name="__RefHeading___Toc2513_972910476"/>
+      <w:bookmarkStart w:id="56" w:name="__RefHeading___Toc2513_3544882389"/>
       <w:bookmarkEnd w:id="56"/>
       <w:r>
         <w:rPr>
@@ -18459,7 +18459,7 @@
         <w:pStyle w:val="TableCaption"/>
         <w:rPr/>
       </w:pPr>
-      <w:bookmarkStart w:id="57" w:name="__RefHeading___Toc2547_972910476"/>
+      <w:bookmarkStart w:id="57" w:name="__RefHeading___Toc2547_3544882389"/>
       <w:bookmarkEnd w:id="57"/>
       <w:r>
         <w:rPr>
@@ -19065,7 +19065,7 @@
         <w:pStyle w:val="Heading2"/>
         <w:rPr/>
       </w:pPr>
-      <w:bookmarkStart w:id="58" w:name="__RefHeading___Toc2475_972910476"/>
+      <w:bookmarkStart w:id="58" w:name="__RefHeading___Toc2475_3544882389"/>
       <w:bookmarkEnd w:id="58"/>
       <w:r>
         <w:rPr/>
@@ -19141,7 +19141,7 @@
         <w:pStyle w:val="FigureCaption"/>
         <w:rPr/>
       </w:pPr>
-      <w:bookmarkStart w:id="59" w:name="__RefHeading___Toc2511_972910476"/>
+      <w:bookmarkStart w:id="59" w:name="__RefHeading___Toc2511_3544882389"/>
       <w:bookmarkEnd w:id="59"/>
       <w:r>
         <w:rPr>
@@ -19205,7 +19205,7 @@
         <w:pStyle w:val="FigureCaption"/>
         <w:rPr/>
       </w:pPr>
-      <w:bookmarkStart w:id="60" w:name="__RefHeading___Toc2509_972910476"/>
+      <w:bookmarkStart w:id="60" w:name="__RefHeading___Toc2509_3544882389"/>
       <w:bookmarkEnd w:id="60"/>
       <w:r>
         <w:rPr>
@@ -19269,7 +19269,7 @@
         <w:pStyle w:val="FigureCaption"/>
         <w:rPr/>
       </w:pPr>
-      <w:bookmarkStart w:id="61" w:name="__RefHeading___Toc2507_972910476"/>
+      <w:bookmarkStart w:id="61" w:name="__RefHeading___Toc2507_3544882389"/>
       <w:bookmarkEnd w:id="61"/>
       <w:r>
         <w:rPr>
@@ -19333,7 +19333,7 @@
         <w:pStyle w:val="FigureCaption"/>
         <w:rPr/>
       </w:pPr>
-      <w:bookmarkStart w:id="62" w:name="__RefHeading___Toc2505_972910476"/>
+      <w:bookmarkStart w:id="62" w:name="__RefHeading___Toc2505_3544882389"/>
       <w:bookmarkEnd w:id="62"/>
       <w:r>
         <w:rPr>
@@ -19397,7 +19397,7 @@
         <w:pStyle w:val="FigureCaption"/>
         <w:rPr/>
       </w:pPr>
-      <w:bookmarkStart w:id="63" w:name="__RefHeading___Toc2503_972910476"/>
+      <w:bookmarkStart w:id="63" w:name="__RefHeading___Toc2503_3544882389"/>
       <w:bookmarkEnd w:id="63"/>
       <w:r>
         <w:rPr>
@@ -19412,7 +19412,7 @@
         <w:pStyle w:val="TableCaption"/>
         <w:rPr/>
       </w:pPr>
-      <w:bookmarkStart w:id="64" w:name="__RefHeading___Toc2545_972910476"/>
+      <w:bookmarkStart w:id="64" w:name="__RefHeading___Toc2545_3544882389"/>
       <w:bookmarkEnd w:id="64"/>
       <w:r>
         <w:rPr>
@@ -20963,7 +20963,7 @@
         <w:pStyle w:val="Heading2"/>
         <w:rPr/>
       </w:pPr>
-      <w:bookmarkStart w:id="65" w:name="__RefHeading___Toc2477_972910476"/>
+      <w:bookmarkStart w:id="65" w:name="__RefHeading___Toc2477_3544882389"/>
       <w:bookmarkEnd w:id="65"/>
       <w:r>
         <w:rPr/>
@@ -21039,7 +21039,7 @@
         <w:pStyle w:val="FigureCaption"/>
         <w:rPr/>
       </w:pPr>
-      <w:bookmarkStart w:id="66" w:name="__RefHeading___Toc2501_972910476"/>
+      <w:bookmarkStart w:id="66" w:name="__RefHeading___Toc2501_3544882389"/>
       <w:bookmarkEnd w:id="66"/>
       <w:r>
         <w:rPr>
@@ -21054,7 +21054,7 @@
         <w:pStyle w:val="TableCaption"/>
         <w:rPr/>
       </w:pPr>
-      <w:bookmarkStart w:id="67" w:name="__RefHeading___Toc2543_972910476"/>
+      <w:bookmarkStart w:id="67" w:name="__RefHeading___Toc2543_3544882389"/>
       <w:bookmarkEnd w:id="67"/>
       <w:r>
         <w:rPr>
@@ -22093,7 +22093,7 @@
         <w:pStyle w:val="Heading2"/>
         <w:rPr/>
       </w:pPr>
-      <w:bookmarkStart w:id="68" w:name="__RefHeading___Toc2479_972910476"/>
+      <w:bookmarkStart w:id="68" w:name="__RefHeading___Toc2479_3544882389"/>
       <w:bookmarkEnd w:id="68"/>
       <w:r>
         <w:rPr/>
@@ -22196,7 +22196,7 @@
         <w:pStyle w:val="Heading1"/>
         <w:rPr/>
       </w:pPr>
-      <w:bookmarkStart w:id="69" w:name="__RefHeading___Toc2481_972910476"/>
+      <w:bookmarkStart w:id="69" w:name="__RefHeading___Toc2481_3544882389"/>
       <w:bookmarkEnd w:id="69"/>
       <w:r>
         <w:rPr/>
@@ -22223,7 +22223,7 @@
         <w:pStyle w:val="Heading2"/>
         <w:rPr/>
       </w:pPr>
-      <w:bookmarkStart w:id="70" w:name="__RefHeading___Toc2483_972910476"/>
+      <w:bookmarkStart w:id="70" w:name="__RefHeading___Toc2483_3544882389"/>
       <w:bookmarkEnd w:id="70"/>
       <w:r>
         <w:rPr/>
@@ -22427,7 +22427,7 @@
         <w:pStyle w:val="Heading2"/>
         <w:rPr/>
       </w:pPr>
-      <w:bookmarkStart w:id="71" w:name="__RefHeading___Toc2485_972910476"/>
+      <w:bookmarkStart w:id="71" w:name="__RefHeading___Toc2485_3544882389"/>
       <w:bookmarkEnd w:id="71"/>
       <w:r>
         <w:rPr/>
@@ -22535,7 +22535,7 @@
         <w:pStyle w:val="Heading2"/>
         <w:rPr/>
       </w:pPr>
-      <w:bookmarkStart w:id="72" w:name="__RefHeading___Toc2487_972910476"/>
+      <w:bookmarkStart w:id="72" w:name="__RefHeading___Toc2487_3544882389"/>
       <w:bookmarkEnd w:id="72"/>
       <w:r>
         <w:rPr/>
@@ -22547,7 +22547,7 @@
         <w:pStyle w:val="TableCaption"/>
         <w:rPr/>
       </w:pPr>
-      <w:bookmarkStart w:id="73" w:name="__RefHeading___Toc2541_972910476"/>
+      <w:bookmarkStart w:id="73" w:name="__RefHeading___Toc2541_3544882389"/>
       <w:bookmarkEnd w:id="73"/>
       <w:r>
         <w:rPr>
@@ -22764,7 +22764,7 @@
         <w:pStyle w:val="Heading1"/>
         <w:rPr/>
       </w:pPr>
-      <w:bookmarkStart w:id="74" w:name="__RefHeading___Toc2489_972910476"/>
+      <w:bookmarkStart w:id="74" w:name="__RefHeading___Toc2489_3544882389"/>
       <w:bookmarkEnd w:id="74"/>
       <w:r>
         <w:rPr/>
@@ -22823,7 +22823,7 @@
         <w:pStyle w:val="Heading1"/>
         <w:rPr/>
       </w:pPr>
-      <w:bookmarkStart w:id="75" w:name="__RefHeading___Toc2491_972910476"/>
+      <w:bookmarkStart w:id="75" w:name="__RefHeading___Toc2491_3544882389"/>
       <w:bookmarkEnd w:id="75"/>
       <w:r>
         <w:rPr/>
@@ -22850,7 +22850,7 @@
         <w:pStyle w:val="TableCaption"/>
         <w:rPr/>
       </w:pPr>
-      <w:bookmarkStart w:id="76" w:name="__RefHeading___Toc2539_972910476"/>
+      <w:bookmarkStart w:id="76" w:name="__RefHeading___Toc2539_3544882389"/>
       <w:bookmarkEnd w:id="76"/>
       <w:r>
         <w:rPr>
@@ -23888,7 +23888,7 @@
         <w:pStyle w:val="Heading1"/>
         <w:rPr/>
       </w:pPr>
-      <w:bookmarkStart w:id="77" w:name="__RefHeading___Toc2493_972910476"/>
+      <w:bookmarkStart w:id="77" w:name="__RefHeading___Toc2493_3544882389"/>
       <w:bookmarkEnd w:id="77"/>
       <w:r>
         <w:rPr/>
@@ -24014,7 +24014,7 @@
         <w:pStyle w:val="Heading1"/>
         <w:rPr/>
       </w:pPr>
-      <w:bookmarkStart w:id="78" w:name="__RefHeading___Toc2495_972910476"/>
+      <w:bookmarkStart w:id="78" w:name="__RefHeading___Toc2495_3544882389"/>
       <w:bookmarkEnd w:id="78"/>
       <w:r>
         <w:rPr/>
@@ -24911,7 +24911,7 @@
         <w:pStyle w:val="Heading1"/>
         <w:rPr/>
       </w:pPr>
-      <w:bookmarkStart w:id="79" w:name="__RefHeading___Toc2497_972910476"/>
+      <w:bookmarkStart w:id="79" w:name="__RefHeading___Toc2497_3544882389"/>
       <w:bookmarkEnd w:id="79"/>
       <w:r>
         <w:rPr/>
@@ -24938,7 +24938,7 @@
         <w:pStyle w:val="TableCaption"/>
         <w:rPr/>
       </w:pPr>
-      <w:bookmarkStart w:id="80" w:name="__RefHeading___Toc2537_972910476"/>
+      <w:bookmarkStart w:id="80" w:name="__RefHeading___Toc2537_3544882389"/>
       <w:bookmarkEnd w:id="80"/>
       <w:r>
         <w:rPr>
@@ -25566,7 +25566,7 @@
       <w:footerReference w:type="first" r:id="rId25"/>
       <w:type w:val="nextPage"/>
       <w:pgSz w:w="11906" w:h="16838"/>
-      <w:pgMar w:left="1390" w:right="1390" w:gutter="0" w:header="0" w:top="1368" w:footer="576" w:bottom="1296"/>
+      <w:pgMar w:left="1680" w:right="1100" w:gutter="0" w:header="0" w:top="1368" w:footer="576" w:bottom="1296"/>
       <w:pgNumType w:start="1" w:fmt="decimal"/>
       <w:formProt w:val="false"/>
       <w:textDirection w:val="lrTb"/>

</xml_diff>